<commit_message>
Version 2.1.5-dev.8 : état du tome et guide Word aligné
- Fusion du lot D (état du tome choisi par l'équipe).
- Guide Word : chapitre « état des tomes et des œuvres » aligné sur les
  vrais libellés et confirmations ; « Tome complet » remplacé par
  l'encadré « État du tome » ; « Complet » devient « Publié ».

Co-Authored-By: Claude Opus 5.5 <noreply@anthropic.com>
Claude-Session: https://claude.ai/code/session_01Fgz3cxegL2JwiMcCfV4koy
</commit_message>
<xml_diff>
--- a/docs/guide-equipe/Guide-equipe-Yume-Novel.docx
+++ b/docs/guide-equipe/Guide-equipe-Yume-Novel.docx
@@ -61,7 +61,7 @@
           <w:sz w:val="22"/>
           <w:szCs w:val="22"/>
         </w:rPr>
-        <w:t xml:space="preserve">Version 2.1.5-dev.5 du 1er octobre 2026</w:t>
+        <w:t xml:space="preserve">Version 2.1.5-dev.8 du 1er octobre 2026</w:t>
       </w:r>
     </w:p>
     <w:p>
@@ -942,7 +942,7 @@
               <w:rPr>
                 <w:rStyle w:val="IndexLink"/>
               </w:rPr>
-              <w:t xml:space="default">8.2 Passer un tome à « Complet » sans annonce</w:t>
+              <w:t xml:space="default">8.2 Passer un tome à « Publié » depuis sa fiche</w:t>
               <w:tab/>
               <w:t xml:space="default">24</w:t>
             </w:r>
@@ -1153,7 +1153,7 @@
               </w:rPr>
               <w:t xml:space="default">10.5 Changer l'état d'une œuvre</w:t>
               <w:tab/>
-              <w:t xml:space="default">31</w:t>
+              <w:t xml:space="default">32</w:t>
             </w:r>
           </w:hyperlink>
         </w:p>
@@ -5655,7 +5655,7 @@
     </w:p>
     <w:p>
       <w:r>
-        <w:t xml:space="preserve">Aujourd'hui, l'état d'un tome suit ses chapitres : rien à choisir.</w:t>
+        <w:t xml:space="preserve">L'état d'un tome suit ses chapitres : le site le met à jour tout seul.</w:t>
       </w:r>
     </w:p>
     <w:tbl>
@@ -5671,8 +5671,9 @@
         </w:tblBorders>
       </w:tblPr>
       <w:tblGrid>
+        <w:gridCol w:w="1635"/>
         <w:gridCol w:w="1300"/>
-        <w:gridCol w:w="7726"/>
+        <w:gridCol w:w="6091"/>
       </w:tblGrid>
       <w:tr>
         <w:trPr>
@@ -5681,7 +5682,7 @@
         </w:trPr>
         <w:tc>
           <w:tcPr>
-            <w:tcW w:type="dxa" w:w="1300"/>
+            <w:tcW w:type="dxa" w:w="1635"/>
             <w:tcBorders>
               <w:top w:val="single" w:color="CFC6DE" w:sz="4"/>
               <w:left w:val="single" w:color="CFC6DE" w:sz="4"/>
@@ -5716,13 +5717,54 @@
                 <w:sz w:val="19"/>
                 <w:szCs w:val="19"/>
               </w:rPr>
-              <w:t xml:space="preserve">Parution</w:t>
-            </w:r>
-          </w:p>
-        </w:tc>
-        <w:tc>
-          <w:tcPr>
-            <w:tcW w:type="dxa" w:w="7726"/>
+              <w:t xml:space="preserve">État (équipe)</w:t>
+            </w:r>
+          </w:p>
+        </w:tc>
+        <w:tc>
+          <w:tcPr>
+            <w:tcW w:type="dxa" w:w="1300"/>
+            <w:tcBorders>
+              <w:top w:val="single" w:color="CFC6DE" w:sz="4"/>
+              <w:left w:val="single" w:color="CFC6DE" w:sz="4"/>
+              <w:bottom w:val="single" w:color="CFC6DE" w:sz="4"/>
+              <w:right w:val="single" w:color="CFC6DE" w:sz="4"/>
+            </w:tcBorders>
+            <w:shd w:fill="3A2A63" w:color="auto" w:val="clear"/>
+            <w:tcMar>
+              <w:top w:type="dxa" w:w="70"/>
+              <w:left w:type="dxa" w:w="110"/>
+              <w:bottom w:type="dxa" w:w="70"/>
+              <w:right w:type="dxa" w:w="110"/>
+            </w:tcMar>
+            <w:vAlign w:val="center"/>
+          </w:tcPr>
+          <w:p>
+            <w:pPr>
+              <w:spacing w:after="0" w:before="0"/>
+              <w:rPr>
+                <w:b/>
+                <w:bCs/>
+                <w:color w:val="FFFFFF"/>
+                <w:sz w:val="19"/>
+                <w:szCs w:val="19"/>
+              </w:rPr>
+            </w:pPr>
+            <w:r>
+              <w:rPr>
+                <w:b/>
+                <w:bCs/>
+                <w:color w:val="FFFFFF"/>
+                <w:sz w:val="19"/>
+                <w:szCs w:val="19"/>
+              </w:rPr>
+              <w:t xml:space="preserve">Les lecteurs voient</w:t>
+            </w:r>
+          </w:p>
+        </w:tc>
+        <w:tc>
+          <w:tcPr>
+            <w:tcW w:type="dxa" w:w="6091"/>
             <w:tcBorders>
               <w:top w:val="single" w:color="CFC6DE" w:sz="4"/>
               <w:left w:val="single" w:color="CFC6DE" w:sz="4"/>
@@ -5769,7 +5811,7 @@
         </w:trPr>
         <w:tc>
           <w:tcPr>
-            <w:tcW w:type="dxa" w:w="1300"/>
+            <w:tcW w:type="dxa" w:w="1635"/>
             <w:tcBorders>
               <w:top w:val="single" w:color="CFC6DE" w:sz="4"/>
               <w:left w:val="single" w:color="CFC6DE" w:sz="4"/>
@@ -5799,13 +5841,47 @@
                 <w:sz w:val="19"/>
                 <w:szCs w:val="19"/>
               </w:rPr>
+              <w:t xml:space="preserve">Planifié</w:t>
+            </w:r>
+          </w:p>
+        </w:tc>
+        <w:tc>
+          <w:tcPr>
+            <w:tcW w:type="dxa" w:w="1300"/>
+            <w:tcBorders>
+              <w:top w:val="single" w:color="CFC6DE" w:sz="4"/>
+              <w:left w:val="single" w:color="CFC6DE" w:sz="4"/>
+              <w:bottom w:val="single" w:color="CFC6DE" w:sz="4"/>
+              <w:right w:val="single" w:color="CFC6DE" w:sz="4"/>
+            </w:tcBorders>
+            <w:tcMar>
+              <w:top w:type="dxa" w:w="70"/>
+              <w:left w:type="dxa" w:w="110"/>
+              <w:bottom w:type="dxa" w:w="70"/>
+              <w:right w:type="dxa" w:w="110"/>
+            </w:tcMar>
+            <w:vAlign w:val="center"/>
+          </w:tcPr>
+          <w:p>
+            <w:pPr>
+              <w:spacing w:after="0" w:before="0"/>
+              <w:rPr>
+                <w:sz w:val="19"/>
+                <w:szCs w:val="19"/>
+              </w:rPr>
+            </w:pPr>
+            <w:r>
+              <w:rPr>
+                <w:sz w:val="19"/>
+                <w:szCs w:val="19"/>
+              </w:rPr>
               <w:t xml:space="preserve">À paraître</w:t>
             </w:r>
           </w:p>
         </w:tc>
         <w:tc>
           <w:tcPr>
-            <w:tcW w:type="dxa" w:w="7726"/>
+            <w:tcW w:type="dxa" w:w="6091"/>
             <w:tcBorders>
               <w:top w:val="single" w:color="CFC6DE" w:sz="4"/>
               <w:left w:val="single" w:color="CFC6DE" w:sz="4"/>
@@ -5845,7 +5921,7 @@
         </w:trPr>
         <w:tc>
           <w:tcPr>
-            <w:tcW w:type="dxa" w:w="1300"/>
+            <w:tcW w:type="dxa" w:w="1635"/>
             <w:tcBorders>
               <w:top w:val="single" w:color="CFC6DE" w:sz="4"/>
               <w:left w:val="single" w:color="CFC6DE" w:sz="4"/>
@@ -5876,13 +5952,48 @@
                 <w:sz w:val="19"/>
                 <w:szCs w:val="19"/>
               </w:rPr>
+              <w:t xml:space="preserve">En cours de publication</w:t>
+            </w:r>
+          </w:p>
+        </w:tc>
+        <w:tc>
+          <w:tcPr>
+            <w:tcW w:type="dxa" w:w="1300"/>
+            <w:tcBorders>
+              <w:top w:val="single" w:color="CFC6DE" w:sz="4"/>
+              <w:left w:val="single" w:color="CFC6DE" w:sz="4"/>
+              <w:bottom w:val="single" w:color="CFC6DE" w:sz="4"/>
+              <w:right w:val="single" w:color="CFC6DE" w:sz="4"/>
+            </w:tcBorders>
+            <w:shd w:fill="F6F3FA" w:color="auto" w:val="clear"/>
+            <w:tcMar>
+              <w:top w:type="dxa" w:w="70"/>
+              <w:left w:type="dxa" w:w="110"/>
+              <w:bottom w:type="dxa" w:w="70"/>
+              <w:right w:type="dxa" w:w="110"/>
+            </w:tcMar>
+            <w:vAlign w:val="center"/>
+          </w:tcPr>
+          <w:p>
+            <w:pPr>
+              <w:spacing w:after="0" w:before="0"/>
+              <w:rPr>
+                <w:sz w:val="19"/>
+                <w:szCs w:val="19"/>
+              </w:rPr>
+            </w:pPr>
+            <w:r>
+              <w:rPr>
+                <w:sz w:val="19"/>
+                <w:szCs w:val="19"/>
+              </w:rPr>
               <w:t xml:space="preserve">En cours</w:t>
             </w:r>
           </w:p>
         </w:tc>
         <w:tc>
           <w:tcPr>
-            <w:tcW w:type="dxa" w:w="7726"/>
+            <w:tcW w:type="dxa" w:w="6091"/>
             <w:tcBorders>
               <w:top w:val="single" w:color="CFC6DE" w:sz="4"/>
               <w:left w:val="single" w:color="CFC6DE" w:sz="4"/>
@@ -5923,7 +6034,7 @@
         </w:trPr>
         <w:tc>
           <w:tcPr>
-            <w:tcW w:type="dxa" w:w="1300"/>
+            <w:tcW w:type="dxa" w:w="1635"/>
             <w:tcBorders>
               <w:top w:val="single" w:color="CFC6DE" w:sz="4"/>
               <w:left w:val="single" w:color="CFC6DE" w:sz="4"/>
@@ -5953,13 +6064,13 @@
                 <w:sz w:val="19"/>
                 <w:szCs w:val="19"/>
               </w:rPr>
-              <w:t xml:space="preserve">Complet</w:t>
-            </w:r>
-          </w:p>
-        </w:tc>
-        <w:tc>
-          <w:tcPr>
-            <w:tcW w:type="dxa" w:w="7726"/>
+              <w:t xml:space="preserve">Publié</w:t>
+            </w:r>
+          </w:p>
+        </w:tc>
+        <w:tc>
+          <w:tcPr>
+            <w:tcW w:type="dxa" w:w="1300"/>
             <w:tcBorders>
               <w:top w:val="single" w:color="CFC6DE" w:sz="4"/>
               <w:left w:val="single" w:color="CFC6DE" w:sz="4"/>
@@ -5987,7 +6098,41 @@
                 <w:sz w:val="19"/>
                 <w:szCs w:val="19"/>
               </w:rPr>
-              <w:t xml:space="preserve">Quand l'équipe coche « Tome complet ». Tous les chapitres sont en ligne, les liens PDF et EPUB s'ajoutent.</w:t>
+              <w:t xml:space="preserve">Publié</w:t>
+            </w:r>
+          </w:p>
+        </w:tc>
+        <w:tc>
+          <w:tcPr>
+            <w:tcW w:type="dxa" w:w="6091"/>
+            <w:tcBorders>
+              <w:top w:val="single" w:color="CFC6DE" w:sz="4"/>
+              <w:left w:val="single" w:color="CFC6DE" w:sz="4"/>
+              <w:bottom w:val="single" w:color="CFC6DE" w:sz="4"/>
+              <w:right w:val="single" w:color="CFC6DE" w:sz="4"/>
+            </w:tcBorders>
+            <w:tcMar>
+              <w:top w:type="dxa" w:w="70"/>
+              <w:left w:type="dxa" w:w="110"/>
+              <w:bottom w:type="dxa" w:w="70"/>
+              <w:right w:type="dxa" w:w="110"/>
+            </w:tcMar>
+            <w:vAlign w:val="center"/>
+          </w:tcPr>
+          <w:p>
+            <w:pPr>
+              <w:spacing w:after="0" w:before="0"/>
+              <w:rPr>
+                <w:sz w:val="19"/>
+                <w:szCs w:val="19"/>
+              </w:rPr>
+            </w:pPr>
+            <w:r>
+              <w:rPr>
+                <w:sz w:val="19"/>
+                <w:szCs w:val="19"/>
+              </w:rPr>
+              <w:t xml:space="preserve">Quand l'équipe coche « Tome complet » ou choisit « Publié ». Tous les chapitres sont en ligne, les liens PDF et EPUB s'ajoutent.</w:t>
             </w:r>
           </w:p>
         </w:tc>
@@ -6050,7 +6195,7 @@
               <w:t xml:space="preserve"> : </w:t>
             </w:r>
             <w:r>
-              <w:t xml:space="preserve">version 2.1.5. L'équipe pourra aussi choisir l'état du tome à la main : </w:t>
+              <w:t xml:space="preserve">version 2.1.5. L'équipe peut aussi changer l'état du tome à la main : </w:t>
             </w:r>
             <w:r>
               <w:rPr>
@@ -9605,7 +9750,7 @@
     </w:p>
     <w:p>
       <w:r>
-        <w:t xml:space="preserve">Résultat : tous les chapitres sont en ligne, le tome est « Complet », les liens s'affichent et le planning passe à « Publié », 100 %. L'annonce dit « Le tome 2 de SukaMoka est disponible ! ».</w:t>
+        <w:t xml:space="preserve">Résultat : tous les chapitres sont en ligne, le tome est « Publié », les liens s'affichent et le planning passe à « Publié », 100 %. L'annonce dit « Le tome 2 de SukaMoka est disponible ! ».</w:t>
       </w:r>
     </w:p>
     <w:tbl>
@@ -11600,7 +11745,7 @@
     </w:p>
     <w:p>
       <w:r>
-        <w:t xml:space="preserve">Le tome passe « Complet », les liens s'affichent, le planning passe à « Publié », 100 %. L'annonce dit « Le tome 2 de SukaMoka est complet : PDF et EPUB disponibles ». Si les derniers chapitres sont programmés, tout cela se fait à la sortie du dernier.</w:t>
+        <w:t xml:space="preserve">Le tome passe « Publié », les liens s'affichent, le planning passe à « Publié », 100 %. L'annonce dit « Le tome 2 de SukaMoka est complet : PDF et EPUB disponibles ». Si les derniers chapitres sont programmés, tout cela se fait à la sortie du dernier.</w:t>
       </w:r>
     </w:p>
     <w:p>
@@ -11609,7 +11754,7 @@
       </w:pPr>
       <w:bookmarkStart w:name="titre-44" w:id="110"/>
       <w:r>
-        <w:t xml:space="preserve">8.2 Passer un tome à « Complet » sans annonce</w:t>
+        <w:t xml:space="preserve">8.2 Passer un tome à « Publié » depuis sa fiche</w:t>
       </w:r>
       <w:bookmarkEnd w:id="110"/>
     </w:p>
@@ -11665,17 +11810,17 @@
           <w:b/>
           <w:bCs/>
         </w:rPr>
-        <w:t xml:space="preserve">Tome complet</w:t>
-      </w:r>
-      <w:r>
-        <w:t xml:space="preserve">, cochez </w:t>
-      </w:r>
-      <w:r>
-        <w:rPr>
-          <w:b/>
-          <w:bCs/>
-        </w:rPr>
-        <w:t xml:space="preserve">Tous les chapitres sont en ligne : passer le tome à « Complet » (sans annonce)</w:t>
+        <w:t xml:space="preserve">État du tome</w:t>
+      </w:r>
+      <w:r>
+        <w:t xml:space="preserve">, choisissez </w:t>
+      </w:r>
+      <w:r>
+        <w:rPr>
+          <w:b/>
+          <w:bCs/>
+        </w:rPr>
+        <w:t xml:space="preserve">Publié</w:t>
       </w:r>
       <w:r>
         <w:t xml:space="preserve">.</w:t>
@@ -11724,6 +11869,29 @@
         <w:spacing w:after="60" w:before="40"/>
       </w:pPr>
       <w:r>
+        <w:t xml:space="preserve">Cochez </w:t>
+      </w:r>
+      <w:r>
+        <w:rPr>
+          <w:b/>
+          <w:bCs/>
+        </w:rPr>
+        <w:t xml:space="preserve">Annoncer « Le tome N est complet »</w:t>
+      </w:r>
+      <w:r>
+        <w:t xml:space="preserve"> si vous voulez prévenir les lecteurs (décochée par défaut).</w:t>
+      </w:r>
+    </w:p>
+    <w:p>
+      <w:pPr>
+        <w:pStyle w:val="ListParagraph"/>
+        <w:numPr>
+          <w:ilvl w:val="0"/>
+          <w:numId w:val="21"/>
+        </w:numPr>
+        <w:spacing w:after="60" w:before="40"/>
+      </w:pPr>
+      <w:r>
         <w:t xml:space="preserve">Cliquez sur </w:t>
       </w:r>
       <w:r>
@@ -11734,7 +11902,7 @@
         <w:t xml:space="preserve">Enregistrer</w:t>
       </w:r>
       <w:r>
-        <w:t xml:space="preserve">.</w:t>
+        <w:t xml:space="preserve">, puis confirmez si le site le demande.</w:t>
       </w:r>
     </w:p>
     <w:p>
@@ -11746,9 +11914,9 @@
       <w:r>
         <w:drawing>
           <wp:inline distT="0" distB="0" distL="0" distR="0">
-            <wp:extent cx="2286000" cy="2047875"/>
+            <wp:extent cx="4572000" cy="2295525"/>
             <wp:effectExtent t="0" r="0" b="0" l="0"/>
-            <wp:docPr id="27" name="TomeEnCours-complet.png" descr="L'encadré « Tome complet » de la fiche du tome." title="L'encadré « Tome complet » de la fiche du tome."/>
+            <wp:docPr id="27" name="EtatTome-etats.png" descr="L'encadré « État du tome » de la fiche du tome." title="L'encadré « État du tome » de la fiche du tome."/>
             <wp:cNvGraphicFramePr>
               <a:graphicFrameLocks xmlns:a="http://schemas.openxmlformats.org/drawingml/2006/main" noChangeAspect="1"/>
             </wp:cNvGraphicFramePr>
@@ -11771,7 +11939,7 @@
                   <pic:spPr bwMode="auto">
                     <a:xfrm>
                       <a:off x="0" y="0"/>
-                      <a:ext cx="2286000" cy="2047875"/>
+                      <a:ext cx="4572000" cy="2295525"/>
                     </a:xfrm>
                     <a:prstGeom prst="rect">
                       <a:avLst/>
@@ -11796,7 +11964,7 @@
         <w:t xml:space="preserve">Figure 9 — </w:t>
       </w:r>
       <w:r>
-        <w:t xml:space="preserve">L'encadré « Tome complet » de la fiche du tome.</w:t>
+        <w:t xml:space="preserve">L'encadré « État du tome » de la fiche du tome.</w:t>
       </w:r>
     </w:p>
     <w:tbl>
@@ -11823,11 +11991,11 @@
             <w:tcW w:type="dxa" w:w="9026"/>
             <w:tcBorders>
               <w:top w:val="none" w:color="FFFFFF" w:sz="0"/>
-              <w:left w:val="single" w:color="D9822B" w:sz="24"/>
+              <w:left w:val="single" w:color="7A4FB0" w:sz="24"/>
               <w:bottom w:val="none" w:color="FFFFFF" w:sz="0"/>
               <w:right w:val="none" w:color="FFFFFF" w:sz="0"/>
             </w:tcBorders>
-            <w:shd w:fill="FDF1E4" w:color="auto" w:val="clear"/>
+            <w:shd w:fill="F1ECFA" w:color="auto" w:val="clear"/>
             <w:tcMar>
               <w:top w:type="dxa" w:w="120"/>
               <w:left w:type="dxa" w:w="200"/>
@@ -11843,15 +12011,15 @@
               <w:rPr>
                 <w:b/>
                 <w:bCs/>
-                <w:color w:val="9A4D0C"/>
-              </w:rPr>
-              <w:t xml:space="preserve">Attention</w:t>
+                <w:color w:val="4B2A7B"/>
+              </w:rPr>
+              <w:t xml:space="preserve">À savoir</w:t>
             </w:r>
             <w:r>
               <w:t xml:space="preserve"> : </w:t>
             </w:r>
             <w:r>
-              <w:t xml:space="preserve">ici, rien n'est annoncé : ni article, ni Discord, ni e-mail. Pour annoncer le tome complet, cochez plutôt la case en ajoutant ses derniers chapitres (procédure précédente).</w:t>
+              <w:t xml:space="preserve">sans la case d'annonce, rien n'est annoncé : ni article, ni Discord, ni e-mail. Voir aussi le chapitre « Nouveau (version 2.1.5) : l'état des tomes et des œuvres ».</w:t>
             </w:r>
           </w:p>
         </w:tc>
@@ -11914,7 +12082,17 @@
           <w:b/>
           <w:bCs/>
         </w:rPr>
-        <w:t xml:space="preserve">Tome complet</w:t>
+        <w:t xml:space="preserve">État du tome</w:t>
+      </w:r>
+      <w:r>
+        <w:t xml:space="preserve">, sous </w:t>
+      </w:r>
+      <w:r>
+        <w:rPr>
+          <w:b/>
+          <w:bCs/>
+        </w:rPr>
+        <w:t xml:space="preserve">Publié</w:t>
       </w:r>
       <w:r>
         <w:t xml:space="preserve">, remplacez le lien.</w:t>
@@ -12808,7 +12986,7 @@
               <w:t xml:space="preserve"> : </w:t>
             </w:r>
             <w:r>
-              <w:t xml:space="preserve">ce chapitre décrit des fonctions de la version 2.1.5, en cours de finition. Il suit les maquettes validées par l'équipe. Les noms exacts des boutons peuvent encore changer.</w:t>
+              <w:t xml:space="preserve">ce chapitre décrit des fonctions de la version 2.1.5. Les images viennent des maquettes : si un détail diffère de l'écran, c'est le texte qui fait foi.</w:t>
             </w:r>
           </w:p>
         </w:tc>
@@ -13436,7 +13614,7 @@
                     </pic:cNvPicPr>
                   </pic:nvPicPr>
                   <pic:blipFill>
-                    <a:blip r:embed="rId24" cstate="none"/>
+                    <a:blip r:embed="rId19" cstate="none"/>
                     <a:srcRect/>
                     <a:stretch>
                       <a:fillRect/>
@@ -13727,6 +13905,1316 @@
             <wp:extent cx="5715000" cy="1333500"/>
             <wp:effectExtent t="0" r="0" b="0" l="0"/>
             <wp:docPr id="33" name="EtatTome-confirmations.png" descr="Les confirmations demandées avant un changement qui touche les lecteurs." title="Les confirmations demandées avant un changement qui touche les lecteurs."/>
+            <wp:cNvGraphicFramePr>
+              <a:graphicFrameLocks xmlns:a="http://schemas.openxmlformats.org/drawingml/2006/main" noChangeAspect="1"/>
+            </wp:cNvGraphicFramePr>
+            <a:graphic xmlns:a="http://schemas.openxmlformats.org/drawingml/2006/main">
+              <a:graphicData uri="http://schemas.openxmlformats.org/drawingml/2006/picture">
+                <pic:pic xmlns:pic="http://schemas.openxmlformats.org/drawingml/2006/picture">
+                  <pic:nvPicPr>
+                    <pic:cNvPr id="0" name="" descr=""/>
+                    <pic:cNvPicPr>
+                      <a:picLocks noChangeAspect="1" noChangeArrowheads="1"/>
+                    </pic:cNvPicPr>
+                  </pic:nvPicPr>
+                  <pic:blipFill>
+                    <a:blip r:embed="rId24" cstate="none"/>
+                    <a:srcRect/>
+                    <a:stretch>
+                      <a:fillRect/>
+                    </a:stretch>
+                  </pic:blipFill>
+                  <pic:spPr bwMode="auto">
+                    <a:xfrm>
+                      <a:off x="0" y="0"/>
+                      <a:ext cx="5715000" cy="1333500"/>
+                    </a:xfrm>
+                    <a:prstGeom prst="rect">
+                      <a:avLst/>
+                    </a:prstGeom>
+                  </pic:spPr>
+                </pic:pic>
+              </a:graphicData>
+            </a:graphic>
+          </wp:inline>
+        </w:drawing>
+      </w:r>
+    </w:p>
+    <w:p>
+      <w:pPr>
+        <w:pStyle w:val="Legende"/>
+      </w:pPr>
+      <w:r>
+        <w:rPr>
+          <w:b/>
+          <w:bCs/>
+        </w:rPr>
+        <w:t xml:space="preserve">Figure 15 — </w:t>
+      </w:r>
+      <w:r>
+        <w:t xml:space="preserve">Les confirmations demandées avant un changement qui touche les lecteurs.</w:t>
+      </w:r>
+    </w:p>
+    <w:tbl>
+      <w:tblPr>
+        <w:tblW w:type="dxa" w:w="9026"/>
+        <w:tblBorders>
+          <w:top w:val="single" w:color="auto" w:sz="4"/>
+          <w:left w:val="single" w:color="auto" w:sz="4"/>
+          <w:bottom w:val="single" w:color="auto" w:sz="4"/>
+          <w:right w:val="single" w:color="auto" w:sz="4"/>
+          <w:insideH w:val="single" w:color="auto" w:sz="4"/>
+          <w:insideV w:val="single" w:color="auto" w:sz="4"/>
+        </w:tblBorders>
+      </w:tblPr>
+      <w:tblGrid>
+        <w:gridCol w:w="1716"/>
+        <w:gridCol w:w="2534"/>
+        <w:gridCol w:w="4776"/>
+      </w:tblGrid>
+      <w:tr>
+        <w:trPr>
+          <w:cantSplit/>
+          <w:tblHeader/>
+        </w:trPr>
+        <w:tc>
+          <w:tcPr>
+            <w:tcW w:type="dxa" w:w="1716"/>
+            <w:tcBorders>
+              <w:top w:val="single" w:color="CFC6DE" w:sz="4"/>
+              <w:left w:val="single" w:color="CFC6DE" w:sz="4"/>
+              <w:bottom w:val="single" w:color="CFC6DE" w:sz="4"/>
+              <w:right w:val="single" w:color="CFC6DE" w:sz="4"/>
+            </w:tcBorders>
+            <w:shd w:fill="3A2A63" w:color="auto" w:val="clear"/>
+            <w:tcMar>
+              <w:top w:type="dxa" w:w="70"/>
+              <w:left w:type="dxa" w:w="110"/>
+              <w:bottom w:type="dxa" w:w="70"/>
+              <w:right w:type="dxa" w:w="110"/>
+            </w:tcMar>
+            <w:vAlign w:val="center"/>
+          </w:tcPr>
+          <w:p>
+            <w:pPr>
+              <w:spacing w:after="0" w:before="0"/>
+              <w:rPr>
+                <w:b/>
+                <w:bCs/>
+                <w:color w:val="FFFFFF"/>
+                <w:sz w:val="19"/>
+                <w:szCs w:val="19"/>
+              </w:rPr>
+            </w:pPr>
+            <w:r>
+              <w:rPr>
+                <w:b/>
+                <w:bCs/>
+                <w:color w:val="FFFFFF"/>
+                <w:sz w:val="19"/>
+                <w:szCs w:val="19"/>
+              </w:rPr>
+              <w:t xml:space="preserve">Changement</w:t>
+            </w:r>
+          </w:p>
+        </w:tc>
+        <w:tc>
+          <w:tcPr>
+            <w:tcW w:type="dxa" w:w="2534"/>
+            <w:tcBorders>
+              <w:top w:val="single" w:color="CFC6DE" w:sz="4"/>
+              <w:left w:val="single" w:color="CFC6DE" w:sz="4"/>
+              <w:bottom w:val="single" w:color="CFC6DE" w:sz="4"/>
+              <w:right w:val="single" w:color="CFC6DE" w:sz="4"/>
+            </w:tcBorders>
+            <w:shd w:fill="3A2A63" w:color="auto" w:val="clear"/>
+            <w:tcMar>
+              <w:top w:type="dxa" w:w="70"/>
+              <w:left w:type="dxa" w:w="110"/>
+              <w:bottom w:type="dxa" w:w="70"/>
+              <w:right w:type="dxa" w:w="110"/>
+            </w:tcMar>
+            <w:vAlign w:val="center"/>
+          </w:tcPr>
+          <w:p>
+            <w:pPr>
+              <w:spacing w:after="0" w:before="0"/>
+              <w:rPr>
+                <w:b/>
+                <w:bCs/>
+                <w:color w:val="FFFFFF"/>
+                <w:sz w:val="19"/>
+                <w:szCs w:val="19"/>
+              </w:rPr>
+            </w:pPr>
+            <w:r>
+              <w:rPr>
+                <w:b/>
+                <w:bCs/>
+                <w:color w:val="FFFFFF"/>
+                <w:sz w:val="19"/>
+                <w:szCs w:val="19"/>
+              </w:rPr>
+              <w:t xml:space="preserve">Bouton de confirmation</w:t>
+            </w:r>
+          </w:p>
+        </w:tc>
+        <w:tc>
+          <w:tcPr>
+            <w:tcW w:type="dxa" w:w="4776"/>
+            <w:tcBorders>
+              <w:top w:val="single" w:color="CFC6DE" w:sz="4"/>
+              <w:left w:val="single" w:color="CFC6DE" w:sz="4"/>
+              <w:bottom w:val="single" w:color="CFC6DE" w:sz="4"/>
+              <w:right w:val="single" w:color="CFC6DE" w:sz="4"/>
+            </w:tcBorders>
+            <w:shd w:fill="3A2A63" w:color="auto" w:val="clear"/>
+            <w:tcMar>
+              <w:top w:type="dxa" w:w="70"/>
+              <w:left w:type="dxa" w:w="110"/>
+              <w:bottom w:type="dxa" w:w="70"/>
+              <w:right w:type="dxa" w:w="110"/>
+            </w:tcMar>
+            <w:vAlign w:val="center"/>
+          </w:tcPr>
+          <w:p>
+            <w:pPr>
+              <w:spacing w:after="0" w:before="0"/>
+              <w:rPr>
+                <w:b/>
+                <w:bCs/>
+                <w:color w:val="FFFFFF"/>
+                <w:sz w:val="19"/>
+                <w:szCs w:val="19"/>
+              </w:rPr>
+            </w:pPr>
+            <w:r>
+              <w:rPr>
+                <w:b/>
+                <w:bCs/>
+                <w:color w:val="FFFFFF"/>
+                <w:sz w:val="19"/>
+                <w:szCs w:val="19"/>
+              </w:rPr>
+              <w:t xml:space="preserve">Ce qui se passe</w:t>
+            </w:r>
+          </w:p>
+        </w:tc>
+      </w:tr>
+      <w:tr>
+        <w:trPr>
+          <w:cantSplit/>
+          <w:tblHeader w:val="off"/>
+        </w:trPr>
+        <w:tc>
+          <w:tcPr>
+            <w:tcW w:type="dxa" w:w="1716"/>
+            <w:tcBorders>
+              <w:top w:val="single" w:color="CFC6DE" w:sz="4"/>
+              <w:left w:val="single" w:color="CFC6DE" w:sz="4"/>
+              <w:bottom w:val="single" w:color="CFC6DE" w:sz="4"/>
+              <w:right w:val="single" w:color="CFC6DE" w:sz="4"/>
+            </w:tcBorders>
+            <w:tcMar>
+              <w:top w:type="dxa" w:w="70"/>
+              <w:left w:type="dxa" w:w="110"/>
+              <w:bottom w:type="dxa" w:w="70"/>
+              <w:right w:type="dxa" w:w="110"/>
+            </w:tcMar>
+            <w:vAlign w:val="center"/>
+          </w:tcPr>
+          <w:p>
+            <w:pPr>
+              <w:spacing w:after="0" w:before="0"/>
+              <w:rPr>
+                <w:sz w:val="19"/>
+                <w:szCs w:val="19"/>
+              </w:rPr>
+            </w:pPr>
+            <w:r>
+              <w:rPr>
+                <w:b/>
+                <w:bCs/>
+                <w:sz w:val="19"/>
+                <w:szCs w:val="19"/>
+              </w:rPr>
+              <w:t xml:space="preserve">Planifié → En cours de publication</w:t>
+            </w:r>
+          </w:p>
+        </w:tc>
+        <w:tc>
+          <w:tcPr>
+            <w:tcW w:type="dxa" w:w="2534"/>
+            <w:tcBorders>
+              <w:top w:val="single" w:color="CFC6DE" w:sz="4"/>
+              <w:left w:val="single" w:color="CFC6DE" w:sz="4"/>
+              <w:bottom w:val="single" w:color="CFC6DE" w:sz="4"/>
+              <w:right w:val="single" w:color="CFC6DE" w:sz="4"/>
+            </w:tcBorders>
+            <w:tcMar>
+              <w:top w:type="dxa" w:w="70"/>
+              <w:left w:type="dxa" w:w="110"/>
+              <w:bottom w:type="dxa" w:w="70"/>
+              <w:right w:type="dxa" w:w="110"/>
+            </w:tcMar>
+            <w:vAlign w:val="center"/>
+          </w:tcPr>
+          <w:p>
+            <w:pPr>
+              <w:spacing w:after="0" w:before="0"/>
+              <w:rPr>
+                <w:sz w:val="19"/>
+                <w:szCs w:val="19"/>
+              </w:rPr>
+            </w:pPr>
+            <w:r>
+              <w:rPr>
+                <w:sz w:val="19"/>
+                <w:szCs w:val="19"/>
+              </w:rPr>
+              <w:t xml:space="preserve">aucun</w:t>
+            </w:r>
+          </w:p>
+        </w:tc>
+        <w:tc>
+          <w:tcPr>
+            <w:tcW w:type="dxa" w:w="4776"/>
+            <w:tcBorders>
+              <w:top w:val="single" w:color="CFC6DE" w:sz="4"/>
+              <w:left w:val="single" w:color="CFC6DE" w:sz="4"/>
+              <w:bottom w:val="single" w:color="CFC6DE" w:sz="4"/>
+              <w:right w:val="single" w:color="CFC6DE" w:sz="4"/>
+            </w:tcBorders>
+            <w:tcMar>
+              <w:top w:type="dxa" w:w="70"/>
+              <w:left w:type="dxa" w:w="110"/>
+              <w:bottom w:type="dxa" w:w="70"/>
+              <w:right w:type="dxa" w:w="110"/>
+            </w:tcMar>
+            <w:vAlign w:val="center"/>
+          </w:tcPr>
+          <w:p>
+            <w:pPr>
+              <w:spacing w:after="0" w:before="0"/>
+              <w:rPr>
+                <w:sz w:val="19"/>
+                <w:szCs w:val="19"/>
+              </w:rPr>
+            </w:pPr>
+            <w:r>
+              <w:rPr>
+                <w:sz w:val="19"/>
+                <w:szCs w:val="19"/>
+              </w:rPr>
+              <w:t xml:space="preserve">Rien ne change tant qu'aucun chapitre n'est en ligne. Le site propose d'</w:t>
+            </w:r>
+            <w:r>
+              <w:rPr>
+                <w:b/>
+                <w:bCs/>
+                <w:sz w:val="19"/>
+                <w:szCs w:val="19"/>
+              </w:rPr>
+              <w:t xml:space="preserve">Ajouter des chapitres</w:t>
+            </w:r>
+            <w:r>
+              <w:rPr>
+                <w:sz w:val="19"/>
+                <w:szCs w:val="19"/>
+              </w:rPr>
+              <w:t xml:space="preserve">.</w:t>
+            </w:r>
+          </w:p>
+        </w:tc>
+      </w:tr>
+      <w:tr>
+        <w:trPr>
+          <w:cantSplit/>
+          <w:tblHeader w:val="off"/>
+        </w:trPr>
+        <w:tc>
+          <w:tcPr>
+            <w:tcW w:type="dxa" w:w="1716"/>
+            <w:tcBorders>
+              <w:top w:val="single" w:color="CFC6DE" w:sz="4"/>
+              <w:left w:val="single" w:color="CFC6DE" w:sz="4"/>
+              <w:bottom w:val="single" w:color="CFC6DE" w:sz="4"/>
+              <w:right w:val="single" w:color="CFC6DE" w:sz="4"/>
+            </w:tcBorders>
+            <w:shd w:fill="F6F3FA" w:color="auto" w:val="clear"/>
+            <w:tcMar>
+              <w:top w:type="dxa" w:w="70"/>
+              <w:left w:type="dxa" w:w="110"/>
+              <w:bottom w:type="dxa" w:w="70"/>
+              <w:right w:type="dxa" w:w="110"/>
+            </w:tcMar>
+            <w:vAlign w:val="center"/>
+          </w:tcPr>
+          <w:p>
+            <w:pPr>
+              <w:spacing w:after="0" w:before="0"/>
+              <w:rPr>
+                <w:sz w:val="19"/>
+                <w:szCs w:val="19"/>
+              </w:rPr>
+            </w:pPr>
+            <w:r>
+              <w:rPr>
+                <w:b/>
+                <w:bCs/>
+                <w:sz w:val="19"/>
+                <w:szCs w:val="19"/>
+              </w:rPr>
+              <w:t xml:space="preserve">Planifié → Publié</w:t>
+            </w:r>
+          </w:p>
+        </w:tc>
+        <w:tc>
+          <w:tcPr>
+            <w:tcW w:type="dxa" w:w="2534"/>
+            <w:tcBorders>
+              <w:top w:val="single" w:color="CFC6DE" w:sz="4"/>
+              <w:left w:val="single" w:color="CFC6DE" w:sz="4"/>
+              <w:bottom w:val="single" w:color="CFC6DE" w:sz="4"/>
+              <w:right w:val="single" w:color="CFC6DE" w:sz="4"/>
+            </w:tcBorders>
+            <w:shd w:fill="F6F3FA" w:color="auto" w:val="clear"/>
+            <w:tcMar>
+              <w:top w:type="dxa" w:w="70"/>
+              <w:left w:type="dxa" w:w="110"/>
+              <w:bottom w:type="dxa" w:w="70"/>
+              <w:right w:type="dxa" w:w="110"/>
+            </w:tcMar>
+            <w:vAlign w:val="center"/>
+          </w:tcPr>
+          <w:p>
+            <w:pPr>
+              <w:spacing w:after="0" w:before="0"/>
+              <w:rPr>
+                <w:sz w:val="19"/>
+                <w:szCs w:val="19"/>
+              </w:rPr>
+            </w:pPr>
+            <w:r>
+              <w:rPr>
+                <w:b/>
+                <w:bCs/>
+                <w:sz w:val="19"/>
+                <w:szCs w:val="19"/>
+              </w:rPr>
+              <w:t xml:space="preserve">Oui, publier le tome</w:t>
+            </w:r>
+          </w:p>
+        </w:tc>
+        <w:tc>
+          <w:tcPr>
+            <w:tcW w:type="dxa" w:w="4776"/>
+            <w:tcBorders>
+              <w:top w:val="single" w:color="CFC6DE" w:sz="4"/>
+              <w:left w:val="single" w:color="CFC6DE" w:sz="4"/>
+              <w:bottom w:val="single" w:color="CFC6DE" w:sz="4"/>
+              <w:right w:val="single" w:color="CFC6DE" w:sz="4"/>
+            </w:tcBorders>
+            <w:shd w:fill="F6F3FA" w:color="auto" w:val="clear"/>
+            <w:tcMar>
+              <w:top w:type="dxa" w:w="70"/>
+              <w:left w:type="dxa" w:w="110"/>
+              <w:bottom w:type="dxa" w:w="70"/>
+              <w:right w:type="dxa" w:w="110"/>
+            </w:tcMar>
+            <w:vAlign w:val="center"/>
+          </w:tcPr>
+          <w:p>
+            <w:pPr>
+              <w:spacing w:after="0" w:before="0"/>
+              <w:rPr>
+                <w:sz w:val="19"/>
+                <w:szCs w:val="19"/>
+              </w:rPr>
+            </w:pPr>
+            <w:r>
+              <w:rPr>
+                <w:sz w:val="19"/>
+                <w:szCs w:val="19"/>
+              </w:rPr>
+              <w:t xml:space="preserve">Le tome et ses chapitres prêts sont publiés. Annonce seulement si vous avez coché la case d'annonce.</w:t>
+            </w:r>
+          </w:p>
+        </w:tc>
+      </w:tr>
+      <w:tr>
+        <w:trPr>
+          <w:cantSplit/>
+          <w:tblHeader w:val="off"/>
+        </w:trPr>
+        <w:tc>
+          <w:tcPr>
+            <w:tcW w:type="dxa" w:w="1716"/>
+            <w:tcBorders>
+              <w:top w:val="single" w:color="CFC6DE" w:sz="4"/>
+              <w:left w:val="single" w:color="CFC6DE" w:sz="4"/>
+              <w:bottom w:val="single" w:color="CFC6DE" w:sz="4"/>
+              <w:right w:val="single" w:color="CFC6DE" w:sz="4"/>
+            </w:tcBorders>
+            <w:tcMar>
+              <w:top w:type="dxa" w:w="70"/>
+              <w:left w:type="dxa" w:w="110"/>
+              <w:bottom w:type="dxa" w:w="70"/>
+              <w:right w:type="dxa" w:w="110"/>
+            </w:tcMar>
+            <w:vAlign w:val="center"/>
+          </w:tcPr>
+          <w:p>
+            <w:pPr>
+              <w:spacing w:after="0" w:before="0"/>
+              <w:rPr>
+                <w:sz w:val="19"/>
+                <w:szCs w:val="19"/>
+              </w:rPr>
+            </w:pPr>
+            <w:r>
+              <w:rPr>
+                <w:b/>
+                <w:bCs/>
+                <w:sz w:val="19"/>
+                <w:szCs w:val="19"/>
+              </w:rPr>
+              <w:t xml:space="preserve">En cours de publication → Publié</w:t>
+            </w:r>
+          </w:p>
+        </w:tc>
+        <w:tc>
+          <w:tcPr>
+            <w:tcW w:type="dxa" w:w="2534"/>
+            <w:tcBorders>
+              <w:top w:val="single" w:color="CFC6DE" w:sz="4"/>
+              <w:left w:val="single" w:color="CFC6DE" w:sz="4"/>
+              <w:bottom w:val="single" w:color="CFC6DE" w:sz="4"/>
+              <w:right w:val="single" w:color="CFC6DE" w:sz="4"/>
+            </w:tcBorders>
+            <w:tcMar>
+              <w:top w:type="dxa" w:w="70"/>
+              <w:left w:type="dxa" w:w="110"/>
+              <w:bottom w:type="dxa" w:w="70"/>
+              <w:right w:type="dxa" w:w="110"/>
+            </w:tcMar>
+            <w:vAlign w:val="center"/>
+          </w:tcPr>
+          <w:p>
+            <w:pPr>
+              <w:spacing w:after="0" w:before="0"/>
+              <w:rPr>
+                <w:sz w:val="19"/>
+                <w:szCs w:val="19"/>
+              </w:rPr>
+            </w:pPr>
+            <w:r>
+              <w:rPr>
+                <w:b/>
+                <w:bCs/>
+                <w:sz w:val="19"/>
+                <w:szCs w:val="19"/>
+              </w:rPr>
+              <w:t xml:space="preserve">Oui, passer à « Publié »</w:t>
+            </w:r>
+            <w:r>
+              <w:rPr>
+                <w:sz w:val="19"/>
+                <w:szCs w:val="19"/>
+              </w:rPr>
+              <w:t xml:space="preserve"> (demandé s'il manque des chapitres prévus)</w:t>
+            </w:r>
+          </w:p>
+        </w:tc>
+        <w:tc>
+          <w:tcPr>
+            <w:tcW w:type="dxa" w:w="4776"/>
+            <w:tcBorders>
+              <w:top w:val="single" w:color="CFC6DE" w:sz="4"/>
+              <w:left w:val="single" w:color="CFC6DE" w:sz="4"/>
+              <w:bottom w:val="single" w:color="CFC6DE" w:sz="4"/>
+              <w:right w:val="single" w:color="CFC6DE" w:sz="4"/>
+            </w:tcBorders>
+            <w:tcMar>
+              <w:top w:type="dxa" w:w="70"/>
+              <w:left w:type="dxa" w:w="110"/>
+              <w:bottom w:type="dxa" w:w="70"/>
+              <w:right w:type="dxa" w:w="110"/>
+            </w:tcMar>
+            <w:vAlign w:val="center"/>
+          </w:tcPr>
+          <w:p>
+            <w:pPr>
+              <w:spacing w:after="0" w:before="0"/>
+              <w:rPr>
+                <w:sz w:val="19"/>
+                <w:szCs w:val="19"/>
+              </w:rPr>
+            </w:pPr>
+            <w:r>
+              <w:rPr>
+                <w:sz w:val="19"/>
+                <w:szCs w:val="19"/>
+              </w:rPr>
+              <w:t xml:space="preserve">Les liens PDF et EPUB s'affichent, le planning passe à « Publié » (100 %). Annonce « Le tome est complet » seulement si la case est cochée.</w:t>
+            </w:r>
+          </w:p>
+        </w:tc>
+      </w:tr>
+      <w:tr>
+        <w:trPr>
+          <w:cantSplit/>
+          <w:tblHeader w:val="off"/>
+        </w:trPr>
+        <w:tc>
+          <w:tcPr>
+            <w:tcW w:type="dxa" w:w="1716"/>
+            <w:tcBorders>
+              <w:top w:val="single" w:color="CFC6DE" w:sz="4"/>
+              <w:left w:val="single" w:color="CFC6DE" w:sz="4"/>
+              <w:bottom w:val="single" w:color="CFC6DE" w:sz="4"/>
+              <w:right w:val="single" w:color="CFC6DE" w:sz="4"/>
+            </w:tcBorders>
+            <w:shd w:fill="F6F3FA" w:color="auto" w:val="clear"/>
+            <w:tcMar>
+              <w:top w:type="dxa" w:w="70"/>
+              <w:left w:type="dxa" w:w="110"/>
+              <w:bottom w:type="dxa" w:w="70"/>
+              <w:right w:type="dxa" w:w="110"/>
+            </w:tcMar>
+            <w:vAlign w:val="center"/>
+          </w:tcPr>
+          <w:p>
+            <w:pPr>
+              <w:spacing w:after="0" w:before="0"/>
+              <w:rPr>
+                <w:sz w:val="19"/>
+                <w:szCs w:val="19"/>
+              </w:rPr>
+            </w:pPr>
+            <w:r>
+              <w:rPr>
+                <w:b/>
+                <w:bCs/>
+                <w:sz w:val="19"/>
+                <w:szCs w:val="19"/>
+              </w:rPr>
+              <w:t xml:space="preserve">Publié → En cours de publication</w:t>
+            </w:r>
+          </w:p>
+        </w:tc>
+        <w:tc>
+          <w:tcPr>
+            <w:tcW w:type="dxa" w:w="2534"/>
+            <w:tcBorders>
+              <w:top w:val="single" w:color="CFC6DE" w:sz="4"/>
+              <w:left w:val="single" w:color="CFC6DE" w:sz="4"/>
+              <w:bottom w:val="single" w:color="CFC6DE" w:sz="4"/>
+              <w:right w:val="single" w:color="CFC6DE" w:sz="4"/>
+            </w:tcBorders>
+            <w:shd w:fill="F6F3FA" w:color="auto" w:val="clear"/>
+            <w:tcMar>
+              <w:top w:type="dxa" w:w="70"/>
+              <w:left w:type="dxa" w:w="110"/>
+              <w:bottom w:type="dxa" w:w="70"/>
+              <w:right w:type="dxa" w:w="110"/>
+            </w:tcMar>
+            <w:vAlign w:val="center"/>
+          </w:tcPr>
+          <w:p>
+            <w:pPr>
+              <w:spacing w:after="0" w:before="0"/>
+              <w:rPr>
+                <w:sz w:val="19"/>
+                <w:szCs w:val="19"/>
+              </w:rPr>
+            </w:pPr>
+            <w:r>
+              <w:rPr>
+                <w:b/>
+                <w:bCs/>
+                <w:sz w:val="19"/>
+                <w:szCs w:val="19"/>
+              </w:rPr>
+              <w:t xml:space="preserve">Oui, rouvrir le tome</w:t>
+            </w:r>
+          </w:p>
+        </w:tc>
+        <w:tc>
+          <w:tcPr>
+            <w:tcW w:type="dxa" w:w="4776"/>
+            <w:tcBorders>
+              <w:top w:val="single" w:color="CFC6DE" w:sz="4"/>
+              <w:left w:val="single" w:color="CFC6DE" w:sz="4"/>
+              <w:bottom w:val="single" w:color="CFC6DE" w:sz="4"/>
+              <w:right w:val="single" w:color="CFC6DE" w:sz="4"/>
+            </w:tcBorders>
+            <w:shd w:fill="F6F3FA" w:color="auto" w:val="clear"/>
+            <w:tcMar>
+              <w:top w:type="dxa" w:w="70"/>
+              <w:left w:type="dxa" w:w="110"/>
+              <w:bottom w:type="dxa" w:w="70"/>
+              <w:right w:type="dxa" w:w="110"/>
+            </w:tcMar>
+            <w:vAlign w:val="center"/>
+          </w:tcPr>
+          <w:p>
+            <w:pPr>
+              <w:spacing w:after="0" w:before="0"/>
+              <w:rPr>
+                <w:sz w:val="19"/>
+                <w:szCs w:val="19"/>
+              </w:rPr>
+            </w:pPr>
+            <w:r>
+              <w:rPr>
+                <w:sz w:val="19"/>
+                <w:szCs w:val="19"/>
+              </w:rPr>
+              <w:t xml:space="preserve">Le tome est rouvert. Les liens PDF et EPUB sont gardés mais masqués aux lecteurs. Le planning revient à l'étape « Édition ».</w:t>
+            </w:r>
+          </w:p>
+        </w:tc>
+      </w:tr>
+      <w:tr>
+        <w:trPr>
+          <w:cantSplit/>
+          <w:tblHeader w:val="off"/>
+        </w:trPr>
+        <w:tc>
+          <w:tcPr>
+            <w:tcW w:type="dxa" w:w="1716"/>
+            <w:tcBorders>
+              <w:top w:val="single" w:color="CFC6DE" w:sz="4"/>
+              <w:left w:val="single" w:color="CFC6DE" w:sz="4"/>
+              <w:bottom w:val="single" w:color="CFC6DE" w:sz="4"/>
+              <w:right w:val="single" w:color="CFC6DE" w:sz="4"/>
+            </w:tcBorders>
+            <w:tcMar>
+              <w:top w:type="dxa" w:w="70"/>
+              <w:left w:type="dxa" w:w="110"/>
+              <w:bottom w:type="dxa" w:w="70"/>
+              <w:right w:type="dxa" w:w="110"/>
+            </w:tcMar>
+            <w:vAlign w:val="center"/>
+          </w:tcPr>
+          <w:p>
+            <w:pPr>
+              <w:spacing w:after="0" w:before="0"/>
+              <w:rPr>
+                <w:sz w:val="19"/>
+                <w:szCs w:val="19"/>
+              </w:rPr>
+            </w:pPr>
+            <w:r>
+              <w:rPr>
+                <w:b/>
+                <w:bCs/>
+                <w:sz w:val="19"/>
+                <w:szCs w:val="19"/>
+              </w:rPr>
+              <w:t xml:space="preserve">En cours de publication → Planifié</w:t>
+            </w:r>
+          </w:p>
+        </w:tc>
+        <w:tc>
+          <w:tcPr>
+            <w:tcW w:type="dxa" w:w="2534"/>
+            <w:tcBorders>
+              <w:top w:val="single" w:color="CFC6DE" w:sz="4"/>
+              <w:left w:val="single" w:color="CFC6DE" w:sz="4"/>
+              <w:bottom w:val="single" w:color="CFC6DE" w:sz="4"/>
+              <w:right w:val="single" w:color="CFC6DE" w:sz="4"/>
+            </w:tcBorders>
+            <w:tcMar>
+              <w:top w:type="dxa" w:w="70"/>
+              <w:left w:type="dxa" w:w="110"/>
+              <w:bottom w:type="dxa" w:w="70"/>
+              <w:right w:type="dxa" w:w="110"/>
+            </w:tcMar>
+            <w:vAlign w:val="center"/>
+          </w:tcPr>
+          <w:p>
+            <w:pPr>
+              <w:spacing w:after="0" w:before="0"/>
+              <w:rPr>
+                <w:sz w:val="19"/>
+                <w:szCs w:val="19"/>
+              </w:rPr>
+            </w:pPr>
+            <w:r>
+              <w:rPr>
+                <w:b/>
+                <w:bCs/>
+                <w:sz w:val="19"/>
+                <w:szCs w:val="19"/>
+              </w:rPr>
+              <w:t xml:space="preserve">Oui, retirer de la lecture</w:t>
+            </w:r>
+          </w:p>
+        </w:tc>
+        <w:tc>
+          <w:tcPr>
+            <w:tcW w:type="dxa" w:w="4776"/>
+            <w:tcBorders>
+              <w:top w:val="single" w:color="CFC6DE" w:sz="4"/>
+              <w:left w:val="single" w:color="CFC6DE" w:sz="4"/>
+              <w:bottom w:val="single" w:color="CFC6DE" w:sz="4"/>
+              <w:right w:val="single" w:color="CFC6DE" w:sz="4"/>
+            </w:tcBorders>
+            <w:tcMar>
+              <w:top w:type="dxa" w:w="70"/>
+              <w:left w:type="dxa" w:w="110"/>
+              <w:bottom w:type="dxa" w:w="70"/>
+              <w:right w:type="dxa" w:w="110"/>
+            </w:tcMar>
+            <w:vAlign w:val="center"/>
+          </w:tcPr>
+          <w:p>
+            <w:pPr>
+              <w:spacing w:after="0" w:before="0"/>
+              <w:rPr>
+                <w:sz w:val="19"/>
+                <w:szCs w:val="19"/>
+              </w:rPr>
+            </w:pPr>
+            <w:r>
+              <w:rPr>
+                <w:sz w:val="19"/>
+                <w:szCs w:val="19"/>
+              </w:rPr>
+              <w:t xml:space="preserve">Les chapitres en ligne et programmés repassent en brouillon, le tome aussi, l'annonce est dépubliée et les notifications pas encore parties sont annulées. Le tome redevient « à paraître ».</w:t>
+            </w:r>
+          </w:p>
+        </w:tc>
+      </w:tr>
+      <w:tr>
+        <w:trPr>
+          <w:cantSplit/>
+          <w:tblHeader w:val="off"/>
+        </w:trPr>
+        <w:tc>
+          <w:tcPr>
+            <w:tcW w:type="dxa" w:w="1716"/>
+            <w:tcBorders>
+              <w:top w:val="single" w:color="CFC6DE" w:sz="4"/>
+              <w:left w:val="single" w:color="CFC6DE" w:sz="4"/>
+              <w:bottom w:val="single" w:color="CFC6DE" w:sz="4"/>
+              <w:right w:val="single" w:color="CFC6DE" w:sz="4"/>
+            </w:tcBorders>
+            <w:shd w:fill="F6F3FA" w:color="auto" w:val="clear"/>
+            <w:tcMar>
+              <w:top w:type="dxa" w:w="70"/>
+              <w:left w:type="dxa" w:w="110"/>
+              <w:bottom w:type="dxa" w:w="70"/>
+              <w:right w:type="dxa" w:w="110"/>
+            </w:tcMar>
+            <w:vAlign w:val="center"/>
+          </w:tcPr>
+          <w:p>
+            <w:pPr>
+              <w:spacing w:after="0" w:before="0"/>
+              <w:rPr>
+                <w:sz w:val="19"/>
+                <w:szCs w:val="19"/>
+              </w:rPr>
+            </w:pPr>
+            <w:r>
+              <w:rPr>
+                <w:b/>
+                <w:bCs/>
+                <w:sz w:val="19"/>
+                <w:szCs w:val="19"/>
+              </w:rPr>
+              <w:t xml:space="preserve">Publié → Planifié</w:t>
+            </w:r>
+          </w:p>
+        </w:tc>
+        <w:tc>
+          <w:tcPr>
+            <w:tcW w:type="dxa" w:w="2534"/>
+            <w:tcBorders>
+              <w:top w:val="single" w:color="CFC6DE" w:sz="4"/>
+              <w:left w:val="single" w:color="CFC6DE" w:sz="4"/>
+              <w:bottom w:val="single" w:color="CFC6DE" w:sz="4"/>
+              <w:right w:val="single" w:color="CFC6DE" w:sz="4"/>
+            </w:tcBorders>
+            <w:shd w:fill="F6F3FA" w:color="auto" w:val="clear"/>
+            <w:tcMar>
+              <w:top w:type="dxa" w:w="70"/>
+              <w:left w:type="dxa" w:w="110"/>
+              <w:bottom w:type="dxa" w:w="70"/>
+              <w:right w:type="dxa" w:w="110"/>
+            </w:tcMar>
+            <w:vAlign w:val="center"/>
+          </w:tcPr>
+          <w:p>
+            <w:pPr>
+              <w:spacing w:after="0" w:before="0"/>
+              <w:rPr>
+                <w:sz w:val="19"/>
+                <w:szCs w:val="19"/>
+              </w:rPr>
+            </w:pPr>
+            <w:r>
+              <w:rPr>
+                <w:sz w:val="19"/>
+                <w:szCs w:val="19"/>
+              </w:rPr>
+              <w:t xml:space="preserve">cocher </w:t>
+            </w:r>
+            <w:r>
+              <w:rPr>
+                <w:b/>
+                <w:bCs/>
+                <w:sz w:val="19"/>
+                <w:szCs w:val="19"/>
+              </w:rPr>
+              <w:t xml:space="preserve">Je comprends que le tome entier ne sera plus lisible</w:t>
+            </w:r>
+            <w:r>
+              <w:rPr>
+                <w:sz w:val="19"/>
+                <w:szCs w:val="19"/>
+              </w:rPr>
+              <w:t xml:space="preserve">, puis </w:t>
+            </w:r>
+            <w:r>
+              <w:rPr>
+                <w:b/>
+                <w:bCs/>
+                <w:sz w:val="19"/>
+                <w:szCs w:val="19"/>
+              </w:rPr>
+              <w:t xml:space="preserve">Oui, retirer le tome de la lecture</w:t>
+            </w:r>
+          </w:p>
+        </w:tc>
+        <w:tc>
+          <w:tcPr>
+            <w:tcW w:type="dxa" w:w="4776"/>
+            <w:tcBorders>
+              <w:top w:val="single" w:color="CFC6DE" w:sz="4"/>
+              <w:left w:val="single" w:color="CFC6DE" w:sz="4"/>
+              <w:bottom w:val="single" w:color="CFC6DE" w:sz="4"/>
+              <w:right w:val="single" w:color="CFC6DE" w:sz="4"/>
+            </w:tcBorders>
+            <w:shd w:fill="F6F3FA" w:color="auto" w:val="clear"/>
+            <w:tcMar>
+              <w:top w:type="dxa" w:w="70"/>
+              <w:left w:type="dxa" w:w="110"/>
+              <w:bottom w:type="dxa" w:w="70"/>
+              <w:right w:type="dxa" w:w="110"/>
+            </w:tcMar>
+            <w:vAlign w:val="center"/>
+          </w:tcPr>
+          <w:p>
+            <w:pPr>
+              <w:spacing w:after="0" w:before="0"/>
+              <w:rPr>
+                <w:sz w:val="19"/>
+                <w:szCs w:val="19"/>
+              </w:rPr>
+            </w:pPr>
+            <w:r>
+              <w:rPr>
+                <w:sz w:val="19"/>
+                <w:szCs w:val="19"/>
+              </w:rPr>
+              <w:t xml:space="preserve">Même retrait, pour le tome entier.</w:t>
+            </w:r>
+          </w:p>
+        </w:tc>
+      </w:tr>
+    </w:tbl>
+    <w:p>
+      <w:pPr>
+        <w:spacing w:after="60" w:before="0"/>
+      </w:pPr>
+    </w:p>
+    <w:tbl>
+      <w:tblPr>
+        <w:tblW w:type="dxa" w:w="9026"/>
+        <w:tblBorders>
+          <w:top w:val="single" w:color="auto" w:sz="4"/>
+          <w:left w:val="single" w:color="auto" w:sz="4"/>
+          <w:bottom w:val="single" w:color="auto" w:sz="4"/>
+          <w:right w:val="single" w:color="auto" w:sz="4"/>
+          <w:insideH w:val="single" w:color="auto" w:sz="4"/>
+          <w:insideV w:val="single" w:color="auto" w:sz="4"/>
+        </w:tblBorders>
+      </w:tblPr>
+      <w:tblGrid>
+        <w:gridCol w:w="9026"/>
+      </w:tblGrid>
+      <w:tr>
+        <w:trPr>
+          <w:cantSplit/>
+        </w:trPr>
+        <w:tc>
+          <w:tcPr>
+            <w:tcW w:type="dxa" w:w="9026"/>
+            <w:tcBorders>
+              <w:top w:val="none" w:color="FFFFFF" w:sz="0"/>
+              <w:left w:val="single" w:color="D9822B" w:sz="24"/>
+              <w:bottom w:val="none" w:color="FFFFFF" w:sz="0"/>
+              <w:right w:val="none" w:color="FFFFFF" w:sz="0"/>
+            </w:tcBorders>
+            <w:shd w:fill="FDF1E4" w:color="auto" w:val="clear"/>
+            <w:tcMar>
+              <w:top w:type="dxa" w:w="120"/>
+              <w:left w:type="dxa" w:w="200"/>
+              <w:bottom w:type="dxa" w:w="120"/>
+              <w:right w:type="dxa" w:w="160"/>
+            </w:tcMar>
+          </w:tcPr>
+          <w:p>
+            <w:pPr>
+              <w:spacing w:after="0" w:before="0"/>
+            </w:pPr>
+            <w:r>
+              <w:rPr>
+                <w:b/>
+                <w:bCs/>
+                <w:color w:val="9A4D0C"/>
+              </w:rPr>
+              <w:t xml:space="preserve">Attention</w:t>
+            </w:r>
+            <w:r>
+              <w:t xml:space="preserve"> : </w:t>
+            </w:r>
+            <w:r>
+              <w:t xml:space="preserve">le retour </w:t>
+            </w:r>
+            <w:r>
+              <w:rPr>
+                <w:b/>
+                <w:bCs/>
+              </w:rPr>
+              <w:t xml:space="preserve">En cours de publication → Planifié</w:t>
+            </w:r>
+            <w:r>
+              <w:t xml:space="preserve"> retire les chapitres que les lecteurs pouvaient lire. Il sert à réparer une publication faite par erreur. Pour arrêter un tome sans rien retirer, mettez-le plutôt en pause (voir « Mettre un tome en pause »).</w:t>
+            </w:r>
+          </w:p>
+        </w:tc>
+      </w:tr>
+    </w:tbl>
+    <w:p>
+      <w:pPr>
+        <w:pStyle w:val="Heading2"/>
+      </w:pPr>
+      <w:bookmarkStart w:name="titre-54" w:id="120"/>
+      <w:r>
+        <w:t xml:space="preserve">10.4 J'ai publié au lieu de programmer : comment réparer</w:t>
+      </w:r>
+      <w:bookmarkEnd w:id="120"/>
+    </w:p>
+    <w:p>
+      <w:r>
+        <w:t xml:space="preserve">Exemple : vous vouliez programmer le prologue pour samedi, mais vous avez cliqué sur </w:t>
+      </w:r>
+      <w:r>
+        <w:rPr>
+          <w:b/>
+          <w:bCs/>
+        </w:rPr>
+        <w:t xml:space="preserve">Maintenant</w:t>
+      </w:r>
+      <w:r>
+        <w:t xml:space="preserve">. Le tome est passé « En cours » et l'annonce est partie.</w:t>
+      </w:r>
+    </w:p>
+    <w:p>
+      <w:pPr>
+        <w:pStyle w:val="ListParagraph"/>
+        <w:numPr>
+          <w:ilvl w:val="0"/>
+          <w:numId w:val="26"/>
+        </w:numPr>
+        <w:spacing w:after="60" w:before="40"/>
+      </w:pPr>
+      <w:r>
+        <w:rPr>
+          <w:b/>
+          <w:bCs/>
+        </w:rPr>
+        <w:t xml:space="preserve">Tous les tomes</w:t>
+      </w:r>
+      <w:r>
+        <w:t xml:space="preserve">, puis </w:t>
+      </w:r>
+      <w:r>
+        <w:rPr>
+          <w:b/>
+          <w:bCs/>
+        </w:rPr>
+        <w:t xml:space="preserve">Modifier</w:t>
+      </w:r>
+      <w:r>
+        <w:t xml:space="preserve"> sur la ligne du tome.</w:t>
+      </w:r>
+    </w:p>
+    <w:p>
+      <w:pPr>
+        <w:pStyle w:val="ListParagraph"/>
+        <w:numPr>
+          <w:ilvl w:val="0"/>
+          <w:numId w:val="26"/>
+        </w:numPr>
+        <w:spacing w:after="60" w:before="40"/>
+      </w:pPr>
+      <w:r>
+        <w:t xml:space="preserve">Dans </w:t>
+      </w:r>
+      <w:r>
+        <w:rPr>
+          <w:b/>
+          <w:bCs/>
+        </w:rPr>
+        <w:t xml:space="preserve">État du tome</w:t>
+      </w:r>
+      <w:r>
+        <w:t xml:space="preserve">, choisissez </w:t>
+      </w:r>
+      <w:r>
+        <w:rPr>
+          <w:b/>
+          <w:bCs/>
+        </w:rPr>
+        <w:t xml:space="preserve">Planifié</w:t>
+      </w:r>
+      <w:r>
+        <w:t xml:space="preserve">.</w:t>
+      </w:r>
+    </w:p>
+    <w:p>
+      <w:pPr>
+        <w:pStyle w:val="ListParagraph"/>
+        <w:numPr>
+          <w:ilvl w:val="0"/>
+          <w:numId w:val="26"/>
+        </w:numPr>
+        <w:spacing w:after="60" w:before="40"/>
+      </w:pPr>
+      <w:r>
+        <w:t xml:space="preserve">Cliquez sur </w:t>
+      </w:r>
+      <w:r>
+        <w:rPr>
+          <w:b/>
+          <w:bCs/>
+        </w:rPr>
+        <w:t xml:space="preserve">Enregistrer</w:t>
+      </w:r>
+      <w:r>
+        <w:t xml:space="preserve">, puis confirmez avec </w:t>
+      </w:r>
+      <w:r>
+        <w:rPr>
+          <w:b/>
+          <w:bCs/>
+        </w:rPr>
+        <w:t xml:space="preserve">Oui, retirer de la lecture</w:t>
+      </w:r>
+      <w:r>
+        <w:t xml:space="preserve">. Le prologue n'est plus lisible, l'annonce est dépubliée et le tome redevient « à paraître ».</w:t>
+      </w:r>
+    </w:p>
+    <w:p>
+      <w:pPr>
+        <w:pStyle w:val="ListParagraph"/>
+        <w:numPr>
+          <w:ilvl w:val="0"/>
+          <w:numId w:val="26"/>
+        </w:numPr>
+        <w:spacing w:after="60" w:before="40"/>
+      </w:pPr>
+      <w:r>
+        <w:t xml:space="preserve">Ouvrez </w:t>
+      </w:r>
+      <w:r>
+        <w:rPr>
+          <w:b/>
+          <w:bCs/>
+        </w:rPr>
+        <w:t xml:space="preserve">Ajouter des chapitres</w:t>
+      </w:r>
+      <w:r>
+        <w:t xml:space="preserve">, choisissez le tome et déposez de nouveau le fichier : le prologue apparaît </w:t>
+      </w:r>
+      <w:r>
+        <w:rPr>
+          <w:b/>
+          <w:bCs/>
+        </w:rPr>
+        <w:t xml:space="preserve">Brouillon</w:t>
+      </w:r>
+      <w:r>
+        <w:t xml:space="preserve">.</w:t>
+      </w:r>
+    </w:p>
+    <w:p>
+      <w:pPr>
+        <w:pStyle w:val="ListParagraph"/>
+        <w:numPr>
+          <w:ilvl w:val="0"/>
+          <w:numId w:val="26"/>
+        </w:numPr>
+        <w:spacing w:after="60" w:before="40"/>
+      </w:pPr>
+      <w:r>
+        <w:t xml:space="preserve">Choisissez </w:t>
+      </w:r>
+      <w:r>
+        <w:rPr>
+          <w:b/>
+          <w:bCs/>
+        </w:rPr>
+        <w:t xml:space="preserve">À une date</w:t>
+      </w:r>
+      <w:r>
+        <w:t xml:space="preserve">, indiquez samedi 18 h, puis cliquez sur </w:t>
+      </w:r>
+      <w:r>
+        <w:rPr>
+          <w:b/>
+          <w:bCs/>
+        </w:rPr>
+        <w:t xml:space="preserve">Programmer 1 chapitre</w:t>
+      </w:r>
+      <w:r>
+        <w:t xml:space="preserve"> et confirmez. Le prologue sortira samedi, avec son annonce.</w:t>
+      </w:r>
+    </w:p>
+    <w:p>
+      <w:pPr>
+        <w:pStyle w:val="ListParagraph"/>
+        <w:numPr>
+          <w:ilvl w:val="0"/>
+          <w:numId w:val="26"/>
+        </w:numPr>
+        <w:spacing w:after="60" w:before="40"/>
+      </w:pPr>
+      <w:r>
+        <w:t xml:space="preserve">Prévenez l'équipe sur Discord : le message Discord et les e-mails déjà partis ne peuvent pas être repris. L'article d'annonce, lui, a été dépublié et reviendra à la vraie sortie.</w:t>
+      </w:r>
+    </w:p>
+    <w:tbl>
+      <w:tblPr>
+        <w:tblW w:type="dxa" w:w="9026"/>
+        <w:tblBorders>
+          <w:top w:val="single" w:color="auto" w:sz="4"/>
+          <w:left w:val="single" w:color="auto" w:sz="4"/>
+          <w:bottom w:val="single" w:color="auto" w:sz="4"/>
+          <w:right w:val="single" w:color="auto" w:sz="4"/>
+          <w:insideH w:val="single" w:color="auto" w:sz="4"/>
+          <w:insideV w:val="single" w:color="auto" w:sz="4"/>
+        </w:tblBorders>
+      </w:tblPr>
+      <w:tblGrid>
+        <w:gridCol w:w="9026"/>
+      </w:tblGrid>
+      <w:tr>
+        <w:trPr>
+          <w:cantSplit/>
+        </w:trPr>
+        <w:tc>
+          <w:tcPr>
+            <w:tcW w:type="dxa" w:w="9026"/>
+            <w:tcBorders>
+              <w:top w:val="none" w:color="FFFFFF" w:sz="0"/>
+              <w:left w:val="single" w:color="2E9E6A" w:sz="24"/>
+              <w:bottom w:val="none" w:color="FFFFFF" w:sz="0"/>
+              <w:right w:val="none" w:color="FFFFFF" w:sz="0"/>
+            </w:tcBorders>
+            <w:shd w:fill="E9F7EF" w:color="auto" w:val="clear"/>
+            <w:tcMar>
+              <w:top w:type="dxa" w:w="120"/>
+              <w:left w:type="dxa" w:w="200"/>
+              <w:bottom w:type="dxa" w:w="120"/>
+              <w:right w:type="dxa" w:w="160"/>
+            </w:tcMar>
+          </w:tcPr>
+          <w:p>
+            <w:pPr>
+              <w:spacing w:after="0" w:before="0"/>
+            </w:pPr>
+            <w:r>
+              <w:rPr>
+                <w:b/>
+                <w:bCs/>
+                <w:color w:val="1E6B47"/>
+              </w:rPr>
+              <w:t xml:space="preserve">Astuce</w:t>
+            </w:r>
+            <w:r>
+              <w:t xml:space="preserve"> : </w:t>
+            </w:r>
+            <w:r>
+              <w:t xml:space="preserve">si un seul chapitre est sorti trop tôt dans un tome déjà en cours, pas besoin de changer l'état du tome. Utilisez </w:t>
+            </w:r>
+            <w:r>
+              <w:rPr>
+                <w:b/>
+                <w:bCs/>
+              </w:rPr>
+              <w:t xml:space="preserve">Retirer</w:t>
+            </w:r>
+            <w:r>
+              <w:t xml:space="preserve"> sur la ligne du chapitre, puis </w:t>
+            </w:r>
+            <w:r>
+              <w:rPr>
+                <w:b/>
+                <w:bCs/>
+              </w:rPr>
+              <w:t xml:space="preserve">Changer la date</w:t>
+            </w:r>
+            <w:r>
+              <w:t xml:space="preserve"> (voir « Publier, reprogrammer ou retirer un chapitre »).</w:t>
+            </w:r>
+          </w:p>
+        </w:tc>
+      </w:tr>
+    </w:tbl>
+    <w:p>
+      <w:pPr>
+        <w:pStyle w:val="Heading2"/>
+      </w:pPr>
+      <w:bookmarkStart w:name="titre-55" w:id="121"/>
+      <w:r>
+        <w:t xml:space="preserve">10.5 Changer l'état d'une œuvre</w:t>
+      </w:r>
+      <w:bookmarkEnd w:id="121"/>
+    </w:p>
+    <w:p>
+      <w:r>
+        <w:t xml:space="preserve">L'état d'une œuvre se change directement dans la liste </w:t>
+      </w:r>
+      <w:r>
+        <w:rPr>
+          <w:b/>
+          <w:bCs/>
+        </w:rPr>
+        <w:t xml:space="preserve">Œuvres</w:t>
+      </w:r>
+      <w:r>
+        <w:t xml:space="preserve">, sans ouvrir sa fiche. Il s'affiche sur la bibliothèque, sur la fiche de l'œuvre et dans ses filtres. L'état de chaque tome est rappelé à côté.</w:t>
+      </w:r>
+    </w:p>
+    <w:p>
+      <w:pPr>
+        <w:keepNext/>
+        <w:spacing w:after="60" w:before="160"/>
+        <w:jc w:val="center"/>
+      </w:pPr>
+      <w:r>
+        <w:drawing>
+          <wp:inline distT="0" distB="0" distL="0" distR="0">
+            <wp:extent cx="5715000" cy="4581525"/>
+            <wp:effectExtent t="0" r="0" b="0" l="0"/>
+            <wp:docPr id="34" name="EtatOeuvre-contenu.png" descr="La liste « Œuvres » avec l'état de chaque œuvre et de ses tomes." title="La liste « Œuvres » avec l'état de chaque œuvre et de ses tomes."/>
             <wp:cNvGraphicFramePr>
               <a:graphicFrameLocks xmlns:a="http://schemas.openxmlformats.org/drawingml/2006/main" noChangeAspect="1"/>
             </wp:cNvGraphicFramePr>
@@ -13749,7 +15237,7 @@
                   <pic:spPr bwMode="auto">
                     <a:xfrm>
                       <a:off x="0" y="0"/>
-                      <a:ext cx="5715000" cy="1333500"/>
+                      <a:ext cx="5715000" cy="4581525"/>
                     </a:xfrm>
                     <a:prstGeom prst="rect">
                       <a:avLst/>
@@ -13771,10 +15259,157 @@
           <w:b/>
           <w:bCs/>
         </w:rPr>
-        <w:t xml:space="preserve">Figure 15 — </w:t>
-      </w:r>
-      <w:r>
-        <w:t xml:space="preserve">Les confirmations demandées avant un changement qui touche les lecteurs.</w:t>
+        <w:t xml:space="preserve">Figure 16 — </w:t>
+      </w:r>
+      <w:r>
+        <w:t xml:space="preserve">La liste « Œuvres » avec l'état de chaque œuvre et de ses tomes.</w:t>
+      </w:r>
+    </w:p>
+    <w:p>
+      <w:pPr>
+        <w:pStyle w:val="ListParagraph"/>
+        <w:numPr>
+          <w:ilvl w:val="0"/>
+          <w:numId w:val="27"/>
+        </w:numPr>
+        <w:spacing w:after="60" w:before="40"/>
+      </w:pPr>
+      <w:r>
+        <w:t xml:space="preserve">Dans le menu, ouvrez </w:t>
+      </w:r>
+      <w:r>
+        <w:rPr>
+          <w:b/>
+          <w:bCs/>
+        </w:rPr>
+        <w:t xml:space="preserve">Catalogue</w:t>
+      </w:r>
+      <w:r>
+        <w:t xml:space="preserve">, puis </w:t>
+      </w:r>
+      <w:r>
+        <w:rPr>
+          <w:b/>
+          <w:bCs/>
+        </w:rPr>
+        <w:t xml:space="preserve">Œuvres</w:t>
+      </w:r>
+      <w:r>
+        <w:t xml:space="preserve">.</w:t>
+      </w:r>
+    </w:p>
+    <w:p>
+      <w:pPr>
+        <w:pStyle w:val="ListParagraph"/>
+        <w:numPr>
+          <w:ilvl w:val="0"/>
+          <w:numId w:val="27"/>
+        </w:numPr>
+        <w:spacing w:after="60" w:before="40"/>
+      </w:pPr>
+      <w:r>
+        <w:t xml:space="preserve">Pour retrouver une œuvre, filtrez par </w:t>
+      </w:r>
+      <w:r>
+        <w:rPr>
+          <w:b/>
+          <w:bCs/>
+        </w:rPr>
+        <w:t xml:space="preserve">État</w:t>
+      </w:r>
+      <w:r>
+        <w:t xml:space="preserve">, par type, ou tapez une partie du titre.</w:t>
+      </w:r>
+    </w:p>
+    <w:p>
+      <w:pPr>
+        <w:pStyle w:val="ListParagraph"/>
+        <w:numPr>
+          <w:ilvl w:val="0"/>
+          <w:numId w:val="27"/>
+        </w:numPr>
+        <w:spacing w:after="60" w:before="40"/>
+      </w:pPr>
+      <w:r>
+        <w:t xml:space="preserve">Sur la ligne de l'œuvre, choisissez son nouvel état dans la liste </w:t>
+      </w:r>
+      <w:r>
+        <w:rPr>
+          <w:b/>
+          <w:bCs/>
+        </w:rPr>
+        <w:t xml:space="preserve">État de l'œuvre</w:t>
+      </w:r>
+      <w:r>
+        <w:t xml:space="preserve">.</w:t>
+      </w:r>
+    </w:p>
+    <w:p>
+      <w:pPr>
+        <w:pStyle w:val="ListParagraph"/>
+        <w:numPr>
+          <w:ilvl w:val="0"/>
+          <w:numId w:val="27"/>
+        </w:numPr>
+        <w:spacing w:after="60" w:before="40"/>
+      </w:pPr>
+      <w:r>
+        <w:t xml:space="preserve">Cliquez sur </w:t>
+      </w:r>
+      <w:r>
+        <w:rPr>
+          <w:b/>
+          <w:bCs/>
+        </w:rPr>
+        <w:t xml:space="preserve">Changer</w:t>
+      </w:r>
+      <w:r>
+        <w:t xml:space="preserve">. Pour entrer dans « Licenciée » ou en sortir, l'écran </w:t>
+      </w:r>
+      <w:r>
+        <w:rPr>
+          <w:b/>
+          <w:bCs/>
+        </w:rPr>
+        <w:t xml:space="preserve">Ce qui va changer</w:t>
+      </w:r>
+      <w:r>
+        <w:t xml:space="preserve"> s'ouvre : lisez-le, puis cliquez sur </w:t>
+      </w:r>
+      <w:r>
+        <w:rPr>
+          <w:b/>
+          <w:bCs/>
+        </w:rPr>
+        <w:t xml:space="preserve">Confirmer : passer à « … »</w:t>
+      </w:r>
+      <w:r>
+        <w:t xml:space="preserve">.</w:t>
+      </w:r>
+    </w:p>
+    <w:p>
+      <w:r>
+        <w:t xml:space="preserve">Vous pouvez aussi changer l'état dans la fiche de l'œuvre (</w:t>
+      </w:r>
+      <w:r>
+        <w:rPr>
+          <w:b/>
+          <w:bCs/>
+        </w:rPr>
+        <w:t xml:space="preserve">Modifier</w:t>
+      </w:r>
+      <w:r>
+        <w:t xml:space="preserve">, champ </w:t>
+      </w:r>
+      <w:r>
+        <w:rPr>
+          <w:b/>
+          <w:bCs/>
+        </w:rPr>
+        <w:t xml:space="preserve">État de l'œuvre</w:t>
+      </w:r>
+      <w:r>
+        <w:t xml:space="preserve">) : les mêmes confirmations s'appliquent.</w:t>
       </w:r>
     </w:p>
     <w:tbl>
@@ -13790,8 +15425,8 @@
         </w:tblBorders>
       </w:tblPr>
       <w:tblGrid>
-        <w:gridCol w:w="2605"/>
-        <w:gridCol w:w="6421"/>
+        <w:gridCol w:w="1635"/>
+        <w:gridCol w:w="7391"/>
       </w:tblGrid>
       <w:tr>
         <w:trPr>
@@ -13800,7 +15435,7 @@
         </w:trPr>
         <w:tc>
           <w:tcPr>
-            <w:tcW w:type="dxa" w:w="2605"/>
+            <w:tcW w:type="dxa" w:w="1635"/>
             <w:tcBorders>
               <w:top w:val="single" w:color="CFC6DE" w:sz="4"/>
               <w:left w:val="single" w:color="CFC6DE" w:sz="4"/>
@@ -13835,13 +15470,13 @@
                 <w:sz w:val="19"/>
                 <w:szCs w:val="19"/>
               </w:rPr>
-              <w:t xml:space="preserve">Changement</w:t>
-            </w:r>
-          </w:p>
-        </w:tc>
-        <w:tc>
-          <w:tcPr>
-            <w:tcW w:type="dxa" w:w="6421"/>
+              <w:t xml:space="preserve">État de l'œuvre</w:t>
+            </w:r>
+          </w:p>
+        </w:tc>
+        <w:tc>
+          <w:tcPr>
+            <w:tcW w:type="dxa" w:w="7391"/>
             <w:tcBorders>
               <w:top w:val="single" w:color="CFC6DE" w:sz="4"/>
               <w:left w:val="single" w:color="CFC6DE" w:sz="4"/>
@@ -13876,7 +15511,7 @@
                 <w:sz w:val="19"/>
                 <w:szCs w:val="19"/>
               </w:rPr>
-              <w:t xml:space="preserve">Ce qui se passe</w:t>
+              <w:t xml:space="preserve">Ce que fait le site</w:t>
             </w:r>
           </w:p>
         </w:tc>
@@ -13888,7 +15523,7 @@
         </w:trPr>
         <w:tc>
           <w:tcPr>
-            <w:tcW w:type="dxa" w:w="2605"/>
+            <w:tcW w:type="dxa" w:w="1635"/>
             <w:tcBorders>
               <w:top w:val="single" w:color="CFC6DE" w:sz="4"/>
               <w:left w:val="single" w:color="CFC6DE" w:sz="4"/>
@@ -13918,13 +15553,13 @@
                 <w:sz w:val="19"/>
                 <w:szCs w:val="19"/>
               </w:rPr>
-              <w:t xml:space="preserve">Planifié → En cours de publication</w:t>
-            </w:r>
-          </w:p>
-        </w:tc>
-        <w:tc>
-          <w:tcPr>
-            <w:tcW w:type="dxa" w:w="6421"/>
+              <w:t xml:space="preserve">En cours de publication</w:t>
+            </w:r>
+          </w:p>
+        </w:tc>
+        <w:tc>
+          <w:tcPr>
+            <w:tcW w:type="dxa" w:w="7391"/>
             <w:tcBorders>
               <w:top w:val="single" w:color="CFC6DE" w:sz="4"/>
               <w:left w:val="single" w:color="CFC6DE" w:sz="4"/>
@@ -13952,23 +15587,7 @@
                 <w:sz w:val="19"/>
                 <w:szCs w:val="19"/>
               </w:rPr>
-              <w:t xml:space="preserve">Rien ne change tant qu'aucun chapitre n'est en ligne. Le site propose d'</w:t>
-            </w:r>
-            <w:r>
-              <w:rPr>
-                <w:b/>
-                <w:bCs/>
-                <w:sz w:val="19"/>
-                <w:szCs w:val="19"/>
-              </w:rPr>
-              <w:t xml:space="preserve">Ajouter des chapitres</w:t>
-            </w:r>
-            <w:r>
-              <w:rPr>
-                <w:sz w:val="19"/>
-                <w:szCs w:val="19"/>
-              </w:rPr>
-              <w:t xml:space="preserve">.</w:t>
+              <w:t xml:space="preserve">L'équipe traduit et publie. Les lecteurs voient « Traduction en cours ».</w:t>
             </w:r>
           </w:p>
         </w:tc>
@@ -13980,7 +15599,7 @@
         </w:trPr>
         <w:tc>
           <w:tcPr>
-            <w:tcW w:type="dxa" w:w="2605"/>
+            <w:tcW w:type="dxa" w:w="1635"/>
             <w:tcBorders>
               <w:top w:val="single" w:color="CFC6DE" w:sz="4"/>
               <w:left w:val="single" w:color="CFC6DE" w:sz="4"/>
@@ -14011,13 +15630,13 @@
                 <w:sz w:val="19"/>
                 <w:szCs w:val="19"/>
               </w:rPr>
-              <w:t xml:space="preserve">En cours de publication → Publié</w:t>
-            </w:r>
-          </w:p>
-        </w:tc>
-        <w:tc>
-          <w:tcPr>
-            <w:tcW w:type="dxa" w:w="6421"/>
+              <w:t xml:space="preserve">Terminée</w:t>
+            </w:r>
+          </w:p>
+        </w:tc>
+        <w:tc>
+          <w:tcPr>
+            <w:tcW w:type="dxa" w:w="7391"/>
             <w:tcBorders>
               <w:top w:val="single" w:color="CFC6DE" w:sz="4"/>
               <w:left w:val="single" w:color="CFC6DE" w:sz="4"/>
@@ -14046,7 +15665,7 @@
                 <w:sz w:val="19"/>
                 <w:szCs w:val="19"/>
               </w:rPr>
-              <w:t xml:space="preserve">Le tome est affiché « Publié », même s'il manque des chapitres prévus (la confirmation le rappelle). Les liens PDF et EPUB s'affichent, le planning passe à 100 %.</w:t>
+              <w:t xml:space="preserve">Tous les tomes prévus sont publiés. Plus de rappel de planning. Quand tous les tomes de la VO sont « Publié », le site propose de passer à « Terminée », sans l'imposer.</w:t>
             </w:r>
           </w:p>
         </w:tc>
@@ -14058,7 +15677,7 @@
         </w:trPr>
         <w:tc>
           <w:tcPr>
-            <w:tcW w:type="dxa" w:w="2605"/>
+            <w:tcW w:type="dxa" w:w="1635"/>
             <w:tcBorders>
               <w:top w:val="single" w:color="CFC6DE" w:sz="4"/>
               <w:left w:val="single" w:color="CFC6DE" w:sz="4"/>
@@ -14088,13 +15707,13 @@
                 <w:sz w:val="19"/>
                 <w:szCs w:val="19"/>
               </w:rPr>
-              <w:t xml:space="preserve">Publié → En cours de publication</w:t>
-            </w:r>
-          </w:p>
-        </w:tc>
-        <w:tc>
-          <w:tcPr>
-            <w:tcW w:type="dxa" w:w="6421"/>
+              <w:t xml:space="preserve">En pause</w:t>
+            </w:r>
+          </w:p>
+        </w:tc>
+        <w:tc>
+          <w:tcPr>
+            <w:tcW w:type="dxa" w:w="7391"/>
             <w:tcBorders>
               <w:top w:val="single" w:color="CFC6DE" w:sz="4"/>
               <w:left w:val="single" w:color="CFC6DE" w:sz="4"/>
@@ -14122,7 +15741,23 @@
                 <w:sz w:val="19"/>
                 <w:szCs w:val="19"/>
               </w:rPr>
-              <w:t xml:space="preserve">Le tome est rouvert. Les liens PDF et EPUB sont masqués.</w:t>
+              <w:t xml:space="preserve">Une reprise est prévue. Les tomes restent au planning, mais le site n'envoie </w:t>
+            </w:r>
+            <w:r>
+              <w:rPr>
+                <w:b/>
+                <w:bCs/>
+                <w:sz w:val="19"/>
+                <w:szCs w:val="19"/>
+              </w:rPr>
+              <w:t xml:space="preserve">plus aucun rappel ni alerte de retard</w:t>
+            </w:r>
+            <w:r>
+              <w:rPr>
+                <w:sz w:val="19"/>
+                <w:szCs w:val="19"/>
+              </w:rPr>
+              <w:t xml:space="preserve"> pour cette œuvre.</w:t>
             </w:r>
           </w:p>
         </w:tc>
@@ -14134,7 +15769,7 @@
         </w:trPr>
         <w:tc>
           <w:tcPr>
-            <w:tcW w:type="dxa" w:w="2605"/>
+            <w:tcW w:type="dxa" w:w="1635"/>
             <w:tcBorders>
               <w:top w:val="single" w:color="CFC6DE" w:sz="4"/>
               <w:left w:val="single" w:color="CFC6DE" w:sz="4"/>
@@ -14165,13 +15800,13 @@
                 <w:sz w:val="19"/>
                 <w:szCs w:val="19"/>
               </w:rPr>
-              <w:t xml:space="preserve">En cours de publication → Planifié</w:t>
-            </w:r>
-          </w:p>
-        </w:tc>
-        <w:tc>
-          <w:tcPr>
-            <w:tcW w:type="dxa" w:w="6421"/>
+              <w:t xml:space="preserve">Abandonnée</w:t>
+            </w:r>
+          </w:p>
+        </w:tc>
+        <w:tc>
+          <w:tcPr>
+            <w:tcW w:type="dxa" w:w="7391"/>
             <w:tcBorders>
               <w:top w:val="single" w:color="CFC6DE" w:sz="4"/>
               <w:left w:val="single" w:color="CFC6DE" w:sz="4"/>
@@ -14200,8 +15835,41 @@
                 <w:sz w:val="19"/>
                 <w:szCs w:val="19"/>
               </w:rPr>
-              <w:t xml:space="preserve">Les chapitres en ligne sont </w:t>
-            </w:r>
+              <w:t xml:space="preserve">Plus de traduction. Les tomes publiés restent lisibles. Plus de rappel.</w:t>
+            </w:r>
+          </w:p>
+        </w:tc>
+      </w:tr>
+      <w:tr>
+        <w:trPr>
+          <w:cantSplit/>
+          <w:tblHeader w:val="off"/>
+        </w:trPr>
+        <w:tc>
+          <w:tcPr>
+            <w:tcW w:type="dxa" w:w="1635"/>
+            <w:tcBorders>
+              <w:top w:val="single" w:color="CFC6DE" w:sz="4"/>
+              <w:left w:val="single" w:color="CFC6DE" w:sz="4"/>
+              <w:bottom w:val="single" w:color="CFC6DE" w:sz="4"/>
+              <w:right w:val="single" w:color="CFC6DE" w:sz="4"/>
+            </w:tcBorders>
+            <w:tcMar>
+              <w:top w:type="dxa" w:w="70"/>
+              <w:left w:type="dxa" w:w="110"/>
+              <w:bottom w:type="dxa" w:w="70"/>
+              <w:right w:type="dxa" w:w="110"/>
+            </w:tcMar>
+            <w:vAlign w:val="center"/>
+          </w:tcPr>
+          <w:p>
+            <w:pPr>
+              <w:spacing w:after="0" w:before="0"/>
+              <w:rPr>
+                <w:sz w:val="19"/>
+                <w:szCs w:val="19"/>
+              </w:rPr>
+            </w:pPr>
             <w:r>
               <w:rPr>
                 <w:b/>
@@ -14209,14 +15877,57 @@
                 <w:sz w:val="19"/>
                 <w:szCs w:val="19"/>
               </w:rPr>
-              <w:t xml:space="preserve">retirés de la lecture</w:t>
-            </w:r>
-            <w:r>
-              <w:rPr>
-                <w:sz w:val="19"/>
-                <w:szCs w:val="19"/>
-              </w:rPr>
-              <w:t xml:space="preserve"> : ils repassent en brouillon. Le tome redevient « à paraître ».</w:t>
+              <w:t xml:space="preserve">Licenciée</w:t>
+            </w:r>
+          </w:p>
+        </w:tc>
+        <w:tc>
+          <w:tcPr>
+            <w:tcW w:type="dxa" w:w="7391"/>
+            <w:tcBorders>
+              <w:top w:val="single" w:color="CFC6DE" w:sz="4"/>
+              <w:left w:val="single" w:color="CFC6DE" w:sz="4"/>
+              <w:bottom w:val="single" w:color="CFC6DE" w:sz="4"/>
+              <w:right w:val="single" w:color="CFC6DE" w:sz="4"/>
+            </w:tcBorders>
+            <w:tcMar>
+              <w:top w:type="dxa" w:w="70"/>
+              <w:left w:type="dxa" w:w="110"/>
+              <w:bottom w:type="dxa" w:w="70"/>
+              <w:right w:type="dxa" w:w="110"/>
+            </w:tcMar>
+            <w:vAlign w:val="center"/>
+          </w:tcPr>
+          <w:p>
+            <w:pPr>
+              <w:spacing w:after="0" w:before="0"/>
+              <w:rPr>
+                <w:sz w:val="19"/>
+                <w:szCs w:val="19"/>
+              </w:rPr>
+            </w:pPr>
+            <w:r>
+              <w:rPr>
+                <w:sz w:val="19"/>
+                <w:szCs w:val="19"/>
+              </w:rPr>
+              <w:t xml:space="preserve">L'œuvre est publiée officiellement en France. Le site </w:t>
+            </w:r>
+            <w:r>
+              <w:rPr>
+                <w:b/>
+                <w:bCs/>
+                <w:sz w:val="19"/>
+                <w:szCs w:val="19"/>
+              </w:rPr>
+              <w:t xml:space="preserve">retire automatiquement la lecture en ligne et les liens PDF et EPUB</w:t>
+            </w:r>
+            <w:r>
+              <w:rPr>
+                <w:sz w:val="19"/>
+                <w:szCs w:val="19"/>
+              </w:rPr>
+              <w:t xml:space="preserve"> de tous ses tomes et annule les e-mails d'alerte en attente. La fiche de l'œuvre et ses tomes restent en ligne, avec la mention « Licenciée ». Plus de rappel.</w:t>
             </w:r>
           </w:p>
         </w:tc>
@@ -14279,17 +15990,14 @@
               <w:t xml:space="preserve"> : </w:t>
             </w:r>
             <w:r>
-              <w:t xml:space="preserve">le retour </w:t>
-            </w:r>
-            <w:r>
               <w:rPr>
                 <w:b/>
                 <w:bCs/>
               </w:rPr>
-              <w:t xml:space="preserve">En cours de publication → Planifié</w:t>
-            </w:r>
-            <w:r>
-              <w:t xml:space="preserve"> retire les chapitres que les lecteurs pouvaient lire. Il sert à réparer une publication faite par erreur. Pour arrêter un tome sans rien retirer, mettez-le plutôt en pause (voir « Mettre un tome en pause »).</w:t>
+              <w:t xml:space="preserve">Licenciée</w:t>
+            </w:r>
+            <w:r>
+              <w:t xml:space="preserve"> retire tout de suite la lecture et les liens de toute l'œuvre. Vérifiez avec un gérant avant de choisir cet état.</w:t>
             </w:r>
           </w:p>
         </w:tc>
@@ -14297,203 +16005,8 @@
     </w:tbl>
     <w:p>
       <w:pPr>
-        <w:pStyle w:val="Heading2"/>
-      </w:pPr>
-      <w:bookmarkStart w:name="titre-54" w:id="120"/>
-      <w:r>
-        <w:t xml:space="preserve">10.4 J'ai publié au lieu de programmer : comment réparer</w:t>
-      </w:r>
-      <w:bookmarkEnd w:id="120"/>
-    </w:p>
-    <w:p>
-      <w:r>
-        <w:t xml:space="preserve">Exemple : vous vouliez programmer le prologue pour samedi, mais vous avez cliqué sur </w:t>
-      </w:r>
-      <w:r>
-        <w:rPr>
-          <w:b/>
-          <w:bCs/>
-        </w:rPr>
-        <w:t xml:space="preserve">Maintenant</w:t>
-      </w:r>
-      <w:r>
-        <w:t xml:space="preserve">. Le tome est passé « En cours » et l'annonce est partie.</w:t>
-      </w:r>
-    </w:p>
-    <w:p>
-      <w:pPr>
-        <w:pStyle w:val="ListParagraph"/>
-        <w:numPr>
-          <w:ilvl w:val="0"/>
-          <w:numId w:val="26"/>
-        </w:numPr>
-        <w:spacing w:after="60" w:before="40"/>
-      </w:pPr>
-      <w:r>
-        <w:rPr>
-          <w:b/>
-          <w:bCs/>
-        </w:rPr>
-        <w:t xml:space="preserve">Tous les tomes</w:t>
-      </w:r>
-      <w:r>
-        <w:t xml:space="preserve">, puis </w:t>
-      </w:r>
-      <w:r>
-        <w:rPr>
-          <w:b/>
-          <w:bCs/>
-        </w:rPr>
-        <w:t xml:space="preserve">Modifier</w:t>
-      </w:r>
-      <w:r>
-        <w:t xml:space="preserve"> sur la ligne du tome.</w:t>
-      </w:r>
-    </w:p>
-    <w:p>
-      <w:pPr>
-        <w:pStyle w:val="ListParagraph"/>
-        <w:numPr>
-          <w:ilvl w:val="0"/>
-          <w:numId w:val="26"/>
-        </w:numPr>
-        <w:spacing w:after="60" w:before="40"/>
-      </w:pPr>
-      <w:r>
-        <w:t xml:space="preserve">Dans </w:t>
-      </w:r>
-      <w:r>
-        <w:rPr>
-          <w:b/>
-          <w:bCs/>
-        </w:rPr>
-        <w:t xml:space="preserve">État du tome</w:t>
-      </w:r>
-      <w:r>
-        <w:t xml:space="preserve">, choisissez </w:t>
-      </w:r>
-      <w:r>
-        <w:rPr>
-          <w:b/>
-          <w:bCs/>
-        </w:rPr>
-        <w:t xml:space="preserve">Planifié</w:t>
-      </w:r>
-      <w:r>
-        <w:t xml:space="preserve">.</w:t>
-      </w:r>
-    </w:p>
-    <w:p>
-      <w:pPr>
-        <w:pStyle w:val="ListParagraph"/>
-        <w:numPr>
-          <w:ilvl w:val="0"/>
-          <w:numId w:val="26"/>
-        </w:numPr>
-        <w:spacing w:after="60" w:before="40"/>
-      </w:pPr>
-      <w:r>
-        <w:t xml:space="preserve">Cliquez sur </w:t>
-      </w:r>
-      <w:r>
-        <w:rPr>
-          <w:b/>
-          <w:bCs/>
-        </w:rPr>
-        <w:t xml:space="preserve">Enregistrer</w:t>
-      </w:r>
-      <w:r>
-        <w:t xml:space="preserve">, puis confirmez avec </w:t>
-      </w:r>
-      <w:r>
-        <w:rPr>
-          <w:b/>
-          <w:bCs/>
-        </w:rPr>
-        <w:t xml:space="preserve">Retirer les chapitres</w:t>
-      </w:r>
-      <w:r>
-        <w:t xml:space="preserve">. Le prologue n'est plus lisible et le tome redevient « à paraître ».</w:t>
-      </w:r>
-    </w:p>
-    <w:p>
-      <w:pPr>
-        <w:pStyle w:val="ListParagraph"/>
-        <w:numPr>
-          <w:ilvl w:val="0"/>
-          <w:numId w:val="26"/>
-        </w:numPr>
-        <w:spacing w:after="60" w:before="40"/>
-      </w:pPr>
-      <w:r>
-        <w:t xml:space="preserve">Ouvrez </w:t>
-      </w:r>
-      <w:r>
-        <w:rPr>
-          <w:b/>
-          <w:bCs/>
-        </w:rPr>
-        <w:t xml:space="preserve">Ajouter des chapitres</w:t>
-      </w:r>
-      <w:r>
-        <w:t xml:space="preserve">, choisissez le tome et déposez de nouveau le fichier : le prologue apparaît </w:t>
-      </w:r>
-      <w:r>
-        <w:rPr>
-          <w:b/>
-          <w:bCs/>
-        </w:rPr>
-        <w:t xml:space="preserve">Brouillon</w:t>
-      </w:r>
-      <w:r>
-        <w:t xml:space="preserve">.</w:t>
-      </w:r>
-    </w:p>
-    <w:p>
-      <w:pPr>
-        <w:pStyle w:val="ListParagraph"/>
-        <w:numPr>
-          <w:ilvl w:val="0"/>
-          <w:numId w:val="26"/>
-        </w:numPr>
-        <w:spacing w:after="60" w:before="40"/>
-      </w:pPr>
-      <w:r>
-        <w:t xml:space="preserve">Choisissez </w:t>
-      </w:r>
-      <w:r>
-        <w:rPr>
-          <w:b/>
-          <w:bCs/>
-        </w:rPr>
-        <w:t xml:space="preserve">À une date</w:t>
-      </w:r>
-      <w:r>
-        <w:t xml:space="preserve">, indiquez samedi 18 h, puis cliquez sur </w:t>
-      </w:r>
-      <w:r>
-        <w:rPr>
-          <w:b/>
-          <w:bCs/>
-        </w:rPr>
-        <w:t xml:space="preserve">Programmer 1 chapitre</w:t>
-      </w:r>
-      <w:r>
-        <w:t xml:space="preserve"> et confirmez. Le prologue sortira samedi, avec son annonce.</w:t>
-      </w:r>
-    </w:p>
-    <w:p>
-      <w:pPr>
-        <w:pStyle w:val="ListParagraph"/>
-        <w:numPr>
-          <w:ilvl w:val="0"/>
-          <w:numId w:val="26"/>
-        </w:numPr>
-        <w:spacing w:after="60" w:before="40"/>
-      </w:pPr>
-      <w:r>
-        <w:t xml:space="preserve">Prévenez l'équipe sur Discord : l'annonce déjà envoyée (Discord, e-mail) ne peut pas être reprise. Un éditeur peut dépublier l'article d'annonce dans l'administration.</w:t>
-      </w:r>
+        <w:spacing w:after="60" w:before="0"/>
+      </w:pPr>
     </w:p>
     <w:tbl>
       <w:tblPr>
@@ -14519,11 +16032,11 @@
             <w:tcW w:type="dxa" w:w="9026"/>
             <w:tcBorders>
               <w:top w:val="none" w:color="FFFFFF" w:sz="0"/>
-              <w:left w:val="single" w:color="2E9E6A" w:sz="24"/>
+              <w:left w:val="single" w:color="7A4FB0" w:sz="24"/>
               <w:bottom w:val="none" w:color="FFFFFF" w:sz="0"/>
               <w:right w:val="none" w:color="FFFFFF" w:sz="0"/>
             </w:tcBorders>
-            <w:shd w:fill="E9F7EF" w:color="auto" w:val="clear"/>
+            <w:shd w:fill="F1ECFA" w:color="auto" w:val="clear"/>
             <w:tcMar>
               <w:top w:type="dxa" w:w="120"/>
               <w:left w:type="dxa" w:w="200"/>
@@ -14539,35 +16052,25 @@
               <w:rPr>
                 <w:b/>
                 <w:bCs/>
-                <w:color w:val="1E6B47"/>
-              </w:rPr>
-              <w:t xml:space="preserve">Astuce</w:t>
+                <w:color w:val="4B2A7B"/>
+              </w:rPr>
+              <w:t xml:space="preserve">À savoir</w:t>
             </w:r>
             <w:r>
               <w:t xml:space="preserve"> : </w:t>
             </w:r>
             <w:r>
-              <w:t xml:space="preserve">si un seul chapitre est sorti trop tôt dans un tome déjà en cours, pas besoin de changer l'état du tome. Utilisez </w:t>
+              <w:t xml:space="preserve">c'est réversible. En quittant « Licenciée », la case </w:t>
             </w:r>
             <w:r>
               <w:rPr>
                 <w:b/>
                 <w:bCs/>
               </w:rPr>
-              <w:t xml:space="preserve">Retirer</w:t>
-            </w:r>
-            <w:r>
-              <w:t xml:space="preserve"> sur la ligne du chapitre, puis </w:t>
-            </w:r>
-            <w:r>
-              <w:rPr>
-                <w:b/>
-                <w:bCs/>
-              </w:rPr>
-              <w:t xml:space="preserve">Changer la date</w:t>
-            </w:r>
-            <w:r>
-              <w:t xml:space="preserve"> (voir « Publier, reprogrammer ou retirer un chapitre »).</w:t>
+              <w:t xml:space="preserve">Remettre en ligne la lecture et les liens retirés à la licence</w:t>
+            </w:r>
+            <w:r>
+              <w:t xml:space="preserve"> (cochée par défaut) remet tout en ligne, sans aucune annonce.</w:t>
             </w:r>
           </w:p>
         </w:tc>
@@ -14575,28 +16078,28 @@
     </w:tbl>
     <w:p>
       <w:pPr>
+        <w:pStyle w:val="Heading1"/>
+      </w:pPr>
+      <w:bookmarkStart w:name="titre-56" w:id="122"/>
+      <w:r>
+        <w:t xml:space="preserve">11 Ce que voient les lecteurs</w:t>
+      </w:r>
+      <w:bookmarkEnd w:id="122"/>
+    </w:p>
+    <w:p>
+      <w:r>
+        <w:t xml:space="preserve">Il est utile de savoir ce que montre le site, pour répondre aux lecteurs sur Discord.</w:t>
+      </w:r>
+    </w:p>
+    <w:p>
+      <w:pPr>
         <w:pStyle w:val="Heading2"/>
       </w:pPr>
-      <w:bookmarkStart w:name="titre-55" w:id="121"/>
-      <w:r>
-        <w:t xml:space="preserve">10.5 Changer l'état d'une œuvre</w:t>
-      </w:r>
-      <w:bookmarkEnd w:id="121"/>
-    </w:p>
-    <w:p>
-      <w:r>
-        <w:t xml:space="preserve">L'état d'une œuvre se change directement dans la liste </w:t>
-      </w:r>
-      <w:r>
-        <w:rPr>
-          <w:b/>
-          <w:bCs/>
-        </w:rPr>
-        <w:t xml:space="preserve">Œuvres</w:t>
-      </w:r>
-      <w:r>
-        <w:t xml:space="preserve">, sans ouvrir sa fiche. Il s'affiche sur la bibliothèque, sur la fiche de l'œuvre et dans ses filtres. L'état de chaque tome est rappelé à côté.</w:t>
-      </w:r>
+      <w:bookmarkStart w:name="titre-57" w:id="123"/>
+      <w:r>
+        <w:t xml:space="preserve">11.1 La fiche d'une œuvre</w:t>
+      </w:r>
+      <w:bookmarkEnd w:id="123"/>
     </w:p>
     <w:p>
       <w:pPr>
@@ -14607,9 +16110,9 @@
       <w:r>
         <w:drawing>
           <wp:inline distT="0" distB="0" distL="0" distR="0">
-            <wp:extent cx="5715000" cy="4581525"/>
+            <wp:extent cx="5715000" cy="4095750"/>
             <wp:effectExtent t="0" r="0" b="0" l="0"/>
-            <wp:docPr id="34" name="EtatOeuvre-contenu.png" descr="La liste « Œuvres » avec l'état de chaque œuvre et de ses tomes." title="La liste « Œuvres » avec l'état de chaque œuvre et de ses tomes."/>
+            <wp:docPr id="35" name="Public-page.png" descr="La fiche d'une œuvre, vue par un lecteur." title="La fiche d'une œuvre, vue par un lecteur."/>
             <wp:cNvGraphicFramePr>
               <a:graphicFrameLocks xmlns:a="http://schemas.openxmlformats.org/drawingml/2006/main" noChangeAspect="1"/>
             </wp:cNvGraphicFramePr>
@@ -14632,7 +16135,7 @@
                   <pic:spPr bwMode="auto">
                     <a:xfrm>
                       <a:off x="0" y="0"/>
-                      <a:ext cx="5715000" cy="4581525"/>
+                      <a:ext cx="5715000" cy="4095750"/>
                     </a:xfrm>
                     <a:prstGeom prst="rect">
                       <a:avLst/>
@@ -14654,10 +16157,10 @@
           <w:b/>
           <w:bCs/>
         </w:rPr>
-        <w:t xml:space="preserve">Figure 16 — </w:t>
-      </w:r>
-      <w:r>
-        <w:t xml:space="preserve">La liste « Œuvres » avec l'état de chaque œuvre et de ses tomes.</w:t>
+        <w:t xml:space="preserve">Figure 17 — </w:t>
+      </w:r>
+      <w:r>
+        <w:t xml:space="preserve">La fiche d'une œuvre, vue par un lecteur.</w:t>
       </w:r>
     </w:p>
     <w:p>
@@ -14665,29 +16168,19 @@
         <w:pStyle w:val="ListParagraph"/>
         <w:numPr>
           <w:ilvl w:val="0"/>
-          <w:numId w:val="27"/>
+          <w:numId w:val="2"/>
         </w:numPr>
-        <w:spacing w:after="60" w:before="40"/>
-      </w:pPr>
-      <w:r>
-        <w:t xml:space="preserve">Dans le menu, ouvrez </w:t>
-      </w:r>
-      <w:r>
-        <w:rPr>
-          <w:b/>
-          <w:bCs/>
-        </w:rPr>
-        <w:t xml:space="preserve">Catalogue</w:t>
-      </w:r>
-      <w:r>
-        <w:t xml:space="preserve">, puis </w:t>
-      </w:r>
-      <w:r>
-        <w:rPr>
-          <w:b/>
-          <w:bCs/>
-        </w:rPr>
-        <w:t xml:space="preserve">Œuvres</w:t>
+        <w:spacing w:after="60" w:before="0"/>
+      </w:pPr>
+      <w:r>
+        <w:t xml:space="preserve">En haut : la couverture, le type, l'état de la traduction, le synopsis et les boutons pour reprendre la lecture, mettre l'œuvre en favori (avec une alerte à chaque sortie) et l'</w:t>
+      </w:r>
+      <w:r>
+        <w:rPr>
+          <w:b/>
+          <w:bCs/>
+        </w:rPr>
+        <w:t xml:space="preserve">Ajouter à une liste</w:t>
       </w:r>
       <w:r>
         <w:t xml:space="preserve">.</w:t>
@@ -14698,22 +16191,22 @@
         <w:pStyle w:val="ListParagraph"/>
         <w:numPr>
           <w:ilvl w:val="0"/>
-          <w:numId w:val="27"/>
+          <w:numId w:val="2"/>
         </w:numPr>
-        <w:spacing w:after="60" w:before="40"/>
-      </w:pPr>
-      <w:r>
-        <w:t xml:space="preserve">Pour retrouver une œuvre, filtrez par </w:t>
-      </w:r>
-      <w:r>
-        <w:rPr>
-          <w:b/>
-          <w:bCs/>
-        </w:rPr>
-        <w:t xml:space="preserve">État</w:t>
-      </w:r>
-      <w:r>
-        <w:t xml:space="preserve">, par type, ou tapez une partie du titre.</w:t>
+        <w:spacing w:after="60" w:before="0"/>
+      </w:pPr>
+      <w:r>
+        <w:t xml:space="preserve">À droite : la </w:t>
+      </w:r>
+      <w:r>
+        <w:rPr>
+          <w:b/>
+          <w:bCs/>
+        </w:rPr>
+        <w:t xml:space="preserve">Prochaine sortie</w:t>
+      </w:r>
+      <w:r>
+        <w:t xml:space="preserve">, quand un chapitre est programmé.</w:t>
       </w:r>
     </w:p>
     <w:p>
@@ -14721,19 +16214,69 @@
         <w:pStyle w:val="ListParagraph"/>
         <w:numPr>
           <w:ilvl w:val="0"/>
-          <w:numId w:val="27"/>
+          <w:numId w:val="2"/>
         </w:numPr>
-        <w:spacing w:after="60" w:before="40"/>
-      </w:pPr>
-      <w:r>
-        <w:t xml:space="preserve">Sur la ligne de l'œuvre, choisissez son nouvel état dans la liste </w:t>
-      </w:r>
-      <w:r>
-        <w:rPr>
-          <w:b/>
-          <w:bCs/>
-        </w:rPr>
-        <w:t xml:space="preserve">État de l'œuvre</w:t>
+        <w:spacing w:after="60" w:before="0"/>
+      </w:pPr>
+      <w:r>
+        <w:t xml:space="preserve">La liste des tomes : chaque tome avec sa parution (</w:t>
+      </w:r>
+      <w:r>
+        <w:rPr>
+          <w:b/>
+          <w:bCs/>
+        </w:rPr>
+        <w:t xml:space="preserve">À paraître</w:t>
+      </w:r>
+      <w:r>
+        <w:t xml:space="preserve">, </w:t>
+      </w:r>
+      <w:r>
+        <w:rPr>
+          <w:b/>
+          <w:bCs/>
+        </w:rPr>
+        <w:t xml:space="preserve">En cours</w:t>
+      </w:r>
+      <w:r>
+        <w:t xml:space="preserve">, </w:t>
+      </w:r>
+      <w:r>
+        <w:rPr>
+          <w:b/>
+          <w:bCs/>
+        </w:rPr>
+        <w:t xml:space="preserve">Publié</w:t>
+      </w:r>
+      <w:r>
+        <w:t xml:space="preserve">), </w:t>
+      </w:r>
+      <w:r>
+        <w:rPr>
+          <w:b/>
+          <w:bCs/>
+        </w:rPr>
+        <w:t xml:space="preserve">Lire en ligne</w:t>
+      </w:r>
+      <w:r>
+        <w:t xml:space="preserve"> et, pour un tome publié, </w:t>
+      </w:r>
+      <w:r>
+        <w:rPr>
+          <w:b/>
+          <w:bCs/>
+        </w:rPr>
+        <w:t xml:space="preserve">PDF</w:t>
+      </w:r>
+      <w:r>
+        <w:t xml:space="preserve"> et </w:t>
+      </w:r>
+      <w:r>
+        <w:rPr>
+          <w:b/>
+          <w:bCs/>
+        </w:rPr>
+        <w:t xml:space="preserve">EPUB</w:t>
       </w:r>
       <w:r>
         <w:t xml:space="preserve">.</w:t>
@@ -14744,629 +16287,43 @@
         <w:pStyle w:val="ListParagraph"/>
         <w:numPr>
           <w:ilvl w:val="0"/>
-          <w:numId w:val="27"/>
+          <w:numId w:val="2"/>
         </w:numPr>
-        <w:spacing w:after="60" w:before="40"/>
-      </w:pPr>
-      <w:r>
-        <w:t xml:space="preserve">Enregistrez. Pour un changement qui touche les lecteurs (« Licenciée »), une question demande confirmation.</w:t>
-      </w:r>
-    </w:p>
-    <w:tbl>
-      <w:tblPr>
-        <w:tblW w:type="dxa" w:w="9026"/>
-        <w:tblBorders>
-          <w:top w:val="single" w:color="auto" w:sz="4"/>
-          <w:left w:val="single" w:color="auto" w:sz="4"/>
-          <w:bottom w:val="single" w:color="auto" w:sz="4"/>
-          <w:right w:val="single" w:color="auto" w:sz="4"/>
-          <w:insideH w:val="single" w:color="auto" w:sz="4"/>
-          <w:insideV w:val="single" w:color="auto" w:sz="4"/>
-        </w:tblBorders>
-      </w:tblPr>
-      <w:tblGrid>
-        <w:gridCol w:w="1635"/>
-        <w:gridCol w:w="7391"/>
-      </w:tblGrid>
-      <w:tr>
-        <w:trPr>
-          <w:cantSplit/>
-          <w:tblHeader/>
-        </w:trPr>
-        <w:tc>
-          <w:tcPr>
-            <w:tcW w:type="dxa" w:w="1635"/>
-            <w:tcBorders>
-              <w:top w:val="single" w:color="CFC6DE" w:sz="4"/>
-              <w:left w:val="single" w:color="CFC6DE" w:sz="4"/>
-              <w:bottom w:val="single" w:color="CFC6DE" w:sz="4"/>
-              <w:right w:val="single" w:color="CFC6DE" w:sz="4"/>
-            </w:tcBorders>
-            <w:shd w:fill="3A2A63" w:color="auto" w:val="clear"/>
-            <w:tcMar>
-              <w:top w:type="dxa" w:w="70"/>
-              <w:left w:type="dxa" w:w="110"/>
-              <w:bottom w:type="dxa" w:w="70"/>
-              <w:right w:type="dxa" w:w="110"/>
-            </w:tcMar>
-            <w:vAlign w:val="center"/>
-          </w:tcPr>
-          <w:p>
-            <w:pPr>
-              <w:spacing w:after="0" w:before="0"/>
-              <w:rPr>
-                <w:b/>
-                <w:bCs/>
-                <w:color w:val="FFFFFF"/>
-                <w:sz w:val="19"/>
-                <w:szCs w:val="19"/>
-              </w:rPr>
-            </w:pPr>
-            <w:r>
-              <w:rPr>
-                <w:b/>
-                <w:bCs/>
-                <w:color w:val="FFFFFF"/>
-                <w:sz w:val="19"/>
-                <w:szCs w:val="19"/>
-              </w:rPr>
-              <w:t xml:space="preserve">État de l'œuvre</w:t>
-            </w:r>
-          </w:p>
-        </w:tc>
-        <w:tc>
-          <w:tcPr>
-            <w:tcW w:type="dxa" w:w="7391"/>
-            <w:tcBorders>
-              <w:top w:val="single" w:color="CFC6DE" w:sz="4"/>
-              <w:left w:val="single" w:color="CFC6DE" w:sz="4"/>
-              <w:bottom w:val="single" w:color="CFC6DE" w:sz="4"/>
-              <w:right w:val="single" w:color="CFC6DE" w:sz="4"/>
-            </w:tcBorders>
-            <w:shd w:fill="3A2A63" w:color="auto" w:val="clear"/>
-            <w:tcMar>
-              <w:top w:type="dxa" w:w="70"/>
-              <w:left w:type="dxa" w:w="110"/>
-              <w:bottom w:type="dxa" w:w="70"/>
-              <w:right w:type="dxa" w:w="110"/>
-            </w:tcMar>
-            <w:vAlign w:val="center"/>
-          </w:tcPr>
-          <w:p>
-            <w:pPr>
-              <w:spacing w:after="0" w:before="0"/>
-              <w:rPr>
-                <w:b/>
-                <w:bCs/>
-                <w:color w:val="FFFFFF"/>
-                <w:sz w:val="19"/>
-                <w:szCs w:val="19"/>
-              </w:rPr>
-            </w:pPr>
-            <w:r>
-              <w:rPr>
-                <w:b/>
-                <w:bCs/>
-                <w:color w:val="FFFFFF"/>
-                <w:sz w:val="19"/>
-                <w:szCs w:val="19"/>
-              </w:rPr>
-              <w:t xml:space="preserve">Ce que fait le site</w:t>
-            </w:r>
-          </w:p>
-        </w:tc>
-      </w:tr>
-      <w:tr>
-        <w:trPr>
-          <w:cantSplit/>
-          <w:tblHeader w:val="off"/>
-        </w:trPr>
-        <w:tc>
-          <w:tcPr>
-            <w:tcW w:type="dxa" w:w="1635"/>
-            <w:tcBorders>
-              <w:top w:val="single" w:color="CFC6DE" w:sz="4"/>
-              <w:left w:val="single" w:color="CFC6DE" w:sz="4"/>
-              <w:bottom w:val="single" w:color="CFC6DE" w:sz="4"/>
-              <w:right w:val="single" w:color="CFC6DE" w:sz="4"/>
-            </w:tcBorders>
-            <w:tcMar>
-              <w:top w:type="dxa" w:w="70"/>
-              <w:left w:type="dxa" w:w="110"/>
-              <w:bottom w:type="dxa" w:w="70"/>
-              <w:right w:type="dxa" w:w="110"/>
-            </w:tcMar>
-            <w:vAlign w:val="center"/>
-          </w:tcPr>
-          <w:p>
-            <w:pPr>
-              <w:spacing w:after="0" w:before="0"/>
-              <w:rPr>
-                <w:sz w:val="19"/>
-                <w:szCs w:val="19"/>
-              </w:rPr>
-            </w:pPr>
-            <w:r>
-              <w:rPr>
-                <w:b/>
-                <w:bCs/>
-                <w:sz w:val="19"/>
-                <w:szCs w:val="19"/>
-              </w:rPr>
-              <w:t xml:space="preserve">En cours de publication</w:t>
-            </w:r>
-          </w:p>
-        </w:tc>
-        <w:tc>
-          <w:tcPr>
-            <w:tcW w:type="dxa" w:w="7391"/>
-            <w:tcBorders>
-              <w:top w:val="single" w:color="CFC6DE" w:sz="4"/>
-              <w:left w:val="single" w:color="CFC6DE" w:sz="4"/>
-              <w:bottom w:val="single" w:color="CFC6DE" w:sz="4"/>
-              <w:right w:val="single" w:color="CFC6DE" w:sz="4"/>
-            </w:tcBorders>
-            <w:tcMar>
-              <w:top w:type="dxa" w:w="70"/>
-              <w:left w:type="dxa" w:w="110"/>
-              <w:bottom w:type="dxa" w:w="70"/>
-              <w:right w:type="dxa" w:w="110"/>
-            </w:tcMar>
-            <w:vAlign w:val="center"/>
-          </w:tcPr>
-          <w:p>
-            <w:pPr>
-              <w:spacing w:after="0" w:before="0"/>
-              <w:rPr>
-                <w:sz w:val="19"/>
-                <w:szCs w:val="19"/>
-              </w:rPr>
-            </w:pPr>
-            <w:r>
-              <w:rPr>
-                <w:sz w:val="19"/>
-                <w:szCs w:val="19"/>
-              </w:rPr>
-              <w:t xml:space="preserve">L'équipe traduit et publie. Les lecteurs voient « Traduction en cours ».</w:t>
-            </w:r>
-          </w:p>
-        </w:tc>
-      </w:tr>
-      <w:tr>
-        <w:trPr>
-          <w:cantSplit/>
-          <w:tblHeader w:val="off"/>
-        </w:trPr>
-        <w:tc>
-          <w:tcPr>
-            <w:tcW w:type="dxa" w:w="1635"/>
-            <w:tcBorders>
-              <w:top w:val="single" w:color="CFC6DE" w:sz="4"/>
-              <w:left w:val="single" w:color="CFC6DE" w:sz="4"/>
-              <w:bottom w:val="single" w:color="CFC6DE" w:sz="4"/>
-              <w:right w:val="single" w:color="CFC6DE" w:sz="4"/>
-            </w:tcBorders>
-            <w:shd w:fill="F6F3FA" w:color="auto" w:val="clear"/>
-            <w:tcMar>
-              <w:top w:type="dxa" w:w="70"/>
-              <w:left w:type="dxa" w:w="110"/>
-              <w:bottom w:type="dxa" w:w="70"/>
-              <w:right w:type="dxa" w:w="110"/>
-            </w:tcMar>
-            <w:vAlign w:val="center"/>
-          </w:tcPr>
-          <w:p>
-            <w:pPr>
-              <w:spacing w:after="0" w:before="0"/>
-              <w:rPr>
-                <w:sz w:val="19"/>
-                <w:szCs w:val="19"/>
-              </w:rPr>
-            </w:pPr>
-            <w:r>
-              <w:rPr>
-                <w:b/>
-                <w:bCs/>
-                <w:sz w:val="19"/>
-                <w:szCs w:val="19"/>
-              </w:rPr>
-              <w:t xml:space="preserve">Terminée</w:t>
-            </w:r>
-          </w:p>
-        </w:tc>
-        <w:tc>
-          <w:tcPr>
-            <w:tcW w:type="dxa" w:w="7391"/>
-            <w:tcBorders>
-              <w:top w:val="single" w:color="CFC6DE" w:sz="4"/>
-              <w:left w:val="single" w:color="CFC6DE" w:sz="4"/>
-              <w:bottom w:val="single" w:color="CFC6DE" w:sz="4"/>
-              <w:right w:val="single" w:color="CFC6DE" w:sz="4"/>
-            </w:tcBorders>
-            <w:shd w:fill="F6F3FA" w:color="auto" w:val="clear"/>
-            <w:tcMar>
-              <w:top w:type="dxa" w:w="70"/>
-              <w:left w:type="dxa" w:w="110"/>
-              <w:bottom w:type="dxa" w:w="70"/>
-              <w:right w:type="dxa" w:w="110"/>
-            </w:tcMar>
-            <w:vAlign w:val="center"/>
-          </w:tcPr>
-          <w:p>
-            <w:pPr>
-              <w:spacing w:after="0" w:before="0"/>
-              <w:rPr>
-                <w:sz w:val="19"/>
-                <w:szCs w:val="19"/>
-              </w:rPr>
-            </w:pPr>
-            <w:r>
-              <w:rPr>
-                <w:sz w:val="19"/>
-                <w:szCs w:val="19"/>
-              </w:rPr>
-              <w:t xml:space="preserve">Tous les tomes prévus sont publiés. Plus de rappel de planning. Quand tous les tomes de la VO sont « Publié », le site propose de passer à « Terminée », sans l'imposer.</w:t>
-            </w:r>
-          </w:p>
-        </w:tc>
-      </w:tr>
-      <w:tr>
-        <w:trPr>
-          <w:cantSplit/>
-          <w:tblHeader w:val="off"/>
-        </w:trPr>
-        <w:tc>
-          <w:tcPr>
-            <w:tcW w:type="dxa" w:w="1635"/>
-            <w:tcBorders>
-              <w:top w:val="single" w:color="CFC6DE" w:sz="4"/>
-              <w:left w:val="single" w:color="CFC6DE" w:sz="4"/>
-              <w:bottom w:val="single" w:color="CFC6DE" w:sz="4"/>
-              <w:right w:val="single" w:color="CFC6DE" w:sz="4"/>
-            </w:tcBorders>
-            <w:tcMar>
-              <w:top w:type="dxa" w:w="70"/>
-              <w:left w:type="dxa" w:w="110"/>
-              <w:bottom w:type="dxa" w:w="70"/>
-              <w:right w:type="dxa" w:w="110"/>
-            </w:tcMar>
-            <w:vAlign w:val="center"/>
-          </w:tcPr>
-          <w:p>
-            <w:pPr>
-              <w:spacing w:after="0" w:before="0"/>
-              <w:rPr>
-                <w:sz w:val="19"/>
-                <w:szCs w:val="19"/>
-              </w:rPr>
-            </w:pPr>
-            <w:r>
-              <w:rPr>
-                <w:b/>
-                <w:bCs/>
-                <w:sz w:val="19"/>
-                <w:szCs w:val="19"/>
-              </w:rPr>
-              <w:t xml:space="preserve">En pause</w:t>
-            </w:r>
-          </w:p>
-        </w:tc>
-        <w:tc>
-          <w:tcPr>
-            <w:tcW w:type="dxa" w:w="7391"/>
-            <w:tcBorders>
-              <w:top w:val="single" w:color="CFC6DE" w:sz="4"/>
-              <w:left w:val="single" w:color="CFC6DE" w:sz="4"/>
-              <w:bottom w:val="single" w:color="CFC6DE" w:sz="4"/>
-              <w:right w:val="single" w:color="CFC6DE" w:sz="4"/>
-            </w:tcBorders>
-            <w:tcMar>
-              <w:top w:type="dxa" w:w="70"/>
-              <w:left w:type="dxa" w:w="110"/>
-              <w:bottom w:type="dxa" w:w="70"/>
-              <w:right w:type="dxa" w:w="110"/>
-            </w:tcMar>
-            <w:vAlign w:val="center"/>
-          </w:tcPr>
-          <w:p>
-            <w:pPr>
-              <w:spacing w:after="0" w:before="0"/>
-              <w:rPr>
-                <w:sz w:val="19"/>
-                <w:szCs w:val="19"/>
-              </w:rPr>
-            </w:pPr>
-            <w:r>
-              <w:rPr>
-                <w:sz w:val="19"/>
-                <w:szCs w:val="19"/>
-              </w:rPr>
-              <w:t xml:space="preserve">Une reprise est prévue. Les tomes restent au planning, mais le site n'envoie </w:t>
-            </w:r>
-            <w:r>
-              <w:rPr>
-                <w:b/>
-                <w:bCs/>
-                <w:sz w:val="19"/>
-                <w:szCs w:val="19"/>
-              </w:rPr>
-              <w:t xml:space="preserve">plus aucun rappel ni alerte de retard</w:t>
-            </w:r>
-            <w:r>
-              <w:rPr>
-                <w:sz w:val="19"/>
-                <w:szCs w:val="19"/>
-              </w:rPr>
-              <w:t xml:space="preserve"> pour cette œuvre.</w:t>
-            </w:r>
-          </w:p>
-        </w:tc>
-      </w:tr>
-      <w:tr>
-        <w:trPr>
-          <w:cantSplit/>
-          <w:tblHeader w:val="off"/>
-        </w:trPr>
-        <w:tc>
-          <w:tcPr>
-            <w:tcW w:type="dxa" w:w="1635"/>
-            <w:tcBorders>
-              <w:top w:val="single" w:color="CFC6DE" w:sz="4"/>
-              <w:left w:val="single" w:color="CFC6DE" w:sz="4"/>
-              <w:bottom w:val="single" w:color="CFC6DE" w:sz="4"/>
-              <w:right w:val="single" w:color="CFC6DE" w:sz="4"/>
-            </w:tcBorders>
-            <w:shd w:fill="F6F3FA" w:color="auto" w:val="clear"/>
-            <w:tcMar>
-              <w:top w:type="dxa" w:w="70"/>
-              <w:left w:type="dxa" w:w="110"/>
-              <w:bottom w:type="dxa" w:w="70"/>
-              <w:right w:type="dxa" w:w="110"/>
-            </w:tcMar>
-            <w:vAlign w:val="center"/>
-          </w:tcPr>
-          <w:p>
-            <w:pPr>
-              <w:spacing w:after="0" w:before="0"/>
-              <w:rPr>
-                <w:sz w:val="19"/>
-                <w:szCs w:val="19"/>
-              </w:rPr>
-            </w:pPr>
-            <w:r>
-              <w:rPr>
-                <w:b/>
-                <w:bCs/>
-                <w:sz w:val="19"/>
-                <w:szCs w:val="19"/>
-              </w:rPr>
-              <w:t xml:space="preserve">Abandonnée</w:t>
-            </w:r>
-          </w:p>
-        </w:tc>
-        <w:tc>
-          <w:tcPr>
-            <w:tcW w:type="dxa" w:w="7391"/>
-            <w:tcBorders>
-              <w:top w:val="single" w:color="CFC6DE" w:sz="4"/>
-              <w:left w:val="single" w:color="CFC6DE" w:sz="4"/>
-              <w:bottom w:val="single" w:color="CFC6DE" w:sz="4"/>
-              <w:right w:val="single" w:color="CFC6DE" w:sz="4"/>
-            </w:tcBorders>
-            <w:shd w:fill="F6F3FA" w:color="auto" w:val="clear"/>
-            <w:tcMar>
-              <w:top w:type="dxa" w:w="70"/>
-              <w:left w:type="dxa" w:w="110"/>
-              <w:bottom w:type="dxa" w:w="70"/>
-              <w:right w:type="dxa" w:w="110"/>
-            </w:tcMar>
-            <w:vAlign w:val="center"/>
-          </w:tcPr>
-          <w:p>
-            <w:pPr>
-              <w:spacing w:after="0" w:before="0"/>
-              <w:rPr>
-                <w:sz w:val="19"/>
-                <w:szCs w:val="19"/>
-              </w:rPr>
-            </w:pPr>
-            <w:r>
-              <w:rPr>
-                <w:sz w:val="19"/>
-                <w:szCs w:val="19"/>
-              </w:rPr>
-              <w:t xml:space="preserve">Plus de traduction. Les tomes publiés restent lisibles. Plus de rappel.</w:t>
-            </w:r>
-          </w:p>
-        </w:tc>
-      </w:tr>
-      <w:tr>
-        <w:trPr>
-          <w:cantSplit/>
-          <w:tblHeader w:val="off"/>
-        </w:trPr>
-        <w:tc>
-          <w:tcPr>
-            <w:tcW w:type="dxa" w:w="1635"/>
-            <w:tcBorders>
-              <w:top w:val="single" w:color="CFC6DE" w:sz="4"/>
-              <w:left w:val="single" w:color="CFC6DE" w:sz="4"/>
-              <w:bottom w:val="single" w:color="CFC6DE" w:sz="4"/>
-              <w:right w:val="single" w:color="CFC6DE" w:sz="4"/>
-            </w:tcBorders>
-            <w:tcMar>
-              <w:top w:type="dxa" w:w="70"/>
-              <w:left w:type="dxa" w:w="110"/>
-              <w:bottom w:type="dxa" w:w="70"/>
-              <w:right w:type="dxa" w:w="110"/>
-            </w:tcMar>
-            <w:vAlign w:val="center"/>
-          </w:tcPr>
-          <w:p>
-            <w:pPr>
-              <w:spacing w:after="0" w:before="0"/>
-              <w:rPr>
-                <w:sz w:val="19"/>
-                <w:szCs w:val="19"/>
-              </w:rPr>
-            </w:pPr>
-            <w:r>
-              <w:rPr>
-                <w:b/>
-                <w:bCs/>
-                <w:sz w:val="19"/>
-                <w:szCs w:val="19"/>
-              </w:rPr>
-              <w:t xml:space="preserve">Licenciée</w:t>
-            </w:r>
-          </w:p>
-        </w:tc>
-        <w:tc>
-          <w:tcPr>
-            <w:tcW w:type="dxa" w:w="7391"/>
-            <w:tcBorders>
-              <w:top w:val="single" w:color="CFC6DE" w:sz="4"/>
-              <w:left w:val="single" w:color="CFC6DE" w:sz="4"/>
-              <w:bottom w:val="single" w:color="CFC6DE" w:sz="4"/>
-              <w:right w:val="single" w:color="CFC6DE" w:sz="4"/>
-            </w:tcBorders>
-            <w:tcMar>
-              <w:top w:type="dxa" w:w="70"/>
-              <w:left w:type="dxa" w:w="110"/>
-              <w:bottom w:type="dxa" w:w="70"/>
-              <w:right w:type="dxa" w:w="110"/>
-            </w:tcMar>
-            <w:vAlign w:val="center"/>
-          </w:tcPr>
-          <w:p>
-            <w:pPr>
-              <w:spacing w:after="0" w:before="0"/>
-              <w:rPr>
-                <w:sz w:val="19"/>
-                <w:szCs w:val="19"/>
-              </w:rPr>
-            </w:pPr>
-            <w:r>
-              <w:rPr>
-                <w:sz w:val="19"/>
-                <w:szCs w:val="19"/>
-              </w:rPr>
-              <w:t xml:space="preserve">L'œuvre est publiée officiellement en France. Le site </w:t>
-            </w:r>
-            <w:r>
-              <w:rPr>
-                <w:b/>
-                <w:bCs/>
-                <w:sz w:val="19"/>
-                <w:szCs w:val="19"/>
-              </w:rPr>
-              <w:t xml:space="preserve">retire automatiquement la lecture en ligne et les liens PDF et EPUB</w:t>
-            </w:r>
-            <w:r>
-              <w:rPr>
-                <w:sz w:val="19"/>
-                <w:szCs w:val="19"/>
-              </w:rPr>
-              <w:t xml:space="preserve">. Plus de rappel.</w:t>
-            </w:r>
-          </w:p>
-        </w:tc>
-      </w:tr>
-    </w:tbl>
-    <w:p>
-      <w:pPr>
         <w:spacing w:after="60" w:before="0"/>
       </w:pPr>
-    </w:p>
-    <w:tbl>
-      <w:tblPr>
-        <w:tblW w:type="dxa" w:w="9026"/>
-        <w:tblBorders>
-          <w:top w:val="single" w:color="auto" w:sz="4"/>
-          <w:left w:val="single" w:color="auto" w:sz="4"/>
-          <w:bottom w:val="single" w:color="auto" w:sz="4"/>
-          <w:right w:val="single" w:color="auto" w:sz="4"/>
-          <w:insideH w:val="single" w:color="auto" w:sz="4"/>
-          <w:insideV w:val="single" w:color="auto" w:sz="4"/>
-        </w:tblBorders>
-      </w:tblPr>
-      <w:tblGrid>
-        <w:gridCol w:w="9026"/>
-      </w:tblGrid>
-      <w:tr>
-        <w:trPr>
-          <w:cantSplit/>
-        </w:trPr>
-        <w:tc>
-          <w:tcPr>
-            <w:tcW w:type="dxa" w:w="9026"/>
-            <w:tcBorders>
-              <w:top w:val="none" w:color="FFFFFF" w:sz="0"/>
-              <w:left w:val="single" w:color="D9822B" w:sz="24"/>
-              <w:bottom w:val="none" w:color="FFFFFF" w:sz="0"/>
-              <w:right w:val="none" w:color="FFFFFF" w:sz="0"/>
-            </w:tcBorders>
-            <w:shd w:fill="FDF1E4" w:color="auto" w:val="clear"/>
-            <w:tcMar>
-              <w:top w:type="dxa" w:w="120"/>
-              <w:left w:type="dxa" w:w="200"/>
-              <w:bottom w:type="dxa" w:w="120"/>
-              <w:right w:type="dxa" w:w="160"/>
-            </w:tcMar>
-          </w:tcPr>
-          <w:p>
-            <w:pPr>
-              <w:spacing w:after="0" w:before="0"/>
-            </w:pPr>
-            <w:r>
-              <w:rPr>
-                <w:b/>
-                <w:bCs/>
-                <w:color w:val="9A4D0C"/>
-              </w:rPr>
-              <w:t xml:space="preserve">Attention</w:t>
-            </w:r>
-            <w:r>
-              <w:t xml:space="preserve"> : </w:t>
-            </w:r>
-            <w:r>
-              <w:rPr>
-                <w:b/>
-                <w:bCs/>
-              </w:rPr>
-              <w:t xml:space="preserve">Licenciée</w:t>
-            </w:r>
-            <w:r>
-              <w:t xml:space="preserve"> retire tout de suite la lecture et les liens de toute l'œuvre. Vérifiez avec un gérant avant de choisir cet état.</w:t>
-            </w:r>
-          </w:p>
-        </w:tc>
-      </w:tr>
-    </w:tbl>
-    <w:p>
-      <w:pPr>
-        <w:pStyle w:val="Heading1"/>
-      </w:pPr>
-      <w:bookmarkStart w:name="titre-56" w:id="122"/>
-      <w:r>
-        <w:t xml:space="preserve">11 Ce que voient les lecteurs</w:t>
-      </w:r>
-      <w:bookmarkEnd w:id="122"/>
-    </w:p>
-    <w:p>
-      <w:r>
-        <w:t xml:space="preserve">Il est utile de savoir ce que montre le site, pour répondre aux lecteurs sur Discord.</w:t>
+      <w:r>
+        <w:t xml:space="preserve">Les onglets </w:t>
+      </w:r>
+      <w:r>
+        <w:rPr>
+          <w:b/>
+          <w:bCs/>
+        </w:rPr>
+        <w:t xml:space="preserve">Actualités</w:t>
+      </w:r>
+      <w:r>
+        <w:t xml:space="preserve"> et </w:t>
+      </w:r>
+      <w:r>
+        <w:rPr>
+          <w:b/>
+          <w:bCs/>
+        </w:rPr>
+        <w:t xml:space="preserve">Glossaire</w:t>
+      </w:r>
+      <w:r>
+        <w:t xml:space="preserve"> apparaissent quand l'œuvre en a.</w:t>
       </w:r>
     </w:p>
     <w:p>
       <w:pPr>
         <w:pStyle w:val="Heading2"/>
       </w:pPr>
-      <w:bookmarkStart w:name="titre-57" w:id="123"/>
-      <w:r>
-        <w:t xml:space="preserve">11.1 La fiche d'une œuvre</w:t>
-      </w:r>
-      <w:bookmarkEnd w:id="123"/>
+      <w:bookmarkStart w:name="titre-58" w:id="124"/>
+      <w:r>
+        <w:t xml:space="preserve">11.2 La page d'un tome en cours</w:t>
+      </w:r>
+      <w:bookmarkEnd w:id="124"/>
     </w:p>
     <w:p>
       <w:pPr>
@@ -15377,9 +16334,9 @@
       <w:r>
         <w:drawing>
           <wp:inline distT="0" distB="0" distL="0" distR="0">
-            <wp:extent cx="5715000" cy="4095750"/>
+            <wp:extent cx="5715000" cy="3476625"/>
             <wp:effectExtent t="0" r="0" b="0" l="0"/>
-            <wp:docPr id="35" name="Public-page.png" descr="La fiche d'une œuvre, vue par un lecteur." title="La fiche d'une œuvre, vue par un lecteur."/>
+            <wp:docPr id="36" name="PublicTome-page.png" descr="La page d'un tome en cours, vue par un lecteur." title="La page d'un tome en cours, vue par un lecteur."/>
             <wp:cNvGraphicFramePr>
               <a:graphicFrameLocks xmlns:a="http://schemas.openxmlformats.org/drawingml/2006/main" noChangeAspect="1"/>
             </wp:cNvGraphicFramePr>
@@ -15402,230 +16359,6 @@
                   <pic:spPr bwMode="auto">
                     <a:xfrm>
                       <a:off x="0" y="0"/>
-                      <a:ext cx="5715000" cy="4095750"/>
-                    </a:xfrm>
-                    <a:prstGeom prst="rect">
-                      <a:avLst/>
-                    </a:prstGeom>
-                  </pic:spPr>
-                </pic:pic>
-              </a:graphicData>
-            </a:graphic>
-          </wp:inline>
-        </w:drawing>
-      </w:r>
-    </w:p>
-    <w:p>
-      <w:pPr>
-        <w:pStyle w:val="Legende"/>
-      </w:pPr>
-      <w:r>
-        <w:rPr>
-          <w:b/>
-          <w:bCs/>
-        </w:rPr>
-        <w:t xml:space="preserve">Figure 17 — </w:t>
-      </w:r>
-      <w:r>
-        <w:t xml:space="preserve">La fiche d'une œuvre, vue par un lecteur.</w:t>
-      </w:r>
-    </w:p>
-    <w:p>
-      <w:pPr>
-        <w:pStyle w:val="ListParagraph"/>
-        <w:numPr>
-          <w:ilvl w:val="0"/>
-          <w:numId w:val="2"/>
-        </w:numPr>
-        <w:spacing w:after="60" w:before="0"/>
-      </w:pPr>
-      <w:r>
-        <w:t xml:space="preserve">En haut : la couverture, le type, l'état de la traduction, le synopsis et les boutons pour reprendre la lecture, mettre l'œuvre en favori (avec une alerte à chaque sortie) et l'</w:t>
-      </w:r>
-      <w:r>
-        <w:rPr>
-          <w:b/>
-          <w:bCs/>
-        </w:rPr>
-        <w:t xml:space="preserve">Ajouter à une liste</w:t>
-      </w:r>
-      <w:r>
-        <w:t xml:space="preserve">.</w:t>
-      </w:r>
-    </w:p>
-    <w:p>
-      <w:pPr>
-        <w:pStyle w:val="ListParagraph"/>
-        <w:numPr>
-          <w:ilvl w:val="0"/>
-          <w:numId w:val="2"/>
-        </w:numPr>
-        <w:spacing w:after="60" w:before="0"/>
-      </w:pPr>
-      <w:r>
-        <w:t xml:space="preserve">À droite : la </w:t>
-      </w:r>
-      <w:r>
-        <w:rPr>
-          <w:b/>
-          <w:bCs/>
-        </w:rPr>
-        <w:t xml:space="preserve">Prochaine sortie</w:t>
-      </w:r>
-      <w:r>
-        <w:t xml:space="preserve">, quand un chapitre est programmé.</w:t>
-      </w:r>
-    </w:p>
-    <w:p>
-      <w:pPr>
-        <w:pStyle w:val="ListParagraph"/>
-        <w:numPr>
-          <w:ilvl w:val="0"/>
-          <w:numId w:val="2"/>
-        </w:numPr>
-        <w:spacing w:after="60" w:before="0"/>
-      </w:pPr>
-      <w:r>
-        <w:t xml:space="preserve">La liste des tomes : chaque tome avec sa parution (</w:t>
-      </w:r>
-      <w:r>
-        <w:rPr>
-          <w:b/>
-          <w:bCs/>
-        </w:rPr>
-        <w:t xml:space="preserve">À paraître</w:t>
-      </w:r>
-      <w:r>
-        <w:t xml:space="preserve">, </w:t>
-      </w:r>
-      <w:r>
-        <w:rPr>
-          <w:b/>
-          <w:bCs/>
-        </w:rPr>
-        <w:t xml:space="preserve">En cours</w:t>
-      </w:r>
-      <w:r>
-        <w:t xml:space="preserve">, </w:t>
-      </w:r>
-      <w:r>
-        <w:rPr>
-          <w:b/>
-          <w:bCs/>
-        </w:rPr>
-        <w:t xml:space="preserve">Complet</w:t>
-      </w:r>
-      <w:r>
-        <w:t xml:space="preserve">), </w:t>
-      </w:r>
-      <w:r>
-        <w:rPr>
-          <w:b/>
-          <w:bCs/>
-        </w:rPr>
-        <w:t xml:space="preserve">Lire en ligne</w:t>
-      </w:r>
-      <w:r>
-        <w:t xml:space="preserve"> et, pour un tome complet, </w:t>
-      </w:r>
-      <w:r>
-        <w:rPr>
-          <w:b/>
-          <w:bCs/>
-        </w:rPr>
-        <w:t xml:space="preserve">PDF</w:t>
-      </w:r>
-      <w:r>
-        <w:t xml:space="preserve"> et </w:t>
-      </w:r>
-      <w:r>
-        <w:rPr>
-          <w:b/>
-          <w:bCs/>
-        </w:rPr>
-        <w:t xml:space="preserve">EPUB</w:t>
-      </w:r>
-      <w:r>
-        <w:t xml:space="preserve">.</w:t>
-      </w:r>
-    </w:p>
-    <w:p>
-      <w:pPr>
-        <w:pStyle w:val="ListParagraph"/>
-        <w:numPr>
-          <w:ilvl w:val="0"/>
-          <w:numId w:val="2"/>
-        </w:numPr>
-        <w:spacing w:after="60" w:before="0"/>
-      </w:pPr>
-      <w:r>
-        <w:t xml:space="preserve">Les onglets </w:t>
-      </w:r>
-      <w:r>
-        <w:rPr>
-          <w:b/>
-          <w:bCs/>
-        </w:rPr>
-        <w:t xml:space="preserve">Actualités</w:t>
-      </w:r>
-      <w:r>
-        <w:t xml:space="preserve"> et </w:t>
-      </w:r>
-      <w:r>
-        <w:rPr>
-          <w:b/>
-          <w:bCs/>
-        </w:rPr>
-        <w:t xml:space="preserve">Glossaire</w:t>
-      </w:r>
-      <w:r>
-        <w:t xml:space="preserve"> apparaissent quand l'œuvre en a.</w:t>
-      </w:r>
-    </w:p>
-    <w:p>
-      <w:pPr>
-        <w:pStyle w:val="Heading2"/>
-      </w:pPr>
-      <w:bookmarkStart w:name="titre-58" w:id="124"/>
-      <w:r>
-        <w:t xml:space="preserve">11.2 La page d'un tome en cours</w:t>
-      </w:r>
-      <w:bookmarkEnd w:id="124"/>
-    </w:p>
-    <w:p>
-      <w:pPr>
-        <w:keepNext/>
-        <w:spacing w:after="60" w:before="160"/>
-        <w:jc w:val="center"/>
-      </w:pPr>
-      <w:r>
-        <w:drawing>
-          <wp:inline distT="0" distB="0" distL="0" distR="0">
-            <wp:extent cx="5715000" cy="3476625"/>
-            <wp:effectExtent t="0" r="0" b="0" l="0"/>
-            <wp:docPr id="36" name="PublicTome-page.png" descr="La page d'un tome en cours, vue par un lecteur." title="La page d'un tome en cours, vue par un lecteur."/>
-            <wp:cNvGraphicFramePr>
-              <a:graphicFrameLocks xmlns:a="http://schemas.openxmlformats.org/drawingml/2006/main" noChangeAspect="1"/>
-            </wp:cNvGraphicFramePr>
-            <a:graphic xmlns:a="http://schemas.openxmlformats.org/drawingml/2006/main">
-              <a:graphicData uri="http://schemas.openxmlformats.org/drawingml/2006/picture">
-                <pic:pic xmlns:pic="http://schemas.openxmlformats.org/drawingml/2006/picture">
-                  <pic:nvPicPr>
-                    <pic:cNvPr id="0" name="" descr=""/>
-                    <pic:cNvPicPr>
-                      <a:picLocks noChangeAspect="1" noChangeArrowheads="1"/>
-                    </pic:cNvPicPr>
-                  </pic:nvPicPr>
-                  <pic:blipFill>
-                    <a:blip r:embed="rId28" cstate="none"/>
-                    <a:srcRect/>
-                    <a:stretch>
-                      <a:fillRect/>
-                    </a:stretch>
-                  </pic:blipFill>
-                  <pic:spPr bwMode="auto">
-                    <a:xfrm>
-                      <a:off x="0" y="0"/>
                       <a:ext cx="5715000" cy="3476625"/>
                     </a:xfrm>
                     <a:prstGeom prst="rect">
@@ -17214,14 +17947,30 @@
                 <w:sz w:val="19"/>
                 <w:szCs w:val="19"/>
               </w:rPr>
-              <w:t xml:space="preserve">Tome complet</w:t>
-            </w:r>
-            <w:r>
-              <w:rPr>
-                <w:sz w:val="19"/>
-                <w:szCs w:val="19"/>
-              </w:rPr>
-              <w:t xml:space="preserve"> : remplacez le lien, puis </w:t>
+              <w:t xml:space="preserve">État du tome</w:t>
+            </w:r>
+            <w:r>
+              <w:rPr>
+                <w:sz w:val="19"/>
+                <w:szCs w:val="19"/>
+              </w:rPr>
+              <w:t xml:space="preserve"> (</w:t>
+            </w:r>
+            <w:r>
+              <w:rPr>
+                <w:b/>
+                <w:bCs/>
+                <w:sz w:val="19"/>
+                <w:szCs w:val="19"/>
+              </w:rPr>
+              <w:t xml:space="preserve">Publié</w:t>
+            </w:r>
+            <w:r>
+              <w:rPr>
+                <w:sz w:val="19"/>
+                <w:szCs w:val="19"/>
+              </w:rPr>
+              <w:t xml:space="preserve">) : remplacez le lien, puis </w:t>
             </w:r>
             <w:r>
               <w:rPr>
@@ -18296,7 +19045,7 @@
         <w:sz w:val="17"/>
         <w:szCs w:val="17"/>
       </w:rPr>
-      <w:t xml:space="preserve">Version 2.1.5-dev.5 du 1er octobre 2026</w:t>
+      <w:t xml:space="preserve">Version 2.1.5-dev.8 du 1er octobre 2026</w:t>
     </w:r>
     <w:r>
       <w:rPr>

</xml_diff>

<commit_message>
MangaDex : garde-fou des chapitres en double (2.3.0-dev.14)
Un seul chapitre par numéro et par volume compatible : celui déjà sur le
site, sinon le premier mis en lecture. Les doublons ne sont ni créés ni mis
à jour et sont listés au rapport avec leur lien MangaDex. Même numéro dans
un autre volume et oneshots non concernés ; si le chapitre gardé disparaît
de MangaDex, le doublon prend sa place. Tests, contrat §8 bis, procédures,
guide de l'équipe (DOCX reconstruit) et journal des décisions.

Co-Authored-By: Claude Opus 5.5 <noreply@anthropic.com>
Claude-Session: https://claude.ai/code/session_01T7LJMtQz7RsnJA7p5Eg2Ev
</commit_message>
<xml_diff>
--- a/docs/guide-equipe/Guide-equipe-Yume-Novel.docx
+++ b/docs/guide-equipe/Guide-equipe-Yume-Novel.docx
@@ -61,7 +61,7 @@
           <w:sz w:val="22"/>
           <w:szCs w:val="22"/>
         </w:rPr>
-        <w:t xml:space="preserve">Version 2.3.0-dev.13 du 17 octobre 2026</w:t>
+        <w:t xml:space="preserve">Version 2.3.0-dev.14 du 17 octobre 2026</w:t>
       </w:r>
     </w:p>
     <w:p>
@@ -7556,8 +7556,8 @@
         </w:tblBorders>
       </w:tblPr>
       <w:tblGrid>
-        <w:gridCol w:w="3032"/>
-        <w:gridCol w:w="5994"/>
+        <w:gridCol w:w="3093"/>
+        <w:gridCol w:w="5933"/>
       </w:tblGrid>
       <w:tr>
         <w:trPr>
@@ -7566,7 +7566,7 @@
         </w:trPr>
         <w:tc>
           <w:tcPr>
-            <w:tcW w:type="dxa" w:w="3032"/>
+            <w:tcW w:type="dxa" w:w="3093"/>
             <w:tcBorders>
               <w:top w:val="single" w:color="CFC6DE" w:sz="4"/>
               <w:left w:val="single" w:color="CFC6DE" w:sz="4"/>
@@ -7607,7 +7607,7 @@
         </w:tc>
         <w:tc>
           <w:tcPr>
-            <w:tcW w:type="dxa" w:w="5994"/>
+            <w:tcW w:type="dxa" w:w="5933"/>
             <w:tcBorders>
               <w:top w:val="single" w:color="CFC6DE" w:sz="4"/>
               <w:left w:val="single" w:color="CFC6DE" w:sz="4"/>
@@ -7654,7 +7654,7 @@
         </w:trPr>
         <w:tc>
           <w:tcPr>
-            <w:tcW w:type="dxa" w:w="3032"/>
+            <w:tcW w:type="dxa" w:w="3093"/>
             <w:tcBorders>
               <w:top w:val="single" w:color="CFC6DE" w:sz="4"/>
               <w:left w:val="single" w:color="CFC6DE" w:sz="4"/>
@@ -7690,7 +7690,7 @@
         </w:tc>
         <w:tc>
           <w:tcPr>
-            <w:tcW w:type="dxa" w:w="5994"/>
+            <w:tcW w:type="dxa" w:w="5933"/>
             <w:tcBorders>
               <w:top w:val="single" w:color="CFC6DE" w:sz="4"/>
               <w:left w:val="single" w:color="CFC6DE" w:sz="4"/>
@@ -7730,7 +7730,7 @@
         </w:trPr>
         <w:tc>
           <w:tcPr>
-            <w:tcW w:type="dxa" w:w="3032"/>
+            <w:tcW w:type="dxa" w:w="3093"/>
             <w:tcBorders>
               <w:top w:val="single" w:color="CFC6DE" w:sz="4"/>
               <w:left w:val="single" w:color="CFC6DE" w:sz="4"/>
@@ -7767,7 +7767,7 @@
         </w:tc>
         <w:tc>
           <w:tcPr>
-            <w:tcW w:type="dxa" w:w="5994"/>
+            <w:tcW w:type="dxa" w:w="5933"/>
             <w:tcBorders>
               <w:top w:val="single" w:color="CFC6DE" w:sz="4"/>
               <w:left w:val="single" w:color="CFC6DE" w:sz="4"/>
@@ -7808,7 +7808,7 @@
         </w:trPr>
         <w:tc>
           <w:tcPr>
-            <w:tcW w:type="dxa" w:w="3032"/>
+            <w:tcW w:type="dxa" w:w="3093"/>
             <w:tcBorders>
               <w:top w:val="single" w:color="CFC6DE" w:sz="4"/>
               <w:left w:val="single" w:color="CFC6DE" w:sz="4"/>
@@ -7844,7 +7844,7 @@
         </w:tc>
         <w:tc>
           <w:tcPr>
-            <w:tcW w:type="dxa" w:w="5994"/>
+            <w:tcW w:type="dxa" w:w="5933"/>
             <w:tcBorders>
               <w:top w:val="single" w:color="CFC6DE" w:sz="4"/>
               <w:left w:val="single" w:color="CFC6DE" w:sz="4"/>
@@ -7884,7 +7884,7 @@
         </w:trPr>
         <w:tc>
           <w:tcPr>
-            <w:tcW w:type="dxa" w:w="3032"/>
+            <w:tcW w:type="dxa" w:w="3093"/>
             <w:tcBorders>
               <w:top w:val="single" w:color="CFC6DE" w:sz="4"/>
               <w:left w:val="single" w:color="CFC6DE" w:sz="4"/>
@@ -7921,7 +7921,7 @@
         </w:tc>
         <w:tc>
           <w:tcPr>
-            <w:tcW w:type="dxa" w:w="5994"/>
+            <w:tcW w:type="dxa" w:w="5933"/>
             <w:tcBorders>
               <w:top w:val="single" w:color="CFC6DE" w:sz="4"/>
               <w:left w:val="single" w:color="CFC6DE" w:sz="4"/>
@@ -7951,6 +7951,82 @@
                 <w:szCs w:val="19"/>
               </w:rPr>
               <w:t xml:space="preserve">Chapitres mis en brouillon par l'équipe et modifiés sur MangaDex : leur titre est mis à jour, ils restent hors ligne.</w:t>
+            </w:r>
+          </w:p>
+        </w:tc>
+      </w:tr>
+      <w:tr>
+        <w:trPr>
+          <w:cantSplit/>
+          <w:tblHeader w:val="off"/>
+        </w:trPr>
+        <w:tc>
+          <w:tcPr>
+            <w:tcW w:type="dxa" w:w="3093"/>
+            <w:tcBorders>
+              <w:top w:val="single" w:color="CFC6DE" w:sz="4"/>
+              <w:left w:val="single" w:color="CFC6DE" w:sz="4"/>
+              <w:bottom w:val="single" w:color="CFC6DE" w:sz="4"/>
+              <w:right w:val="single" w:color="CFC6DE" w:sz="4"/>
+            </w:tcBorders>
+            <w:tcMar>
+              <w:top w:type="dxa" w:w="70"/>
+              <w:left w:type="dxa" w:w="110"/>
+              <w:bottom w:type="dxa" w:w="70"/>
+              <w:right w:type="dxa" w:w="110"/>
+            </w:tcMar>
+            <w:vAlign w:val="center"/>
+          </w:tcPr>
+          <w:p>
+            <w:pPr>
+              <w:spacing w:after="0" w:before="0"/>
+              <w:rPr>
+                <w:sz w:val="19"/>
+                <w:szCs w:val="19"/>
+              </w:rPr>
+            </w:pPr>
+            <w:r>
+              <w:rPr>
+                <w:b/>
+                <w:bCs/>
+                <w:sz w:val="19"/>
+                <w:szCs w:val="19"/>
+              </w:rPr>
+              <w:t xml:space="preserve">Chapitres en double sur MangaDex (ignorés)</w:t>
+            </w:r>
+          </w:p>
+        </w:tc>
+        <w:tc>
+          <w:tcPr>
+            <w:tcW w:type="dxa" w:w="5933"/>
+            <w:tcBorders>
+              <w:top w:val="single" w:color="CFC6DE" w:sz="4"/>
+              <w:left w:val="single" w:color="CFC6DE" w:sz="4"/>
+              <w:bottom w:val="single" w:color="CFC6DE" w:sz="4"/>
+              <w:right w:val="single" w:color="CFC6DE" w:sz="4"/>
+            </w:tcBorders>
+            <w:tcMar>
+              <w:top w:type="dxa" w:w="70"/>
+              <w:left w:type="dxa" w:w="110"/>
+              <w:bottom w:type="dxa" w:w="70"/>
+              <w:right w:type="dxa" w:w="110"/>
+            </w:tcMar>
+            <w:vAlign w:val="center"/>
+          </w:tcPr>
+          <w:p>
+            <w:pPr>
+              <w:spacing w:after="0" w:before="0"/>
+              <w:rPr>
+                <w:sz w:val="19"/>
+                <w:szCs w:val="19"/>
+              </w:rPr>
+            </w:pPr>
+            <w:r>
+              <w:rPr>
+                <w:sz w:val="19"/>
+                <w:szCs w:val="19"/>
+              </w:rPr>
+              <w:t xml:space="preserve">Le même chapitre a été envoyé plusieurs fois sur MangaDex. Le site garde celui déjà en ligne (sinon le premier sorti). Supprimez le doublon sur MangaDex avec le lien du rapport.</w:t>
             </w:r>
           </w:p>
         </w:tc>
@@ -25534,7 +25610,7 @@
         <w:sz w:val="17"/>
         <w:szCs w:val="17"/>
       </w:rPr>
-      <w:t xml:space="preserve">Version 2.3.0-dev.13 du 17 octobre 2026</w:t>
+      <w:t xml:space="preserve">Version 2.3.0-dev.14 du 17 octobre 2026</w:t>
     </w:r>
     <w:r>
       <w:rPr>

</xml_diff>

<commit_message>
Version 2.3.0 : lecture des mangas MangaDex sur le site
Passage de 2.3.0-dev.14 à 2.3.0 pour la mise en ligne. Journal des
décisions : Agents of the Four Seasons passe à « Licenciée », permissions
d'envoi du groupe MangaDex inchangées. Guide de l'équipe régénéré.

Co-Authored-By: Claude Opus 5.5 <noreply@anthropic.com>
Claude-Session: https://claude.ai/code/session_01T7LJMtQz7RsnJA7p5Eg2Ev
</commit_message>
<xml_diff>
--- a/docs/guide-equipe/Guide-equipe-Yume-Novel.docx
+++ b/docs/guide-equipe/Guide-equipe-Yume-Novel.docx
@@ -61,7 +61,7 @@
           <w:sz w:val="22"/>
           <w:szCs w:val="22"/>
         </w:rPr>
-        <w:t xml:space="preserve">Version 2.3.0-dev.14 du 17 octobre 2026</w:t>
+        <w:t xml:space="preserve">Version 2.3.0 du 18 octobre 2026</w:t>
       </w:r>
     </w:p>
     <w:p>
@@ -25610,7 +25610,7 @@
         <w:sz w:val="17"/>
         <w:szCs w:val="17"/>
       </w:rPr>
-      <w:t xml:space="preserve">Version 2.3.0-dev.14 du 17 octobre 2026</w:t>
+      <w:t xml:space="preserve">Version 2.3.0 du 18 octobre 2026</w:t>
     </w:r>
     <w:r>
       <w:rPr>

</xml_diff>

<commit_message>
Documentation MangaDex : vérifications en production (2.3.1-dev.1)
Résultats des contrôles faits le 18/10/2026 sur yumenovel.fr après la mise
en ligne de la 2.3.0 : images gardées par le cache de WordPress.com (MISS
puis HIT, contournement pour un lecteur connecté), aucune image dans la
médiathèque, relais fermé aux requêtes invalides ou étrangères. Contrat
§8 bis (cache mesuré), journal des décisions (jalon et release v2.3.0).

Co-Authored-By: Claude Opus 5.5 <noreply@anthropic.com>
Claude-Session: https://claude.ai/code/session_01T7LJMtQz7RsnJA7p5Eg2Ev
</commit_message>
<xml_diff>
--- a/docs/guide-equipe/Guide-equipe-Yume-Novel.docx
+++ b/docs/guide-equipe/Guide-equipe-Yume-Novel.docx
@@ -61,7 +61,7 @@
           <w:sz w:val="22"/>
           <w:szCs w:val="22"/>
         </w:rPr>
-        <w:t xml:space="preserve">Version 2.3.0 du 18 octobre 2026</w:t>
+        <w:t xml:space="preserve">Version 2.3.1-dev.1 du 18 octobre 2026</w:t>
       </w:r>
     </w:p>
     <w:p>
@@ -25610,7 +25610,7 @@
         <w:sz w:val="17"/>
         <w:szCs w:val="17"/>
       </w:rPr>
-      <w:t xml:space="preserve">Version 2.3.0 du 18 octobre 2026</w:t>
+      <w:t xml:space="preserve">Version 2.3.1-dev.1 du 18 octobre 2026</w:t>
     </w:r>
     <w:r>
       <w:rPr>

</xml_diff>

<commit_message>
Comptes inscrits : guide Word (chapitre, captures, question fréquente) et marges des cartes de la fiche (2.6.0-dev.8)
Co-Authored-By: Claude Opus 5.5 <noreply@anthropic.com>
Claude-Session: https://claude.ai/code/session_01HyLnmsEEcnC3nx3xxEVjck
</commit_message>
<xml_diff>
--- a/docs/guide-equipe/Guide-equipe-Yume-Novel.docx
+++ b/docs/guide-equipe/Guide-equipe-Yume-Novel.docx
@@ -61,7 +61,7 @@
           <w:sz w:val="22"/>
           <w:szCs w:val="22"/>
         </w:rPr>
-        <w:t xml:space="preserve">Version 2.5.1-dev.1 du 20 octobre 2026</w:t>
+        <w:t xml:space="preserve">Version 2.6.0-dev.8 du 24 octobre 2026</w:t>
       </w:r>
     </w:p>
     <w:p>
@@ -1626,7 +1626,7 @@
               <w:rPr>
                 <w:rStyle w:val="IndexLink"/>
               </w:rPr>
-              <w:t xml:space="default">14 Les coquilles signalées par les lecteurs</w:t>
+              <w:t xml:space="default">14 Les comptes inscrits (gérants)</w:t>
               <w:tab/>
               <w:t xml:space="default">55</w:t>
             </w:r>
@@ -1645,7 +1645,7 @@
               <w:rPr>
                 <w:rStyle w:val="IndexLink"/>
               </w:rPr>
-              <w:t xml:space="default">14.1 Comprendre ce que fait le lecteur</w:t>
+              <w:t xml:space="default">14.1 Trouver un compte</w:t>
               <w:tab/>
               <w:t xml:space="default">55</w:t>
             </w:r>
@@ -1664,9 +1664,9 @@
               <w:rPr>
                 <w:rStyle w:val="IndexLink"/>
               </w:rPr>
-              <w:t xml:space="default">14.2 Traiter une coquille</w:t>
+              <w:t xml:space="default">14.2 Consulter la fiche d'un compte</w:t>
               <w:tab/>
-              <w:t xml:space="default">55</w:t>
+              <w:t xml:space="default">56</w:t>
             </w:r>
           </w:hyperlink>
         </w:p>
@@ -1683,9 +1683,28 @@
               <w:rPr>
                 <w:rStyle w:val="IndexLink"/>
               </w:rPr>
-              <w:t xml:space="default">14.3 Retrouver les signalements traités</w:t>
+              <w:t xml:space="default">14.3 Ajouter un lecteur à l'équipe</w:t>
               <w:tab/>
               <w:t xml:space="default">57</w:t>
+            </w:r>
+          </w:hyperlink>
+        </w:p>
+        <w:p>
+          <w:pPr>
+            <w:pStyle w:val="TOC2"/>
+            <w:tabs>
+              <w:tab w:val="clear" w:pos="8786"/>
+              <w:tab w:val="right" w:pos="9025" w:leader="dot"/>
+            </w:tabs>
+          </w:pPr>
+          <w:hyperlink w:history="1" w:anchor="titre-84">
+            <w:r>
+              <w:rPr>
+                <w:rStyle w:val="IndexLink"/>
+              </w:rPr>
+              <w:t xml:space="default">14.4 Exporter la liste</w:t>
+              <w:tab/>
+              <w:t xml:space="default">58</w:t>
             </w:r>
           </w:hyperlink>
         </w:p>
@@ -1697,33 +1716,14 @@
               <w:tab w:val="right" w:pos="9025" w:leader="dot"/>
             </w:tabs>
           </w:pPr>
-          <w:hyperlink w:history="1" w:anchor="titre-84">
+          <w:hyperlink w:history="1" w:anchor="titre-85">
             <w:r>
               <w:rPr>
                 <w:rStyle w:val="IndexLink"/>
               </w:rPr>
-              <w:t xml:space="default">15 Glossaires, actualités et commentaires</w:t>
+              <w:t xml:space="default">15 Les coquilles signalées par les lecteurs</w:t>
               <w:tab/>
-              <w:t xml:space="default">58</w:t>
-            </w:r>
-          </w:hyperlink>
-        </w:p>
-        <w:p>
-          <w:pPr>
-            <w:pStyle w:val="TOC2"/>
-            <w:tabs>
-              <w:tab w:val="clear" w:pos="8786"/>
-              <w:tab w:val="right" w:pos="9025" w:leader="dot"/>
-            </w:tabs>
-          </w:pPr>
-          <w:hyperlink w:history="1" w:anchor="titre-85">
-            <w:r>
-              <w:rPr>
-                <w:rStyle w:val="IndexLink"/>
-              </w:rPr>
-              <w:t xml:space="default">15.1 Publier le glossaire d'une œuvre</w:t>
-              <w:tab/>
-              <w:t xml:space="default">58</w:t>
+              <w:t xml:space="default">59</w:t>
             </w:r>
           </w:hyperlink>
         </w:p>
@@ -1740,9 +1740,9 @@
               <w:rPr>
                 <w:rStyle w:val="IndexLink"/>
               </w:rPr>
-              <w:t xml:space="default">15.2 Lier une actualité à une œuvre</w:t>
+              <w:t xml:space="default">15.1 Comprendre ce que fait le lecteur</w:t>
               <w:tab/>
-              <w:t xml:space="default">58</w:t>
+              <w:t xml:space="default">59</w:t>
             </w:r>
           </w:hyperlink>
         </w:p>
@@ -1759,17 +1759,17 @@
               <w:rPr>
                 <w:rStyle w:val="IndexLink"/>
               </w:rPr>
-              <w:t xml:space="default">15.3 Modérer les commentaires</w:t>
+              <w:t xml:space="default">15.2 Traiter une coquille</w:t>
               <w:tab/>
-              <w:t xml:space="default">58</w:t>
+              <w:t xml:space="default">59</w:t>
             </w:r>
           </w:hyperlink>
         </w:p>
         <w:p>
           <w:pPr>
-            <w:pStyle w:val="TOC1"/>
+            <w:pStyle w:val="TOC2"/>
             <w:tabs>
-              <w:tab w:val="clear" w:pos="9026"/>
+              <w:tab w:val="clear" w:pos="8786"/>
               <w:tab w:val="right" w:pos="9025" w:leader="dot"/>
             </w:tabs>
           </w:pPr>
@@ -1778,9 +1778,9 @@
               <w:rPr>
                 <w:rStyle w:val="IndexLink"/>
               </w:rPr>
-              <w:t xml:space="default">16 Questions fréquentes</w:t>
+              <w:t xml:space="default">15.3 Retrouver les signalements traités</w:t>
               <w:tab/>
-              <w:t xml:space="default">59</w:t>
+              <w:t xml:space="default">61</w:t>
             </w:r>
           </w:hyperlink>
         </w:p>
@@ -1797,9 +1797,9 @@
               <w:rPr>
                 <w:rStyle w:val="IndexLink"/>
               </w:rPr>
-              <w:t xml:space="default">17 En cas de problème</w:t>
+              <w:t xml:space="default">16 Glossaires, actualités et commentaires</w:t>
               <w:tab/>
-              <w:t xml:space="default">61</w:t>
+              <w:t xml:space="default">62</w:t>
             </w:r>
           </w:hyperlink>
         </w:p>
@@ -1816,9 +1816,9 @@
               <w:rPr>
                 <w:rStyle w:val="IndexLink"/>
               </w:rPr>
-              <w:t xml:space="default">17.1 Qui contacter</w:t>
+              <w:t xml:space="default">16.1 Publier le glossaire d'une œuvre</w:t>
               <w:tab/>
-              <w:t xml:space="default">61</w:t>
+              <w:t xml:space="default">62</w:t>
             </w:r>
           </w:hyperlink>
         </w:p>
@@ -1835,9 +1835,104 @@
               <w:rPr>
                 <w:rStyle w:val="IndexLink"/>
               </w:rPr>
-              <w:t xml:space="default">17.2 Signaler un problème</w:t>
+              <w:t xml:space="default">16.2 Lier une actualité à une œuvre</w:t>
               <w:tab/>
-              <w:t xml:space="default">61</w:t>
+              <w:t xml:space="default">62</w:t>
+            </w:r>
+          </w:hyperlink>
+        </w:p>
+        <w:p>
+          <w:pPr>
+            <w:pStyle w:val="TOC2"/>
+            <w:tabs>
+              <w:tab w:val="clear" w:pos="8786"/>
+              <w:tab w:val="right" w:pos="9025" w:leader="dot"/>
+            </w:tabs>
+          </w:pPr>
+          <w:hyperlink w:history="1" w:anchor="titre-92">
+            <w:r>
+              <w:rPr>
+                <w:rStyle w:val="IndexLink"/>
+              </w:rPr>
+              <w:t xml:space="default">16.3 Modérer les commentaires</w:t>
+              <w:tab/>
+              <w:t xml:space="default">62</w:t>
+            </w:r>
+          </w:hyperlink>
+        </w:p>
+        <w:p>
+          <w:pPr>
+            <w:pStyle w:val="TOC1"/>
+            <w:tabs>
+              <w:tab w:val="clear" w:pos="9026"/>
+              <w:tab w:val="right" w:pos="9025" w:leader="dot"/>
+            </w:tabs>
+          </w:pPr>
+          <w:hyperlink w:history="1" w:anchor="titre-93">
+            <w:r>
+              <w:rPr>
+                <w:rStyle w:val="IndexLink"/>
+              </w:rPr>
+              <w:t xml:space="default">17 Questions fréquentes</w:t>
+              <w:tab/>
+              <w:t xml:space="default">63</w:t>
+            </w:r>
+          </w:hyperlink>
+        </w:p>
+        <w:p>
+          <w:pPr>
+            <w:pStyle w:val="TOC1"/>
+            <w:tabs>
+              <w:tab w:val="clear" w:pos="9026"/>
+              <w:tab w:val="right" w:pos="9025" w:leader="dot"/>
+            </w:tabs>
+          </w:pPr>
+          <w:hyperlink w:history="1" w:anchor="titre-94">
+            <w:r>
+              <w:rPr>
+                <w:rStyle w:val="IndexLink"/>
+              </w:rPr>
+              <w:t xml:space="default">18 En cas de problème</w:t>
+              <w:tab/>
+              <w:t xml:space="default">65</w:t>
+            </w:r>
+          </w:hyperlink>
+        </w:p>
+        <w:p>
+          <w:pPr>
+            <w:pStyle w:val="TOC2"/>
+            <w:tabs>
+              <w:tab w:val="clear" w:pos="8786"/>
+              <w:tab w:val="right" w:pos="9025" w:leader="dot"/>
+            </w:tabs>
+          </w:pPr>
+          <w:hyperlink w:history="1" w:anchor="titre-95">
+            <w:r>
+              <w:rPr>
+                <w:rStyle w:val="IndexLink"/>
+              </w:rPr>
+              <w:t xml:space="default">18.1 Qui contacter</w:t>
+              <w:tab/>
+              <w:t xml:space="default">65</w:t>
+            </w:r>
+          </w:hyperlink>
+        </w:p>
+        <w:p>
+          <w:pPr>
+            <w:pStyle w:val="TOC2"/>
+            <w:tabs>
+              <w:tab w:val="clear" w:pos="8786"/>
+              <w:tab w:val="right" w:pos="9025" w:leader="dot"/>
+            </w:tabs>
+          </w:pPr>
+          <w:hyperlink w:history="1" w:anchor="titre-96">
+            <w:r>
+              <w:rPr>
+                <w:rStyle w:val="IndexLink"/>
+              </w:rPr>
+              <w:t xml:space="default">18.2 Signaler un problème</w:t>
+              <w:tab/>
+              <w:t xml:space="default">65</w:t>
             </w:r>
           </w:hyperlink>
           <w:r>
@@ -1850,21 +1945,21 @@
       <w:pPr>
         <w:pStyle w:val="Heading1"/>
       </w:pPr>
-      <w:bookmarkStart w:name="titre-1" w:id="92"/>
+      <w:bookmarkStart w:name="titre-1" w:id="97"/>
       <w:r>
         <w:t xml:space="preserve">1 Bienvenue dans l'espace équipe</w:t>
       </w:r>
-      <w:bookmarkEnd w:id="92"/>
+      <w:bookmarkEnd w:id="97"/>
     </w:p>
     <w:p>
       <w:pPr>
         <w:pStyle w:val="Heading2"/>
       </w:pPr>
-      <w:bookmarkStart w:name="titre-2" w:id="93"/>
+      <w:bookmarkStart w:name="titre-2" w:id="98"/>
       <w:r>
         <w:t xml:space="preserve">1.1 À quoi sert l'espace équipe</w:t>
       </w:r>
-      <w:bookmarkEnd w:id="93"/>
+      <w:bookmarkEnd w:id="98"/>
     </w:p>
     <w:p>
       <w:r>
@@ -1978,11 +2073,11 @@
       <w:pPr>
         <w:pStyle w:val="Heading2"/>
       </w:pPr>
-      <w:bookmarkStart w:name="titre-3" w:id="94"/>
+      <w:bookmarkStart w:name="titre-3" w:id="99"/>
       <w:r>
         <w:t xml:space="preserve">1.2 Qui peut faire quoi</w:t>
       </w:r>
-      <w:bookmarkEnd w:id="94"/>
+      <w:bookmarkEnd w:id="99"/>
     </w:p>
     <w:p>
       <w:r>
@@ -2350,7 +2445,7 @@
                 <w:sz w:val="19"/>
                 <w:szCs w:val="19"/>
               </w:rPr>
-              <w:t xml:space="preserve">Tout ce qui précède, plus : gérer les membres et leurs rôles, voir les indicateurs et la santé du site, modifier les réglages, voir et exporter la liste des lecteurs qui suivent une œuvre.</w:t>
+              <w:t xml:space="preserve">Tout ce qui précède, plus : gérer les membres et leurs rôles, voir les indicateurs et la santé du site, modifier les réglages, voir et exporter la liste des lecteurs qui suivent une œuvre, consulter les comptes inscrits et les ajouter à l'équipe.</w:t>
             </w:r>
           </w:p>
         </w:tc>
@@ -2423,11 +2518,11 @@
       <w:pPr>
         <w:pStyle w:val="Heading2"/>
       </w:pPr>
-      <w:bookmarkStart w:name="titre-4" w:id="95"/>
+      <w:bookmarkStart w:name="titre-4" w:id="100"/>
       <w:r>
         <w:t xml:space="preserve">1.3 Se connecter</w:t>
       </w:r>
-      <w:bookmarkEnd w:id="95"/>
+      <w:bookmarkEnd w:id="100"/>
     </w:p>
     <w:p>
       <w:pPr>
@@ -2900,21 +2995,21 @@
       <w:pPr>
         <w:pStyle w:val="Heading1"/>
       </w:pPr>
-      <w:bookmarkStart w:name="titre-5" w:id="96"/>
+      <w:bookmarkStart w:name="titre-5" w:id="101"/>
       <w:r>
         <w:t xml:space="preserve">2 Le tableau de bord et le menu</w:t>
       </w:r>
-      <w:bookmarkEnd w:id="96"/>
+      <w:bookmarkEnd w:id="101"/>
     </w:p>
     <w:p>
       <w:pPr>
         <w:pStyle w:val="Heading2"/>
       </w:pPr>
-      <w:bookmarkStart w:name="titre-6" w:id="97"/>
+      <w:bookmarkStart w:name="titre-6" w:id="102"/>
       <w:r>
         <w:t xml:space="preserve">2.1 Lire le tableau de bord</w:t>
       </w:r>
-      <w:bookmarkEnd w:id="97"/>
+      <w:bookmarkEnd w:id="102"/>
     </w:p>
     <w:p>
       <w:r>
@@ -3055,11 +3150,11 @@
       <w:pPr>
         <w:pStyle w:val="Heading2"/>
       </w:pPr>
-      <w:bookmarkStart w:name="titre-7" w:id="98"/>
+      <w:bookmarkStart w:name="titre-7" w:id="103"/>
       <w:r>
         <w:t xml:space="preserve">2.2 Se repérer dans le menu</w:t>
       </w:r>
-      <w:bookmarkEnd w:id="98"/>
+      <w:bookmarkEnd w:id="103"/>
     </w:p>
     <w:p>
       <w:r>
@@ -3137,7 +3232,7 @@
           <wp:inline distT="0" distB="0" distL="0" distR="0">
             <wp:extent cx="5715000" cy="3676650"/>
             <wp:effectExtent t="0" r="0" b="0" l="0"/>
-            <wp:docPr id="33" name="Schema-Menu-page.png" descr="Le menu de l'espace équipe, entièrement déplié, et qui voit chaque entrée (schéma)." title="Le menu de l'espace équipe, entièrement déplié, et qui voit chaque entrée (schéma)."/>
+            <wp:docPr id="35" name="Schema-Menu-page.png" descr="Le menu de l'espace équipe, entièrement déplié, et qui voit chaque entrée (schéma)." title="Le menu de l'espace équipe, entièrement déplié, et qui voit chaque entrée (schéma)."/>
             <wp:cNvGraphicFramePr>
               <a:graphicFrameLocks xmlns:a="http://schemas.openxmlformats.org/drawingml/2006/main" noChangeAspect="1"/>
             </wp:cNvGraphicFramePr>
@@ -3270,11 +3365,11 @@
       <w:pPr>
         <w:pStyle w:val="Heading2"/>
       </w:pPr>
-      <w:bookmarkStart w:name="titre-8" w:id="99"/>
+      <w:bookmarkStart w:name="titre-8" w:id="104"/>
       <w:r>
         <w:t xml:space="preserve">2.3 Utiliser les raccourcis d'un tome</w:t>
       </w:r>
-      <w:bookmarkEnd w:id="99"/>
+      <w:bookmarkEnd w:id="104"/>
     </w:p>
     <w:p>
       <w:r>
@@ -3385,11 +3480,11 @@
       <w:pPr>
         <w:pStyle w:val="Heading1"/>
       </w:pPr>
-      <w:bookmarkStart w:name="titre-9" w:id="100"/>
+      <w:bookmarkStart w:name="titre-9" w:id="105"/>
       <w:r>
         <w:t xml:space="preserve">3 Le planning</w:t>
       </w:r>
-      <w:bookmarkEnd w:id="100"/>
+      <w:bookmarkEnd w:id="105"/>
     </w:p>
     <w:p>
       <w:r>
@@ -3417,7 +3512,7 @@
           <wp:inline distT="0" distB="0" distL="0" distR="0">
             <wp:extent cx="5715000" cy="3048000"/>
             <wp:effectExtent t="0" r="0" b="0" l="0"/>
-            <wp:docPr id="34" name="Schema-Planning-page.png" descr="Les étapes du planning, une tâche, les états vus par les lecteurs et les rappels (schéma)." title="Les étapes du planning, une tâche, les états vus par les lecteurs et les rappels (schéma)."/>
+            <wp:docPr id="36" name="Schema-Planning-page.png" descr="Les étapes du planning, une tâche, les états vus par les lecteurs et les rappels (schéma)." title="Les étapes du planning, une tâche, les états vus par les lecteurs et les rappels (schéma)."/>
             <wp:cNvGraphicFramePr>
               <a:graphicFrameLocks xmlns:a="http://schemas.openxmlformats.org/drawingml/2006/main" noChangeAspect="1"/>
             </wp:cNvGraphicFramePr>
@@ -3472,11 +3567,11 @@
       <w:pPr>
         <w:pStyle w:val="Heading2"/>
       </w:pPr>
-      <w:bookmarkStart w:name="titre-10" w:id="101"/>
+      <w:bookmarkStart w:name="titre-10" w:id="106"/>
       <w:r>
         <w:t xml:space="preserve">3.1 Mettre à jour son avancement</w:t>
       </w:r>
-      <w:bookmarkEnd w:id="101"/>
+      <w:bookmarkEnd w:id="106"/>
     </w:p>
     <w:p>
       <w:pPr>
@@ -3804,11 +3899,11 @@
       <w:pPr>
         <w:pStyle w:val="Heading2"/>
       </w:pPr>
-      <w:bookmarkStart w:name="titre-11" w:id="102"/>
+      <w:bookmarkStart w:name="titre-11" w:id="107"/>
       <w:r>
         <w:t xml:space="preserve">3.2 Signaler un tome bloqué</w:t>
       </w:r>
-      <w:bookmarkEnd w:id="102"/>
+      <w:bookmarkEnd w:id="107"/>
     </w:p>
     <w:p>
       <w:r>
@@ -3926,11 +4021,11 @@
       <w:pPr>
         <w:pStyle w:val="Heading2"/>
       </w:pPr>
-      <w:bookmarkStart w:name="titre-12" w:id="103"/>
+      <w:bookmarkStart w:name="titre-12" w:id="108"/>
       <w:r>
         <w:t xml:space="preserve">3.3 Mettre à jour une tâche « En attente »</w:t>
       </w:r>
-      <w:bookmarkEnd w:id="103"/>
+      <w:bookmarkEnd w:id="108"/>
     </w:p>
     <w:p>
       <w:r>
@@ -3971,11 +4066,11 @@
       <w:pPr>
         <w:pStyle w:val="Heading2"/>
       </w:pPr>
-      <w:bookmarkStart w:name="titre-13" w:id="104"/>
+      <w:bookmarkStart w:name="titre-13" w:id="109"/>
       <w:r>
         <w:t xml:space="preserve">3.4 Comprendre ce que voient les lecteurs</w:t>
       </w:r>
-      <w:bookmarkEnd w:id="104"/>
+      <w:bookmarkEnd w:id="109"/>
     </w:p>
     <w:tbl>
       <w:tblPr>
@@ -4594,11 +4689,11 @@
       <w:pPr>
         <w:pStyle w:val="Heading2"/>
       </w:pPr>
-      <w:bookmarkStart w:name="titre-14" w:id="105"/>
+      <w:bookmarkStart w:name="titre-14" w:id="110"/>
       <w:r>
         <w:t xml:space="preserve">3.5 Recevoir (ou ne plus recevoir) les rappels</w:t>
       </w:r>
-      <w:bookmarkEnd w:id="105"/>
+      <w:bookmarkEnd w:id="110"/>
     </w:p>
     <w:p>
       <w:r>
@@ -4850,11 +4945,11 @@
       <w:pPr>
         <w:pStyle w:val="Heading2"/>
       </w:pPr>
-      <w:bookmarkStart w:name="titre-15" w:id="106"/>
+      <w:bookmarkStart w:name="titre-15" w:id="111"/>
       <w:r>
         <w:t xml:space="preserve">3.6 Mettre un tome en pause</w:t>
       </w:r>
-      <w:bookmarkEnd w:id="106"/>
+      <w:bookmarkEnd w:id="111"/>
     </w:p>
     <w:p>
       <w:r>
@@ -4964,11 +5059,11 @@
       <w:pPr>
         <w:pStyle w:val="Heading2"/>
       </w:pPr>
-      <w:bookmarkStart w:name="titre-16" w:id="107"/>
+      <w:bookmarkStart w:name="titre-16" w:id="112"/>
       <w:r>
         <w:t xml:space="preserve">3.7 Retirer un tome ajouté par erreur</w:t>
       </w:r>
-      <w:bookmarkEnd w:id="107"/>
+      <w:bookmarkEnd w:id="112"/>
     </w:p>
     <w:p>
       <w:r>
@@ -5037,11 +5132,11 @@
       <w:pPr>
         <w:pStyle w:val="Heading2"/>
       </w:pPr>
-      <w:bookmarkStart w:name="titre-17" w:id="108"/>
+      <w:bookmarkStart w:name="titre-17" w:id="113"/>
       <w:r>
         <w:t xml:space="preserve">3.8 Trouver un tome dans le planning complet</w:t>
       </w:r>
-      <w:bookmarkEnd w:id="108"/>
+      <w:bookmarkEnd w:id="113"/>
     </w:p>
     <w:p>
       <w:r>
@@ -5185,11 +5280,11 @@
       <w:pPr>
         <w:pStyle w:val="Heading1"/>
       </w:pPr>
-      <w:bookmarkStart w:name="titre-18" w:id="109"/>
+      <w:bookmarkStart w:name="titre-18" w:id="114"/>
       <w:r>
         <w:t xml:space="preserve">4 Les œuvres</w:t>
       </w:r>
-      <w:bookmarkEnd w:id="109"/>
+      <w:bookmarkEnd w:id="114"/>
     </w:p>
     <w:p>
       <w:r>
@@ -5220,11 +5315,11 @@
       <w:pPr>
         <w:pStyle w:val="Heading2"/>
       </w:pPr>
-      <w:bookmarkStart w:name="titre-19" w:id="110"/>
+      <w:bookmarkStart w:name="titre-19" w:id="115"/>
       <w:r>
         <w:t xml:space="preserve">4.1 Créer une œuvre</w:t>
       </w:r>
-      <w:bookmarkEnd w:id="110"/>
+      <w:bookmarkEnd w:id="115"/>
     </w:p>
     <w:p>
       <w:pPr>
@@ -5678,11 +5773,11 @@
       <w:pPr>
         <w:pStyle w:val="Heading2"/>
       </w:pPr>
-      <w:bookmarkStart w:name="titre-20" w:id="111"/>
+      <w:bookmarkStart w:name="titre-20" w:id="116"/>
       <w:r>
         <w:t xml:space="preserve">4.2 Modifier une œuvre et cadrer sa couverture</w:t>
       </w:r>
-      <w:bookmarkEnd w:id="111"/>
+      <w:bookmarkEnd w:id="116"/>
     </w:p>
     <w:p>
       <w:pPr>
@@ -5815,11 +5910,11 @@
       <w:pPr>
         <w:pStyle w:val="Heading2"/>
       </w:pPr>
-      <w:bookmarkStart w:name="titre-21" w:id="112"/>
+      <w:bookmarkStart w:name="titre-21" w:id="117"/>
       <w:r>
         <w:t xml:space="preserve">4.3 Annoncer une nouvelle série sans dévoiler son titre</w:t>
       </w:r>
-      <w:bookmarkEnd w:id="112"/>
+      <w:bookmarkEnd w:id="117"/>
     </w:p>
     <w:p>
       <w:r>
@@ -6012,7 +6107,7 @@
           <wp:inline distT="0" distB="0" distL="0" distR="0">
             <wp:extent cx="5715000" cy="5200650"/>
             <wp:effectExtent t="0" r="0" b="0" l="0"/>
-            <wp:docPr id="35" name="SerieAVenirFormulaire-page.png" descr="La section « Annonce au planning » de « Nouvelle œuvre », et la pastille « Titre caché au public » dans la liste." title="La section « Annonce au planning » de « Nouvelle œuvre », et la pastille « Titre caché au public » dans la liste."/>
+            <wp:docPr id="37" name="SerieAVenirFormulaire-page.png" descr="La section « Annonce au planning » de « Nouvelle œuvre », et la pastille « Titre caché au public » dans la liste." title="La section « Annonce au planning » de « Nouvelle œuvre », et la pastille « Titre caché au public » dans la liste."/>
             <wp:cNvGraphicFramePr>
               <a:graphicFrameLocks xmlns:a="http://schemas.openxmlformats.org/drawingml/2006/main" noChangeAspect="1"/>
             </wp:cNvGraphicFramePr>
@@ -6089,7 +6184,7 @@
           <wp:inline distT="0" distB="0" distL="0" distR="0">
             <wp:extent cx="5715000" cy="5953125"/>
             <wp:effectExtent t="0" r="0" b="0" l="0"/>
-            <wp:docPr id="36" name="SerieAVenirPublic-page.png" descr="Côté lecteurs : « Nouvelle série à venir · Tome 1 » dans le planning de l'accueil et sur la page Planning." title="Côté lecteurs : « Nouvelle série à venir · Tome 1 » dans le planning de l'accueil et sur la page Planning."/>
+            <wp:docPr id="38" name="SerieAVenirPublic-page.png" descr="Côté lecteurs : « Nouvelle série à venir · Tome 1 » dans le planning de l'accueil et sur la page Planning." title="Côté lecteurs : « Nouvelle série à venir · Tome 1 » dans le planning de l'accueil et sur la page Planning."/>
             <wp:cNvGraphicFramePr>
               <a:graphicFrameLocks xmlns:a="http://schemas.openxmlformats.org/drawingml/2006/main" noChangeAspect="1"/>
             </wp:cNvGraphicFramePr>
@@ -6351,11 +6446,11 @@
       <w:pPr>
         <w:pStyle w:val="Heading2"/>
       </w:pPr>
-      <w:bookmarkStart w:name="titre-22" w:id="113"/>
+      <w:bookmarkStart w:name="titre-22" w:id="118"/>
       <w:r>
         <w:t xml:space="preserve">4.4 Gérer les genres</w:t>
       </w:r>
-      <w:bookmarkEnd w:id="113"/>
+      <w:bookmarkEnd w:id="118"/>
     </w:p>
     <w:p>
       <w:r>
@@ -6484,11 +6579,11 @@
       <w:pPr>
         <w:pStyle w:val="Heading1"/>
       </w:pPr>
-      <w:bookmarkStart w:name="titre-23" w:id="114"/>
+      <w:bookmarkStart w:name="titre-23" w:id="119"/>
       <w:r>
         <w:t xml:space="preserve">5 Les mangas (MangaDex)</w:t>
       </w:r>
-      <w:bookmarkEnd w:id="114"/>
+      <w:bookmarkEnd w:id="119"/>
     </w:p>
     <w:p>
       <w:r>
@@ -6887,11 +6982,11 @@
       <w:pPr>
         <w:pStyle w:val="Heading2"/>
       </w:pPr>
-      <w:bookmarkStart w:name="titre-24" w:id="115"/>
+      <w:bookmarkStart w:name="titre-24" w:id="120"/>
       <w:r>
         <w:t xml:space="preserve">5.1 Lier un manga à sa série MangaDex</w:t>
       </w:r>
-      <w:bookmarkEnd w:id="115"/>
+      <w:bookmarkEnd w:id="120"/>
     </w:p>
     <w:p>
       <w:r>
@@ -7315,11 +7410,11 @@
       <w:pPr>
         <w:pStyle w:val="Heading2"/>
       </w:pPr>
-      <w:bookmarkStart w:name="titre-25" w:id="116"/>
+      <w:bookmarkStart w:name="titre-25" w:id="121"/>
       <w:r>
         <w:t xml:space="preserve">5.2 Publier un chapitre de manga</w:t>
       </w:r>
-      <w:bookmarkEnd w:id="116"/>
+      <w:bookmarkEnd w:id="121"/>
     </w:p>
     <w:p>
       <w:pPr>
@@ -7578,11 +7673,11 @@
       <w:pPr>
         <w:pStyle w:val="Heading2"/>
       </w:pPr>
-      <w:bookmarkStart w:name="titre-26" w:id="117"/>
+      <w:bookmarkStart w:name="titre-26" w:id="122"/>
       <w:r>
         <w:t xml:space="preserve">5.3 Annoncer un tome de manga au planning</w:t>
       </w:r>
-      <w:bookmarkEnd w:id="117"/>
+      <w:bookmarkEnd w:id="122"/>
     </w:p>
     <w:p>
       <w:r>
@@ -7828,11 +7923,11 @@
       <w:pPr>
         <w:pStyle w:val="Heading2"/>
       </w:pPr>
-      <w:bookmarkStart w:name="titre-27" w:id="118"/>
+      <w:bookmarkStart w:name="titre-27" w:id="123"/>
       <w:r>
         <w:t xml:space="preserve">5.4 Vérifier la synchronisation</w:t>
       </w:r>
-      <w:bookmarkEnd w:id="118"/>
+      <w:bookmarkEnd w:id="123"/>
     </w:p>
     <w:p>
       <w:r>
@@ -8527,11 +8622,11 @@
       <w:pPr>
         <w:pStyle w:val="Heading2"/>
       </w:pPr>
-      <w:bookmarkStart w:name="titre-28" w:id="119"/>
+      <w:bookmarkStart w:name="titre-28" w:id="124"/>
       <w:r>
         <w:t xml:space="preserve">5.5 Retirer un chapitre ou un manga</w:t>
       </w:r>
-      <w:bookmarkEnd w:id="119"/>
+      <w:bookmarkEnd w:id="124"/>
     </w:p>
     <w:tbl>
       <w:tblPr>
@@ -8945,11 +9040,11 @@
       <w:pPr>
         <w:pStyle w:val="Heading1"/>
       </w:pPr>
-      <w:bookmarkStart w:name="titre-29" w:id="120"/>
+      <w:bookmarkStart w:name="titre-29" w:id="125"/>
       <w:r>
         <w:t xml:space="preserve">6 Créer un tome vide</w:t>
       </w:r>
-      <w:bookmarkEnd w:id="120"/>
+      <w:bookmarkEnd w:id="125"/>
     </w:p>
     <w:p>
       <w:r>
@@ -8960,11 +9055,11 @@
       <w:pPr>
         <w:pStyle w:val="Heading2"/>
       </w:pPr>
-      <w:bookmarkStart w:name="titre-30" w:id="121"/>
+      <w:bookmarkStart w:name="titre-30" w:id="126"/>
       <w:r>
         <w:t xml:space="preserve">6.1 Ouvrir la page « Nouveau tome »</w:t>
       </w:r>
-      <w:bookmarkEnd w:id="121"/>
+      <w:bookmarkEnd w:id="126"/>
     </w:p>
     <w:p>
       <w:r>
@@ -9045,11 +9140,11 @@
       <w:pPr>
         <w:pStyle w:val="Heading2"/>
       </w:pPr>
-      <w:bookmarkStart w:name="titre-31" w:id="122"/>
+      <w:bookmarkStart w:name="titre-31" w:id="127"/>
       <w:r>
         <w:t xml:space="preserve">6.2 Créer le tome</w:t>
       </w:r>
-      <w:bookmarkEnd w:id="122"/>
+      <w:bookmarkEnd w:id="127"/>
     </w:p>
     <w:p>
       <w:pPr>
@@ -9062,7 +9157,7 @@
           <wp:inline distT="0" distB="0" distL="0" distR="0">
             <wp:extent cx="5715000" cy="5153025"/>
             <wp:effectExtent t="0" r="0" b="0" l="0"/>
-            <wp:docPr id="37" name="Main-contenu.png" descr="La page « Nouveau tome » : le tome, l'équipe et le calendrier, puis ce qui sera créé." title="La page « Nouveau tome » : le tome, l'équipe et le calendrier, puis ce qui sera créé."/>
+            <wp:docPr id="39" name="Main-contenu.png" descr="La page « Nouveau tome » : le tome, l'équipe et le calendrier, puis ce qui sera créé." title="La page « Nouveau tome » : le tome, l'équipe et le calendrier, puis ce qui sera créé."/>
             <wp:cNvGraphicFramePr>
               <a:graphicFrameLocks xmlns:a="http://schemas.openxmlformats.org/drawingml/2006/main" noChangeAspect="1"/>
             </wp:cNvGraphicFramePr>
@@ -9613,7 +9708,7 @@
           <wp:inline distT="0" distB="0" distL="0" distR="0">
             <wp:extent cx="5715000" cy="4371975"/>
             <wp:effectExtent t="0" r="0" b="0" l="0"/>
-            <wp:docPr id="38" name="HeureSortie-page.png" descr="« Date cible du tome » et « Heure de sortie » côte à côte : l'heure est gardée, même avec le rythme « Libre »." title="« Date cible du tome » et « Heure de sortie » côte à côte : l'heure est gardée, même avec le rythme « Libre »."/>
+            <wp:docPr id="40" name="HeureSortie-page.png" descr="« Date cible du tome » et « Heure de sortie » côte à côte : l'heure est gardée, même avec le rythme « Libre »." title="« Date cible du tome » et « Heure de sortie » côte à côte : l'heure est gardée, même avec le rythme « Libre »."/>
             <wp:cNvGraphicFramePr>
               <a:graphicFrameLocks xmlns:a="http://schemas.openxmlformats.org/drawingml/2006/main" noChangeAspect="1"/>
             </wp:cNvGraphicFramePr>
@@ -9736,11 +9831,11 @@
       <w:pPr>
         <w:pStyle w:val="Heading2"/>
       </w:pPr>
-      <w:bookmarkStart w:name="titre-32" w:id="123"/>
+      <w:bookmarkStart w:name="titre-32" w:id="128"/>
       <w:r>
         <w:t xml:space="preserve">6.3 Comprendre la parution d'un tome</w:t>
       </w:r>
-      <w:bookmarkEnd w:id="123"/>
+      <w:bookmarkEnd w:id="128"/>
     </w:p>
     <w:p>
       <w:r>
@@ -10324,11 +10419,11 @@
       <w:pPr>
         <w:pStyle w:val="Heading1"/>
       </w:pPr>
-      <w:bookmarkStart w:name="titre-33" w:id="124"/>
+      <w:bookmarkStart w:name="titre-33" w:id="129"/>
       <w:r>
         <w:t xml:space="preserve">7 Préparer le fichier Word</w:t>
       </w:r>
-      <w:bookmarkEnd w:id="124"/>
+      <w:bookmarkEnd w:id="129"/>
     </w:p>
     <w:p>
       <w:r>
@@ -10339,11 +10434,11 @@
       <w:pPr>
         <w:pStyle w:val="Heading2"/>
       </w:pPr>
-      <w:bookmarkStart w:name="titre-34" w:id="125"/>
+      <w:bookmarkStart w:name="titre-34" w:id="130"/>
       <w:r>
         <w:t xml:space="preserve">7.1 Utiliser les bons styles</w:t>
       </w:r>
-      <w:bookmarkEnd w:id="125"/>
+      <w:bookmarkEnd w:id="130"/>
     </w:p>
     <w:tbl>
       <w:tblPr>
@@ -11312,11 +11407,11 @@
       <w:pPr>
         <w:pStyle w:val="Heading2"/>
       </w:pPr>
-      <w:bookmarkStart w:name="titre-35" w:id="126"/>
+      <w:bookmarkStart w:name="titre-35" w:id="131"/>
       <w:r>
         <w:t xml:space="preserve">7.2 Écrire les dialogues et les pensées</w:t>
       </w:r>
-      <w:bookmarkEnd w:id="126"/>
+      <w:bookmarkEnd w:id="131"/>
     </w:p>
     <w:p>
       <w:pPr>
@@ -11368,11 +11463,11 @@
       <w:pPr>
         <w:pStyle w:val="Heading2"/>
       </w:pPr>
-      <w:bookmarkStart w:name="titre-36" w:id="127"/>
+      <w:bookmarkStart w:name="titre-36" w:id="132"/>
       <w:r>
         <w:t xml:space="preserve">7.3 Décrire les illustrations</w:t>
       </w:r>
-      <w:bookmarkEnd w:id="127"/>
+      <w:bookmarkEnd w:id="132"/>
     </w:p>
     <w:p>
       <w:r>
@@ -11513,11 +11608,11 @@
       <w:pPr>
         <w:pStyle w:val="Heading2"/>
       </w:pPr>
-      <w:bookmarkStart w:name="titre-37" w:id="128"/>
+      <w:bookmarkStart w:name="titre-37" w:id="133"/>
       <w:r>
         <w:t xml:space="preserve">7.4 Forcer un début de chapitre avec un marqueur</w:t>
       </w:r>
-      <w:bookmarkEnd w:id="128"/>
+      <w:bookmarkEnd w:id="133"/>
     </w:p>
     <w:p>
       <w:r>
@@ -11995,11 +12090,11 @@
       <w:pPr>
         <w:pStyle w:val="Heading2"/>
       </w:pPr>
-      <w:bookmarkStart w:name="titre-38" w:id="129"/>
+      <w:bookmarkStart w:name="titre-38" w:id="134"/>
       <w:r>
         <w:t xml:space="preserve">7.5 Vérifier le fichier avant de l'envoyer</w:t>
       </w:r>
-      <w:bookmarkEnd w:id="129"/>
+      <w:bookmarkEnd w:id="134"/>
     </w:p>
     <w:p>
       <w:pPr>
@@ -12090,11 +12185,11 @@
       <w:pPr>
         <w:pStyle w:val="Heading1"/>
       </w:pPr>
-      <w:bookmarkStart w:name="titre-39" w:id="130"/>
+      <w:bookmarkStart w:name="titre-39" w:id="135"/>
       <w:r>
         <w:t xml:space="preserve">8 Ajouter des chapitres à un tome</w:t>
       </w:r>
-      <w:bookmarkEnd w:id="130"/>
+      <w:bookmarkEnd w:id="135"/>
     </w:p>
     <w:p>
       <w:r>
@@ -12145,11 +12240,11 @@
       <w:pPr>
         <w:pStyle w:val="Heading2"/>
       </w:pPr>
-      <w:bookmarkStart w:name="titre-40" w:id="131"/>
+      <w:bookmarkStart w:name="titre-40" w:id="136"/>
       <w:r>
         <w:t xml:space="preserve">8.1 Comprendre le formulaire</w:t>
       </w:r>
-      <w:bookmarkEnd w:id="131"/>
+      <w:bookmarkEnd w:id="136"/>
     </w:p>
     <w:p>
       <w:r>
@@ -12167,7 +12262,7 @@
           <wp:inline distT="0" distB="0" distL="0" distR="0">
             <wp:extent cx="4572000" cy="2333625"/>
             <wp:effectExtent t="0" r="0" b="0" l="0"/>
-            <wp:docPr id="39" name="Chapitre-tome.png" descr="Partie 1 · Le tome : l'œuvre, le tome et sa parution." title="Partie 1 · Le tome : l'œuvre, le tome et sa parution."/>
+            <wp:docPr id="41" name="Chapitre-tome.png" descr="Partie 1 · Le tome : l'œuvre, le tome et sa parution." title="Partie 1 · Le tome : l'œuvre, le tome et sa parution."/>
             <wp:cNvGraphicFramePr>
               <a:graphicFrameLocks xmlns:a="http://schemas.openxmlformats.org/drawingml/2006/main" noChangeAspect="1"/>
             </wp:cNvGraphicFramePr>
@@ -12271,7 +12366,7 @@
           <wp:inline distT="0" distB="0" distL="0" distR="0">
             <wp:extent cx="4572000" cy="4238625"/>
             <wp:effectExtent t="0" r="0" b="0" l="0"/>
-            <wp:docPr id="40" name="Chapitre-fichier.png" descr="Partie 2 · Le fichier : le site compare chaque chapitre du fichier au tome." title="Partie 2 · Le fichier : le site compare chaque chapitre du fichier au tome."/>
+            <wp:docPr id="42" name="Chapitre-fichier.png" descr="Partie 2 · Le fichier : le site compare chaque chapitre du fichier au tome." title="Partie 2 · Le fichier : le site compare chaque chapitre du fichier au tome."/>
             <wp:cNvGraphicFramePr>
               <a:graphicFrameLocks xmlns:a="http://schemas.openxmlformats.org/drawingml/2006/main" noChangeAspect="1"/>
             </wp:cNvGraphicFramePr>
@@ -12816,7 +12911,7 @@
           <wp:inline distT="0" distB="0" distL="0" distR="0">
             <wp:extent cx="4572000" cy="1990725"/>
             <wp:effectExtent t="0" r="0" b="0" l="0"/>
-            <wp:docPr id="41" name="Chapitre-sortie.png" descr="Partie 3 · La sortie des nouveaux chapitres." title="Partie 3 · La sortie des nouveaux chapitres."/>
+            <wp:docPr id="43" name="Chapitre-sortie.png" descr="Partie 3 · La sortie des nouveaux chapitres." title="Partie 3 · La sortie des nouveaux chapitres."/>
             <wp:cNvGraphicFramePr>
               <a:graphicFrameLocks xmlns:a="http://schemas.openxmlformats.org/drawingml/2006/main" noChangeAspect="1"/>
             </wp:cNvGraphicFramePr>
@@ -12950,7 +13045,7 @@
           <wp:inline distT="0" distB="0" distL="0" distR="0">
             <wp:extent cx="2571750" cy="4210050"/>
             <wp:effectExtent t="0" r="0" b="0" l="0"/>
-            <wp:docPr id="42" name="Chapitre-resume.png" descr="À droite : « Ce qui va se passer » et le bouton d'envoi, dont le texte change selon vos choix." title="À droite : « Ce qui va se passer » et le bouton d'envoi, dont le texte change selon vos choix."/>
+            <wp:docPr id="44" name="Chapitre-resume.png" descr="À droite : « Ce qui va se passer » et le bouton d'envoi, dont le texte change selon vos choix." title="À droite : « Ce qui va se passer » et le bouton d'envoi, dont le texte change selon vos choix."/>
             <wp:cNvGraphicFramePr>
               <a:graphicFrameLocks xmlns:a="http://schemas.openxmlformats.org/drawingml/2006/main" noChangeAspect="1"/>
             </wp:cNvGraphicFramePr>
@@ -13037,11 +13132,11 @@
       <w:pPr>
         <w:pStyle w:val="Heading2"/>
       </w:pPr>
-      <w:bookmarkStart w:name="titre-41" w:id="132"/>
+      <w:bookmarkStart w:name="titre-41" w:id="137"/>
       <w:r>
         <w:t xml:space="preserve">8.2 Publier le prologue d'un tome en cours</w:t>
       </w:r>
-      <w:bookmarkEnd w:id="132"/>
+      <w:bookmarkEnd w:id="137"/>
     </w:p>
     <w:p>
       <w:r>
@@ -13422,11 +13517,11 @@
       <w:pPr>
         <w:pStyle w:val="Heading2"/>
       </w:pPr>
-      <w:bookmarkStart w:name="titre-42" w:id="133"/>
+      <w:bookmarkStart w:name="titre-42" w:id="138"/>
       <w:r>
         <w:t xml:space="preserve">8.3 Programmer plusieurs chapitres au rythme</w:t>
       </w:r>
-      <w:bookmarkEnd w:id="133"/>
+      <w:bookmarkEnd w:id="138"/>
     </w:p>
     <w:p>
       <w:r>
@@ -13731,11 +13826,11 @@
       <w:pPr>
         <w:pStyle w:val="Heading2"/>
       </w:pPr>
-      <w:bookmarkStart w:name="titre-43" w:id="134"/>
+      <w:bookmarkStart w:name="titre-43" w:id="139"/>
       <w:r>
         <w:t xml:space="preserve">8.4 Publier un tome entier d'un coup</w:t>
       </w:r>
-      <w:bookmarkEnd w:id="134"/>
+      <w:bookmarkEnd w:id="139"/>
     </w:p>
     <w:p>
       <w:r>
@@ -13974,11 +14069,11 @@
       <w:pPr>
         <w:pStyle w:val="Heading2"/>
       </w:pPr>
-      <w:bookmarkStart w:name="titre-44" w:id="135"/>
+      <w:bookmarkStart w:name="titre-44" w:id="140"/>
       <w:r>
         <w:t xml:space="preserve">8.5 Donner tout le tome, chapitre par chapitre, avec les liens à la fin</w:t>
       </w:r>
-      <w:bookmarkEnd w:id="135"/>
+      <w:bookmarkEnd w:id="140"/>
     </w:p>
     <w:p>
       <w:r>
@@ -14283,11 +14378,11 @@
       <w:pPr>
         <w:pStyle w:val="Heading2"/>
       </w:pPr>
-      <w:bookmarkStart w:name="titre-45" w:id="136"/>
+      <w:bookmarkStart w:name="titre-45" w:id="141"/>
       <w:r>
         <w:t xml:space="preserve">8.6 Corriger un chapitre déjà en ligne</w:t>
       </w:r>
-      <w:bookmarkEnd w:id="136"/>
+      <w:bookmarkEnd w:id="141"/>
     </w:p>
     <w:p>
       <w:r>
@@ -14529,11 +14624,11 @@
       <w:pPr>
         <w:pStyle w:val="Heading2"/>
       </w:pPr>
-      <w:bookmarkStart w:name="titre-46" w:id="137"/>
+      <w:bookmarkStart w:name="titre-46" w:id="142"/>
       <w:r>
         <w:t xml:space="preserve">8.7 Découper soi-même les chapitres</w:t>
       </w:r>
-      <w:bookmarkEnd w:id="137"/>
+      <w:bookmarkEnd w:id="142"/>
     </w:p>
     <w:p>
       <w:r>
@@ -14841,11 +14936,11 @@
       <w:pPr>
         <w:pStyle w:val="Heading2"/>
       </w:pPr>
-      <w:bookmarkStart w:name="titre-47" w:id="138"/>
+      <w:bookmarkStart w:name="titre-47" w:id="143"/>
       <w:r>
         <w:t xml:space="preserve">8.8 Ajouter la lecture en ligne d'un tome déjà paru</w:t>
       </w:r>
-      <w:bookmarkEnd w:id="138"/>
+      <w:bookmarkEnd w:id="143"/>
     </w:p>
     <w:p>
       <w:r>
@@ -14943,11 +15038,11 @@
       <w:pPr>
         <w:pStyle w:val="Heading2"/>
       </w:pPr>
-      <w:bookmarkStart w:name="titre-48" w:id="139"/>
+      <w:bookmarkStart w:name="titre-48" w:id="144"/>
       <w:r>
         <w:t xml:space="preserve">8.9 Refaire toute la lecture en ligne d'un tome</w:t>
       </w:r>
-      <w:bookmarkEnd w:id="139"/>
+      <w:bookmarkEnd w:id="144"/>
     </w:p>
     <w:p>
       <w:r>
@@ -15166,11 +15261,11 @@
       <w:pPr>
         <w:pStyle w:val="Heading2"/>
       </w:pPr>
-      <w:bookmarkStart w:name="titre-49" w:id="140"/>
+      <w:bookmarkStart w:name="titre-49" w:id="145"/>
       <w:r>
         <w:t xml:space="preserve">8.10 Savoir ce qui sera annoncé</w:t>
       </w:r>
-      <w:bookmarkEnd w:id="140"/>
+      <w:bookmarkEnd w:id="145"/>
     </w:p>
     <w:tbl>
       <w:tblPr>
@@ -16000,11 +16095,11 @@
       <w:pPr>
         <w:pStyle w:val="Heading2"/>
       </w:pPr>
-      <w:bookmarkStart w:name="titre-50" w:id="141"/>
+      <w:bookmarkStart w:name="titre-50" w:id="146"/>
       <w:r>
         <w:t xml:space="preserve">8.11 Choisir le salon Discord des chapitres</w:t>
       </w:r>
-      <w:bookmarkEnd w:id="141"/>
+      <w:bookmarkEnd w:id="146"/>
     </w:p>
     <w:p>
       <w:r>
@@ -16457,21 +16552,21 @@
       <w:pPr>
         <w:pStyle w:val="Heading1"/>
       </w:pPr>
-      <w:bookmarkStart w:name="titre-51" w:id="142"/>
+      <w:bookmarkStart w:name="titre-51" w:id="147"/>
       <w:r>
         <w:t xml:space="preserve">9 Terminer un tome</w:t>
       </w:r>
-      <w:bookmarkEnd w:id="142"/>
+      <w:bookmarkEnd w:id="147"/>
     </w:p>
     <w:p>
       <w:pPr>
         <w:pStyle w:val="Heading2"/>
       </w:pPr>
-      <w:bookmarkStart w:name="titre-52" w:id="143"/>
+      <w:bookmarkStart w:name="titre-52" w:id="148"/>
       <w:r>
         <w:t xml:space="preserve">9.1 Terminer un tome avec son dernier envoi</w:t>
       </w:r>
-      <w:bookmarkEnd w:id="143"/>
+      <w:bookmarkEnd w:id="148"/>
     </w:p>
     <w:p>
       <w:r>
@@ -16489,7 +16584,7 @@
           <wp:inline distT="0" distB="0" distL="0" distR="0">
             <wp:extent cx="4572000" cy="2828925"/>
             <wp:effectExtent t="0" r="0" b="0" l="0"/>
-            <wp:docPr id="43" name="Chapitre-complet.png" descr="Les liens de téléchargement et les deux cases qui terminent le tome." title="Les liens de téléchargement et les deux cases qui terminent le tome."/>
+            <wp:docPr id="45" name="Chapitre-complet.png" descr="Les liens de téléchargement et les deux cases qui terminent le tome." title="Les liens de téléchargement et les deux cases qui terminent le tome."/>
             <wp:cNvGraphicFramePr>
               <a:graphicFrameLocks xmlns:a="http://schemas.openxmlformats.org/drawingml/2006/main" noChangeAspect="1"/>
             </wp:cNvGraphicFramePr>
@@ -16714,11 +16809,11 @@
       <w:pPr>
         <w:pStyle w:val="Heading2"/>
       </w:pPr>
-      <w:bookmarkStart w:name="titre-53" w:id="144"/>
+      <w:bookmarkStart w:name="titre-53" w:id="149"/>
       <w:r>
         <w:t xml:space="preserve">9.2 Passer un tome à « Publié » depuis sa fiche</w:t>
       </w:r>
-      <w:bookmarkEnd w:id="144"/>
+      <w:bookmarkEnd w:id="149"/>
     </w:p>
     <w:p>
       <w:r>
@@ -16878,7 +16973,7 @@
           <wp:inline distT="0" distB="0" distL="0" distR="0">
             <wp:extent cx="4572000" cy="2286000"/>
             <wp:effectExtent t="0" r="0" b="0" l="0"/>
-            <wp:docPr id="44" name="EtatTome-etats.png" descr="L'encadré « État du tome » de la fiche du tome." title="L'encadré « État du tome » de la fiche du tome."/>
+            <wp:docPr id="46" name="EtatTome-etats.png" descr="L'encadré « État du tome » de la fiche du tome." title="L'encadré « État du tome » de la fiche du tome."/>
             <wp:cNvGraphicFramePr>
               <a:graphicFrameLocks xmlns:a="http://schemas.openxmlformats.org/drawingml/2006/main" noChangeAspect="1"/>
             </wp:cNvGraphicFramePr>
@@ -16991,11 +17086,11 @@
       <w:pPr>
         <w:pStyle w:val="Heading2"/>
       </w:pPr>
-      <w:bookmarkStart w:name="titre-54" w:id="145"/>
+      <w:bookmarkStart w:name="titre-54" w:id="150"/>
       <w:r>
         <w:t xml:space="preserve">9.3 Remplacer un lien PDF ou EPUB mort</w:t>
       </w:r>
-      <w:bookmarkEnd w:id="145"/>
+      <w:bookmarkEnd w:id="150"/>
     </w:p>
     <w:p>
       <w:pPr>
@@ -17087,11 +17182,11 @@
       <w:pPr>
         <w:pStyle w:val="Heading1"/>
       </w:pPr>
-      <w:bookmarkStart w:name="titre-55" w:id="146"/>
+      <w:bookmarkStart w:name="titre-55" w:id="151"/>
       <w:r>
         <w:t xml:space="preserve">10 Modifier un tome</w:t>
       </w:r>
-      <w:bookmarkEnd w:id="146"/>
+      <w:bookmarkEnd w:id="151"/>
     </w:p>
     <w:p>
       <w:r>
@@ -17102,11 +17197,11 @@
       <w:pPr>
         <w:pStyle w:val="Heading2"/>
       </w:pPr>
-      <w:bookmarkStart w:name="titre-56" w:id="147"/>
+      <w:bookmarkStart w:name="titre-56" w:id="152"/>
       <w:r>
         <w:t xml:space="preserve">10.1 Trouver un tome</w:t>
       </w:r>
-      <w:bookmarkEnd w:id="147"/>
+      <w:bookmarkEnd w:id="152"/>
     </w:p>
     <w:p>
       <w:pPr>
@@ -17119,7 +17214,7 @@
           <wp:inline distT="0" distB="0" distL="0" distR="0">
             <wp:extent cx="5715000" cy="4314825"/>
             <wp:effectExtent t="0" r="0" b="0" l="0"/>
-            <wp:docPr id="45" name="TousLesTomes-contenu.png" descr="« Tous les tomes » : chaque tome avec sa parution et ses boutons." title="« Tous les tomes » : chaque tome avec sa parution et ses boutons."/>
+            <wp:docPr id="47" name="TousLesTomes-contenu.png" descr="« Tous les tomes » : chaque tome avec sa parution et ses boutons." title="« Tous les tomes » : chaque tome avec sa parution et ses boutons."/>
             <wp:cNvGraphicFramePr>
               <a:graphicFrameLocks xmlns:a="http://schemas.openxmlformats.org/drawingml/2006/main" noChangeAspect="1"/>
             </wp:cNvGraphicFramePr>
@@ -17333,11 +17428,11 @@
       <w:pPr>
         <w:pStyle w:val="Heading2"/>
       </w:pPr>
-      <w:bookmarkStart w:name="titre-57" w:id="148"/>
+      <w:bookmarkStart w:name="titre-57" w:id="153"/>
       <w:r>
         <w:t xml:space="preserve">10.2 Modifier les informations d'un tome</w:t>
       </w:r>
-      <w:bookmarkEnd w:id="148"/>
+      <w:bookmarkEnd w:id="153"/>
     </w:p>
     <w:p>
       <w:pPr>
@@ -17350,7 +17445,7 @@
           <wp:inline distT="0" distB="0" distL="0" distR="0">
             <wp:extent cx="5715000" cy="5448300"/>
             <wp:effectExtent t="0" r="0" b="0" l="0"/>
-            <wp:docPr id="46" name="TomeEnCours-contenu.png" descr="La fiche « Modifier le tome » : informations, chapitres, couverture, tome complet et planning." title="La fiche « Modifier le tome » : informations, chapitres, couverture, tome complet et planning."/>
+            <wp:docPr id="48" name="TomeEnCours-contenu.png" descr="La fiche « Modifier le tome » : informations, chapitres, couverture, tome complet et planning." title="La fiche « Modifier le tome » : informations, chapitres, couverture, tome complet et planning."/>
             <wp:cNvGraphicFramePr>
               <a:graphicFrameLocks xmlns:a="http://schemas.openxmlformats.org/drawingml/2006/main" noChangeAspect="1"/>
             </wp:cNvGraphicFramePr>
@@ -17693,7 +17788,7 @@
           <wp:inline distT="0" distB="0" distL="0" distR="0">
             <wp:extent cx="5715000" cy="4400550"/>
             <wp:effectExtent t="0" r="0" b="0" l="0"/>
-            <wp:docPr id="47" name="HeureModifier-page.png" descr="« Modifier le tome » : la couverture changée et l'heure de sortie gardée." title="« Modifier le tome » : la couverture changée et l'heure de sortie gardée."/>
+            <wp:docPr id="49" name="HeureModifier-page.png" descr="« Modifier le tome » : la couverture changée et l'heure de sortie gardée." title="« Modifier le tome » : la couverture changée et l'heure de sortie gardée."/>
             <wp:cNvGraphicFramePr>
               <a:graphicFrameLocks xmlns:a="http://schemas.openxmlformats.org/drawingml/2006/main" noChangeAspect="1"/>
             </wp:cNvGraphicFramePr>
@@ -17783,11 +17878,11 @@
       <w:pPr>
         <w:pStyle w:val="Heading2"/>
       </w:pPr>
-      <w:bookmarkStart w:name="titre-58" w:id="149"/>
+      <w:bookmarkStart w:name="titre-58" w:id="154"/>
       <w:r>
         <w:t xml:space="preserve">10.3 Publier, reprogrammer ou retirer un chapitre</w:t>
       </w:r>
-      <w:bookmarkEnd w:id="149"/>
+      <w:bookmarkEnd w:id="154"/>
     </w:p>
     <w:p>
       <w:r>
@@ -17855,7 +17950,7 @@
           <wp:inline distT="0" distB="0" distL="0" distR="0">
             <wp:extent cx="4572000" cy="2695575"/>
             <wp:effectExtent t="0" r="0" b="0" l="0"/>
-            <wp:docPr id="48" name="TomeEnCours-chapitres.png" descr="La liste des chapitres d'un tome en cours." title="La liste des chapitres d'un tome en cours."/>
+            <wp:docPr id="50" name="TomeEnCours-chapitres.png" descr="La liste des chapitres d'un tome en cours." title="La liste des chapitres d'un tome en cours."/>
             <wp:cNvGraphicFramePr>
               <a:graphicFrameLocks xmlns:a="http://schemas.openxmlformats.org/drawingml/2006/main" noChangeAspect="1"/>
             </wp:cNvGraphicFramePr>
@@ -18078,11 +18173,11 @@
       <w:pPr>
         <w:pStyle w:val="Heading1"/>
       </w:pPr>
-      <w:bookmarkStart w:name="titre-59" w:id="150"/>
+      <w:bookmarkStart w:name="titre-59" w:id="155"/>
       <w:r>
         <w:t xml:space="preserve">11 Nouveau (version 2.1.5) : l'état des tomes et des œuvres</w:t>
       </w:r>
-      <w:bookmarkEnd w:id="150"/>
+      <w:bookmarkEnd w:id="155"/>
     </w:p>
     <w:tbl>
       <w:tblPr>
@@ -18146,11 +18241,11 @@
       <w:pPr>
         <w:pStyle w:val="Heading2"/>
       </w:pPr>
-      <w:bookmarkStart w:name="titre-60" w:id="151"/>
+      <w:bookmarkStart w:name="titre-60" w:id="156"/>
       <w:r>
         <w:t xml:space="preserve">11.1 Le cycle de vie d'un tome</w:t>
       </w:r>
-      <w:bookmarkEnd w:id="151"/>
+      <w:bookmarkEnd w:id="156"/>
     </w:p>
     <w:p>
       <w:r>
@@ -18168,7 +18263,7 @@
           <wp:inline distT="0" distB="0" distL="0" distR="0">
             <wp:extent cx="5715000" cy="2743200"/>
             <wp:effectExtent t="0" r="0" b="0" l="0"/>
-            <wp:docPr id="49" name="CycleTome-page.png" descr="Le cycle de vie d'un tome : Planifié, En cours de publication, Publié." title="Le cycle de vie d'un tome : Planifié, En cours de publication, Publié."/>
+            <wp:docPr id="51" name="CycleTome-page.png" descr="Le cycle de vie d'un tome : Planifié, En cours de publication, Publié." title="Le cycle de vie d'un tome : Planifié, En cours de publication, Publié."/>
             <wp:cNvGraphicFramePr>
               <a:graphicFrameLocks xmlns:a="http://schemas.openxmlformats.org/drawingml/2006/main" noChangeAspect="1"/>
             </wp:cNvGraphicFramePr>
@@ -18733,11 +18828,11 @@
       <w:pPr>
         <w:pStyle w:val="Heading2"/>
       </w:pPr>
-      <w:bookmarkStart w:name="titre-61" w:id="152"/>
+      <w:bookmarkStart w:name="titre-61" w:id="157"/>
       <w:r>
         <w:t xml:space="preserve">11.2 Changer l'état d'un tome</w:t>
       </w:r>
-      <w:bookmarkEnd w:id="152"/>
+      <w:bookmarkEnd w:id="157"/>
     </w:p>
     <w:p>
       <w:pPr>
@@ -18750,7 +18845,7 @@
           <wp:inline distT="0" distB="0" distL="0" distR="0">
             <wp:extent cx="5715000" cy="2857500"/>
             <wp:effectExtent t="0" r="0" b="0" l="0"/>
-            <wp:docPr id="50" name="EtatTome-etats.png" descr="L'encadré « État du tome » de la fiche, et les réglages propres à chaque état." title="L'encadré « État du tome » de la fiche, et les réglages propres à chaque état."/>
+            <wp:docPr id="52" name="EtatTome-etats.png" descr="L'encadré « État du tome » de la fiche, et les réglages propres à chaque état." title="L'encadré « État du tome » de la fiche, et les réglages propres à chaque état."/>
             <wp:cNvGraphicFramePr>
               <a:graphicFrameLocks xmlns:a="http://schemas.openxmlformats.org/drawingml/2006/main" noChangeAspect="1"/>
             </wp:cNvGraphicFramePr>
@@ -19047,11 +19142,11 @@
       <w:pPr>
         <w:pStyle w:val="Heading2"/>
       </w:pPr>
-      <w:bookmarkStart w:name="titre-62" w:id="153"/>
+      <w:bookmarkStart w:name="titre-62" w:id="158"/>
       <w:r>
         <w:t xml:space="preserve">11.3 Savoir ce que fait chaque changement</w:t>
       </w:r>
-      <w:bookmarkEnd w:id="153"/>
+      <w:bookmarkEnd w:id="158"/>
     </w:p>
     <w:p>
       <w:pPr>
@@ -19064,7 +19159,7 @@
           <wp:inline distT="0" distB="0" distL="0" distR="0">
             <wp:extent cx="5715000" cy="1333500"/>
             <wp:effectExtent t="0" r="0" b="0" l="0"/>
-            <wp:docPr id="51" name="EtatTome-confirmations.png" descr="Les confirmations demandées avant un changement qui touche les lecteurs." title="Les confirmations demandées avant un changement qui touche les lecteurs."/>
+            <wp:docPr id="53" name="EtatTome-confirmations.png" descr="Les confirmations demandées avant un changement qui touche les lecteurs." title="Les confirmations demandées avant un changement qui touche les lecteurs."/>
             <wp:cNvGraphicFramePr>
               <a:graphicFrameLocks xmlns:a="http://schemas.openxmlformats.org/drawingml/2006/main" noChangeAspect="1"/>
             </wp:cNvGraphicFramePr>
@@ -20064,11 +20159,11 @@
       <w:pPr>
         <w:pStyle w:val="Heading2"/>
       </w:pPr>
-      <w:bookmarkStart w:name="titre-63" w:id="154"/>
+      <w:bookmarkStart w:name="titre-63" w:id="159"/>
       <w:r>
         <w:t xml:space="preserve">11.4 J'ai publié au lieu de programmer : comment réparer</w:t>
       </w:r>
-      <w:bookmarkEnd w:id="154"/>
+      <w:bookmarkEnd w:id="159"/>
     </w:p>
     <w:p>
       <w:r>
@@ -20342,11 +20437,11 @@
       <w:pPr>
         <w:pStyle w:val="Heading2"/>
       </w:pPr>
-      <w:bookmarkStart w:name="titre-64" w:id="155"/>
+      <w:bookmarkStart w:name="titre-64" w:id="160"/>
       <w:r>
         <w:t xml:space="preserve">11.5 Changer l'état d'une œuvre</w:t>
       </w:r>
-      <w:bookmarkEnd w:id="155"/>
+      <w:bookmarkEnd w:id="160"/>
     </w:p>
     <w:p>
       <w:r>
@@ -20374,7 +20469,7 @@
           <wp:inline distT="0" distB="0" distL="0" distR="0">
             <wp:extent cx="5715000" cy="4581525"/>
             <wp:effectExtent t="0" r="0" b="0" l="0"/>
-            <wp:docPr id="52" name="EtatOeuvre-contenu.png" descr="La liste « Œuvres » avec l'état de chaque œuvre et de ses tomes." title="La liste « Œuvres » avec l'état de chaque œuvre et de ses tomes."/>
+            <wp:docPr id="54" name="EtatOeuvre-contenu.png" descr="La liste « Œuvres » avec l'état de chaque œuvre et de ses tomes." title="La liste « Œuvres » avec l'état de chaque œuvre et de ses tomes."/>
             <wp:cNvGraphicFramePr>
               <a:graphicFrameLocks xmlns:a="http://schemas.openxmlformats.org/drawingml/2006/main" noChangeAspect="1"/>
             </wp:cNvGraphicFramePr>
@@ -21240,11 +21335,11 @@
       <w:pPr>
         <w:pStyle w:val="Heading1"/>
       </w:pPr>
-      <w:bookmarkStart w:name="titre-65" w:id="156"/>
+      <w:bookmarkStart w:name="titre-65" w:id="161"/>
       <w:r>
         <w:t xml:space="preserve">12 Ce que voient les lecteurs</w:t>
       </w:r>
-      <w:bookmarkEnd w:id="156"/>
+      <w:bookmarkEnd w:id="161"/>
     </w:p>
     <w:p>
       <w:r>
@@ -21363,11 +21458,11 @@
       <w:pPr>
         <w:pStyle w:val="Heading2"/>
       </w:pPr>
-      <w:bookmarkStart w:name="titre-66" w:id="157"/>
+      <w:bookmarkStart w:name="titre-66" w:id="162"/>
       <w:r>
         <w:t xml:space="preserve">12.1 Lire un manga</w:t>
       </w:r>
-      <w:bookmarkEnd w:id="157"/>
+      <w:bookmarkEnd w:id="162"/>
     </w:p>
     <w:p>
       <w:r>
@@ -21483,11 +21578,11 @@
       <w:pPr>
         <w:pStyle w:val="Heading2"/>
       </w:pPr>
-      <w:bookmarkStart w:name="titre-67" w:id="158"/>
+      <w:bookmarkStart w:name="titre-67" w:id="163"/>
       <w:r>
         <w:t xml:space="preserve">12.2 La page d'accueil</w:t>
       </w:r>
-      <w:bookmarkEnd w:id="158"/>
+      <w:bookmarkEnd w:id="163"/>
     </w:p>
     <w:p>
       <w:r>
@@ -21525,7 +21620,7 @@
           <wp:inline distT="0" distB="0" distL="0" distR="0">
             <wp:extent cx="5715000" cy="4676775"/>
             <wp:effectExtent t="0" r="0" b="0" l="0"/>
-            <wp:docPr id="53" name="Accueil-planning.png" descr="La section « Planning » de l'accueil : le prochain tome à la une, puis les chapitres et les tomes en préparation." title="La section « Planning » de l'accueil : le prochain tome à la une, puis les chapitres et les tomes en préparation."/>
+            <wp:docPr id="55" name="Accueil-planning.png" descr="La section « Planning » de l'accueil : le prochain tome à la une, puis les chapitres et les tomes en préparation." title="La section « Planning » de l'accueil : le prochain tome à la une, puis les chapitres et les tomes en préparation."/>
             <wp:cNvGraphicFramePr>
               <a:graphicFrameLocks xmlns:a="http://schemas.openxmlformats.org/drawingml/2006/main" noChangeAspect="1"/>
             </wp:cNvGraphicFramePr>
@@ -22070,11 +22165,11 @@
       <w:pPr>
         <w:pStyle w:val="Heading2"/>
       </w:pPr>
-      <w:bookmarkStart w:name="titre-68" w:id="159"/>
+      <w:bookmarkStart w:name="titre-68" w:id="164"/>
       <w:r>
         <w:t xml:space="preserve">12.3 La page Planning</w:t>
       </w:r>
-      <w:bookmarkEnd w:id="159"/>
+      <w:bookmarkEnd w:id="164"/>
     </w:p>
     <w:p>
       <w:r>
@@ -22142,7 +22237,7 @@
           <wp:inline distT="0" distB="0" distL="0" distR="0">
             <wp:extent cx="5715000" cy="1019175"/>
             <wp:effectExtent t="0" r="0" b="0" l="0"/>
-            <wp:docPr id="54" name="PagePlanning-une.png" descr="Sous l'introduction, le même bandeau qu'à l'accueil : le prochain tome à la une." title="Sous l'introduction, le même bandeau qu'à l'accueil : le prochain tome à la une."/>
+            <wp:docPr id="56" name="PagePlanning-une.png" descr="Sous l'introduction, le même bandeau qu'à l'accueil : le prochain tome à la une." title="Sous l'introduction, le même bandeau qu'à l'accueil : le prochain tome à la une."/>
             <wp:cNvGraphicFramePr>
               <a:graphicFrameLocks xmlns:a="http://schemas.openxmlformats.org/drawingml/2006/main" noChangeAspect="1"/>
             </wp:cNvGraphicFramePr>
@@ -22362,7 +22457,7 @@
           <wp:inline distT="0" distB="0" distL="0" distR="0">
             <wp:extent cx="5715000" cy="3228975"/>
             <wp:effectExtent t="0" r="0" b="0" l="0"/>
-            <wp:docPr id="55" name="PagePlanning-vues.png" descr="Les trois vues et le tableau : barres d'avancement, tomes en cours de publication et prochain chapitre." title="Les trois vues et le tableau : barres d'avancement, tomes en cours de publication et prochain chapitre."/>
+            <wp:docPr id="57" name="PagePlanning-vues.png" descr="Les trois vues et le tableau : barres d'avancement, tomes en cours de publication et prochain chapitre." title="Les trois vues et le tableau : barres d'avancement, tomes en cours de publication et prochain chapitre."/>
             <wp:cNvGraphicFramePr>
               <a:graphicFrameLocks xmlns:a="http://schemas.openxmlformats.org/drawingml/2006/main" noChangeAspect="1"/>
             </wp:cNvGraphicFramePr>
@@ -22454,7 +22549,7 @@
           <wp:inline distT="0" distB="0" distL="0" distR="0">
             <wp:extent cx="5715000" cy="2400300"/>
             <wp:effectExtent t="0" r="0" b="0" l="0"/>
-            <wp:docPr id="56" name="PagePlanning-chapitres.png" descr="La vue « Chapitres » de la page Planning." title="La vue « Chapitres » de la page Planning."/>
+            <wp:docPr id="58" name="PagePlanning-chapitres.png" descr="La vue « Chapitres » de la page Planning." title="La vue « Chapitres » de la page Planning."/>
             <wp:cNvGraphicFramePr>
               <a:graphicFrameLocks xmlns:a="http://schemas.openxmlformats.org/drawingml/2006/main" noChangeAspect="1"/>
             </wp:cNvGraphicFramePr>
@@ -22541,7 +22636,7 @@
           <wp:inline distT="0" distB="0" distL="0" distR="0">
             <wp:extent cx="3429000" cy="1209675"/>
             <wp:effectExtent t="0" r="0" b="0" l="0"/>
-            <wp:docPr id="57" name="PagePlanning-legende.png" descr="La légende de la page Planning." title="La légende de la page Planning."/>
+            <wp:docPr id="59" name="PagePlanning-legende.png" descr="La légende de la page Planning." title="La légende de la page Planning."/>
             <wp:cNvGraphicFramePr>
               <a:graphicFrameLocks xmlns:a="http://schemas.openxmlformats.org/drawingml/2006/main" noChangeAspect="1"/>
             </wp:cNvGraphicFramePr>
@@ -22596,11 +22691,11 @@
       <w:pPr>
         <w:pStyle w:val="Heading2"/>
       </w:pPr>
-      <w:bookmarkStart w:name="titre-69" w:id="160"/>
+      <w:bookmarkStart w:name="titre-69" w:id="165"/>
       <w:r>
         <w:t xml:space="preserve">12.4 Faire apparaître un chapitre dans « Prochains » de l'accueil</w:t>
       </w:r>
-      <w:bookmarkEnd w:id="160"/>
+      <w:bookmarkEnd w:id="165"/>
     </w:p>
     <w:p>
       <w:r>
@@ -22846,11 +22941,11 @@
       <w:pPr>
         <w:pStyle w:val="Heading2"/>
       </w:pPr>
-      <w:bookmarkStart w:name="titre-70" w:id="161"/>
+      <w:bookmarkStart w:name="titre-70" w:id="166"/>
       <w:r>
         <w:t xml:space="preserve">12.5 Mettre un tome à la une</w:t>
       </w:r>
-      <w:bookmarkEnd w:id="161"/>
+      <w:bookmarkEnd w:id="166"/>
     </w:p>
     <w:p>
       <w:r>
@@ -23113,11 +23208,11 @@
       <w:pPr>
         <w:pStyle w:val="Heading2"/>
       </w:pPr>
-      <w:bookmarkStart w:name="titre-71" w:id="162"/>
+      <w:bookmarkStart w:name="titre-71" w:id="167"/>
       <w:r>
         <w:t xml:space="preserve">12.6 La fiche d'une œuvre</w:t>
       </w:r>
-      <w:bookmarkEnd w:id="162"/>
+      <w:bookmarkEnd w:id="167"/>
     </w:p>
     <w:p>
       <w:pPr>
@@ -23130,7 +23225,7 @@
           <wp:inline distT="0" distB="0" distL="0" distR="0">
             <wp:extent cx="5715000" cy="4095750"/>
             <wp:effectExtent t="0" r="0" b="0" l="0"/>
-            <wp:docPr id="58" name="Public-page.png" descr="La fiche d'une œuvre, vue par un lecteur." title="La fiche d'une œuvre, vue par un lecteur."/>
+            <wp:docPr id="60" name="Public-page.png" descr="La fiche d'une œuvre, vue par un lecteur." title="La fiche d'une œuvre, vue par un lecteur."/>
             <wp:cNvGraphicFramePr>
               <a:graphicFrameLocks xmlns:a="http://schemas.openxmlformats.org/drawingml/2006/main" noChangeAspect="1"/>
             </wp:cNvGraphicFramePr>
@@ -23357,11 +23452,11 @@
       <w:pPr>
         <w:pStyle w:val="Heading2"/>
       </w:pPr>
-      <w:bookmarkStart w:name="titre-72" w:id="163"/>
+      <w:bookmarkStart w:name="titre-72" w:id="168"/>
       <w:r>
         <w:t xml:space="preserve">12.7 Les suggestions et les nouveaux chapitres</w:t>
       </w:r>
-      <w:bookmarkEnd w:id="163"/>
+      <w:bookmarkEnd w:id="168"/>
     </w:p>
     <w:tbl>
       <w:tblPr>
@@ -23698,11 +23793,11 @@
       <w:pPr>
         <w:pStyle w:val="Heading2"/>
       </w:pPr>
-      <w:bookmarkStart w:name="titre-73" w:id="164"/>
+      <w:bookmarkStart w:name="titre-73" w:id="169"/>
       <w:r>
         <w:t xml:space="preserve">12.8 La page d'un tome en cours</w:t>
       </w:r>
-      <w:bookmarkEnd w:id="164"/>
+      <w:bookmarkEnd w:id="169"/>
     </w:p>
     <w:p>
       <w:pPr>
@@ -23715,7 +23810,7 @@
           <wp:inline distT="0" distB="0" distL="0" distR="0">
             <wp:extent cx="5715000" cy="3476625"/>
             <wp:effectExtent t="0" r="0" b="0" l="0"/>
-            <wp:docPr id="59" name="PublicTome-page.png" descr="La page d'un tome en cours, vue par un lecteur." title="La page d'un tome en cours, vue par un lecteur."/>
+            <wp:docPr id="61" name="PublicTome-page.png" descr="La page d'un tome en cours, vue par un lecteur." title="La page d'un tome en cours, vue par un lecteur."/>
             <wp:cNvGraphicFramePr>
               <a:graphicFrameLocks xmlns:a="http://schemas.openxmlformats.org/drawingml/2006/main" noChangeAspect="1"/>
             </wp:cNvGraphicFramePr>
@@ -23849,11 +23944,11 @@
       <w:pPr>
         <w:pStyle w:val="Heading1"/>
       </w:pPr>
-      <w:bookmarkStart w:name="titre-74" w:id="165"/>
+      <w:bookmarkStart w:name="titre-74" w:id="170"/>
       <w:r>
         <w:t xml:space="preserve">13 Les statistiques d'audience</w:t>
       </w:r>
-      <w:bookmarkEnd w:id="165"/>
+      <w:bookmarkEnd w:id="170"/>
     </w:p>
     <w:p>
       <w:r>
@@ -24531,11 +24626,11 @@
       <w:pPr>
         <w:pStyle w:val="Heading2"/>
       </w:pPr>
-      <w:bookmarkStart w:name="titre-75" w:id="166"/>
+      <w:bookmarkStart w:name="titre-75" w:id="171"/>
       <w:r>
         <w:t xml:space="preserve">13.1 Lire l'aperçu</w:t>
       </w:r>
-      <w:bookmarkEnd w:id="166"/>
+      <w:bookmarkEnd w:id="171"/>
     </w:p>
     <w:p>
       <w:pPr>
@@ -24677,7 +24772,7 @@
           <wp:inline distT="0" distB="0" distL="0" distR="0">
             <wp:extent cx="4572000" cy="5334000"/>
             <wp:effectExtent t="0" r="0" b="0" l="0"/>
-            <wp:docPr id="60" name="Statistiques-apercu.png" descr="L'onglet Aperçu des statistiques (chiffres fictifs)." title="L'onglet Aperçu des statistiques (chiffres fictifs)."/>
+            <wp:docPr id="62" name="Statistiques-apercu.png" descr="L'onglet Aperçu des statistiques (chiffres fictifs)." title="L'onglet Aperçu des statistiques (chiffres fictifs)."/>
             <wp:cNvGraphicFramePr>
               <a:graphicFrameLocks xmlns:a="http://schemas.openxmlformats.org/drawingml/2006/main" noChangeAspect="1"/>
             </wp:cNvGraphicFramePr>
@@ -24975,11 +25070,11 @@
       <w:pPr>
         <w:pStyle w:val="Heading2"/>
       </w:pPr>
-      <w:bookmarkStart w:name="titre-76" w:id="167"/>
+      <w:bookmarkStart w:name="titre-76" w:id="172"/>
       <w:r>
         <w:t xml:space="preserve">13.2 Consulter les statistiques d'une œuvre</w:t>
       </w:r>
-      <w:bookmarkEnd w:id="167"/>
+      <w:bookmarkEnd w:id="172"/>
     </w:p>
     <w:p>
       <w:pPr>
@@ -25111,7 +25206,7 @@
           <wp:inline distT="0" distB="0" distL="0" distR="0">
             <wp:extent cx="4572000" cy="4448175"/>
             <wp:effectExtent t="0" r="0" b="0" l="0"/>
-            <wp:docPr id="61" name="Statistiques-fiche.png" descr="La fiche statistique d'une œuvre (chiffres fictifs)." title="La fiche statistique d'une œuvre (chiffres fictifs)."/>
+            <wp:docPr id="63" name="Statistiques-fiche.png" descr="La fiche statistique d'une œuvre (chiffres fictifs)." title="La fiche statistique d'une œuvre (chiffres fictifs)."/>
             <wp:cNvGraphicFramePr>
               <a:graphicFrameLocks xmlns:a="http://schemas.openxmlformats.org/drawingml/2006/main" noChangeAspect="1"/>
             </wp:cNvGraphicFramePr>
@@ -25224,11 +25319,11 @@
       <w:pPr>
         <w:pStyle w:val="Heading2"/>
       </w:pPr>
-      <w:bookmarkStart w:name="titre-77" w:id="168"/>
+      <w:bookmarkStart w:name="titre-77" w:id="173"/>
       <w:r>
         <w:t xml:space="preserve">13.3 Voir qui suit une œuvre (gérants)</w:t>
       </w:r>
-      <w:bookmarkEnd w:id="168"/>
+      <w:bookmarkEnd w:id="173"/>
     </w:p>
     <w:p>
       <w:r>
@@ -25401,7 +25496,7 @@
           <wp:inline distT="0" distB="0" distL="0" distR="0">
             <wp:extent cx="4572000" cy="2543175"/>
             <wp:effectExtent t="0" r="0" b="0" l="0"/>
-            <wp:docPr id="62" name="Statistiques-lecteurs.png" descr="La liste des lecteurs qui suivent une œuvre (pseudos fictifs)." title="La liste des lecteurs qui suivent une œuvre (pseudos fictifs)."/>
+            <wp:docPr id="64" name="Statistiques-lecteurs.png" descr="La liste des lecteurs qui suivent une œuvre (pseudos fictifs)." title="La liste des lecteurs qui suivent une œuvre (pseudos fictifs)."/>
             <wp:cNvGraphicFramePr>
               <a:graphicFrameLocks xmlns:a="http://schemas.openxmlformats.org/drawingml/2006/main" noChangeAspect="1"/>
             </wp:cNvGraphicFramePr>
@@ -25539,11 +25634,11 @@
       <w:pPr>
         <w:pStyle w:val="Heading2"/>
       </w:pPr>
-      <w:bookmarkStart w:name="titre-78" w:id="169"/>
+      <w:bookmarkStart w:name="titre-78" w:id="174"/>
       <w:r>
         <w:t xml:space="preserve">13.4 Exporter le classement des œuvres</w:t>
       </w:r>
-      <w:bookmarkEnd w:id="169"/>
+      <w:bookmarkEnd w:id="174"/>
     </w:p>
     <w:p>
       <w:pPr>
@@ -25608,11 +25703,11 @@
       <w:pPr>
         <w:pStyle w:val="Heading2"/>
       </w:pPr>
-      <w:bookmarkStart w:name="titre-79" w:id="170"/>
+      <w:bookmarkStart w:name="titre-79" w:id="175"/>
       <w:r>
         <w:t xml:space="preserve">13.5 Comprendre les données de démonstration</w:t>
       </w:r>
-      <w:bookmarkEnd w:id="170"/>
+      <w:bookmarkEnd w:id="175"/>
     </w:p>
     <w:p>
       <w:r>
@@ -25691,11 +25786,1395 @@
       <w:pPr>
         <w:pStyle w:val="Heading1"/>
       </w:pPr>
-      <w:bookmarkStart w:name="titre-80" w:id="171"/>
-      <w:r>
-        <w:t xml:space="preserve">14 Les coquilles signalées par les lecteurs</w:t>
-      </w:r>
-      <w:bookmarkEnd w:id="171"/>
+      <w:bookmarkStart w:name="titre-80" w:id="176"/>
+      <w:r>
+        <w:t xml:space="preserve">14 Les comptes inscrits (gérants)</w:t>
+      </w:r>
+      <w:bookmarkEnd w:id="176"/>
+    </w:p>
+    <w:p>
+      <w:r>
+        <w:t xml:space="preserve">Le menu </w:t>
+      </w:r>
+      <w:r>
+        <w:rPr>
+          <w:b/>
+          <w:bCs/>
+        </w:rPr>
+        <w:t xml:space="preserve">Équipe</w:t>
+      </w:r>
+      <w:r>
+        <w:t xml:space="preserve">, puis </w:t>
+      </w:r>
+      <w:r>
+        <w:rPr>
+          <w:b/>
+          <w:bCs/>
+        </w:rPr>
+        <w:t xml:space="preserve">Comptes inscrits</w:t>
+      </w:r>
+      <w:r>
+        <w:t xml:space="preserve">, liste tous les comptes du site : lecteurs et membres de l'équipe. Réservé aux gérants et aux administrateurs : les autres membres ne voient pas l'entrée.</w:t>
+      </w:r>
+    </w:p>
+    <w:tbl>
+      <w:tblPr>
+        <w:tblW w:type="dxa" w:w="9026"/>
+        <w:tblBorders>
+          <w:top w:val="single" w:color="auto" w:sz="4"/>
+          <w:left w:val="single" w:color="auto" w:sz="4"/>
+          <w:bottom w:val="single" w:color="auto" w:sz="4"/>
+          <w:right w:val="single" w:color="auto" w:sz="4"/>
+          <w:insideH w:val="single" w:color="auto" w:sz="4"/>
+          <w:insideV w:val="single" w:color="auto" w:sz="4"/>
+        </w:tblBorders>
+      </w:tblPr>
+      <w:tblGrid>
+        <w:gridCol w:w="1300"/>
+        <w:gridCol w:w="7726"/>
+      </w:tblGrid>
+      <w:tr>
+        <w:trPr>
+          <w:cantSplit/>
+          <w:tblHeader/>
+        </w:trPr>
+        <w:tc>
+          <w:tcPr>
+            <w:tcW w:type="dxa" w:w="1300"/>
+            <w:tcBorders>
+              <w:top w:val="single" w:color="CFC6DE" w:sz="4"/>
+              <w:left w:val="single" w:color="CFC6DE" w:sz="4"/>
+              <w:bottom w:val="single" w:color="CFC6DE" w:sz="4"/>
+              <w:right w:val="single" w:color="CFC6DE" w:sz="4"/>
+            </w:tcBorders>
+            <w:shd w:fill="3A2A63" w:color="auto" w:val="clear"/>
+            <w:tcMar>
+              <w:top w:type="dxa" w:w="70"/>
+              <w:left w:type="dxa" w:w="110"/>
+              <w:bottom w:type="dxa" w:w="70"/>
+              <w:right w:type="dxa" w:w="110"/>
+            </w:tcMar>
+            <w:vAlign w:val="center"/>
+          </w:tcPr>
+          <w:p>
+            <w:pPr>
+              <w:spacing w:after="0" w:before="0"/>
+              <w:rPr>
+                <w:b/>
+                <w:bCs/>
+                <w:color w:val="FFFFFF"/>
+                <w:sz w:val="19"/>
+                <w:szCs w:val="19"/>
+              </w:rPr>
+            </w:pPr>
+            <w:r>
+              <w:rPr>
+                <w:b/>
+                <w:bCs/>
+                <w:color w:val="FFFFFF"/>
+                <w:sz w:val="19"/>
+                <w:szCs w:val="19"/>
+              </w:rPr>
+              <w:t xml:space="preserve">Mot</w:t>
+            </w:r>
+          </w:p>
+        </w:tc>
+        <w:tc>
+          <w:tcPr>
+            <w:tcW w:type="dxa" w:w="7726"/>
+            <w:tcBorders>
+              <w:top w:val="single" w:color="CFC6DE" w:sz="4"/>
+              <w:left w:val="single" w:color="CFC6DE" w:sz="4"/>
+              <w:bottom w:val="single" w:color="CFC6DE" w:sz="4"/>
+              <w:right w:val="single" w:color="CFC6DE" w:sz="4"/>
+            </w:tcBorders>
+            <w:shd w:fill="3A2A63" w:color="auto" w:val="clear"/>
+            <w:tcMar>
+              <w:top w:type="dxa" w:w="70"/>
+              <w:left w:type="dxa" w:w="110"/>
+              <w:bottom w:type="dxa" w:w="70"/>
+              <w:right w:type="dxa" w:w="110"/>
+            </w:tcMar>
+            <w:vAlign w:val="center"/>
+          </w:tcPr>
+          <w:p>
+            <w:pPr>
+              <w:spacing w:after="0" w:before="0"/>
+              <w:rPr>
+                <w:b/>
+                <w:bCs/>
+                <w:color w:val="FFFFFF"/>
+                <w:sz w:val="19"/>
+                <w:szCs w:val="19"/>
+              </w:rPr>
+            </w:pPr>
+            <w:r>
+              <w:rPr>
+                <w:b/>
+                <w:bCs/>
+                <w:color w:val="FFFFFF"/>
+                <w:sz w:val="19"/>
+                <w:szCs w:val="19"/>
+              </w:rPr>
+              <w:t xml:space="preserve">Ce qu'il veut dire</w:t>
+            </w:r>
+          </w:p>
+        </w:tc>
+      </w:tr>
+      <w:tr>
+        <w:trPr>
+          <w:cantSplit/>
+          <w:tblHeader w:val="off"/>
+        </w:trPr>
+        <w:tc>
+          <w:tcPr>
+            <w:tcW w:type="dxa" w:w="1300"/>
+            <w:tcBorders>
+              <w:top w:val="single" w:color="CFC6DE" w:sz="4"/>
+              <w:left w:val="single" w:color="CFC6DE" w:sz="4"/>
+              <w:bottom w:val="single" w:color="CFC6DE" w:sz="4"/>
+              <w:right w:val="single" w:color="CFC6DE" w:sz="4"/>
+            </w:tcBorders>
+            <w:tcMar>
+              <w:top w:type="dxa" w:w="70"/>
+              <w:left w:type="dxa" w:w="110"/>
+              <w:bottom w:type="dxa" w:w="70"/>
+              <w:right w:type="dxa" w:w="110"/>
+            </w:tcMar>
+            <w:vAlign w:val="center"/>
+          </w:tcPr>
+          <w:p>
+            <w:pPr>
+              <w:spacing w:after="0" w:before="0"/>
+              <w:rPr>
+                <w:sz w:val="19"/>
+                <w:szCs w:val="19"/>
+              </w:rPr>
+            </w:pPr>
+            <w:r>
+              <w:rPr>
+                <w:b/>
+                <w:bCs/>
+                <w:sz w:val="19"/>
+                <w:szCs w:val="19"/>
+              </w:rPr>
+              <w:t xml:space="preserve">Source</w:t>
+            </w:r>
+          </w:p>
+        </w:tc>
+        <w:tc>
+          <w:tcPr>
+            <w:tcW w:type="dxa" w:w="7726"/>
+            <w:tcBorders>
+              <w:top w:val="single" w:color="CFC6DE" w:sz="4"/>
+              <w:left w:val="single" w:color="CFC6DE" w:sz="4"/>
+              <w:bottom w:val="single" w:color="CFC6DE" w:sz="4"/>
+              <w:right w:val="single" w:color="CFC6DE" w:sz="4"/>
+            </w:tcBorders>
+            <w:tcMar>
+              <w:top w:type="dxa" w:w="70"/>
+              <w:left w:type="dxa" w:w="110"/>
+              <w:bottom w:type="dxa" w:w="70"/>
+              <w:right w:type="dxa" w:w="110"/>
+            </w:tcMar>
+            <w:vAlign w:val="center"/>
+          </w:tcPr>
+          <w:p>
+            <w:pPr>
+              <w:spacing w:after="0" w:before="0"/>
+              <w:rPr>
+                <w:sz w:val="19"/>
+                <w:szCs w:val="19"/>
+              </w:rPr>
+            </w:pPr>
+            <w:r>
+              <w:rPr>
+                <w:sz w:val="19"/>
+                <w:szCs w:val="19"/>
+              </w:rPr>
+              <w:t xml:space="preserve">Comment le compte a été créé : </w:t>
+            </w:r>
+            <w:r>
+              <w:rPr>
+                <w:b/>
+                <w:bCs/>
+                <w:sz w:val="19"/>
+                <w:szCs w:val="19"/>
+              </w:rPr>
+              <w:t xml:space="preserve">Formulaire du site</w:t>
+            </w:r>
+            <w:r>
+              <w:rPr>
+                <w:sz w:val="19"/>
+                <w:szCs w:val="19"/>
+              </w:rPr>
+              <w:t xml:space="preserve"> ou </w:t>
+            </w:r>
+            <w:r>
+              <w:rPr>
+                <w:b/>
+                <w:bCs/>
+                <w:sz w:val="19"/>
+                <w:szCs w:val="19"/>
+              </w:rPr>
+              <w:t xml:space="preserve">Discord</w:t>
+            </w:r>
+            <w:r>
+              <w:rPr>
+                <w:sz w:val="19"/>
+                <w:szCs w:val="19"/>
+              </w:rPr>
+              <w:t xml:space="preserve">. « (déduite) » pour les comptes plus anciens que la fonction</w:t>
+            </w:r>
+          </w:p>
+        </w:tc>
+      </w:tr>
+      <w:tr>
+        <w:trPr>
+          <w:cantSplit/>
+          <w:tblHeader w:val="off"/>
+        </w:trPr>
+        <w:tc>
+          <w:tcPr>
+            <w:tcW w:type="dxa" w:w="1300"/>
+            <w:tcBorders>
+              <w:top w:val="single" w:color="CFC6DE" w:sz="4"/>
+              <w:left w:val="single" w:color="CFC6DE" w:sz="4"/>
+              <w:bottom w:val="single" w:color="CFC6DE" w:sz="4"/>
+              <w:right w:val="single" w:color="CFC6DE" w:sz="4"/>
+            </w:tcBorders>
+            <w:shd w:fill="F6F3FA" w:color="auto" w:val="clear"/>
+            <w:tcMar>
+              <w:top w:type="dxa" w:w="70"/>
+              <w:left w:type="dxa" w:w="110"/>
+              <w:bottom w:type="dxa" w:w="70"/>
+              <w:right w:type="dxa" w:w="110"/>
+            </w:tcMar>
+            <w:vAlign w:val="center"/>
+          </w:tcPr>
+          <w:p>
+            <w:pPr>
+              <w:spacing w:after="0" w:before="0"/>
+              <w:rPr>
+                <w:sz w:val="19"/>
+                <w:szCs w:val="19"/>
+              </w:rPr>
+            </w:pPr>
+            <w:r>
+              <w:rPr>
+                <w:b/>
+                <w:bCs/>
+                <w:sz w:val="19"/>
+                <w:szCs w:val="19"/>
+              </w:rPr>
+              <w:t xml:space="preserve">Dernière activité</w:t>
+            </w:r>
+          </w:p>
+        </w:tc>
+        <w:tc>
+          <w:tcPr>
+            <w:tcW w:type="dxa" w:w="7726"/>
+            <w:tcBorders>
+              <w:top w:val="single" w:color="CFC6DE" w:sz="4"/>
+              <w:left w:val="single" w:color="CFC6DE" w:sz="4"/>
+              <w:bottom w:val="single" w:color="CFC6DE" w:sz="4"/>
+              <w:right w:val="single" w:color="CFC6DE" w:sz="4"/>
+            </w:tcBorders>
+            <w:shd w:fill="F6F3FA" w:color="auto" w:val="clear"/>
+            <w:tcMar>
+              <w:top w:type="dxa" w:w="70"/>
+              <w:left w:type="dxa" w:w="110"/>
+              <w:bottom w:type="dxa" w:w="70"/>
+              <w:right w:type="dxa" w:w="110"/>
+            </w:tcMar>
+            <w:vAlign w:val="center"/>
+          </w:tcPr>
+          <w:p>
+            <w:pPr>
+              <w:spacing w:after="0" w:before="0"/>
+              <w:rPr>
+                <w:sz w:val="19"/>
+                <w:szCs w:val="19"/>
+              </w:rPr>
+            </w:pPr>
+            <w:r>
+              <w:rPr>
+                <w:sz w:val="19"/>
+                <w:szCs w:val="19"/>
+              </w:rPr>
+              <w:t xml:space="preserve">Le jour de la dernière connexion, lecture, mise en favori, commentaire ou coquille signalée. Jamais l'heure ni l'adresse IP. « inconnue » : rien depuis le début du relevé</w:t>
+            </w:r>
+          </w:p>
+        </w:tc>
+      </w:tr>
+      <w:tr>
+        <w:trPr>
+          <w:cantSplit/>
+          <w:tblHeader w:val="off"/>
+        </w:trPr>
+        <w:tc>
+          <w:tcPr>
+            <w:tcW w:type="dxa" w:w="1300"/>
+            <w:tcBorders>
+              <w:top w:val="single" w:color="CFC6DE" w:sz="4"/>
+              <w:left w:val="single" w:color="CFC6DE" w:sz="4"/>
+              <w:bottom w:val="single" w:color="CFC6DE" w:sz="4"/>
+              <w:right w:val="single" w:color="CFC6DE" w:sz="4"/>
+            </w:tcBorders>
+            <w:tcMar>
+              <w:top w:type="dxa" w:w="70"/>
+              <w:left w:type="dxa" w:w="110"/>
+              <w:bottom w:type="dxa" w:w="70"/>
+              <w:right w:type="dxa" w:w="110"/>
+            </w:tcMar>
+            <w:vAlign w:val="center"/>
+          </w:tcPr>
+          <w:p>
+            <w:pPr>
+              <w:spacing w:after="0" w:before="0"/>
+              <w:rPr>
+                <w:sz w:val="19"/>
+                <w:szCs w:val="19"/>
+              </w:rPr>
+            </w:pPr>
+            <w:r>
+              <w:rPr>
+                <w:b/>
+                <w:bCs/>
+                <w:sz w:val="19"/>
+                <w:szCs w:val="19"/>
+              </w:rPr>
+              <w:t xml:space="preserve">Chap. lus (est.)</w:t>
+            </w:r>
+          </w:p>
+        </w:tc>
+        <w:tc>
+          <w:tcPr>
+            <w:tcW w:type="dxa" w:w="7726"/>
+            <w:tcBorders>
+              <w:top w:val="single" w:color="CFC6DE" w:sz="4"/>
+              <w:left w:val="single" w:color="CFC6DE" w:sz="4"/>
+              <w:bottom w:val="single" w:color="CFC6DE" w:sz="4"/>
+              <w:right w:val="single" w:color="CFC6DE" w:sz="4"/>
+            </w:tcBorders>
+            <w:tcMar>
+              <w:top w:type="dxa" w:w="70"/>
+              <w:left w:type="dxa" w:w="110"/>
+              <w:bottom w:type="dxa" w:w="70"/>
+              <w:right w:type="dxa" w:w="110"/>
+            </w:tcMar>
+            <w:vAlign w:val="center"/>
+          </w:tcPr>
+          <w:p>
+            <w:pPr>
+              <w:spacing w:after="0" w:before="0"/>
+              <w:rPr>
+                <w:sz w:val="19"/>
+                <w:szCs w:val="19"/>
+              </w:rPr>
+            </w:pPr>
+            <w:r>
+              <w:rPr>
+                <w:sz w:val="19"/>
+                <w:szCs w:val="19"/>
+              </w:rPr>
+              <w:t xml:space="preserve">Estimation tirée de la position de lecture, comme dans les statistiques</w:t>
+            </w:r>
+          </w:p>
+        </w:tc>
+      </w:tr>
+      <w:tr>
+        <w:trPr>
+          <w:cantSplit/>
+          <w:tblHeader w:val="off"/>
+        </w:trPr>
+        <w:tc>
+          <w:tcPr>
+            <w:tcW w:type="dxa" w:w="1300"/>
+            <w:tcBorders>
+              <w:top w:val="single" w:color="CFC6DE" w:sz="4"/>
+              <w:left w:val="single" w:color="CFC6DE" w:sz="4"/>
+              <w:bottom w:val="single" w:color="CFC6DE" w:sz="4"/>
+              <w:right w:val="single" w:color="CFC6DE" w:sz="4"/>
+            </w:tcBorders>
+            <w:shd w:fill="F6F3FA" w:color="auto" w:val="clear"/>
+            <w:tcMar>
+              <w:top w:type="dxa" w:w="70"/>
+              <w:left w:type="dxa" w:w="110"/>
+              <w:bottom w:type="dxa" w:w="70"/>
+              <w:right w:type="dxa" w:w="110"/>
+            </w:tcMar>
+            <w:vAlign w:val="center"/>
+          </w:tcPr>
+          <w:p>
+            <w:pPr>
+              <w:spacing w:after="0" w:before="0"/>
+              <w:rPr>
+                <w:sz w:val="19"/>
+                <w:szCs w:val="19"/>
+              </w:rPr>
+            </w:pPr>
+            <w:r>
+              <w:rPr>
+                <w:b/>
+                <w:bCs/>
+                <w:sz w:val="19"/>
+                <w:szCs w:val="19"/>
+              </w:rPr>
+              <w:t xml:space="preserve">Favoris</w:t>
+            </w:r>
+          </w:p>
+        </w:tc>
+        <w:tc>
+          <w:tcPr>
+            <w:tcW w:type="dxa" w:w="7726"/>
+            <w:tcBorders>
+              <w:top w:val="single" w:color="CFC6DE" w:sz="4"/>
+              <w:left w:val="single" w:color="CFC6DE" w:sz="4"/>
+              <w:bottom w:val="single" w:color="CFC6DE" w:sz="4"/>
+              <w:right w:val="single" w:color="CFC6DE" w:sz="4"/>
+            </w:tcBorders>
+            <w:shd w:fill="F6F3FA" w:color="auto" w:val="clear"/>
+            <w:tcMar>
+              <w:top w:type="dxa" w:w="70"/>
+              <w:left w:type="dxa" w:w="110"/>
+              <w:bottom w:type="dxa" w:w="70"/>
+              <w:right w:type="dxa" w:w="110"/>
+            </w:tcMar>
+            <w:vAlign w:val="center"/>
+          </w:tcPr>
+          <w:p>
+            <w:pPr>
+              <w:spacing w:after="0" w:before="0"/>
+              <w:rPr>
+                <w:sz w:val="19"/>
+                <w:szCs w:val="19"/>
+              </w:rPr>
+            </w:pPr>
+            <w:r>
+              <w:rPr>
+                <w:sz w:val="19"/>
+                <w:szCs w:val="19"/>
+              </w:rPr>
+              <w:t xml:space="preserve">Nombre de favoris ; entre parenthèses, ceux dont le lecteur reçoit les alertes</w:t>
+            </w:r>
+          </w:p>
+        </w:tc>
+      </w:tr>
+      <w:tr>
+        <w:trPr>
+          <w:cantSplit/>
+          <w:tblHeader w:val="off"/>
+        </w:trPr>
+        <w:tc>
+          <w:tcPr>
+            <w:tcW w:type="dxa" w:w="1300"/>
+            <w:tcBorders>
+              <w:top w:val="single" w:color="CFC6DE" w:sz="4"/>
+              <w:left w:val="single" w:color="CFC6DE" w:sz="4"/>
+              <w:bottom w:val="single" w:color="CFC6DE" w:sz="4"/>
+              <w:right w:val="single" w:color="CFC6DE" w:sz="4"/>
+            </w:tcBorders>
+            <w:tcMar>
+              <w:top w:type="dxa" w:w="70"/>
+              <w:left w:type="dxa" w:w="110"/>
+              <w:bottom w:type="dxa" w:w="70"/>
+              <w:right w:type="dxa" w:w="110"/>
+            </w:tcMar>
+            <w:vAlign w:val="center"/>
+          </w:tcPr>
+          <w:p>
+            <w:pPr>
+              <w:spacing w:after="0" w:before="0"/>
+              <w:rPr>
+                <w:sz w:val="19"/>
+                <w:szCs w:val="19"/>
+              </w:rPr>
+            </w:pPr>
+            <w:r>
+              <w:rPr>
+                <w:b/>
+                <w:bCs/>
+                <w:sz w:val="19"/>
+                <w:szCs w:val="19"/>
+              </w:rPr>
+              <w:t xml:space="preserve">Sans mdp</w:t>
+            </w:r>
+          </w:p>
+        </w:tc>
+        <w:tc>
+          <w:tcPr>
+            <w:tcW w:type="dxa" w:w="7726"/>
+            <w:tcBorders>
+              <w:top w:val="single" w:color="CFC6DE" w:sz="4"/>
+              <w:left w:val="single" w:color="CFC6DE" w:sz="4"/>
+              <w:bottom w:val="single" w:color="CFC6DE" w:sz="4"/>
+              <w:right w:val="single" w:color="CFC6DE" w:sz="4"/>
+            </w:tcBorders>
+            <w:tcMar>
+              <w:top w:type="dxa" w:w="70"/>
+              <w:left w:type="dxa" w:w="110"/>
+              <w:bottom w:type="dxa" w:w="70"/>
+              <w:right w:type="dxa" w:w="110"/>
+            </w:tcMar>
+            <w:vAlign w:val="center"/>
+          </w:tcPr>
+          <w:p>
+            <w:pPr>
+              <w:spacing w:after="0" w:before="0"/>
+              <w:rPr>
+                <w:sz w:val="19"/>
+                <w:szCs w:val="19"/>
+              </w:rPr>
+            </w:pPr>
+            <w:r>
+              <w:rPr>
+                <w:sz w:val="19"/>
+                <w:szCs w:val="19"/>
+              </w:rPr>
+              <w:t xml:space="preserve">Compte créé avec Discord, sans mot de passe : il ne se connecte que par Discord</w:t>
+            </w:r>
+          </w:p>
+        </w:tc>
+      </w:tr>
+    </w:tbl>
+    <w:p>
+      <w:pPr>
+        <w:pStyle w:val="Heading2"/>
+      </w:pPr>
+      <w:bookmarkStart w:name="titre-81" w:id="177"/>
+      <w:r>
+        <w:t xml:space="preserve">14.1 Trouver un compte</w:t>
+      </w:r>
+      <w:bookmarkEnd w:id="177"/>
+    </w:p>
+    <w:p>
+      <w:pPr>
+        <w:pStyle w:val="ListParagraph"/>
+        <w:numPr>
+          <w:ilvl w:val="0"/>
+          <w:numId w:val="41"/>
+        </w:numPr>
+        <w:spacing w:after="60" w:before="40"/>
+      </w:pPr>
+      <w:r>
+        <w:t xml:space="preserve">Dans le menu, ouvrez </w:t>
+      </w:r>
+      <w:r>
+        <w:rPr>
+          <w:b/>
+          <w:bCs/>
+        </w:rPr>
+        <w:t xml:space="preserve">Équipe</w:t>
+      </w:r>
+      <w:r>
+        <w:t xml:space="preserve">, puis </w:t>
+      </w:r>
+      <w:r>
+        <w:rPr>
+          <w:b/>
+          <w:bCs/>
+        </w:rPr>
+        <w:t xml:space="preserve">Comptes inscrits</w:t>
+      </w:r>
+      <w:r>
+        <w:t xml:space="preserve">.</w:t>
+      </w:r>
+    </w:p>
+    <w:p>
+      <w:pPr>
+        <w:pStyle w:val="ListParagraph"/>
+        <w:numPr>
+          <w:ilvl w:val="0"/>
+          <w:numId w:val="41"/>
+        </w:numPr>
+        <w:spacing w:after="60" w:before="40"/>
+      </w:pPr>
+      <w:r>
+        <w:t xml:space="preserve">Dans </w:t>
+      </w:r>
+      <w:r>
+        <w:rPr>
+          <w:b/>
+          <w:bCs/>
+        </w:rPr>
+        <w:t xml:space="preserve">Rechercher</w:t>
+      </w:r>
+      <w:r>
+        <w:t xml:space="preserve">, tapez au moins 2 caractères du pseudo ou du nom Discord, ou l'adresse e-mail </w:t>
+      </w:r>
+      <w:r>
+        <w:rPr>
+          <w:b/>
+          <w:bCs/>
+        </w:rPr>
+        <w:t xml:space="preserve">complète</w:t>
+      </w:r>
+      <w:r>
+        <w:t xml:space="preserve">.</w:t>
+      </w:r>
+    </w:p>
+    <w:p>
+      <w:pPr>
+        <w:pStyle w:val="ListParagraph"/>
+        <w:numPr>
+          <w:ilvl w:val="0"/>
+          <w:numId w:val="41"/>
+        </w:numPr>
+        <w:spacing w:after="60" w:before="40"/>
+      </w:pPr>
+      <w:r>
+        <w:t xml:space="preserve">Au besoin, choisissez un </w:t>
+      </w:r>
+      <w:r>
+        <w:rPr>
+          <w:b/>
+          <w:bCs/>
+        </w:rPr>
+        <w:t xml:space="preserve">Rôle</w:t>
+      </w:r>
+      <w:r>
+        <w:t xml:space="preserve">, une </w:t>
+      </w:r>
+      <w:r>
+        <w:rPr>
+          <w:b/>
+          <w:bCs/>
+        </w:rPr>
+        <w:t xml:space="preserve">Source</w:t>
+      </w:r>
+      <w:r>
+        <w:t xml:space="preserve">, </w:t>
+      </w:r>
+      <w:r>
+        <w:rPr>
+          <w:b/>
+          <w:bCs/>
+        </w:rPr>
+        <w:t xml:space="preserve">Discord</w:t>
+      </w:r>
+      <w:r>
+        <w:t xml:space="preserve">, une </w:t>
+      </w:r>
+      <w:r>
+        <w:rPr>
+          <w:b/>
+          <w:bCs/>
+        </w:rPr>
+        <w:t xml:space="preserve">Activité</w:t>
+      </w:r>
+      <w:r>
+        <w:t xml:space="preserve">, une période d'inscription (</w:t>
+      </w:r>
+      <w:r>
+        <w:rPr>
+          <w:b/>
+          <w:bCs/>
+        </w:rPr>
+        <w:t xml:space="preserve">Inscrits</w:t>
+      </w:r>
+      <w:r>
+        <w:t xml:space="preserve">), </w:t>
+      </w:r>
+      <w:r>
+        <w:rPr>
+          <w:b/>
+          <w:bCs/>
+        </w:rPr>
+        <w:t xml:space="preserve">Trier par</w:t>
+      </w:r>
+      <w:r>
+        <w:t xml:space="preserve"> et l'</w:t>
+      </w:r>
+      <w:r>
+        <w:rPr>
+          <w:b/>
+          <w:bCs/>
+        </w:rPr>
+        <w:t xml:space="preserve">Ordre</w:t>
+      </w:r>
+      <w:r>
+        <w:t xml:space="preserve">, puis cliquez sur </w:t>
+      </w:r>
+      <w:r>
+        <w:rPr>
+          <w:b/>
+          <w:bCs/>
+        </w:rPr>
+        <w:t xml:space="preserve">Filtrer</w:t>
+      </w:r>
+      <w:r>
+        <w:t xml:space="preserve">. </w:t>
+      </w:r>
+      <w:r>
+        <w:rPr>
+          <w:b/>
+          <w:bCs/>
+        </w:rPr>
+        <w:t xml:space="preserve">Réinitialiser</w:t>
+      </w:r>
+      <w:r>
+        <w:t xml:space="preserve"> efface les filtres.</w:t>
+      </w:r>
+    </w:p>
+    <w:p>
+      <w:pPr>
+        <w:pStyle w:val="ListParagraph"/>
+        <w:numPr>
+          <w:ilvl w:val="0"/>
+          <w:numId w:val="41"/>
+        </w:numPr>
+        <w:spacing w:after="60" w:before="40"/>
+      </w:pPr>
+      <w:r>
+        <w:t xml:space="preserve">Les </w:t>
+      </w:r>
+      <w:r>
+        <w:rPr>
+          <w:b/>
+          <w:bCs/>
+        </w:rPr>
+        <w:t xml:space="preserve">Filtres rapides</w:t>
+      </w:r>
+      <w:r>
+        <w:t xml:space="preserve"> (</w:t>
+      </w:r>
+      <w:r>
+        <w:rPr>
+          <w:b/>
+          <w:bCs/>
+        </w:rPr>
+        <w:t xml:space="preserve">Discord</w:t>
+      </w:r>
+      <w:r>
+        <w:t xml:space="preserve">, </w:t>
+      </w:r>
+      <w:r>
+        <w:rPr>
+          <w:b/>
+          <w:bCs/>
+        </w:rPr>
+        <w:t xml:space="preserve">Équipe</w:t>
+      </w:r>
+      <w:r>
+        <w:t xml:space="preserve">, </w:t>
+      </w:r>
+      <w:r>
+        <w:rPr>
+          <w:b/>
+          <w:bCs/>
+        </w:rPr>
+        <w:t xml:space="preserve">Actifs 7 j</w:t>
+      </w:r>
+      <w:r>
+        <w:t xml:space="preserve">) appliquent un filtre en un clic.</w:t>
+      </w:r>
+    </w:p>
+    <w:p>
+      <w:pPr>
+        <w:keepNext/>
+        <w:spacing w:after="60" w:before="160"/>
+        <w:jc w:val="center"/>
+      </w:pPr>
+      <w:r>
+        <w:drawing>
+          <wp:inline distT="0" distB="0" distL="0" distR="0">
+            <wp:extent cx="4476750" cy="6667500"/>
+            <wp:effectExtent t="0" r="0" b="0" l="0"/>
+            <wp:docPr id="65" name="Comptes-liste.png" descr="La liste des comptes inscrits (comptes fictifs)." title="La liste des comptes inscrits (comptes fictifs)."/>
+            <wp:cNvGraphicFramePr>
+              <a:graphicFrameLocks xmlns:a="http://schemas.openxmlformats.org/drawingml/2006/main" noChangeAspect="1"/>
+            </wp:cNvGraphicFramePr>
+            <a:graphic xmlns:a="http://schemas.openxmlformats.org/drawingml/2006/main">
+              <a:graphicData uri="http://schemas.openxmlformats.org/drawingml/2006/picture">
+                <pic:pic xmlns:pic="http://schemas.openxmlformats.org/drawingml/2006/picture">
+                  <pic:nvPicPr>
+                    <pic:cNvPr id="0" name="" descr=""/>
+                    <pic:cNvPicPr>
+                      <a:picLocks noChangeAspect="1" noChangeArrowheads="1"/>
+                    </pic:cNvPicPr>
+                  </pic:nvPicPr>
+                  <pic:blipFill>
+                    <a:blip r:embed="rId40" cstate="none"/>
+                    <a:srcRect/>
+                    <a:stretch>
+                      <a:fillRect/>
+                    </a:stretch>
+                  </pic:blipFill>
+                  <pic:spPr bwMode="auto">
+                    <a:xfrm>
+                      <a:off x="0" y="0"/>
+                      <a:ext cx="4476750" cy="6667500"/>
+                    </a:xfrm>
+                    <a:prstGeom prst="rect">
+                      <a:avLst/>
+                    </a:prstGeom>
+                  </pic:spPr>
+                </pic:pic>
+              </a:graphicData>
+            </a:graphic>
+          </wp:inline>
+        </w:drawing>
+      </w:r>
+    </w:p>
+    <w:p>
+      <w:pPr>
+        <w:pStyle w:val="Legende"/>
+      </w:pPr>
+      <w:r>
+        <w:rPr>
+          <w:b/>
+          <w:bCs/>
+        </w:rPr>
+        <w:t xml:space="preserve">Figure 31 — </w:t>
+      </w:r>
+      <w:r>
+        <w:t xml:space="preserve">La liste des comptes inscrits (comptes fictifs).</w:t>
+      </w:r>
+    </w:p>
+    <w:p>
+      <w:pPr>
+        <w:pStyle w:val="Heading2"/>
+      </w:pPr>
+      <w:bookmarkStart w:name="titre-82" w:id="178"/>
+      <w:r>
+        <w:t xml:space="preserve">14.2 Consulter la fiche d'un compte</w:t>
+      </w:r>
+      <w:bookmarkEnd w:id="178"/>
+    </w:p>
+    <w:p>
+      <w:pPr>
+        <w:pStyle w:val="ListParagraph"/>
+        <w:numPr>
+          <w:ilvl w:val="0"/>
+          <w:numId w:val="42"/>
+        </w:numPr>
+        <w:spacing w:after="60" w:before="40"/>
+      </w:pPr>
+      <w:r>
+        <w:t xml:space="preserve">Cliquez sur le pseudo dans la liste.</w:t>
+      </w:r>
+    </w:p>
+    <w:p>
+      <w:pPr>
+        <w:pStyle w:val="ListParagraph"/>
+        <w:numPr>
+          <w:ilvl w:val="0"/>
+          <w:numId w:val="42"/>
+        </w:numPr>
+        <w:spacing w:after="60" w:before="40"/>
+      </w:pPr>
+      <w:r>
+        <w:t xml:space="preserve">La fiche affiche l'identité (dont l'</w:t>
+      </w:r>
+      <w:r>
+        <w:rPr>
+          <w:b/>
+          <w:bCs/>
+        </w:rPr>
+        <w:t xml:space="preserve">adresse e-mail</w:t>
+      </w:r>
+      <w:r>
+        <w:t xml:space="preserve">), la lecture (séries suivies, chapitres lus, dernière position), les favoris et alertes, les listes de lecture, les notes, les commentaires, les coquilles signalées et les notifications.</w:t>
+      </w:r>
+    </w:p>
+    <w:p>
+      <w:pPr>
+        <w:pStyle w:val="ListParagraph"/>
+        <w:numPr>
+          <w:ilvl w:val="0"/>
+          <w:numId w:val="42"/>
+        </w:numPr>
+        <w:spacing w:after="60" w:before="40"/>
+      </w:pPr>
+      <w:r>
+        <w:rPr>
+          <w:b/>
+          <w:bCs/>
+        </w:rPr>
+        <w:t xml:space="preserve">← Comptes inscrits</w:t>
+      </w:r>
+      <w:r>
+        <w:t xml:space="preserve"> ramène à la liste, avec les mêmes filtres.</w:t>
+      </w:r>
+    </w:p>
+    <w:p>
+      <w:pPr>
+        <w:keepNext/>
+        <w:spacing w:after="60" w:before="160"/>
+        <w:jc w:val="center"/>
+      </w:pPr>
+      <w:r>
+        <w:drawing>
+          <wp:inline distT="0" distB="0" distL="0" distR="0">
+            <wp:extent cx="4572000" cy="6410325"/>
+            <wp:effectExtent t="0" r="0" b="0" l="0"/>
+            <wp:docPr id="66" name="Comptes-fiche.png" descr="La fiche d'un compte (données fictives)." title="La fiche d'un compte (données fictives)."/>
+            <wp:cNvGraphicFramePr>
+              <a:graphicFrameLocks xmlns:a="http://schemas.openxmlformats.org/drawingml/2006/main" noChangeAspect="1"/>
+            </wp:cNvGraphicFramePr>
+            <a:graphic xmlns:a="http://schemas.openxmlformats.org/drawingml/2006/main">
+              <a:graphicData uri="http://schemas.openxmlformats.org/drawingml/2006/picture">
+                <pic:pic xmlns:pic="http://schemas.openxmlformats.org/drawingml/2006/picture">
+                  <pic:nvPicPr>
+                    <pic:cNvPr id="0" name="" descr=""/>
+                    <pic:cNvPicPr>
+                      <a:picLocks noChangeAspect="1" noChangeArrowheads="1"/>
+                    </pic:cNvPicPr>
+                  </pic:nvPicPr>
+                  <pic:blipFill>
+                    <a:blip r:embed="rId41" cstate="none"/>
+                    <a:srcRect/>
+                    <a:stretch>
+                      <a:fillRect/>
+                    </a:stretch>
+                  </pic:blipFill>
+                  <pic:spPr bwMode="auto">
+                    <a:xfrm>
+                      <a:off x="0" y="0"/>
+                      <a:ext cx="4572000" cy="6410325"/>
+                    </a:xfrm>
+                    <a:prstGeom prst="rect">
+                      <a:avLst/>
+                    </a:prstGeom>
+                  </pic:spPr>
+                </pic:pic>
+              </a:graphicData>
+            </a:graphic>
+          </wp:inline>
+        </w:drawing>
+      </w:r>
+    </w:p>
+    <w:p>
+      <w:pPr>
+        <w:pStyle w:val="Legende"/>
+      </w:pPr>
+      <w:r>
+        <w:rPr>
+          <w:b/>
+          <w:bCs/>
+        </w:rPr>
+        <w:t xml:space="preserve">Figure 32 — </w:t>
+      </w:r>
+      <w:r>
+        <w:t xml:space="preserve">La fiche d'un compte (données fictives).</w:t>
+      </w:r>
+    </w:p>
+    <w:tbl>
+      <w:tblPr>
+        <w:tblW w:type="dxa" w:w="9026"/>
+        <w:tblBorders>
+          <w:top w:val="single" w:color="auto" w:sz="4"/>
+          <w:left w:val="single" w:color="auto" w:sz="4"/>
+          <w:bottom w:val="single" w:color="auto" w:sz="4"/>
+          <w:right w:val="single" w:color="auto" w:sz="4"/>
+          <w:insideH w:val="single" w:color="auto" w:sz="4"/>
+          <w:insideV w:val="single" w:color="auto" w:sz="4"/>
+        </w:tblBorders>
+      </w:tblPr>
+      <w:tblGrid>
+        <w:gridCol w:w="9026"/>
+      </w:tblGrid>
+      <w:tr>
+        <w:trPr>
+          <w:cantSplit/>
+        </w:trPr>
+        <w:tc>
+          <w:tcPr>
+            <w:tcW w:type="dxa" w:w="9026"/>
+            <w:tcBorders>
+              <w:top w:val="none" w:color="FFFFFF" w:sz="0"/>
+              <w:left w:val="single" w:color="7A4FB0" w:sz="24"/>
+              <w:bottom w:val="none" w:color="FFFFFF" w:sz="0"/>
+              <w:right w:val="none" w:color="FFFFFF" w:sz="0"/>
+            </w:tcBorders>
+            <w:shd w:fill="F1ECFA" w:color="auto" w:val="clear"/>
+            <w:tcMar>
+              <w:top w:type="dxa" w:w="120"/>
+              <w:left w:type="dxa" w:w="200"/>
+              <w:bottom w:type="dxa" w:w="120"/>
+              <w:right w:type="dxa" w:w="160"/>
+            </w:tcMar>
+          </w:tcPr>
+          <w:p>
+            <w:pPr>
+              <w:spacing w:after="0" w:before="0"/>
+            </w:pPr>
+            <w:r>
+              <w:rPr>
+                <w:b/>
+                <w:bCs/>
+                <w:color w:val="4B2A7B"/>
+              </w:rPr>
+              <w:t xml:space="preserve">À savoir</w:t>
+            </w:r>
+            <w:r>
+              <w:t xml:space="preserve"> : </w:t>
+            </w:r>
+            <w:r>
+              <w:t xml:space="preserve">les listes de lecture </w:t>
+            </w:r>
+            <w:r>
+              <w:rPr>
+                <w:b/>
+                <w:bCs/>
+              </w:rPr>
+              <w:t xml:space="preserve">privées</w:t>
+            </w:r>
+            <w:r>
+              <w:t xml:space="preserve"> sont comptées, jamais montrées. Chaque fiche consultée est enregistrée (qui, quand, quel compte).</w:t>
+            </w:r>
+          </w:p>
+        </w:tc>
+      </w:tr>
+    </w:tbl>
+    <w:p>
+      <w:pPr>
+        <w:pStyle w:val="Heading2"/>
+      </w:pPr>
+      <w:bookmarkStart w:name="titre-83" w:id="179"/>
+      <w:r>
+        <w:t xml:space="preserve">14.3 Ajouter un lecteur à l'équipe</w:t>
+      </w:r>
+      <w:bookmarkEnd w:id="179"/>
+    </w:p>
+    <w:p>
+      <w:pPr>
+        <w:pStyle w:val="ListParagraph"/>
+        <w:numPr>
+          <w:ilvl w:val="0"/>
+          <w:numId w:val="43"/>
+        </w:numPr>
+        <w:spacing w:after="60" w:before="40"/>
+      </w:pPr>
+      <w:r>
+        <w:t xml:space="preserve">Ouvrez la fiche du compte (procédure précédente).</w:t>
+      </w:r>
+    </w:p>
+    <w:p>
+      <w:pPr>
+        <w:pStyle w:val="ListParagraph"/>
+        <w:numPr>
+          <w:ilvl w:val="0"/>
+          <w:numId w:val="43"/>
+        </w:numPr>
+        <w:spacing w:after="60" w:before="40"/>
+      </w:pPr>
+      <w:r>
+        <w:t xml:space="preserve">Dans </w:t>
+      </w:r>
+      <w:r>
+        <w:rPr>
+          <w:b/>
+          <w:bCs/>
+        </w:rPr>
+        <w:t xml:space="preserve">Ajouter à l'équipe</w:t>
+      </w:r>
+      <w:r>
+        <w:t xml:space="preserve">, choisissez le </w:t>
+      </w:r>
+      <w:r>
+        <w:rPr>
+          <w:b/>
+          <w:bCs/>
+        </w:rPr>
+        <w:t xml:space="preserve">Rôle dans l'équipe</w:t>
+      </w:r>
+      <w:r>
+        <w:t xml:space="preserve"> (</w:t>
+      </w:r>
+      <w:r>
+        <w:rPr>
+          <w:b/>
+          <w:bCs/>
+        </w:rPr>
+        <w:t xml:space="preserve">Traducteur</w:t>
+      </w:r>
+      <w:r>
+        <w:t xml:space="preserve">, </w:t>
+      </w:r>
+      <w:r>
+        <w:rPr>
+          <w:b/>
+          <w:bCs/>
+        </w:rPr>
+        <w:t xml:space="preserve">Relecteur</w:t>
+      </w:r>
+      <w:r>
+        <w:t xml:space="preserve">, </w:t>
+      </w:r>
+      <w:r>
+        <w:rPr>
+          <w:b/>
+          <w:bCs/>
+        </w:rPr>
+        <w:t xml:space="preserve">Graphiste</w:t>
+      </w:r>
+      <w:r>
+        <w:t xml:space="preserve"> ou </w:t>
+      </w:r>
+      <w:r>
+        <w:rPr>
+          <w:b/>
+          <w:bCs/>
+        </w:rPr>
+        <w:t xml:space="preserve">Éditeur Yume</w:t>
+      </w:r>
+      <w:r>
+        <w:t xml:space="preserve">).</w:t>
+      </w:r>
+    </w:p>
+    <w:p>
+      <w:pPr>
+        <w:pStyle w:val="ListParagraph"/>
+        <w:numPr>
+          <w:ilvl w:val="0"/>
+          <w:numId w:val="43"/>
+        </w:numPr>
+        <w:spacing w:after="60" w:before="40"/>
+      </w:pPr>
+      <w:r>
+        <w:t xml:space="preserve">Cliquez sur </w:t>
+      </w:r>
+      <w:r>
+        <w:rPr>
+          <w:b/>
+          <w:bCs/>
+        </w:rPr>
+        <w:t xml:space="preserve">Ajouter à l'équipe</w:t>
+      </w:r>
+      <w:r>
+        <w:t xml:space="preserve">. Un message confirme l'ajout ; le rôle se change ensuite dans </w:t>
+      </w:r>
+      <w:r>
+        <w:rPr>
+          <w:b/>
+          <w:bCs/>
+        </w:rPr>
+        <w:t xml:space="preserve">Membres et rôles</w:t>
+      </w:r>
+      <w:r>
+        <w:t xml:space="preserve">.</w:t>
+      </w:r>
+    </w:p>
+    <w:p>
+      <w:r>
+        <w:t xml:space="preserve">Un compte créé avec Discord s'ajoute comme les autres. Le compte garde son pseudo, ses favoris et sa lecture.</w:t>
+      </w:r>
+    </w:p>
+    <w:tbl>
+      <w:tblPr>
+        <w:tblW w:type="dxa" w:w="9026"/>
+        <w:tblBorders>
+          <w:top w:val="single" w:color="auto" w:sz="4"/>
+          <w:left w:val="single" w:color="auto" w:sz="4"/>
+          <w:bottom w:val="single" w:color="auto" w:sz="4"/>
+          <w:right w:val="single" w:color="auto" w:sz="4"/>
+          <w:insideH w:val="single" w:color="auto" w:sz="4"/>
+          <w:insideV w:val="single" w:color="auto" w:sz="4"/>
+        </w:tblBorders>
+      </w:tblPr>
+      <w:tblGrid>
+        <w:gridCol w:w="9026"/>
+      </w:tblGrid>
+      <w:tr>
+        <w:trPr>
+          <w:cantSplit/>
+        </w:trPr>
+        <w:tc>
+          <w:tcPr>
+            <w:tcW w:type="dxa" w:w="9026"/>
+            <w:tcBorders>
+              <w:top w:val="none" w:color="FFFFFF" w:sz="0"/>
+              <w:left w:val="single" w:color="2E9E6A" w:sz="24"/>
+              <w:bottom w:val="none" w:color="FFFFFF" w:sz="0"/>
+              <w:right w:val="none" w:color="FFFFFF" w:sz="0"/>
+            </w:tcBorders>
+            <w:shd w:fill="E9F7EF" w:color="auto" w:val="clear"/>
+            <w:tcMar>
+              <w:top w:type="dxa" w:w="120"/>
+              <w:left w:type="dxa" w:w="200"/>
+              <w:bottom w:type="dxa" w:w="120"/>
+              <w:right w:type="dxa" w:w="160"/>
+            </w:tcMar>
+          </w:tcPr>
+          <w:p>
+            <w:pPr>
+              <w:spacing w:after="0" w:before="0"/>
+            </w:pPr>
+            <w:r>
+              <w:rPr>
+                <w:b/>
+                <w:bCs/>
+                <w:color w:val="1E6B47"/>
+              </w:rPr>
+              <w:t xml:space="preserve">Astuce</w:t>
+            </w:r>
+            <w:r>
+              <w:t xml:space="preserve"> : </w:t>
+            </w:r>
+            <w:r>
+              <w:t xml:space="preserve">dans </w:t>
+            </w:r>
+            <w:r>
+              <w:rPr>
+                <w:b/>
+                <w:bCs/>
+              </w:rPr>
+              <w:t xml:space="preserve">Membres et rôles</w:t>
+            </w:r>
+            <w:r>
+              <w:t xml:space="preserve">, </w:t>
+            </w:r>
+            <w:r>
+              <w:rPr>
+                <w:b/>
+                <w:bCs/>
+              </w:rPr>
+              <w:t xml:space="preserve">Ajouter un membre</w:t>
+            </w:r>
+            <w:r>
+              <w:t xml:space="preserve"> accepte aussi le pseudo, l'adresse e-mail ou le nom Discord du compte.</w:t>
+            </w:r>
+          </w:p>
+        </w:tc>
+      </w:tr>
+    </w:tbl>
+    <w:p>
+      <w:pPr>
+        <w:pStyle w:val="Heading2"/>
+      </w:pPr>
+      <w:bookmarkStart w:name="titre-84" w:id="180"/>
+      <w:r>
+        <w:t xml:space="preserve">14.4 Exporter la liste</w:t>
+      </w:r>
+      <w:bookmarkEnd w:id="180"/>
+    </w:p>
+    <w:p>
+      <w:pPr>
+        <w:pStyle w:val="ListParagraph"/>
+        <w:numPr>
+          <w:ilvl w:val="0"/>
+          <w:numId w:val="44"/>
+        </w:numPr>
+        <w:spacing w:after="60" w:before="40"/>
+      </w:pPr>
+      <w:r>
+        <w:t xml:space="preserve">Filtrez la liste si besoin (procédure « Trouver un compte »).</w:t>
+      </w:r>
+    </w:p>
+    <w:p>
+      <w:pPr>
+        <w:pStyle w:val="ListParagraph"/>
+        <w:numPr>
+          <w:ilvl w:val="0"/>
+          <w:numId w:val="44"/>
+        </w:numPr>
+        <w:spacing w:after="60" w:before="40"/>
+      </w:pPr>
+      <w:r>
+        <w:t xml:space="preserve">Cliquez sur </w:t>
+      </w:r>
+      <w:r>
+        <w:rPr>
+          <w:b/>
+          <w:bCs/>
+        </w:rPr>
+        <w:t xml:space="preserve">Exporter la liste (CSV)</w:t>
+      </w:r>
+      <w:r>
+        <w:t xml:space="preserve"> : le fichier contient tous les comptes filtrés, toutes pages comprises, </w:t>
+      </w:r>
+      <w:r>
+        <w:rPr>
+          <w:b/>
+          <w:bCs/>
+        </w:rPr>
+        <w:t xml:space="preserve">sans adresse e-mail</w:t>
+      </w:r>
+      <w:r>
+        <w:t xml:space="preserve">. Il s'ouvre dans Excel ou LibreOffice.</w:t>
+      </w:r>
+    </w:p>
+    <w:p>
+      <w:r>
+        <w:rPr>
+          <w:b/>
+          <w:bCs/>
+        </w:rPr>
+        <w:t xml:space="preserve">Exporter avec e-mail</w:t>
+      </w:r>
+      <w:r>
+        <w:t xml:space="preserve"> est réservé aux administrateurs.</w:t>
+      </w:r>
+    </w:p>
+    <w:tbl>
+      <w:tblPr>
+        <w:tblW w:type="dxa" w:w="9026"/>
+        <w:tblBorders>
+          <w:top w:val="single" w:color="auto" w:sz="4"/>
+          <w:left w:val="single" w:color="auto" w:sz="4"/>
+          <w:bottom w:val="single" w:color="auto" w:sz="4"/>
+          <w:right w:val="single" w:color="auto" w:sz="4"/>
+          <w:insideH w:val="single" w:color="auto" w:sz="4"/>
+          <w:insideV w:val="single" w:color="auto" w:sz="4"/>
+        </w:tblBorders>
+      </w:tblPr>
+      <w:tblGrid>
+        <w:gridCol w:w="9026"/>
+      </w:tblGrid>
+      <w:tr>
+        <w:trPr>
+          <w:cantSplit/>
+        </w:trPr>
+        <w:tc>
+          <w:tcPr>
+            <w:tcW w:type="dxa" w:w="9026"/>
+            <w:tcBorders>
+              <w:top w:val="none" w:color="FFFFFF" w:sz="0"/>
+              <w:left w:val="single" w:color="D9822B" w:sz="24"/>
+              <w:bottom w:val="none" w:color="FFFFFF" w:sz="0"/>
+              <w:right w:val="none" w:color="FFFFFF" w:sz="0"/>
+            </w:tcBorders>
+            <w:shd w:fill="FDF1E4" w:color="auto" w:val="clear"/>
+            <w:tcMar>
+              <w:top w:type="dxa" w:w="120"/>
+              <w:left w:type="dxa" w:w="200"/>
+              <w:bottom w:type="dxa" w:w="120"/>
+              <w:right w:type="dxa" w:w="160"/>
+            </w:tcMar>
+          </w:tcPr>
+          <w:p>
+            <w:pPr>
+              <w:spacing w:after="0" w:before="0"/>
+            </w:pPr>
+            <w:r>
+              <w:rPr>
+                <w:b/>
+                <w:bCs/>
+                <w:color w:val="9A4D0C"/>
+              </w:rPr>
+              <w:t xml:space="preserve">Attention</w:t>
+            </w:r>
+            <w:r>
+              <w:t xml:space="preserve"> : </w:t>
+            </w:r>
+            <w:r>
+              <w:t xml:space="preserve">ce sont des données personnelles. Ne les recopiez pas sur Discord ni ailleurs. Chaque export est enregistré : gardez le fichier pour un usage interne et supprimez-le après usage.</w:t>
+            </w:r>
+          </w:p>
+        </w:tc>
+      </w:tr>
+    </w:tbl>
+    <w:p>
+      <w:pPr>
+        <w:pStyle w:val="Heading1"/>
+      </w:pPr>
+      <w:bookmarkStart w:name="titre-85" w:id="181"/>
+      <w:r>
+        <w:t xml:space="preserve">15 Les coquilles signalées par les lecteurs</w:t>
+      </w:r>
+      <w:bookmarkEnd w:id="181"/>
     </w:p>
     <w:tbl>
       <w:tblPr>
@@ -25779,18 +27258,18 @@
       <w:pPr>
         <w:pStyle w:val="Heading2"/>
       </w:pPr>
-      <w:bookmarkStart w:name="titre-81" w:id="172"/>
-      <w:r>
-        <w:t xml:space="preserve">14.1 Comprendre ce que fait le lecteur</w:t>
-      </w:r>
-      <w:bookmarkEnd w:id="172"/>
+      <w:bookmarkStart w:name="titre-86" w:id="182"/>
+      <w:r>
+        <w:t xml:space="preserve">15.1 Comprendre ce que fait le lecteur</w:t>
+      </w:r>
+      <w:bookmarkEnd w:id="182"/>
     </w:p>
     <w:p>
       <w:pPr>
         <w:pStyle w:val="ListParagraph"/>
         <w:numPr>
           <w:ilvl w:val="0"/>
-          <w:numId w:val="41"/>
+          <w:numId w:val="45"/>
         </w:numPr>
         <w:spacing w:after="60" w:before="40"/>
       </w:pPr>
@@ -25803,7 +27282,7 @@
         <w:pStyle w:val="ListParagraph"/>
         <w:numPr>
           <w:ilvl w:val="0"/>
-          <w:numId w:val="41"/>
+          <w:numId w:val="45"/>
         </w:numPr>
         <w:spacing w:after="60" w:before="40"/>
       </w:pPr>
@@ -25846,7 +27325,7 @@
         <w:pStyle w:val="ListParagraph"/>
         <w:numPr>
           <w:ilvl w:val="0"/>
-          <w:numId w:val="41"/>
+          <w:numId w:val="45"/>
         </w:numPr>
         <w:spacing w:after="60" w:before="40"/>
       </w:pPr>
@@ -25865,7 +27344,7 @@
           <wp:inline distT="0" distB="0" distL="0" distR="0">
             <wp:extent cx="3143250" cy="2419350"/>
             <wp:effectExtent t="0" r="0" b="0" l="0"/>
-            <wp:docPr id="63" name="Corrections-lecteur.png" descr="La fenêtre « Signaler une coquille » dans un chapitre (exemple fictif)." title="La fenêtre « Signaler une coquille » dans un chapitre (exemple fictif)."/>
+            <wp:docPr id="67" name="Corrections-lecteur.png" descr="La fenêtre « Signaler une coquille » dans un chapitre (exemple fictif)." title="La fenêtre « Signaler une coquille » dans un chapitre (exemple fictif)."/>
             <wp:cNvGraphicFramePr>
               <a:graphicFrameLocks xmlns:a="http://schemas.openxmlformats.org/drawingml/2006/main" noChangeAspect="1"/>
             </wp:cNvGraphicFramePr>
@@ -25879,7 +27358,7 @@
                     </pic:cNvPicPr>
                   </pic:nvPicPr>
                   <pic:blipFill>
-                    <a:blip r:embed="rId40" cstate="none"/>
+                    <a:blip r:embed="rId42" cstate="none"/>
                     <a:srcRect/>
                     <a:stretch>
                       <a:fillRect/>
@@ -25910,7 +27389,7 @@
           <w:b/>
           <w:bCs/>
         </w:rPr>
-        <w:t xml:space="preserve">Figure 31 — </w:t>
+        <w:t xml:space="preserve">Figure 33 — </w:t>
       </w:r>
       <w:r>
         <w:t xml:space="preserve">La fenêtre « Signaler une coquille » dans un chapitre (exemple fictif).</w:t>
@@ -25993,11 +27472,11 @@
       <w:pPr>
         <w:pStyle w:val="Heading2"/>
       </w:pPr>
-      <w:bookmarkStart w:name="titre-82" w:id="173"/>
-      <w:r>
-        <w:t xml:space="preserve">14.2 Traiter une coquille</w:t>
-      </w:r>
-      <w:bookmarkEnd w:id="173"/>
+      <w:bookmarkStart w:name="titre-87" w:id="183"/>
+      <w:r>
+        <w:t xml:space="preserve">15.2 Traiter une coquille</w:t>
+      </w:r>
+      <w:bookmarkEnd w:id="183"/>
     </w:p>
     <w:p>
       <w:r>
@@ -26009,7 +27488,7 @@
         <w:pStyle w:val="ListParagraph"/>
         <w:numPr>
           <w:ilvl w:val="0"/>
-          <w:numId w:val="42"/>
+          <w:numId w:val="46"/>
         </w:numPr>
         <w:spacing w:after="60" w:before="40"/>
       </w:pPr>
@@ -26042,7 +27521,7 @@
         <w:pStyle w:val="ListParagraph"/>
         <w:numPr>
           <w:ilvl w:val="0"/>
-          <w:numId w:val="42"/>
+          <w:numId w:val="46"/>
         </w:numPr>
         <w:spacing w:after="60" w:before="40"/>
       </w:pPr>
@@ -26065,7 +27544,7 @@
         <w:pStyle w:val="ListParagraph"/>
         <w:numPr>
           <w:ilvl w:val="0"/>
-          <w:numId w:val="42"/>
+          <w:numId w:val="46"/>
         </w:numPr>
         <w:spacing w:after="60" w:before="40"/>
       </w:pPr>
@@ -26088,7 +27567,7 @@
         <w:pStyle w:val="ListParagraph"/>
         <w:numPr>
           <w:ilvl w:val="0"/>
-          <w:numId w:val="42"/>
+          <w:numId w:val="46"/>
         </w:numPr>
         <w:spacing w:after="60" w:before="40"/>
       </w:pPr>
@@ -26121,7 +27600,7 @@
         <w:pStyle w:val="ListParagraph"/>
         <w:numPr>
           <w:ilvl w:val="0"/>
-          <w:numId w:val="42"/>
+          <w:numId w:val="46"/>
         </w:numPr>
         <w:spacing w:after="60" w:before="40"/>
       </w:pPr>
@@ -26160,7 +27639,7 @@
           <wp:inline distT="0" distB="0" distL="0" distR="0">
             <wp:extent cx="4572000" cy="5219700"/>
             <wp:effectExtent t="0" r="0" b="0" l="0"/>
-            <wp:docPr id="64" name="Corrections-equipe.png" descr="La liste « Corrections signalées par les lecteurs » (signalements fictifs)." title="La liste « Corrections signalées par les lecteurs » (signalements fictifs)."/>
+            <wp:docPr id="68" name="Corrections-equipe.png" descr="La liste « Corrections signalées par les lecteurs » (signalements fictifs)." title="La liste « Corrections signalées par les lecteurs » (signalements fictifs)."/>
             <wp:cNvGraphicFramePr>
               <a:graphicFrameLocks xmlns:a="http://schemas.openxmlformats.org/drawingml/2006/main" noChangeAspect="1"/>
             </wp:cNvGraphicFramePr>
@@ -26174,7 +27653,7 @@
                     </pic:cNvPicPr>
                   </pic:nvPicPr>
                   <pic:blipFill>
-                    <a:blip r:embed="rId41" cstate="none"/>
+                    <a:blip r:embed="rId43" cstate="none"/>
                     <a:srcRect/>
                     <a:stretch>
                       <a:fillRect/>
@@ -26205,7 +27684,7 @@
           <w:b/>
           <w:bCs/>
         </w:rPr>
-        <w:t xml:space="preserve">Figure 32 — </w:t>
+        <w:t xml:space="preserve">Figure 34 — </w:t>
       </w:r>
       <w:r>
         <w:t xml:space="preserve">La liste « Corrections signalées par les lecteurs » (signalements fictifs).</w:t>
@@ -26391,18 +27870,18 @@
       <w:pPr>
         <w:pStyle w:val="Heading2"/>
       </w:pPr>
-      <w:bookmarkStart w:name="titre-83" w:id="174"/>
-      <w:r>
-        <w:t xml:space="preserve">14.3 Retrouver les signalements traités</w:t>
-      </w:r>
-      <w:bookmarkEnd w:id="174"/>
+      <w:bookmarkStart w:name="titre-88" w:id="184"/>
+      <w:r>
+        <w:t xml:space="preserve">15.3 Retrouver les signalements traités</w:t>
+      </w:r>
+      <w:bookmarkEnd w:id="184"/>
     </w:p>
     <w:p>
       <w:pPr>
         <w:pStyle w:val="ListParagraph"/>
         <w:numPr>
           <w:ilvl w:val="0"/>
-          <w:numId w:val="43"/>
+          <w:numId w:val="47"/>
         </w:numPr>
         <w:spacing w:after="60" w:before="40"/>
       </w:pPr>
@@ -26475,7 +27954,7 @@
         <w:pStyle w:val="ListParagraph"/>
         <w:numPr>
           <w:ilvl w:val="0"/>
-          <w:numId w:val="43"/>
+          <w:numId w:val="47"/>
         </w:numPr>
         <w:spacing w:after="60" w:before="40"/>
       </w:pPr>
@@ -26565,21 +28044,21 @@
       <w:pPr>
         <w:pStyle w:val="Heading1"/>
       </w:pPr>
-      <w:bookmarkStart w:name="titre-84" w:id="175"/>
-      <w:r>
-        <w:t xml:space="preserve">15 Glossaires, actualités et commentaires</w:t>
-      </w:r>
-      <w:bookmarkEnd w:id="175"/>
+      <w:bookmarkStart w:name="titre-89" w:id="185"/>
+      <w:r>
+        <w:t xml:space="preserve">16 Glossaires, actualités et commentaires</w:t>
+      </w:r>
+      <w:bookmarkEnd w:id="185"/>
     </w:p>
     <w:p>
       <w:pPr>
         <w:pStyle w:val="Heading2"/>
       </w:pPr>
-      <w:bookmarkStart w:name="titre-85" w:id="176"/>
-      <w:r>
-        <w:t xml:space="preserve">15.1 Publier le glossaire d'une œuvre</w:t>
-      </w:r>
-      <w:bookmarkEnd w:id="176"/>
+      <w:bookmarkStart w:name="titre-90" w:id="186"/>
+      <w:r>
+        <w:t xml:space="preserve">16.1 Publier le glossaire d'une œuvre</w:t>
+      </w:r>
+      <w:bookmarkEnd w:id="186"/>
     </w:p>
     <w:p>
       <w:r>
@@ -26603,7 +28082,7 @@
         <w:pStyle w:val="ListParagraph"/>
         <w:numPr>
           <w:ilvl w:val="0"/>
-          <w:numId w:val="44"/>
+          <w:numId w:val="48"/>
         </w:numPr>
         <w:spacing w:after="60" w:before="40"/>
       </w:pPr>
@@ -26636,7 +28115,7 @@
         <w:pStyle w:val="ListParagraph"/>
         <w:numPr>
           <w:ilvl w:val="0"/>
-          <w:numId w:val="44"/>
+          <w:numId w:val="48"/>
         </w:numPr>
         <w:spacing w:after="60" w:before="40"/>
       </w:pPr>
@@ -26679,7 +28158,7 @@
         <w:pStyle w:val="ListParagraph"/>
         <w:numPr>
           <w:ilvl w:val="0"/>
-          <w:numId w:val="44"/>
+          <w:numId w:val="48"/>
         </w:numPr>
         <w:spacing w:after="60" w:before="40"/>
       </w:pPr>
@@ -26702,7 +28181,7 @@
         <w:pStyle w:val="ListParagraph"/>
         <w:numPr>
           <w:ilvl w:val="0"/>
-          <w:numId w:val="44"/>
+          <w:numId w:val="48"/>
         </w:numPr>
         <w:spacing w:after="60" w:before="40"/>
       </w:pPr>
@@ -26749,11 +28228,11 @@
       <w:pPr>
         <w:pStyle w:val="Heading2"/>
       </w:pPr>
-      <w:bookmarkStart w:name="titre-86" w:id="177"/>
-      <w:r>
-        <w:t xml:space="preserve">15.2 Lier une actualité à une œuvre</w:t>
-      </w:r>
-      <w:bookmarkEnd w:id="177"/>
+      <w:bookmarkStart w:name="titre-91" w:id="187"/>
+      <w:r>
+        <w:t xml:space="preserve">16.2 Lier une actualité à une œuvre</w:t>
+      </w:r>
+      <w:bookmarkEnd w:id="187"/>
     </w:p>
     <w:p>
       <w:r>
@@ -26784,11 +28263,11 @@
       <w:pPr>
         <w:pStyle w:val="Heading2"/>
       </w:pPr>
-      <w:bookmarkStart w:name="titre-87" w:id="178"/>
-      <w:r>
-        <w:t xml:space="preserve">15.3 Modérer les commentaires</w:t>
-      </w:r>
-      <w:bookmarkEnd w:id="178"/>
+      <w:bookmarkStart w:name="titre-92" w:id="188"/>
+      <w:r>
+        <w:t xml:space="preserve">16.3 Modérer les commentaires</w:t>
+      </w:r>
+      <w:bookmarkEnd w:id="188"/>
     </w:p>
     <w:p>
       <w:r>
@@ -27045,11 +28524,11 @@
       <w:pPr>
         <w:pStyle w:val="Heading1"/>
       </w:pPr>
-      <w:bookmarkStart w:name="titre-88" w:id="179"/>
-      <w:r>
-        <w:t xml:space="preserve">16 Questions fréquentes</w:t>
-      </w:r>
-      <w:bookmarkEnd w:id="179"/>
+      <w:bookmarkStart w:name="titre-93" w:id="189"/>
+      <w:r>
+        <w:t xml:space="preserve">17 Questions fréquentes</w:t>
+      </w:r>
+      <w:bookmarkEnd w:id="189"/>
     </w:p>
     <w:tbl>
       <w:tblPr>
@@ -27064,8 +28543,8 @@
         </w:tblBorders>
       </w:tblPr>
       <w:tblGrid>
-        <w:gridCol w:w="3350"/>
-        <w:gridCol w:w="5676"/>
+        <w:gridCol w:w="3387"/>
+        <w:gridCol w:w="5639"/>
       </w:tblGrid>
       <w:tr>
         <w:trPr>
@@ -27074,7 +28553,7 @@
         </w:trPr>
         <w:tc>
           <w:tcPr>
-            <w:tcW w:type="dxa" w:w="3350"/>
+            <w:tcW w:type="dxa" w:w="3387"/>
             <w:tcBorders>
               <w:top w:val="single" w:color="CFC6DE" w:sz="4"/>
               <w:left w:val="single" w:color="CFC6DE" w:sz="4"/>
@@ -27115,7 +28594,7 @@
         </w:tc>
         <w:tc>
           <w:tcPr>
-            <w:tcW w:type="dxa" w:w="5676"/>
+            <w:tcW w:type="dxa" w:w="5639"/>
             <w:tcBorders>
               <w:top w:val="single" w:color="CFC6DE" w:sz="4"/>
               <w:left w:val="single" w:color="CFC6DE" w:sz="4"/>
@@ -27162,7 +28641,7 @@
         </w:trPr>
         <w:tc>
           <w:tcPr>
-            <w:tcW w:type="dxa" w:w="3350"/>
+            <w:tcW w:type="dxa" w:w="3387"/>
             <w:tcBorders>
               <w:top w:val="single" w:color="CFC6DE" w:sz="4"/>
               <w:left w:val="single" w:color="CFC6DE" w:sz="4"/>
@@ -27212,7 +28691,7 @@
         </w:tc>
         <w:tc>
           <w:tcPr>
-            <w:tcW w:type="dxa" w:w="5676"/>
+            <w:tcW w:type="dxa" w:w="5639"/>
             <w:tcBorders>
               <w:top w:val="single" w:color="CFC6DE" w:sz="4"/>
               <w:left w:val="single" w:color="CFC6DE" w:sz="4"/>
@@ -27252,7 +28731,7 @@
         </w:trPr>
         <w:tc>
           <w:tcPr>
-            <w:tcW w:type="dxa" w:w="3350"/>
+            <w:tcW w:type="dxa" w:w="3387"/>
             <w:tcBorders>
               <w:top w:val="single" w:color="CFC6DE" w:sz="4"/>
               <w:left w:val="single" w:color="CFC6DE" w:sz="4"/>
@@ -27287,7 +28766,7 @@
         </w:tc>
         <w:tc>
           <w:tcPr>
-            <w:tcW w:type="dxa" w:w="5676"/>
+            <w:tcW w:type="dxa" w:w="5639"/>
             <w:tcBorders>
               <w:top w:val="single" w:color="CFC6DE" w:sz="4"/>
               <w:left w:val="single" w:color="CFC6DE" w:sz="4"/>
@@ -27328,7 +28807,7 @@
         </w:trPr>
         <w:tc>
           <w:tcPr>
-            <w:tcW w:type="dxa" w:w="3350"/>
+            <w:tcW w:type="dxa" w:w="3387"/>
             <w:tcBorders>
               <w:top w:val="single" w:color="CFC6DE" w:sz="4"/>
               <w:left w:val="single" w:color="CFC6DE" w:sz="4"/>
@@ -27394,7 +28873,7 @@
         </w:tc>
         <w:tc>
           <w:tcPr>
-            <w:tcW w:type="dxa" w:w="5676"/>
+            <w:tcW w:type="dxa" w:w="5639"/>
             <w:tcBorders>
               <w:top w:val="single" w:color="CFC6DE" w:sz="4"/>
               <w:left w:val="single" w:color="CFC6DE" w:sz="4"/>
@@ -27434,7 +28913,7 @@
         </w:trPr>
         <w:tc>
           <w:tcPr>
-            <w:tcW w:type="dxa" w:w="3350"/>
+            <w:tcW w:type="dxa" w:w="3387"/>
             <w:tcBorders>
               <w:top w:val="single" w:color="CFC6DE" w:sz="4"/>
               <w:left w:val="single" w:color="CFC6DE" w:sz="4"/>
@@ -27469,7 +28948,7 @@
         </w:tc>
         <w:tc>
           <w:tcPr>
-            <w:tcW w:type="dxa" w:w="5676"/>
+            <w:tcW w:type="dxa" w:w="5639"/>
             <w:tcBorders>
               <w:top w:val="single" w:color="CFC6DE" w:sz="4"/>
               <w:left w:val="single" w:color="CFC6DE" w:sz="4"/>
@@ -27551,7 +29030,7 @@
         </w:trPr>
         <w:tc>
           <w:tcPr>
-            <w:tcW w:type="dxa" w:w="3350"/>
+            <w:tcW w:type="dxa" w:w="3387"/>
             <w:tcBorders>
               <w:top w:val="single" w:color="CFC6DE" w:sz="4"/>
               <w:left w:val="single" w:color="CFC6DE" w:sz="4"/>
@@ -27585,7 +29064,7 @@
         </w:tc>
         <w:tc>
           <w:tcPr>
-            <w:tcW w:type="dxa" w:w="5676"/>
+            <w:tcW w:type="dxa" w:w="5639"/>
             <w:tcBorders>
               <w:top w:val="single" w:color="CFC6DE" w:sz="4"/>
               <w:left w:val="single" w:color="CFC6DE" w:sz="4"/>
@@ -27650,7 +29129,7 @@
         </w:trPr>
         <w:tc>
           <w:tcPr>
-            <w:tcW w:type="dxa" w:w="3350"/>
+            <w:tcW w:type="dxa" w:w="3387"/>
             <w:tcBorders>
               <w:top w:val="single" w:color="CFC6DE" w:sz="4"/>
               <w:left w:val="single" w:color="CFC6DE" w:sz="4"/>
@@ -27685,7 +29164,7 @@
         </w:tc>
         <w:tc>
           <w:tcPr>
-            <w:tcW w:type="dxa" w:w="5676"/>
+            <w:tcW w:type="dxa" w:w="5639"/>
             <w:tcBorders>
               <w:top w:val="single" w:color="CFC6DE" w:sz="4"/>
               <w:left w:val="single" w:color="CFC6DE" w:sz="4"/>
@@ -27758,7 +29237,7 @@
         </w:trPr>
         <w:tc>
           <w:tcPr>
-            <w:tcW w:type="dxa" w:w="3350"/>
+            <w:tcW w:type="dxa" w:w="3387"/>
             <w:tcBorders>
               <w:top w:val="single" w:color="CFC6DE" w:sz="4"/>
               <w:left w:val="single" w:color="CFC6DE" w:sz="4"/>
@@ -27792,7 +29271,7 @@
         </w:tc>
         <w:tc>
           <w:tcPr>
-            <w:tcW w:type="dxa" w:w="5676"/>
+            <w:tcW w:type="dxa" w:w="5639"/>
             <w:tcBorders>
               <w:top w:val="single" w:color="CFC6DE" w:sz="4"/>
               <w:left w:val="single" w:color="CFC6DE" w:sz="4"/>
@@ -27864,7 +29343,7 @@
         </w:trPr>
         <w:tc>
           <w:tcPr>
-            <w:tcW w:type="dxa" w:w="3350"/>
+            <w:tcW w:type="dxa" w:w="3387"/>
             <w:tcBorders>
               <w:top w:val="single" w:color="CFC6DE" w:sz="4"/>
               <w:left w:val="single" w:color="CFC6DE" w:sz="4"/>
@@ -27899,7 +29378,7 @@
         </w:tc>
         <w:tc>
           <w:tcPr>
-            <w:tcW w:type="dxa" w:w="5676"/>
+            <w:tcW w:type="dxa" w:w="5639"/>
             <w:tcBorders>
               <w:top w:val="single" w:color="CFC6DE" w:sz="4"/>
               <w:left w:val="single" w:color="CFC6DE" w:sz="4"/>
@@ -27956,7 +29435,7 @@
         </w:trPr>
         <w:tc>
           <w:tcPr>
-            <w:tcW w:type="dxa" w:w="3350"/>
+            <w:tcW w:type="dxa" w:w="3387"/>
             <w:tcBorders>
               <w:top w:val="single" w:color="CFC6DE" w:sz="4"/>
               <w:left w:val="single" w:color="CFC6DE" w:sz="4"/>
@@ -27990,7 +29469,7 @@
         </w:tc>
         <w:tc>
           <w:tcPr>
-            <w:tcW w:type="dxa" w:w="5676"/>
+            <w:tcW w:type="dxa" w:w="5639"/>
             <w:tcBorders>
               <w:top w:val="single" w:color="CFC6DE" w:sz="4"/>
               <w:left w:val="single" w:color="CFC6DE" w:sz="4"/>
@@ -28103,7 +29582,7 @@
         </w:trPr>
         <w:tc>
           <w:tcPr>
-            <w:tcW w:type="dxa" w:w="3350"/>
+            <w:tcW w:type="dxa" w:w="3387"/>
             <w:tcBorders>
               <w:top w:val="single" w:color="CFC6DE" w:sz="4"/>
               <w:left w:val="single" w:color="CFC6DE" w:sz="4"/>
@@ -28138,7 +29617,7 @@
         </w:tc>
         <w:tc>
           <w:tcPr>
-            <w:tcW w:type="dxa" w:w="5676"/>
+            <w:tcW w:type="dxa" w:w="5639"/>
             <w:tcBorders>
               <w:top w:val="single" w:color="CFC6DE" w:sz="4"/>
               <w:left w:val="single" w:color="CFC6DE" w:sz="4"/>
@@ -28211,7 +29690,7 @@
         </w:trPr>
         <w:tc>
           <w:tcPr>
-            <w:tcW w:type="dxa" w:w="3350"/>
+            <w:tcW w:type="dxa" w:w="3387"/>
             <w:tcBorders>
               <w:top w:val="single" w:color="CFC6DE" w:sz="4"/>
               <w:left w:val="single" w:color="CFC6DE" w:sz="4"/>
@@ -28245,7 +29724,7 @@
         </w:tc>
         <w:tc>
           <w:tcPr>
-            <w:tcW w:type="dxa" w:w="5676"/>
+            <w:tcW w:type="dxa" w:w="5639"/>
             <w:tcBorders>
               <w:top w:val="single" w:color="CFC6DE" w:sz="4"/>
               <w:left w:val="single" w:color="CFC6DE" w:sz="4"/>
@@ -28301,7 +29780,7 @@
         </w:trPr>
         <w:tc>
           <w:tcPr>
-            <w:tcW w:type="dxa" w:w="3350"/>
+            <w:tcW w:type="dxa" w:w="3387"/>
             <w:tcBorders>
               <w:top w:val="single" w:color="CFC6DE" w:sz="4"/>
               <w:left w:val="single" w:color="CFC6DE" w:sz="4"/>
@@ -28352,7 +29831,7 @@
         </w:tc>
         <w:tc>
           <w:tcPr>
-            <w:tcW w:type="dxa" w:w="5676"/>
+            <w:tcW w:type="dxa" w:w="5639"/>
             <w:tcBorders>
               <w:top w:val="single" w:color="CFC6DE" w:sz="4"/>
               <w:left w:val="single" w:color="CFC6DE" w:sz="4"/>
@@ -28393,7 +29872,7 @@
         </w:trPr>
         <w:tc>
           <w:tcPr>
-            <w:tcW w:type="dxa" w:w="3350"/>
+            <w:tcW w:type="dxa" w:w="3387"/>
             <w:tcBorders>
               <w:top w:val="single" w:color="CFC6DE" w:sz="4"/>
               <w:left w:val="single" w:color="CFC6DE" w:sz="4"/>
@@ -28421,13 +29900,13 @@
                 <w:sz w:val="19"/>
                 <w:szCs w:val="19"/>
               </w:rPr>
-              <w:t xml:space="preserve">Les courbes d'une œuvre sont presque vides.</w:t>
+              <w:t xml:space="preserve">« Aucun compte ne correspond » quand j'ajoute un membre.</w:t>
             </w:r>
           </w:p>
         </w:tc>
         <w:tc>
           <w:tcPr>
-            <w:tcW w:type="dxa" w:w="5676"/>
+            <w:tcW w:type="dxa" w:w="5639"/>
             <w:tcBorders>
               <w:top w:val="single" w:color="CFC6DE" w:sz="4"/>
               <w:left w:val="single" w:color="CFC6DE" w:sz="4"/>
@@ -28455,7 +29934,23 @@
                 <w:sz w:val="19"/>
                 <w:szCs w:val="19"/>
               </w:rPr>
-              <w:t xml:space="preserve">L'historique jour par jour a commencé à l'installation des statistiques : il se remplit chaque nuit.</w:t>
+              <w:t xml:space="preserve">La personne doit d'abord créer son compte sur le site (formulaire ou « Créer un compte avec Discord »). Saisissez ensuite son pseudo, son adresse e-mail ou son nom Discord, ou ajoutez-la depuis sa fiche dans </w:t>
+            </w:r>
+            <w:r>
+              <w:rPr>
+                <w:b/>
+                <w:bCs/>
+                <w:sz w:val="19"/>
+                <w:szCs w:val="19"/>
+              </w:rPr>
+              <w:t xml:space="preserve">Comptes inscrits</w:t>
+            </w:r>
+            <w:r>
+              <w:rPr>
+                <w:sz w:val="19"/>
+                <w:szCs w:val="19"/>
+              </w:rPr>
+              <w:t xml:space="preserve">.</w:t>
             </w:r>
           </w:p>
         </w:tc>
@@ -28467,7 +29962,7 @@
         </w:trPr>
         <w:tc>
           <w:tcPr>
-            <w:tcW w:type="dxa" w:w="3350"/>
+            <w:tcW w:type="dxa" w:w="3387"/>
             <w:tcBorders>
               <w:top w:val="single" w:color="CFC6DE" w:sz="4"/>
               <w:left w:val="single" w:color="CFC6DE" w:sz="4"/>
@@ -28496,13 +29991,13 @@
                 <w:sz w:val="19"/>
                 <w:szCs w:val="19"/>
               </w:rPr>
-              <w:t xml:space="preserve">J'ai oublié mon mot de passe.</w:t>
+              <w:t xml:space="preserve">Les courbes d'une œuvre sont presque vides.</w:t>
             </w:r>
           </w:p>
         </w:tc>
         <w:tc>
           <w:tcPr>
-            <w:tcW w:type="dxa" w:w="5676"/>
+            <w:tcW w:type="dxa" w:w="5639"/>
             <w:tcBorders>
               <w:top w:val="single" w:color="CFC6DE" w:sz="4"/>
               <w:left w:val="single" w:color="CFC6DE" w:sz="4"/>
@@ -28531,23 +30026,7 @@
                 <w:sz w:val="19"/>
                 <w:szCs w:val="19"/>
               </w:rPr>
-              <w:t xml:space="preserve">Lien </w:t>
-            </w:r>
-            <w:r>
-              <w:rPr>
-                <w:b/>
-                <w:bCs/>
-                <w:sz w:val="19"/>
-                <w:szCs w:val="19"/>
-              </w:rPr>
-              <w:t xml:space="preserve">Mot de passe oublié ?</w:t>
-            </w:r>
-            <w:r>
-              <w:rPr>
-                <w:sz w:val="19"/>
-                <w:szCs w:val="19"/>
-              </w:rPr>
-              <w:t xml:space="preserve"> sur la page de connexion.</w:t>
+              <w:t xml:space="preserve">L'historique jour par jour a commencé à l'installation des statistiques : il se remplit chaque nuit.</w:t>
             </w:r>
           </w:p>
         </w:tc>
@@ -28559,7 +30038,7 @@
         </w:trPr>
         <w:tc>
           <w:tcPr>
-            <w:tcW w:type="dxa" w:w="3350"/>
+            <w:tcW w:type="dxa" w:w="3387"/>
             <w:tcBorders>
               <w:top w:val="single" w:color="CFC6DE" w:sz="4"/>
               <w:left w:val="single" w:color="CFC6DE" w:sz="4"/>
@@ -28587,13 +30066,13 @@
                 <w:sz w:val="19"/>
                 <w:szCs w:val="19"/>
               </w:rPr>
-              <w:t xml:space="preserve">Un lecteur ne retrouve pas son identifiant.</w:t>
+              <w:t xml:space="preserve">J'ai oublié mon mot de passe.</w:t>
             </w:r>
           </w:p>
         </w:tc>
         <w:tc>
           <w:tcPr>
-            <w:tcW w:type="dxa" w:w="5676"/>
+            <w:tcW w:type="dxa" w:w="5639"/>
             <w:tcBorders>
               <w:top w:val="single" w:color="CFC6DE" w:sz="4"/>
               <w:left w:val="single" w:color="CFC6DE" w:sz="4"/>
@@ -28621,23 +30100,7 @@
                 <w:sz w:val="19"/>
                 <w:szCs w:val="19"/>
               </w:rPr>
-              <w:t xml:space="preserve">Qu'il se connecte avec son </w:t>
-            </w:r>
-            <w:r>
-              <w:rPr>
-                <w:b/>
-                <w:bCs/>
-                <w:sz w:val="19"/>
-                <w:szCs w:val="19"/>
-              </w:rPr>
-              <w:t xml:space="preserve">adresse e-mail</w:t>
-            </w:r>
-            <w:r>
-              <w:rPr>
-                <w:sz w:val="19"/>
-                <w:szCs w:val="19"/>
-              </w:rPr>
-              <w:t xml:space="preserve">. Depuis la version 2.5, l'identifiant d'un nouveau compte n'est jamais montré. Mot de passe perdu : </w:t>
+              <w:t xml:space="preserve">Lien </w:t>
             </w:r>
             <w:r>
               <w:rPr>
@@ -28653,7 +30116,7 @@
                 <w:sz w:val="19"/>
                 <w:szCs w:val="19"/>
               </w:rPr>
-              <w:t xml:space="preserve"> avec la même adresse.</w:t>
+              <w:t xml:space="preserve"> sur la page de connexion.</w:t>
             </w:r>
           </w:p>
         </w:tc>
@@ -28665,7 +30128,7 @@
         </w:trPr>
         <w:tc>
           <w:tcPr>
-            <w:tcW w:type="dxa" w:w="3350"/>
+            <w:tcW w:type="dxa" w:w="3387"/>
             <w:tcBorders>
               <w:top w:val="single" w:color="CFC6DE" w:sz="4"/>
               <w:left w:val="single" w:color="CFC6DE" w:sz="4"/>
@@ -28694,29 +30157,13 @@
                 <w:sz w:val="19"/>
                 <w:szCs w:val="19"/>
               </w:rPr>
-              <w:t xml:space="preserve">Je ne vois pas </w:t>
-            </w:r>
-            <w:r>
-              <w:rPr>
-                <w:b/>
-                <w:bCs/>
-                <w:sz w:val="19"/>
-                <w:szCs w:val="19"/>
-              </w:rPr>
-              <w:t xml:space="preserve">Corrections</w:t>
-            </w:r>
-            <w:r>
-              <w:rPr>
-                <w:sz w:val="19"/>
-                <w:szCs w:val="19"/>
-              </w:rPr>
-              <w:t xml:space="preserve"> dans le menu.</w:t>
+              <w:t xml:space="preserve">Un lecteur ne retrouve pas son identifiant.</w:t>
             </w:r>
           </w:p>
         </w:tc>
         <w:tc>
           <w:tcPr>
-            <w:tcW w:type="dxa" w:w="5676"/>
+            <w:tcW w:type="dxa" w:w="5639"/>
             <w:tcBorders>
               <w:top w:val="single" w:color="CFC6DE" w:sz="4"/>
               <w:left w:val="single" w:color="CFC6DE" w:sz="4"/>
@@ -28745,7 +30192,39 @@
                 <w:sz w:val="19"/>
                 <w:szCs w:val="19"/>
               </w:rPr>
-              <w:t xml:space="preserve">L'entrée apparaît au premier signalement de coquille reçu.</w:t>
+              <w:t xml:space="preserve">Qu'il se connecte avec son </w:t>
+            </w:r>
+            <w:r>
+              <w:rPr>
+                <w:b/>
+                <w:bCs/>
+                <w:sz w:val="19"/>
+                <w:szCs w:val="19"/>
+              </w:rPr>
+              <w:t xml:space="preserve">adresse e-mail</w:t>
+            </w:r>
+            <w:r>
+              <w:rPr>
+                <w:sz w:val="19"/>
+                <w:szCs w:val="19"/>
+              </w:rPr>
+              <w:t xml:space="preserve">. Depuis la version 2.5, l'identifiant d'un nouveau compte n'est jamais montré. Mot de passe perdu : </w:t>
+            </w:r>
+            <w:r>
+              <w:rPr>
+                <w:b/>
+                <w:bCs/>
+                <w:sz w:val="19"/>
+                <w:szCs w:val="19"/>
+              </w:rPr>
+              <w:t xml:space="preserve">Mot de passe oublié ?</w:t>
+            </w:r>
+            <w:r>
+              <w:rPr>
+                <w:sz w:val="19"/>
+                <w:szCs w:val="19"/>
+              </w:rPr>
+              <w:t xml:space="preserve"> avec la même adresse.</w:t>
             </w:r>
           </w:p>
         </w:tc>
@@ -28757,7 +30236,7 @@
         </w:trPr>
         <w:tc>
           <w:tcPr>
-            <w:tcW w:type="dxa" w:w="3350"/>
+            <w:tcW w:type="dxa" w:w="3387"/>
             <w:tcBorders>
               <w:top w:val="single" w:color="CFC6DE" w:sz="4"/>
               <w:left w:val="single" w:color="CFC6DE" w:sz="4"/>
@@ -28785,45 +30264,29 @@
                 <w:sz w:val="19"/>
                 <w:szCs w:val="19"/>
               </w:rPr>
-              <w:t xml:space="preserve">Je vois les coquilles mais pas les boutons </w:t>
-            </w:r>
-            <w:r>
-              <w:rPr>
-                <w:b/>
-                <w:bCs/>
-                <w:sz w:val="19"/>
-                <w:szCs w:val="19"/>
-              </w:rPr>
-              <w:t xml:space="preserve">Corrigé</w:t>
-            </w:r>
-            <w:r>
-              <w:rPr>
-                <w:sz w:val="19"/>
-                <w:szCs w:val="19"/>
-              </w:rPr>
-              <w:t xml:space="preserve"> et </w:t>
-            </w:r>
-            <w:r>
-              <w:rPr>
-                <w:b/>
-                <w:bCs/>
-                <w:sz w:val="19"/>
-                <w:szCs w:val="19"/>
-              </w:rPr>
-              <w:t xml:space="preserve">Rejeté</w:t>
-            </w:r>
-            <w:r>
-              <w:rPr>
-                <w:sz w:val="19"/>
-                <w:szCs w:val="19"/>
-              </w:rPr>
-              <w:t xml:space="preserve">.</w:t>
+              <w:t xml:space="preserve">Je ne vois pas </w:t>
+            </w:r>
+            <w:r>
+              <w:rPr>
+                <w:b/>
+                <w:bCs/>
+                <w:sz w:val="19"/>
+                <w:szCs w:val="19"/>
+              </w:rPr>
+              <w:t xml:space="preserve">Corrections</w:t>
+            </w:r>
+            <w:r>
+              <w:rPr>
+                <w:sz w:val="19"/>
+                <w:szCs w:val="19"/>
+              </w:rPr>
+              <w:t xml:space="preserve"> dans le menu.</w:t>
             </w:r>
           </w:p>
         </w:tc>
         <w:tc>
           <w:tcPr>
-            <w:tcW w:type="dxa" w:w="5676"/>
+            <w:tcW w:type="dxa" w:w="5639"/>
             <w:tcBorders>
               <w:top w:val="single" w:color="CFC6DE" w:sz="4"/>
               <w:left w:val="single" w:color="CFC6DE" w:sz="4"/>
@@ -28851,7 +30314,7 @@
                 <w:sz w:val="19"/>
                 <w:szCs w:val="19"/>
               </w:rPr>
-              <w:t xml:space="preserve">Ils sont réservés aux éditeurs et aux gérants. Prévenez un éditeur sur Discord.</w:t>
+              <w:t xml:space="preserve">L'entrée apparaît au premier signalement de coquille reçu.</w:t>
             </w:r>
           </w:p>
         </w:tc>
@@ -28863,7 +30326,7 @@
         </w:trPr>
         <w:tc>
           <w:tcPr>
-            <w:tcW w:type="dxa" w:w="3350"/>
+            <w:tcW w:type="dxa" w:w="3387"/>
             <w:tcBorders>
               <w:top w:val="single" w:color="CFC6DE" w:sz="4"/>
               <w:left w:val="single" w:color="CFC6DE" w:sz="4"/>
@@ -28892,16 +30355,32 @@
                 <w:sz w:val="19"/>
                 <w:szCs w:val="19"/>
               </w:rPr>
-              <w:t xml:space="preserve">Une fiche d'œuvre n'affiche pas </w:t>
-            </w:r>
-            <w:r>
-              <w:rPr>
-                <w:b/>
-                <w:bCs/>
-                <w:sz w:val="19"/>
-                <w:szCs w:val="19"/>
-              </w:rPr>
-              <w:t xml:space="preserve">Si vous avez aimé…</w:t>
+              <w:t xml:space="preserve">Je vois les coquilles mais pas les boutons </w:t>
+            </w:r>
+            <w:r>
+              <w:rPr>
+                <w:b/>
+                <w:bCs/>
+                <w:sz w:val="19"/>
+                <w:szCs w:val="19"/>
+              </w:rPr>
+              <w:t xml:space="preserve">Corrigé</w:t>
+            </w:r>
+            <w:r>
+              <w:rPr>
+                <w:sz w:val="19"/>
+                <w:szCs w:val="19"/>
+              </w:rPr>
+              <w:t xml:space="preserve"> et </w:t>
+            </w:r>
+            <w:r>
+              <w:rPr>
+                <w:b/>
+                <w:bCs/>
+                <w:sz w:val="19"/>
+                <w:szCs w:val="19"/>
+              </w:rPr>
+              <w:t xml:space="preserve">Rejeté</w:t>
             </w:r>
             <w:r>
               <w:rPr>
@@ -28914,7 +30393,7 @@
         </w:tc>
         <w:tc>
           <w:tcPr>
-            <w:tcW w:type="dxa" w:w="5676"/>
+            <w:tcW w:type="dxa" w:w="5639"/>
             <w:tcBorders>
               <w:top w:val="single" w:color="CFC6DE" w:sz="4"/>
               <w:left w:val="single" w:color="CFC6DE" w:sz="4"/>
@@ -28943,6 +30422,96 @@
                 <w:sz w:val="19"/>
                 <w:szCs w:val="19"/>
               </w:rPr>
+              <w:t xml:space="preserve">Ils sont réservés aux éditeurs et aux gérants. Prévenez un éditeur sur Discord.</w:t>
+            </w:r>
+          </w:p>
+        </w:tc>
+      </w:tr>
+      <w:tr>
+        <w:trPr>
+          <w:cantSplit/>
+          <w:tblHeader w:val="off"/>
+        </w:trPr>
+        <w:tc>
+          <w:tcPr>
+            <w:tcW w:type="dxa" w:w="3387"/>
+            <w:tcBorders>
+              <w:top w:val="single" w:color="CFC6DE" w:sz="4"/>
+              <w:left w:val="single" w:color="CFC6DE" w:sz="4"/>
+              <w:bottom w:val="single" w:color="CFC6DE" w:sz="4"/>
+              <w:right w:val="single" w:color="CFC6DE" w:sz="4"/>
+            </w:tcBorders>
+            <w:tcMar>
+              <w:top w:type="dxa" w:w="70"/>
+              <w:left w:type="dxa" w:w="110"/>
+              <w:bottom w:type="dxa" w:w="70"/>
+              <w:right w:type="dxa" w:w="110"/>
+            </w:tcMar>
+            <w:vAlign w:val="center"/>
+          </w:tcPr>
+          <w:p>
+            <w:pPr>
+              <w:spacing w:after="0" w:before="0"/>
+              <w:rPr>
+                <w:sz w:val="19"/>
+                <w:szCs w:val="19"/>
+              </w:rPr>
+            </w:pPr>
+            <w:r>
+              <w:rPr>
+                <w:sz w:val="19"/>
+                <w:szCs w:val="19"/>
+              </w:rPr>
+              <w:t xml:space="preserve">Une fiche d'œuvre n'affiche pas </w:t>
+            </w:r>
+            <w:r>
+              <w:rPr>
+                <w:b/>
+                <w:bCs/>
+                <w:sz w:val="19"/>
+                <w:szCs w:val="19"/>
+              </w:rPr>
+              <w:t xml:space="preserve">Si vous avez aimé…</w:t>
+            </w:r>
+            <w:r>
+              <w:rPr>
+                <w:sz w:val="19"/>
+                <w:szCs w:val="19"/>
+              </w:rPr>
+              <w:t xml:space="preserve">.</w:t>
+            </w:r>
+          </w:p>
+        </w:tc>
+        <w:tc>
+          <w:tcPr>
+            <w:tcW w:type="dxa" w:w="5639"/>
+            <w:tcBorders>
+              <w:top w:val="single" w:color="CFC6DE" w:sz="4"/>
+              <w:left w:val="single" w:color="CFC6DE" w:sz="4"/>
+              <w:bottom w:val="single" w:color="CFC6DE" w:sz="4"/>
+              <w:right w:val="single" w:color="CFC6DE" w:sz="4"/>
+            </w:tcBorders>
+            <w:tcMar>
+              <w:top w:type="dxa" w:w="70"/>
+              <w:left w:type="dxa" w:w="110"/>
+              <w:bottom w:type="dxa" w:w="70"/>
+              <w:right w:type="dxa" w:w="110"/>
+            </w:tcMar>
+            <w:vAlign w:val="center"/>
+          </w:tcPr>
+          <w:p>
+            <w:pPr>
+              <w:spacing w:after="0" w:before="0"/>
+              <w:rPr>
+                <w:sz w:val="19"/>
+                <w:szCs w:val="19"/>
+              </w:rPr>
+            </w:pPr>
+            <w:r>
+              <w:rPr>
+                <w:sz w:val="19"/>
+                <w:szCs w:val="19"/>
+              </w:rPr>
               <w:t xml:space="preserve">Il faut au moins 2 œuvres proches. Complétez les genres de l'œuvre.</w:t>
             </w:r>
           </w:p>
@@ -28953,21 +30522,21 @@
       <w:pPr>
         <w:pStyle w:val="Heading1"/>
       </w:pPr>
-      <w:bookmarkStart w:name="titre-89" w:id="180"/>
-      <w:r>
-        <w:t xml:space="preserve">17 En cas de problème</w:t>
-      </w:r>
-      <w:bookmarkEnd w:id="180"/>
+      <w:bookmarkStart w:name="titre-94" w:id="190"/>
+      <w:r>
+        <w:t xml:space="preserve">18 En cas de problème</w:t>
+      </w:r>
+      <w:bookmarkEnd w:id="190"/>
     </w:p>
     <w:p>
       <w:pPr>
         <w:pStyle w:val="Heading2"/>
       </w:pPr>
-      <w:bookmarkStart w:name="titre-90" w:id="181"/>
-      <w:r>
-        <w:t xml:space="preserve">17.1 Qui contacter</w:t>
-      </w:r>
-      <w:bookmarkEnd w:id="181"/>
+      <w:bookmarkStart w:name="titre-95" w:id="191"/>
+      <w:r>
+        <w:t xml:space="preserve">18.1 Qui contacter</w:t>
+      </w:r>
+      <w:bookmarkEnd w:id="191"/>
     </w:p>
     <w:tbl>
       <w:tblPr>
@@ -29464,11 +31033,11 @@
       <w:pPr>
         <w:pStyle w:val="Heading2"/>
       </w:pPr>
-      <w:bookmarkStart w:name="titre-91" w:id="182"/>
-      <w:r>
-        <w:t xml:space="preserve">17.2 Signaler un problème</w:t>
-      </w:r>
-      <w:bookmarkEnd w:id="182"/>
+      <w:bookmarkStart w:name="titre-96" w:id="192"/>
+      <w:r>
+        <w:t xml:space="preserve">18.2 Signaler un problème</w:t>
+      </w:r>
+      <w:bookmarkEnd w:id="192"/>
     </w:p>
     <w:p>
       <w:r>
@@ -29480,7 +31049,7 @@
         <w:pStyle w:val="ListParagraph"/>
         <w:numPr>
           <w:ilvl w:val="0"/>
-          <w:numId w:val="45"/>
+          <w:numId w:val="49"/>
         </w:numPr>
         <w:spacing w:after="60" w:before="40"/>
       </w:pPr>
@@ -29493,7 +31062,7 @@
         <w:pStyle w:val="ListParagraph"/>
         <w:numPr>
           <w:ilvl w:val="0"/>
-          <w:numId w:val="45"/>
+          <w:numId w:val="49"/>
         </w:numPr>
         <w:spacing w:after="60" w:before="40"/>
       </w:pPr>
@@ -29506,7 +31075,7 @@
         <w:pStyle w:val="ListParagraph"/>
         <w:numPr>
           <w:ilvl w:val="0"/>
-          <w:numId w:val="45"/>
+          <w:numId w:val="49"/>
         </w:numPr>
         <w:spacing w:after="60" w:before="40"/>
       </w:pPr>
@@ -29519,7 +31088,7 @@
         <w:pStyle w:val="ListParagraph"/>
         <w:numPr>
           <w:ilvl w:val="0"/>
-          <w:numId w:val="45"/>
+          <w:numId w:val="49"/>
         </w:numPr>
         <w:spacing w:after="60" w:before="40"/>
       </w:pPr>
@@ -29728,7 +31297,7 @@
         <w:sz w:val="17"/>
         <w:szCs w:val="17"/>
       </w:rPr>
-      <w:t xml:space="preserve">Version 2.5.1-dev.1 du 20 octobre 2026</w:t>
+      <w:t xml:space="preserve">Version 2.6.0-dev.8 du 24 octobre 2026</w:t>
     </w:r>
     <w:r>
       <w:rPr>
@@ -30214,6 +31783,30 @@
     </w:lvlOverride>
   </w:num>
   <w:num w:numId="45">
+    <w:abstractNumId w:val="2"/>
+    <w:lvlOverride w:ilvl="0">
+      <w:startOverride w:val="1"/>
+    </w:lvlOverride>
+  </w:num>
+  <w:num w:numId="46">
+    <w:abstractNumId w:val="2"/>
+    <w:lvlOverride w:ilvl="0">
+      <w:startOverride w:val="1"/>
+    </w:lvlOverride>
+  </w:num>
+  <w:num w:numId="47">
+    <w:abstractNumId w:val="2"/>
+    <w:lvlOverride w:ilvl="0">
+      <w:startOverride w:val="1"/>
+    </w:lvlOverride>
+  </w:num>
+  <w:num w:numId="48">
+    <w:abstractNumId w:val="2"/>
+    <w:lvlOverride w:ilvl="0">
+      <w:startOverride w:val="1"/>
+    </w:lvlOverride>
+  </w:num>
+  <w:num w:numId="49">
     <w:abstractNumId w:val="2"/>
     <w:lvlOverride w:ilvl="0">
       <w:startOverride w:val="1"/>

</xml_diff>

<commit_message>
Thèmes saisonniers : arbre décoratif en fond de page (2.7.0-dev.4)
Sprites de l'arbre du logo (printemps, été, Halloween, hiver, Noël) en WebP et AVIF, 1x et 2x,
posés par le thème à droite et en bas de la fenêtre, derrière le contenu : filigrane à 30 % sous
1 900 px (4,5:1 conservé sur le texte courant), marge libre au-delà. Jamais sur les chapitres, la
page Illustrations, l'espace équipe, sous Sépia, avec le contraste renforcé, ni sous 1 024 px (image
non téléchargée). Réglage « Arbre décoratif » dans la section Thème saisonnier, deux tests, guide de
l'équipe (Markdown et DOCX), contrat, design et docs/08 (décisions du 30/10). L'arbre d'automne
sera ajouté dès réception du fichier.

Co-Authored-By: Claude Fable 5.1 <noreply@anthropic.com>
Claude-Session: https://claude.ai/code/session_015YMDuD9pvskBfZXb8f4YCu
</commit_message>
<xml_diff>
--- a/docs/guide-equipe/Guide-equipe-Yume-Novel.docx
+++ b/docs/guide-equipe/Guide-equipe-Yume-Novel.docx
@@ -61,7 +61,7 @@
           <w:sz w:val="22"/>
           <w:szCs w:val="22"/>
         </w:rPr>
-        <w:t xml:space="preserve">Version 2.6.0 du 30 octobre 2026</w:t>
+        <w:t xml:space="preserve">Version 2.7.0-dev.3 du 30 octobre 2026</w:t>
       </w:r>
     </w:p>
     <w:p>
@@ -1786,39 +1786,39 @@
         </w:p>
         <w:p>
           <w:pPr>
+            <w:pStyle w:val="TOC2"/>
+            <w:tabs>
+              <w:tab w:val="clear" w:pos="8786"/>
+              <w:tab w:val="right" w:pos="9025" w:leader="dot"/>
+            </w:tabs>
+          </w:pPr>
+          <w:hyperlink w:history="1" w:anchor="titre-89">
+            <w:r>
+              <w:rPr>
+                <w:rStyle w:val="IndexLink"/>
+              </w:rPr>
+              <w:t xml:space="default">15.4 Afficher ou retirer l'arbre décoratif</w:t>
+              <w:tab/>
+              <w:t xml:space="default">60</w:t>
+            </w:r>
+          </w:hyperlink>
+        </w:p>
+        <w:p>
+          <w:pPr>
             <w:pStyle w:val="TOC1"/>
             <w:tabs>
               <w:tab w:val="clear" w:pos="9026"/>
               <w:tab w:val="right" w:pos="9025" w:leader="dot"/>
             </w:tabs>
           </w:pPr>
-          <w:hyperlink w:history="1" w:anchor="titre-89">
+          <w:hyperlink w:history="1" w:anchor="titre-90">
             <w:r>
               <w:rPr>
                 <w:rStyle w:val="IndexLink"/>
               </w:rPr>
               <w:t xml:space="default">16 Les coquilles signalées par les lecteurs</w:t>
               <w:tab/>
-              <w:t xml:space="default">61</w:t>
-            </w:r>
-          </w:hyperlink>
-        </w:p>
-        <w:p>
-          <w:pPr>
-            <w:pStyle w:val="TOC2"/>
-            <w:tabs>
-              <w:tab w:val="clear" w:pos="8786"/>
-              <w:tab w:val="right" w:pos="9025" w:leader="dot"/>
-            </w:tabs>
-          </w:pPr>
-          <w:hyperlink w:history="1" w:anchor="titre-90">
-            <w:r>
-              <w:rPr>
-                <w:rStyle w:val="IndexLink"/>
-              </w:rPr>
-              <w:t xml:space="default">16.1 Comprendre ce que fait le lecteur</w:t>
-              <w:tab/>
-              <w:t xml:space="default">61</w:t>
+              <w:t xml:space="default">62</w:t>
             </w:r>
           </w:hyperlink>
         </w:p>
@@ -1835,9 +1835,9 @@
               <w:rPr>
                 <w:rStyle w:val="IndexLink"/>
               </w:rPr>
-              <w:t xml:space="default">16.2 Traiter une coquille</w:t>
+              <w:t xml:space="default">16.1 Comprendre ce que fait le lecteur</w:t>
               <w:tab/>
-              <w:t xml:space="default">61</w:t>
+              <w:t xml:space="default">62</w:t>
             </w:r>
           </w:hyperlink>
         </w:p>
@@ -1854,9 +1854,28 @@
               <w:rPr>
                 <w:rStyle w:val="IndexLink"/>
               </w:rPr>
+              <w:t xml:space="default">16.2 Traiter une coquille</w:t>
+              <w:tab/>
+              <w:t xml:space="default">62</w:t>
+            </w:r>
+          </w:hyperlink>
+        </w:p>
+        <w:p>
+          <w:pPr>
+            <w:pStyle w:val="TOC2"/>
+            <w:tabs>
+              <w:tab w:val="clear" w:pos="8786"/>
+              <w:tab w:val="right" w:pos="9025" w:leader="dot"/>
+            </w:tabs>
+          </w:pPr>
+          <w:hyperlink w:history="1" w:anchor="titre-93">
+            <w:r>
+              <w:rPr>
+                <w:rStyle w:val="IndexLink"/>
+              </w:rPr>
               <w:t xml:space="default">16.3 Retrouver les signalements traités</w:t>
               <w:tab/>
-              <w:t xml:space="default">63</w:t>
+              <w:t xml:space="default">64</w:t>
             </w:r>
           </w:hyperlink>
         </w:p>
@@ -1868,33 +1887,14 @@
               <w:tab w:val="right" w:pos="9025" w:leader="dot"/>
             </w:tabs>
           </w:pPr>
-          <w:hyperlink w:history="1" w:anchor="titre-93">
+          <w:hyperlink w:history="1" w:anchor="titre-94">
             <w:r>
               <w:rPr>
                 <w:rStyle w:val="IndexLink"/>
               </w:rPr>
               <w:t xml:space="default">17 Glossaires, actualités et commentaires</w:t>
               <w:tab/>
-              <w:t xml:space="default">64</w:t>
-            </w:r>
-          </w:hyperlink>
-        </w:p>
-        <w:p>
-          <w:pPr>
-            <w:pStyle w:val="TOC2"/>
-            <w:tabs>
-              <w:tab w:val="clear" w:pos="8786"/>
-              <w:tab w:val="right" w:pos="9025" w:leader="dot"/>
-            </w:tabs>
-          </w:pPr>
-          <w:hyperlink w:history="1" w:anchor="titre-94">
-            <w:r>
-              <w:rPr>
-                <w:rStyle w:val="IndexLink"/>
-              </w:rPr>
-              <w:t xml:space="default">17.1 Publier le glossaire d'une œuvre</w:t>
-              <w:tab/>
-              <w:t xml:space="default">64</w:t>
+              <w:t xml:space="default">65</w:t>
             </w:r>
           </w:hyperlink>
         </w:p>
@@ -1911,9 +1911,9 @@
               <w:rPr>
                 <w:rStyle w:val="IndexLink"/>
               </w:rPr>
-              <w:t xml:space="default">17.2 Lier une actualité à une œuvre</w:t>
+              <w:t xml:space="default">17.1 Publier le glossaire d'une œuvre</w:t>
               <w:tab/>
-              <w:t xml:space="default">64</w:t>
+              <w:t xml:space="default">65</w:t>
             </w:r>
           </w:hyperlink>
         </w:p>
@@ -1930,17 +1930,17 @@
               <w:rPr>
                 <w:rStyle w:val="IndexLink"/>
               </w:rPr>
-              <w:t xml:space="default">17.3 Modérer les commentaires</w:t>
+              <w:t xml:space="default">17.2 Lier une actualité à une œuvre</w:t>
               <w:tab/>
-              <w:t xml:space="default">64</w:t>
+              <w:t xml:space="default">65</w:t>
             </w:r>
           </w:hyperlink>
         </w:p>
         <w:p>
           <w:pPr>
-            <w:pStyle w:val="TOC1"/>
+            <w:pStyle w:val="TOC2"/>
             <w:tabs>
-              <w:tab w:val="clear" w:pos="9026"/>
+              <w:tab w:val="clear" w:pos="8786"/>
               <w:tab w:val="right" w:pos="9025" w:leader="dot"/>
             </w:tabs>
           </w:pPr>
@@ -1949,7 +1949,7 @@
               <w:rPr>
                 <w:rStyle w:val="IndexLink"/>
               </w:rPr>
-              <w:t xml:space="default">18 Questions fréquentes</w:t>
+              <w:t xml:space="default">17.3 Modérer les commentaires</w:t>
               <w:tab/>
               <w:t xml:space="default">65</w:t>
             </w:r>
@@ -1968,17 +1968,17 @@
               <w:rPr>
                 <w:rStyle w:val="IndexLink"/>
               </w:rPr>
-              <w:t xml:space="default">19 En cas de problème</w:t>
+              <w:t xml:space="default">18 Questions fréquentes</w:t>
               <w:tab/>
-              <w:t xml:space="default">67</w:t>
+              <w:t xml:space="default">66</w:t>
             </w:r>
           </w:hyperlink>
         </w:p>
         <w:p>
           <w:pPr>
-            <w:pStyle w:val="TOC2"/>
+            <w:pStyle w:val="TOC1"/>
             <w:tabs>
-              <w:tab w:val="clear" w:pos="8786"/>
+              <w:tab w:val="clear" w:pos="9026"/>
               <w:tab w:val="right" w:pos="9025" w:leader="dot"/>
             </w:tabs>
           </w:pPr>
@@ -1987,9 +1987,9 @@
               <w:rPr>
                 <w:rStyle w:val="IndexLink"/>
               </w:rPr>
-              <w:t xml:space="default">19.1 Qui contacter</w:t>
+              <w:t xml:space="default">19 En cas de problème</w:t>
               <w:tab/>
-              <w:t xml:space="default">67</w:t>
+              <w:t xml:space="default">68</w:t>
             </w:r>
           </w:hyperlink>
         </w:p>
@@ -2006,9 +2006,28 @@
               <w:rPr>
                 <w:rStyle w:val="IndexLink"/>
               </w:rPr>
+              <w:t xml:space="default">19.1 Qui contacter</w:t>
+              <w:tab/>
+              <w:t xml:space="default">68</w:t>
+            </w:r>
+          </w:hyperlink>
+        </w:p>
+        <w:p>
+          <w:pPr>
+            <w:pStyle w:val="TOC2"/>
+            <w:tabs>
+              <w:tab w:val="clear" w:pos="8786"/>
+              <w:tab w:val="right" w:pos="9025" w:leader="dot"/>
+            </w:tabs>
+          </w:pPr>
+          <w:hyperlink w:history="1" w:anchor="titre-101">
+            <w:r>
+              <w:rPr>
+                <w:rStyle w:val="IndexLink"/>
+              </w:rPr>
               <w:t xml:space="default">19.2 Signaler un problème</w:t>
               <w:tab/>
-              <w:t xml:space="default">67</w:t>
+              <w:t xml:space="default">68</w:t>
             </w:r>
           </w:hyperlink>
           <w:r>
@@ -2021,21 +2040,21 @@
       <w:pPr>
         <w:pStyle w:val="Heading1"/>
       </w:pPr>
-      <w:bookmarkStart w:name="titre-1" w:id="101"/>
+      <w:bookmarkStart w:name="titre-1" w:id="102"/>
       <w:r>
         <w:t xml:space="preserve">1 Bienvenue dans l'espace équipe</w:t>
       </w:r>
-      <w:bookmarkEnd w:id="101"/>
+      <w:bookmarkEnd w:id="102"/>
     </w:p>
     <w:p>
       <w:pPr>
         <w:pStyle w:val="Heading2"/>
       </w:pPr>
-      <w:bookmarkStart w:name="titre-2" w:id="102"/>
+      <w:bookmarkStart w:name="titre-2" w:id="103"/>
       <w:r>
         <w:t xml:space="preserve">1.1 À quoi sert l'espace équipe</w:t>
       </w:r>
-      <w:bookmarkEnd w:id="102"/>
+      <w:bookmarkEnd w:id="103"/>
     </w:p>
     <w:p>
       <w:r>
@@ -2149,11 +2168,11 @@
       <w:pPr>
         <w:pStyle w:val="Heading2"/>
       </w:pPr>
-      <w:bookmarkStart w:name="titre-3" w:id="103"/>
+      <w:bookmarkStart w:name="titre-3" w:id="104"/>
       <w:r>
         <w:t xml:space="preserve">1.2 Qui peut faire quoi</w:t>
       </w:r>
-      <w:bookmarkEnd w:id="103"/>
+      <w:bookmarkEnd w:id="104"/>
     </w:p>
     <w:p>
       <w:r>
@@ -2594,11 +2613,11 @@
       <w:pPr>
         <w:pStyle w:val="Heading2"/>
       </w:pPr>
-      <w:bookmarkStart w:name="titre-4" w:id="104"/>
+      <w:bookmarkStart w:name="titre-4" w:id="105"/>
       <w:r>
         <w:t xml:space="preserve">1.3 Se connecter</w:t>
       </w:r>
-      <w:bookmarkEnd w:id="104"/>
+      <w:bookmarkEnd w:id="105"/>
     </w:p>
     <w:p>
       <w:pPr>
@@ -3071,21 +3090,21 @@
       <w:pPr>
         <w:pStyle w:val="Heading1"/>
       </w:pPr>
-      <w:bookmarkStart w:name="titre-5" w:id="105"/>
+      <w:bookmarkStart w:name="titre-5" w:id="106"/>
       <w:r>
         <w:t xml:space="preserve">2 Le tableau de bord et le menu</w:t>
       </w:r>
-      <w:bookmarkEnd w:id="105"/>
+      <w:bookmarkEnd w:id="106"/>
     </w:p>
     <w:p>
       <w:pPr>
         <w:pStyle w:val="Heading2"/>
       </w:pPr>
-      <w:bookmarkStart w:name="titre-6" w:id="106"/>
+      <w:bookmarkStart w:name="titre-6" w:id="107"/>
       <w:r>
         <w:t xml:space="preserve">2.1 Lire le tableau de bord</w:t>
       </w:r>
-      <w:bookmarkEnd w:id="106"/>
+      <w:bookmarkEnd w:id="107"/>
     </w:p>
     <w:p>
       <w:r>
@@ -3226,11 +3245,11 @@
       <w:pPr>
         <w:pStyle w:val="Heading2"/>
       </w:pPr>
-      <w:bookmarkStart w:name="titre-7" w:id="107"/>
+      <w:bookmarkStart w:name="titre-7" w:id="108"/>
       <w:r>
         <w:t xml:space="preserve">2.2 Se repérer dans le menu</w:t>
       </w:r>
-      <w:bookmarkEnd w:id="107"/>
+      <w:bookmarkEnd w:id="108"/>
     </w:p>
     <w:p>
       <w:r>
@@ -3441,11 +3460,11 @@
       <w:pPr>
         <w:pStyle w:val="Heading2"/>
       </w:pPr>
-      <w:bookmarkStart w:name="titre-8" w:id="108"/>
+      <w:bookmarkStart w:name="titre-8" w:id="109"/>
       <w:r>
         <w:t xml:space="preserve">2.3 Utiliser les raccourcis d'un tome</w:t>
       </w:r>
-      <w:bookmarkEnd w:id="108"/>
+      <w:bookmarkEnd w:id="109"/>
     </w:p>
     <w:p>
       <w:r>
@@ -3556,11 +3575,11 @@
       <w:pPr>
         <w:pStyle w:val="Heading1"/>
       </w:pPr>
-      <w:bookmarkStart w:name="titre-9" w:id="109"/>
+      <w:bookmarkStart w:name="titre-9" w:id="110"/>
       <w:r>
         <w:t xml:space="preserve">3 Le planning</w:t>
       </w:r>
-      <w:bookmarkEnd w:id="109"/>
+      <w:bookmarkEnd w:id="110"/>
     </w:p>
     <w:p>
       <w:r>
@@ -3643,11 +3662,11 @@
       <w:pPr>
         <w:pStyle w:val="Heading2"/>
       </w:pPr>
-      <w:bookmarkStart w:name="titre-10" w:id="110"/>
+      <w:bookmarkStart w:name="titre-10" w:id="111"/>
       <w:r>
         <w:t xml:space="preserve">3.1 Mettre à jour son avancement</w:t>
       </w:r>
-      <w:bookmarkEnd w:id="110"/>
+      <w:bookmarkEnd w:id="111"/>
     </w:p>
     <w:p>
       <w:pPr>
@@ -3975,11 +3994,11 @@
       <w:pPr>
         <w:pStyle w:val="Heading2"/>
       </w:pPr>
-      <w:bookmarkStart w:name="titre-11" w:id="111"/>
+      <w:bookmarkStart w:name="titre-11" w:id="112"/>
       <w:r>
         <w:t xml:space="preserve">3.2 Signaler un tome bloqué</w:t>
       </w:r>
-      <w:bookmarkEnd w:id="111"/>
+      <w:bookmarkEnd w:id="112"/>
     </w:p>
     <w:p>
       <w:r>
@@ -4097,11 +4116,11 @@
       <w:pPr>
         <w:pStyle w:val="Heading2"/>
       </w:pPr>
-      <w:bookmarkStart w:name="titre-12" w:id="112"/>
+      <w:bookmarkStart w:name="titre-12" w:id="113"/>
       <w:r>
         <w:t xml:space="preserve">3.3 Mettre à jour une tâche « En attente »</w:t>
       </w:r>
-      <w:bookmarkEnd w:id="112"/>
+      <w:bookmarkEnd w:id="113"/>
     </w:p>
     <w:p>
       <w:r>
@@ -4142,11 +4161,11 @@
       <w:pPr>
         <w:pStyle w:val="Heading2"/>
       </w:pPr>
-      <w:bookmarkStart w:name="titre-13" w:id="113"/>
+      <w:bookmarkStart w:name="titre-13" w:id="114"/>
       <w:r>
         <w:t xml:space="preserve">3.4 Comprendre ce que voient les lecteurs</w:t>
       </w:r>
-      <w:bookmarkEnd w:id="113"/>
+      <w:bookmarkEnd w:id="114"/>
     </w:p>
     <w:tbl>
       <w:tblPr>
@@ -4765,11 +4784,11 @@
       <w:pPr>
         <w:pStyle w:val="Heading2"/>
       </w:pPr>
-      <w:bookmarkStart w:name="titre-14" w:id="114"/>
+      <w:bookmarkStart w:name="titre-14" w:id="115"/>
       <w:r>
         <w:t xml:space="preserve">3.5 Recevoir (ou ne plus recevoir) les rappels</w:t>
       </w:r>
-      <w:bookmarkEnd w:id="114"/>
+      <w:bookmarkEnd w:id="115"/>
     </w:p>
     <w:p>
       <w:r>
@@ -5021,11 +5040,11 @@
       <w:pPr>
         <w:pStyle w:val="Heading2"/>
       </w:pPr>
-      <w:bookmarkStart w:name="titre-15" w:id="115"/>
+      <w:bookmarkStart w:name="titre-15" w:id="116"/>
       <w:r>
         <w:t xml:space="preserve">3.6 Mettre un tome en pause</w:t>
       </w:r>
-      <w:bookmarkEnd w:id="115"/>
+      <w:bookmarkEnd w:id="116"/>
     </w:p>
     <w:p>
       <w:r>
@@ -5135,11 +5154,11 @@
       <w:pPr>
         <w:pStyle w:val="Heading2"/>
       </w:pPr>
-      <w:bookmarkStart w:name="titre-16" w:id="116"/>
+      <w:bookmarkStart w:name="titre-16" w:id="117"/>
       <w:r>
         <w:t xml:space="preserve">3.7 Retirer un tome ajouté par erreur</w:t>
       </w:r>
-      <w:bookmarkEnd w:id="116"/>
+      <w:bookmarkEnd w:id="117"/>
     </w:p>
     <w:p>
       <w:r>
@@ -5208,11 +5227,11 @@
       <w:pPr>
         <w:pStyle w:val="Heading2"/>
       </w:pPr>
-      <w:bookmarkStart w:name="titre-17" w:id="117"/>
+      <w:bookmarkStart w:name="titre-17" w:id="118"/>
       <w:r>
         <w:t xml:space="preserve">3.8 Trouver un tome dans le planning complet</w:t>
       </w:r>
-      <w:bookmarkEnd w:id="117"/>
+      <w:bookmarkEnd w:id="118"/>
     </w:p>
     <w:p>
       <w:r>
@@ -5356,11 +5375,11 @@
       <w:pPr>
         <w:pStyle w:val="Heading1"/>
       </w:pPr>
-      <w:bookmarkStart w:name="titre-18" w:id="118"/>
+      <w:bookmarkStart w:name="titre-18" w:id="119"/>
       <w:r>
         <w:t xml:space="preserve">4 Les œuvres</w:t>
       </w:r>
-      <w:bookmarkEnd w:id="118"/>
+      <w:bookmarkEnd w:id="119"/>
     </w:p>
     <w:p>
       <w:r>
@@ -5391,11 +5410,11 @@
       <w:pPr>
         <w:pStyle w:val="Heading2"/>
       </w:pPr>
-      <w:bookmarkStart w:name="titre-19" w:id="119"/>
+      <w:bookmarkStart w:name="titre-19" w:id="120"/>
       <w:r>
         <w:t xml:space="preserve">4.1 Créer une œuvre</w:t>
       </w:r>
-      <w:bookmarkEnd w:id="119"/>
+      <w:bookmarkEnd w:id="120"/>
     </w:p>
     <w:p>
       <w:pPr>
@@ -5849,11 +5868,11 @@
       <w:pPr>
         <w:pStyle w:val="Heading2"/>
       </w:pPr>
-      <w:bookmarkStart w:name="titre-20" w:id="120"/>
+      <w:bookmarkStart w:name="titre-20" w:id="121"/>
       <w:r>
         <w:t xml:space="preserve">4.2 Modifier une œuvre et cadrer sa couverture</w:t>
       </w:r>
-      <w:bookmarkEnd w:id="120"/>
+      <w:bookmarkEnd w:id="121"/>
     </w:p>
     <w:p>
       <w:pPr>
@@ -5986,11 +6005,11 @@
       <w:pPr>
         <w:pStyle w:val="Heading2"/>
       </w:pPr>
-      <w:bookmarkStart w:name="titre-21" w:id="121"/>
+      <w:bookmarkStart w:name="titre-21" w:id="122"/>
       <w:r>
         <w:t xml:space="preserve">4.3 Annoncer une nouvelle série sans dévoiler son titre</w:t>
       </w:r>
-      <w:bookmarkEnd w:id="121"/>
+      <w:bookmarkEnd w:id="122"/>
     </w:p>
     <w:p>
       <w:r>
@@ -6522,11 +6541,11 @@
       <w:pPr>
         <w:pStyle w:val="Heading2"/>
       </w:pPr>
-      <w:bookmarkStart w:name="titre-22" w:id="122"/>
+      <w:bookmarkStart w:name="titre-22" w:id="123"/>
       <w:r>
         <w:t xml:space="preserve">4.4 Gérer les genres</w:t>
       </w:r>
-      <w:bookmarkEnd w:id="122"/>
+      <w:bookmarkEnd w:id="123"/>
     </w:p>
     <w:p>
       <w:r>
@@ -6655,11 +6674,11 @@
       <w:pPr>
         <w:pStyle w:val="Heading1"/>
       </w:pPr>
-      <w:bookmarkStart w:name="titre-23" w:id="123"/>
+      <w:bookmarkStart w:name="titre-23" w:id="124"/>
       <w:r>
         <w:t xml:space="preserve">5 Les mangas (MangaDex)</w:t>
       </w:r>
-      <w:bookmarkEnd w:id="123"/>
+      <w:bookmarkEnd w:id="124"/>
     </w:p>
     <w:p>
       <w:r>
@@ -7058,11 +7077,11 @@
       <w:pPr>
         <w:pStyle w:val="Heading2"/>
       </w:pPr>
-      <w:bookmarkStart w:name="titre-24" w:id="124"/>
+      <w:bookmarkStart w:name="titre-24" w:id="125"/>
       <w:r>
         <w:t xml:space="preserve">5.1 Lier un manga à sa série MangaDex</w:t>
       </w:r>
-      <w:bookmarkEnd w:id="124"/>
+      <w:bookmarkEnd w:id="125"/>
     </w:p>
     <w:p>
       <w:r>
@@ -7486,11 +7505,11 @@
       <w:pPr>
         <w:pStyle w:val="Heading2"/>
       </w:pPr>
-      <w:bookmarkStart w:name="titre-25" w:id="125"/>
+      <w:bookmarkStart w:name="titre-25" w:id="126"/>
       <w:r>
         <w:t xml:space="preserve">5.2 Publier un chapitre de manga</w:t>
       </w:r>
-      <w:bookmarkEnd w:id="125"/>
+      <w:bookmarkEnd w:id="126"/>
     </w:p>
     <w:p>
       <w:pPr>
@@ -7749,11 +7768,11 @@
       <w:pPr>
         <w:pStyle w:val="Heading2"/>
       </w:pPr>
-      <w:bookmarkStart w:name="titre-26" w:id="126"/>
+      <w:bookmarkStart w:name="titre-26" w:id="127"/>
       <w:r>
         <w:t xml:space="preserve">5.3 Annoncer un tome de manga au planning</w:t>
       </w:r>
-      <w:bookmarkEnd w:id="126"/>
+      <w:bookmarkEnd w:id="127"/>
     </w:p>
     <w:p>
       <w:r>
@@ -7999,11 +8018,11 @@
       <w:pPr>
         <w:pStyle w:val="Heading2"/>
       </w:pPr>
-      <w:bookmarkStart w:name="titre-27" w:id="127"/>
+      <w:bookmarkStart w:name="titre-27" w:id="128"/>
       <w:r>
         <w:t xml:space="preserve">5.4 Vérifier la synchronisation</w:t>
       </w:r>
-      <w:bookmarkEnd w:id="127"/>
+      <w:bookmarkEnd w:id="128"/>
     </w:p>
     <w:p>
       <w:r>
@@ -8698,11 +8717,11 @@
       <w:pPr>
         <w:pStyle w:val="Heading2"/>
       </w:pPr>
-      <w:bookmarkStart w:name="titre-28" w:id="128"/>
+      <w:bookmarkStart w:name="titre-28" w:id="129"/>
       <w:r>
         <w:t xml:space="preserve">5.5 Retirer un chapitre ou un manga</w:t>
       </w:r>
-      <w:bookmarkEnd w:id="128"/>
+      <w:bookmarkEnd w:id="129"/>
     </w:p>
     <w:tbl>
       <w:tblPr>
@@ -9116,11 +9135,11 @@
       <w:pPr>
         <w:pStyle w:val="Heading1"/>
       </w:pPr>
-      <w:bookmarkStart w:name="titre-29" w:id="129"/>
+      <w:bookmarkStart w:name="titre-29" w:id="130"/>
       <w:r>
         <w:t xml:space="preserve">6 Créer un tome vide</w:t>
       </w:r>
-      <w:bookmarkEnd w:id="129"/>
+      <w:bookmarkEnd w:id="130"/>
     </w:p>
     <w:p>
       <w:r>
@@ -9131,11 +9150,11 @@
       <w:pPr>
         <w:pStyle w:val="Heading2"/>
       </w:pPr>
-      <w:bookmarkStart w:name="titre-30" w:id="130"/>
+      <w:bookmarkStart w:name="titre-30" w:id="131"/>
       <w:r>
         <w:t xml:space="preserve">6.1 Ouvrir la page « Nouveau tome »</w:t>
       </w:r>
-      <w:bookmarkEnd w:id="130"/>
+      <w:bookmarkEnd w:id="131"/>
     </w:p>
     <w:p>
       <w:r>
@@ -9216,11 +9235,11 @@
       <w:pPr>
         <w:pStyle w:val="Heading2"/>
       </w:pPr>
-      <w:bookmarkStart w:name="titre-31" w:id="131"/>
+      <w:bookmarkStart w:name="titre-31" w:id="132"/>
       <w:r>
         <w:t xml:space="preserve">6.2 Créer le tome</w:t>
       </w:r>
-      <w:bookmarkEnd w:id="131"/>
+      <w:bookmarkEnd w:id="132"/>
     </w:p>
     <w:p>
       <w:pPr>
@@ -9907,11 +9926,11 @@
       <w:pPr>
         <w:pStyle w:val="Heading2"/>
       </w:pPr>
-      <w:bookmarkStart w:name="titre-32" w:id="132"/>
+      <w:bookmarkStart w:name="titre-32" w:id="133"/>
       <w:r>
         <w:t xml:space="preserve">6.3 Comprendre la parution d'un tome</w:t>
       </w:r>
-      <w:bookmarkEnd w:id="132"/>
+      <w:bookmarkEnd w:id="133"/>
     </w:p>
     <w:p>
       <w:r>
@@ -10495,11 +10514,11 @@
       <w:pPr>
         <w:pStyle w:val="Heading1"/>
       </w:pPr>
-      <w:bookmarkStart w:name="titre-33" w:id="133"/>
+      <w:bookmarkStart w:name="titre-33" w:id="134"/>
       <w:r>
         <w:t xml:space="preserve">7 Préparer le fichier Word</w:t>
       </w:r>
-      <w:bookmarkEnd w:id="133"/>
+      <w:bookmarkEnd w:id="134"/>
     </w:p>
     <w:p>
       <w:r>
@@ -10510,11 +10529,11 @@
       <w:pPr>
         <w:pStyle w:val="Heading2"/>
       </w:pPr>
-      <w:bookmarkStart w:name="titre-34" w:id="134"/>
+      <w:bookmarkStart w:name="titre-34" w:id="135"/>
       <w:r>
         <w:t xml:space="preserve">7.1 Utiliser les bons styles</w:t>
       </w:r>
-      <w:bookmarkEnd w:id="134"/>
+      <w:bookmarkEnd w:id="135"/>
     </w:p>
     <w:tbl>
       <w:tblPr>
@@ -11483,11 +11502,11 @@
       <w:pPr>
         <w:pStyle w:val="Heading2"/>
       </w:pPr>
-      <w:bookmarkStart w:name="titre-35" w:id="135"/>
+      <w:bookmarkStart w:name="titre-35" w:id="136"/>
       <w:r>
         <w:t xml:space="preserve">7.2 Écrire les dialogues et les pensées</w:t>
       </w:r>
-      <w:bookmarkEnd w:id="135"/>
+      <w:bookmarkEnd w:id="136"/>
     </w:p>
     <w:p>
       <w:pPr>
@@ -11539,11 +11558,11 @@
       <w:pPr>
         <w:pStyle w:val="Heading2"/>
       </w:pPr>
-      <w:bookmarkStart w:name="titre-36" w:id="136"/>
+      <w:bookmarkStart w:name="titre-36" w:id="137"/>
       <w:r>
         <w:t xml:space="preserve">7.3 Décrire les illustrations</w:t>
       </w:r>
-      <w:bookmarkEnd w:id="136"/>
+      <w:bookmarkEnd w:id="137"/>
     </w:p>
     <w:p>
       <w:r>
@@ -11684,11 +11703,11 @@
       <w:pPr>
         <w:pStyle w:val="Heading2"/>
       </w:pPr>
-      <w:bookmarkStart w:name="titre-37" w:id="137"/>
+      <w:bookmarkStart w:name="titre-37" w:id="138"/>
       <w:r>
         <w:t xml:space="preserve">7.4 Forcer un début de chapitre avec un marqueur</w:t>
       </w:r>
-      <w:bookmarkEnd w:id="137"/>
+      <w:bookmarkEnd w:id="138"/>
     </w:p>
     <w:p>
       <w:r>
@@ -12166,11 +12185,11 @@
       <w:pPr>
         <w:pStyle w:val="Heading2"/>
       </w:pPr>
-      <w:bookmarkStart w:name="titre-38" w:id="138"/>
+      <w:bookmarkStart w:name="titre-38" w:id="139"/>
       <w:r>
         <w:t xml:space="preserve">7.5 Vérifier le fichier avant de l'envoyer</w:t>
       </w:r>
-      <w:bookmarkEnd w:id="138"/>
+      <w:bookmarkEnd w:id="139"/>
     </w:p>
     <w:p>
       <w:pPr>
@@ -12261,11 +12280,11 @@
       <w:pPr>
         <w:pStyle w:val="Heading1"/>
       </w:pPr>
-      <w:bookmarkStart w:name="titre-39" w:id="139"/>
+      <w:bookmarkStart w:name="titre-39" w:id="140"/>
       <w:r>
         <w:t xml:space="preserve">8 Ajouter des chapitres à un tome</w:t>
       </w:r>
-      <w:bookmarkEnd w:id="139"/>
+      <w:bookmarkEnd w:id="140"/>
     </w:p>
     <w:p>
       <w:r>
@@ -12316,11 +12335,11 @@
       <w:pPr>
         <w:pStyle w:val="Heading2"/>
       </w:pPr>
-      <w:bookmarkStart w:name="titre-40" w:id="140"/>
+      <w:bookmarkStart w:name="titre-40" w:id="141"/>
       <w:r>
         <w:t xml:space="preserve">8.1 Comprendre le formulaire</w:t>
       </w:r>
-      <w:bookmarkEnd w:id="140"/>
+      <w:bookmarkEnd w:id="141"/>
     </w:p>
     <w:p>
       <w:r>
@@ -13208,11 +13227,11 @@
       <w:pPr>
         <w:pStyle w:val="Heading2"/>
       </w:pPr>
-      <w:bookmarkStart w:name="titre-41" w:id="141"/>
+      <w:bookmarkStart w:name="titre-41" w:id="142"/>
       <w:r>
         <w:t xml:space="preserve">8.2 Publier le prologue d'un tome en cours</w:t>
       </w:r>
-      <w:bookmarkEnd w:id="141"/>
+      <w:bookmarkEnd w:id="142"/>
     </w:p>
     <w:p>
       <w:r>
@@ -13593,11 +13612,11 @@
       <w:pPr>
         <w:pStyle w:val="Heading2"/>
       </w:pPr>
-      <w:bookmarkStart w:name="titre-42" w:id="142"/>
+      <w:bookmarkStart w:name="titre-42" w:id="143"/>
       <w:r>
         <w:t xml:space="preserve">8.3 Programmer plusieurs chapitres au rythme</w:t>
       </w:r>
-      <w:bookmarkEnd w:id="142"/>
+      <w:bookmarkEnd w:id="143"/>
     </w:p>
     <w:p>
       <w:r>
@@ -13902,11 +13921,11 @@
       <w:pPr>
         <w:pStyle w:val="Heading2"/>
       </w:pPr>
-      <w:bookmarkStart w:name="titre-43" w:id="143"/>
+      <w:bookmarkStart w:name="titre-43" w:id="144"/>
       <w:r>
         <w:t xml:space="preserve">8.4 Publier un tome entier d'un coup</w:t>
       </w:r>
-      <w:bookmarkEnd w:id="143"/>
+      <w:bookmarkEnd w:id="144"/>
     </w:p>
     <w:p>
       <w:r>
@@ -14145,11 +14164,11 @@
       <w:pPr>
         <w:pStyle w:val="Heading2"/>
       </w:pPr>
-      <w:bookmarkStart w:name="titre-44" w:id="144"/>
+      <w:bookmarkStart w:name="titre-44" w:id="145"/>
       <w:r>
         <w:t xml:space="preserve">8.5 Donner tout le tome, chapitre par chapitre, avec les liens à la fin</w:t>
       </w:r>
-      <w:bookmarkEnd w:id="144"/>
+      <w:bookmarkEnd w:id="145"/>
     </w:p>
     <w:p>
       <w:r>
@@ -14454,11 +14473,11 @@
       <w:pPr>
         <w:pStyle w:val="Heading2"/>
       </w:pPr>
-      <w:bookmarkStart w:name="titre-45" w:id="145"/>
+      <w:bookmarkStart w:name="titre-45" w:id="146"/>
       <w:r>
         <w:t xml:space="preserve">8.6 Corriger un chapitre déjà en ligne</w:t>
       </w:r>
-      <w:bookmarkEnd w:id="145"/>
+      <w:bookmarkEnd w:id="146"/>
     </w:p>
     <w:p>
       <w:r>
@@ -14700,11 +14719,11 @@
       <w:pPr>
         <w:pStyle w:val="Heading2"/>
       </w:pPr>
-      <w:bookmarkStart w:name="titre-46" w:id="146"/>
+      <w:bookmarkStart w:name="titre-46" w:id="147"/>
       <w:r>
         <w:t xml:space="preserve">8.7 Découper soi-même les chapitres</w:t>
       </w:r>
-      <w:bookmarkEnd w:id="146"/>
+      <w:bookmarkEnd w:id="147"/>
     </w:p>
     <w:p>
       <w:r>
@@ -15012,11 +15031,11 @@
       <w:pPr>
         <w:pStyle w:val="Heading2"/>
       </w:pPr>
-      <w:bookmarkStart w:name="titre-47" w:id="147"/>
+      <w:bookmarkStart w:name="titre-47" w:id="148"/>
       <w:r>
         <w:t xml:space="preserve">8.8 Ajouter la lecture en ligne d'un tome déjà paru</w:t>
       </w:r>
-      <w:bookmarkEnd w:id="147"/>
+      <w:bookmarkEnd w:id="148"/>
     </w:p>
     <w:p>
       <w:r>
@@ -15114,11 +15133,11 @@
       <w:pPr>
         <w:pStyle w:val="Heading2"/>
       </w:pPr>
-      <w:bookmarkStart w:name="titre-48" w:id="148"/>
+      <w:bookmarkStart w:name="titre-48" w:id="149"/>
       <w:r>
         <w:t xml:space="preserve">8.9 Refaire toute la lecture en ligne d'un tome</w:t>
       </w:r>
-      <w:bookmarkEnd w:id="148"/>
+      <w:bookmarkEnd w:id="149"/>
     </w:p>
     <w:p>
       <w:r>
@@ -15337,11 +15356,11 @@
       <w:pPr>
         <w:pStyle w:val="Heading2"/>
       </w:pPr>
-      <w:bookmarkStart w:name="titre-49" w:id="149"/>
+      <w:bookmarkStart w:name="titre-49" w:id="150"/>
       <w:r>
         <w:t xml:space="preserve">8.10 Savoir ce qui sera annoncé</w:t>
       </w:r>
-      <w:bookmarkEnd w:id="149"/>
+      <w:bookmarkEnd w:id="150"/>
     </w:p>
     <w:tbl>
       <w:tblPr>
@@ -16171,11 +16190,11 @@
       <w:pPr>
         <w:pStyle w:val="Heading2"/>
       </w:pPr>
-      <w:bookmarkStart w:name="titre-50" w:id="150"/>
+      <w:bookmarkStart w:name="titre-50" w:id="151"/>
       <w:r>
         <w:t xml:space="preserve">8.11 Choisir le salon Discord des chapitres</w:t>
       </w:r>
-      <w:bookmarkEnd w:id="150"/>
+      <w:bookmarkEnd w:id="151"/>
     </w:p>
     <w:p>
       <w:r>
@@ -16628,21 +16647,21 @@
       <w:pPr>
         <w:pStyle w:val="Heading1"/>
       </w:pPr>
-      <w:bookmarkStart w:name="titre-51" w:id="151"/>
+      <w:bookmarkStart w:name="titre-51" w:id="152"/>
       <w:r>
         <w:t xml:space="preserve">9 Terminer un tome</w:t>
       </w:r>
-      <w:bookmarkEnd w:id="151"/>
+      <w:bookmarkEnd w:id="152"/>
     </w:p>
     <w:p>
       <w:pPr>
         <w:pStyle w:val="Heading2"/>
       </w:pPr>
-      <w:bookmarkStart w:name="titre-52" w:id="152"/>
+      <w:bookmarkStart w:name="titre-52" w:id="153"/>
       <w:r>
         <w:t xml:space="preserve">9.1 Terminer un tome avec son dernier envoi</w:t>
       </w:r>
-      <w:bookmarkEnd w:id="152"/>
+      <w:bookmarkEnd w:id="153"/>
     </w:p>
     <w:p>
       <w:r>
@@ -16885,11 +16904,11 @@
       <w:pPr>
         <w:pStyle w:val="Heading2"/>
       </w:pPr>
-      <w:bookmarkStart w:name="titre-53" w:id="153"/>
+      <w:bookmarkStart w:name="titre-53" w:id="154"/>
       <w:r>
         <w:t xml:space="preserve">9.2 Passer un tome à « Publié » depuis sa fiche</w:t>
       </w:r>
-      <w:bookmarkEnd w:id="153"/>
+      <w:bookmarkEnd w:id="154"/>
     </w:p>
     <w:p>
       <w:r>
@@ -17162,11 +17181,11 @@
       <w:pPr>
         <w:pStyle w:val="Heading2"/>
       </w:pPr>
-      <w:bookmarkStart w:name="titre-54" w:id="154"/>
+      <w:bookmarkStart w:name="titre-54" w:id="155"/>
       <w:r>
         <w:t xml:space="preserve">9.3 Remplacer un lien PDF ou EPUB mort</w:t>
       </w:r>
-      <w:bookmarkEnd w:id="154"/>
+      <w:bookmarkEnd w:id="155"/>
     </w:p>
     <w:p>
       <w:pPr>
@@ -17258,11 +17277,11 @@
       <w:pPr>
         <w:pStyle w:val="Heading1"/>
       </w:pPr>
-      <w:bookmarkStart w:name="titre-55" w:id="155"/>
+      <w:bookmarkStart w:name="titre-55" w:id="156"/>
       <w:r>
         <w:t xml:space="preserve">10 Modifier un tome</w:t>
       </w:r>
-      <w:bookmarkEnd w:id="155"/>
+      <w:bookmarkEnd w:id="156"/>
     </w:p>
     <w:p>
       <w:r>
@@ -17273,11 +17292,11 @@
       <w:pPr>
         <w:pStyle w:val="Heading2"/>
       </w:pPr>
-      <w:bookmarkStart w:name="titre-56" w:id="156"/>
+      <w:bookmarkStart w:name="titre-56" w:id="157"/>
       <w:r>
         <w:t xml:space="preserve">10.1 Trouver un tome</w:t>
       </w:r>
-      <w:bookmarkEnd w:id="156"/>
+      <w:bookmarkEnd w:id="157"/>
     </w:p>
     <w:p>
       <w:pPr>
@@ -17504,11 +17523,11 @@
       <w:pPr>
         <w:pStyle w:val="Heading2"/>
       </w:pPr>
-      <w:bookmarkStart w:name="titre-57" w:id="157"/>
+      <w:bookmarkStart w:name="titre-57" w:id="158"/>
       <w:r>
         <w:t xml:space="preserve">10.2 Modifier les informations d'un tome</w:t>
       </w:r>
-      <w:bookmarkEnd w:id="157"/>
+      <w:bookmarkEnd w:id="158"/>
     </w:p>
     <w:p>
       <w:pPr>
@@ -17954,11 +17973,11 @@
       <w:pPr>
         <w:pStyle w:val="Heading2"/>
       </w:pPr>
-      <w:bookmarkStart w:name="titre-58" w:id="158"/>
+      <w:bookmarkStart w:name="titre-58" w:id="159"/>
       <w:r>
         <w:t xml:space="preserve">10.3 Publier, reprogrammer ou retirer un chapitre</w:t>
       </w:r>
-      <w:bookmarkEnd w:id="158"/>
+      <w:bookmarkEnd w:id="159"/>
     </w:p>
     <w:p>
       <w:r>
@@ -18249,11 +18268,11 @@
       <w:pPr>
         <w:pStyle w:val="Heading1"/>
       </w:pPr>
-      <w:bookmarkStart w:name="titre-59" w:id="159"/>
+      <w:bookmarkStart w:name="titre-59" w:id="160"/>
       <w:r>
         <w:t xml:space="preserve">11 Nouveau (version 2.1.5) : l'état des tomes et des œuvres</w:t>
       </w:r>
-      <w:bookmarkEnd w:id="159"/>
+      <w:bookmarkEnd w:id="160"/>
     </w:p>
     <w:tbl>
       <w:tblPr>
@@ -18317,11 +18336,11 @@
       <w:pPr>
         <w:pStyle w:val="Heading2"/>
       </w:pPr>
-      <w:bookmarkStart w:name="titre-60" w:id="160"/>
+      <w:bookmarkStart w:name="titre-60" w:id="161"/>
       <w:r>
         <w:t xml:space="preserve">11.1 Le cycle de vie d'un tome</w:t>
       </w:r>
-      <w:bookmarkEnd w:id="160"/>
+      <w:bookmarkEnd w:id="161"/>
     </w:p>
     <w:p>
       <w:r>
@@ -18904,11 +18923,11 @@
       <w:pPr>
         <w:pStyle w:val="Heading2"/>
       </w:pPr>
-      <w:bookmarkStart w:name="titre-61" w:id="161"/>
+      <w:bookmarkStart w:name="titre-61" w:id="162"/>
       <w:r>
         <w:t xml:space="preserve">11.2 Changer l'état d'un tome</w:t>
       </w:r>
-      <w:bookmarkEnd w:id="161"/>
+      <w:bookmarkEnd w:id="162"/>
     </w:p>
     <w:p>
       <w:pPr>
@@ -19218,11 +19237,11 @@
       <w:pPr>
         <w:pStyle w:val="Heading2"/>
       </w:pPr>
-      <w:bookmarkStart w:name="titre-62" w:id="162"/>
+      <w:bookmarkStart w:name="titre-62" w:id="163"/>
       <w:r>
         <w:t xml:space="preserve">11.3 Savoir ce que fait chaque changement</w:t>
       </w:r>
-      <w:bookmarkEnd w:id="162"/>
+      <w:bookmarkEnd w:id="163"/>
     </w:p>
     <w:p>
       <w:pPr>
@@ -20235,11 +20254,11 @@
       <w:pPr>
         <w:pStyle w:val="Heading2"/>
       </w:pPr>
-      <w:bookmarkStart w:name="titre-63" w:id="163"/>
+      <w:bookmarkStart w:name="titre-63" w:id="164"/>
       <w:r>
         <w:t xml:space="preserve">11.4 J'ai publié au lieu de programmer : comment réparer</w:t>
       </w:r>
-      <w:bookmarkEnd w:id="163"/>
+      <w:bookmarkEnd w:id="164"/>
     </w:p>
     <w:p>
       <w:r>
@@ -20513,11 +20532,11 @@
       <w:pPr>
         <w:pStyle w:val="Heading2"/>
       </w:pPr>
-      <w:bookmarkStart w:name="titre-64" w:id="164"/>
+      <w:bookmarkStart w:name="titre-64" w:id="165"/>
       <w:r>
         <w:t xml:space="preserve">11.5 Changer l'état d'une œuvre</w:t>
       </w:r>
-      <w:bookmarkEnd w:id="164"/>
+      <w:bookmarkEnd w:id="165"/>
     </w:p>
     <w:p>
       <w:r>
@@ -21411,11 +21430,11 @@
       <w:pPr>
         <w:pStyle w:val="Heading1"/>
       </w:pPr>
-      <w:bookmarkStart w:name="titre-65" w:id="165"/>
+      <w:bookmarkStart w:name="titre-65" w:id="166"/>
       <w:r>
         <w:t xml:space="preserve">12 Ce que voient les lecteurs</w:t>
       </w:r>
-      <w:bookmarkEnd w:id="165"/>
+      <w:bookmarkEnd w:id="166"/>
     </w:p>
     <w:p>
       <w:r>
@@ -21534,11 +21553,11 @@
       <w:pPr>
         <w:pStyle w:val="Heading2"/>
       </w:pPr>
-      <w:bookmarkStart w:name="titre-66" w:id="166"/>
+      <w:bookmarkStart w:name="titre-66" w:id="167"/>
       <w:r>
         <w:t xml:space="preserve">12.1 Lire un manga</w:t>
       </w:r>
-      <w:bookmarkEnd w:id="166"/>
+      <w:bookmarkEnd w:id="167"/>
     </w:p>
     <w:p>
       <w:r>
@@ -21654,11 +21673,11 @@
       <w:pPr>
         <w:pStyle w:val="Heading2"/>
       </w:pPr>
-      <w:bookmarkStart w:name="titre-67" w:id="167"/>
+      <w:bookmarkStart w:name="titre-67" w:id="168"/>
       <w:r>
         <w:t xml:space="preserve">12.2 La page d'accueil</w:t>
       </w:r>
-      <w:bookmarkEnd w:id="167"/>
+      <w:bookmarkEnd w:id="168"/>
     </w:p>
     <w:p>
       <w:r>
@@ -22241,11 +22260,11 @@
       <w:pPr>
         <w:pStyle w:val="Heading2"/>
       </w:pPr>
-      <w:bookmarkStart w:name="titre-68" w:id="168"/>
+      <w:bookmarkStart w:name="titre-68" w:id="169"/>
       <w:r>
         <w:t xml:space="preserve">12.3 La page Planning</w:t>
       </w:r>
-      <w:bookmarkEnd w:id="168"/>
+      <w:bookmarkEnd w:id="169"/>
     </w:p>
     <w:p>
       <w:r>
@@ -22767,11 +22786,11 @@
       <w:pPr>
         <w:pStyle w:val="Heading2"/>
       </w:pPr>
-      <w:bookmarkStart w:name="titre-69" w:id="169"/>
+      <w:bookmarkStart w:name="titre-69" w:id="170"/>
       <w:r>
         <w:t xml:space="preserve">12.4 Faire apparaître un chapitre dans « Prochains » de l'accueil</w:t>
       </w:r>
-      <w:bookmarkEnd w:id="169"/>
+      <w:bookmarkEnd w:id="170"/>
     </w:p>
     <w:p>
       <w:r>
@@ -23017,11 +23036,11 @@
       <w:pPr>
         <w:pStyle w:val="Heading2"/>
       </w:pPr>
-      <w:bookmarkStart w:name="titre-70" w:id="170"/>
+      <w:bookmarkStart w:name="titre-70" w:id="171"/>
       <w:r>
         <w:t xml:space="preserve">12.5 Mettre un tome à la une</w:t>
       </w:r>
-      <w:bookmarkEnd w:id="170"/>
+      <w:bookmarkEnd w:id="171"/>
     </w:p>
     <w:p>
       <w:r>
@@ -23284,11 +23303,11 @@
       <w:pPr>
         <w:pStyle w:val="Heading2"/>
       </w:pPr>
-      <w:bookmarkStart w:name="titre-71" w:id="171"/>
+      <w:bookmarkStart w:name="titre-71" w:id="172"/>
       <w:r>
         <w:t xml:space="preserve">12.6 La fiche d'une œuvre</w:t>
       </w:r>
-      <w:bookmarkEnd w:id="171"/>
+      <w:bookmarkEnd w:id="172"/>
     </w:p>
     <w:p>
       <w:pPr>
@@ -23528,11 +23547,11 @@
       <w:pPr>
         <w:pStyle w:val="Heading2"/>
       </w:pPr>
-      <w:bookmarkStart w:name="titre-72" w:id="172"/>
+      <w:bookmarkStart w:name="titre-72" w:id="173"/>
       <w:r>
         <w:t xml:space="preserve">12.7 Les suggestions et les nouveaux chapitres</w:t>
       </w:r>
-      <w:bookmarkEnd w:id="172"/>
+      <w:bookmarkEnd w:id="173"/>
     </w:p>
     <w:tbl>
       <w:tblPr>
@@ -23869,11 +23888,11 @@
       <w:pPr>
         <w:pStyle w:val="Heading2"/>
       </w:pPr>
-      <w:bookmarkStart w:name="titre-73" w:id="173"/>
+      <w:bookmarkStart w:name="titre-73" w:id="174"/>
       <w:r>
         <w:t xml:space="preserve">12.8 La page d'un tome en cours</w:t>
       </w:r>
-      <w:bookmarkEnd w:id="173"/>
+      <w:bookmarkEnd w:id="174"/>
     </w:p>
     <w:p>
       <w:pPr>
@@ -24020,11 +24039,11 @@
       <w:pPr>
         <w:pStyle w:val="Heading1"/>
       </w:pPr>
-      <w:bookmarkStart w:name="titre-74" w:id="174"/>
+      <w:bookmarkStart w:name="titre-74" w:id="175"/>
       <w:r>
         <w:t xml:space="preserve">13 Les statistiques d'audience</w:t>
       </w:r>
-      <w:bookmarkEnd w:id="174"/>
+      <w:bookmarkEnd w:id="175"/>
     </w:p>
     <w:p>
       <w:r>
@@ -24702,11 +24721,11 @@
       <w:pPr>
         <w:pStyle w:val="Heading2"/>
       </w:pPr>
-      <w:bookmarkStart w:name="titre-75" w:id="175"/>
+      <w:bookmarkStart w:name="titre-75" w:id="176"/>
       <w:r>
         <w:t xml:space="preserve">13.1 Lire l'aperçu</w:t>
       </w:r>
-      <w:bookmarkEnd w:id="175"/>
+      <w:bookmarkEnd w:id="176"/>
     </w:p>
     <w:p>
       <w:pPr>
@@ -25146,11 +25165,11 @@
       <w:pPr>
         <w:pStyle w:val="Heading2"/>
       </w:pPr>
-      <w:bookmarkStart w:name="titre-76" w:id="176"/>
+      <w:bookmarkStart w:name="titre-76" w:id="177"/>
       <w:r>
         <w:t xml:space="preserve">13.2 Consulter les statistiques d'une œuvre</w:t>
       </w:r>
-      <w:bookmarkEnd w:id="176"/>
+      <w:bookmarkEnd w:id="177"/>
     </w:p>
     <w:p>
       <w:pPr>
@@ -25395,11 +25414,11 @@
       <w:pPr>
         <w:pStyle w:val="Heading2"/>
       </w:pPr>
-      <w:bookmarkStart w:name="titre-77" w:id="177"/>
+      <w:bookmarkStart w:name="titre-77" w:id="178"/>
       <w:r>
         <w:t xml:space="preserve">13.3 Voir qui suit une œuvre (gérants)</w:t>
       </w:r>
-      <w:bookmarkEnd w:id="177"/>
+      <w:bookmarkEnd w:id="178"/>
     </w:p>
     <w:p>
       <w:r>
@@ -25710,11 +25729,11 @@
       <w:pPr>
         <w:pStyle w:val="Heading2"/>
       </w:pPr>
-      <w:bookmarkStart w:name="titre-78" w:id="178"/>
+      <w:bookmarkStart w:name="titre-78" w:id="179"/>
       <w:r>
         <w:t xml:space="preserve">13.4 Exporter le classement des œuvres</w:t>
       </w:r>
-      <w:bookmarkEnd w:id="178"/>
+      <w:bookmarkEnd w:id="179"/>
     </w:p>
     <w:p>
       <w:pPr>
@@ -25779,11 +25798,11 @@
       <w:pPr>
         <w:pStyle w:val="Heading2"/>
       </w:pPr>
-      <w:bookmarkStart w:name="titre-79" w:id="179"/>
+      <w:bookmarkStart w:name="titre-79" w:id="180"/>
       <w:r>
         <w:t xml:space="preserve">13.5 Comprendre les données de démonstration</w:t>
       </w:r>
-      <w:bookmarkEnd w:id="179"/>
+      <w:bookmarkEnd w:id="180"/>
     </w:p>
     <w:p>
       <w:r>
@@ -25862,11 +25881,11 @@
       <w:pPr>
         <w:pStyle w:val="Heading1"/>
       </w:pPr>
-      <w:bookmarkStart w:name="titre-80" w:id="180"/>
+      <w:bookmarkStart w:name="titre-80" w:id="181"/>
       <w:r>
         <w:t xml:space="preserve">14 Les comptes inscrits (gérants)</w:t>
       </w:r>
-      <w:bookmarkEnd w:id="180"/>
+      <w:bookmarkEnd w:id="181"/>
     </w:p>
     <w:p>
       <w:r>
@@ -26418,11 +26437,11 @@
       <w:pPr>
         <w:pStyle w:val="Heading2"/>
       </w:pPr>
-      <w:bookmarkStart w:name="titre-81" w:id="181"/>
+      <w:bookmarkStart w:name="titre-81" w:id="182"/>
       <w:r>
         <w:t xml:space="preserve">14.1 Trouver un compte</w:t>
       </w:r>
-      <w:bookmarkEnd w:id="181"/>
+      <w:bookmarkEnd w:id="182"/>
     </w:p>
     <w:p>
       <w:pPr>
@@ -26712,11 +26731,11 @@
       <w:pPr>
         <w:pStyle w:val="Heading2"/>
       </w:pPr>
-      <w:bookmarkStart w:name="titre-82" w:id="182"/>
+      <w:bookmarkStart w:name="titre-82" w:id="183"/>
       <w:r>
         <w:t xml:space="preserve">14.2 Consulter la fiche d'un compte</w:t>
       </w:r>
-      <w:bookmarkEnd w:id="182"/>
+      <w:bookmarkEnd w:id="183"/>
     </w:p>
     <w:p>
       <w:pPr>
@@ -26908,11 +26927,11 @@
       <w:pPr>
         <w:pStyle w:val="Heading2"/>
       </w:pPr>
-      <w:bookmarkStart w:name="titre-83" w:id="183"/>
+      <w:bookmarkStart w:name="titre-83" w:id="184"/>
       <w:r>
         <w:t xml:space="preserve">14.3 Ajouter un lecteur à l'équipe</w:t>
       </w:r>
-      <w:bookmarkEnd w:id="183"/>
+      <w:bookmarkEnd w:id="184"/>
     </w:p>
     <w:p>
       <w:pPr>
@@ -27120,11 +27139,11 @@
       <w:pPr>
         <w:pStyle w:val="Heading2"/>
       </w:pPr>
-      <w:bookmarkStart w:name="titre-84" w:id="184"/>
+      <w:bookmarkStart w:name="titre-84" w:id="185"/>
       <w:r>
         <w:t xml:space="preserve">14.4 Exporter la liste</w:t>
       </w:r>
-      <w:bookmarkEnd w:id="184"/>
+      <w:bookmarkEnd w:id="185"/>
     </w:p>
     <w:p>
       <w:pPr>
@@ -27246,11 +27265,11 @@
       <w:pPr>
         <w:pStyle w:val="Heading1"/>
       </w:pPr>
-      <w:bookmarkStart w:name="titre-85" w:id="185"/>
+      <w:bookmarkStart w:name="titre-85" w:id="186"/>
       <w:r>
         <w:t xml:space="preserve">15 Le thème saisonnier (gérants)</w:t>
       </w:r>
-      <w:bookmarkEnd w:id="185"/>
+      <w:bookmarkEnd w:id="186"/>
     </w:p>
     <w:tbl>
       <w:tblPr>
@@ -28170,11 +28189,11 @@
       <w:pPr>
         <w:pStyle w:val="Heading2"/>
       </w:pPr>
-      <w:bookmarkStart w:name="titre-86" w:id="186"/>
+      <w:bookmarkStart w:name="titre-86" w:id="187"/>
       <w:r>
         <w:t xml:space="preserve">15.1 Programmer le thème du site selon la saison</w:t>
       </w:r>
-      <w:bookmarkEnd w:id="186"/>
+      <w:bookmarkEnd w:id="187"/>
     </w:p>
     <w:p>
       <w:r>
@@ -28637,11 +28656,11 @@
       <w:pPr>
         <w:pStyle w:val="Heading2"/>
       </w:pPr>
-      <w:bookmarkStart w:name="titre-87" w:id="187"/>
+      <w:bookmarkStart w:name="titre-87" w:id="188"/>
       <w:r>
         <w:t xml:space="preserve">15.2 Garder un seul thème toute l'année</w:t>
       </w:r>
-      <w:bookmarkEnd w:id="187"/>
+      <w:bookmarkEnd w:id="188"/>
     </w:p>
     <w:p>
       <w:pPr>
@@ -28794,11 +28813,11 @@
       <w:pPr>
         <w:pStyle w:val="Heading2"/>
       </w:pPr>
-      <w:bookmarkStart w:name="titre-88" w:id="188"/>
+      <w:bookmarkStart w:name="titre-88" w:id="189"/>
       <w:r>
         <w:t xml:space="preserve">15.3 Voir un thème sur n'importe quelle page</w:t>
       </w:r>
-      <w:bookmarkEnd w:id="188"/>
+      <w:bookmarkEnd w:id="189"/>
     </w:p>
     <w:p>
       <w:r>
@@ -29074,8 +29093,117 @@
     </w:tbl>
     <w:p>
       <w:pPr>
-        <w:spacing w:after="60" w:before="0"/>
-      </w:pPr>
+        <w:pStyle w:val="Heading2"/>
+      </w:pPr>
+      <w:bookmarkStart w:name="titre-89" w:id="190"/>
+      <w:r>
+        <w:t xml:space="preserve">15.4 Afficher ou retirer l'arbre décoratif</w:t>
+      </w:r>
+      <w:bookmarkEnd w:id="190"/>
+    </w:p>
+    <w:p>
+      <w:r>
+        <w:t xml:space="preserve">Sur ordinateur, l'arbre de la saison (celui du logo) est posé en fond de page, en bas à droite, derrière le contenu. Il est très pâle sur la plupart des écrans, où il passe sous le texte ; sur les très grands écrans, il est bien visible dans la marge de droite.</w:t>
+      </w:r>
+    </w:p>
+    <w:p>
+      <w:pPr>
+        <w:pStyle w:val="ListParagraph"/>
+        <w:numPr>
+          <w:ilvl w:val="0"/>
+          <w:numId w:val="48"/>
+        </w:numPr>
+        <w:spacing w:after="60" w:before="40"/>
+      </w:pPr>
+      <w:r>
+        <w:t xml:space="preserve">Dans le menu </w:t>
+      </w:r>
+      <w:r>
+        <w:rPr>
+          <w:b/>
+          <w:bCs/>
+        </w:rPr>
+        <w:t xml:space="preserve">Site</w:t>
+      </w:r>
+      <w:r>
+        <w:t xml:space="preserve">, ouvrez </w:t>
+      </w:r>
+      <w:r>
+        <w:rPr>
+          <w:b/>
+          <w:bCs/>
+        </w:rPr>
+        <w:t xml:space="preserve">Réglages</w:t>
+      </w:r>
+      <w:r>
+        <w:t xml:space="preserve">, section </w:t>
+      </w:r>
+      <w:r>
+        <w:rPr>
+          <w:b/>
+          <w:bCs/>
+        </w:rPr>
+        <w:t xml:space="preserve">Thème saisonnier</w:t>
+      </w:r>
+      <w:r>
+        <w:t xml:space="preserve">.</w:t>
+      </w:r>
+    </w:p>
+    <w:p>
+      <w:pPr>
+        <w:pStyle w:val="ListParagraph"/>
+        <w:numPr>
+          <w:ilvl w:val="0"/>
+          <w:numId w:val="48"/>
+        </w:numPr>
+        <w:spacing w:after="60" w:before="40"/>
+      </w:pPr>
+      <w:r>
+        <w:t xml:space="preserve">Cochez ou décochez </w:t>
+      </w:r>
+      <w:r>
+        <w:rPr>
+          <w:b/>
+          <w:bCs/>
+        </w:rPr>
+        <w:t xml:space="preserve">Arbre décoratif</w:t>
+      </w:r>
+      <w:r>
+        <w:t xml:space="preserve">, juste après </w:t>
+      </w:r>
+      <w:r>
+        <w:rPr>
+          <w:b/>
+          <w:bCs/>
+        </w:rPr>
+        <w:t xml:space="preserve">Décors animés</w:t>
+      </w:r>
+      <w:r>
+        <w:t xml:space="preserve"> (case cochée par défaut).</w:t>
+      </w:r>
+    </w:p>
+    <w:p>
+      <w:pPr>
+        <w:pStyle w:val="ListParagraph"/>
+        <w:numPr>
+          <w:ilvl w:val="0"/>
+          <w:numId w:val="48"/>
+        </w:numPr>
+        <w:spacing w:after="60" w:before="40"/>
+      </w:pPr>
+      <w:r>
+        <w:t xml:space="preserve">Cliquez sur </w:t>
+      </w:r>
+      <w:r>
+        <w:rPr>
+          <w:b/>
+          <w:bCs/>
+        </w:rPr>
+        <w:t xml:space="preserve">Enregistrer les réglages</w:t>
+      </w:r>
+      <w:r>
+        <w:t xml:space="preserve">.</w:t>
+      </w:r>
     </w:p>
     <w:tbl>
       <w:tblPr>
@@ -29129,7 +29257,27 @@
               <w:t xml:space="preserve"> : </w:t>
             </w:r>
             <w:r>
-              <w:t xml:space="preserve">les logos des saisons sont des fichiers du site, pas des images de la médiathèque. Pour en changer, envoyez le nouveau visuel à l'équipe technique : il arrive avec une mise à jour du site.</w:t>
+              <w:t xml:space="preserve">l'arbre n'apparaît jamais sur un écran de moins de 1 024 pixels de large (téléphone, tablette en portrait), dans un chapitre, sur la page des illustrations d'un tome, dans l'espace équipe, dans le formulaire de publication ni dans l'administration. Il disparaît aussi pour un lecteur qui a demandé plus de contraste (réglage de l'appareil, ou </w:t>
+            </w:r>
+            <w:r>
+              <w:rPr>
+                <w:b/>
+                <w:bCs/>
+              </w:rPr>
+              <w:t xml:space="preserve">Contraste renforcé</w:t>
+            </w:r>
+            <w:r>
+              <w:t xml:space="preserve"> dans un chapitre), pour un lecteur en thème </w:t>
+            </w:r>
+            <w:r>
+              <w:rPr>
+                <w:b/>
+                <w:bCs/>
+              </w:rPr>
+              <w:t xml:space="preserve">Sépia</w:t>
+            </w:r>
+            <w:r>
+              <w:t xml:space="preserve"> et à l'impression.</w:t>
             </w:r>
           </w:p>
         </w:tc>
@@ -29137,13 +29285,8 @@
     </w:tbl>
     <w:p>
       <w:pPr>
-        <w:pStyle w:val="Heading1"/>
-      </w:pPr>
-      <w:bookmarkStart w:name="titre-89" w:id="189"/>
-      <w:r>
-        <w:t xml:space="preserve">16 Les coquilles signalées par les lecteurs</w:t>
-      </w:r>
-      <w:bookmarkEnd w:id="189"/>
+        <w:spacing w:after="60" w:before="0"/>
+      </w:pPr>
     </w:p>
     <w:tbl>
       <w:tblPr>
@@ -29169,11 +29312,11 @@
             <w:tcW w:type="dxa" w:w="9026"/>
             <w:tcBorders>
               <w:top w:val="none" w:color="FFFFFF" w:sz="0"/>
-              <w:left w:val="single" w:color="D6457F" w:sz="24"/>
+              <w:left w:val="single" w:color="7A4FB0" w:sz="24"/>
               <w:bottom w:val="none" w:color="FFFFFF" w:sz="0"/>
               <w:right w:val="none" w:color="FFFFFF" w:sz="0"/>
             </w:tcBorders>
-            <w:shd w:fill="FCE8F1" w:color="auto" w:val="clear"/>
+            <w:shd w:fill="F1ECFA" w:color="auto" w:val="clear"/>
             <w:tcMar>
               <w:top w:type="dxa" w:w="120"/>
               <w:left w:type="dxa" w:w="200"/>
@@ -29189,35 +29332,15 @@
               <w:rPr>
                 <w:b/>
                 <w:bCs/>
-                <w:color w:val="9C1F52"/>
-              </w:rPr>
-              <w:t xml:space="preserve">Nouveau</w:t>
+                <w:color w:val="4B2A7B"/>
+              </w:rPr>
+              <w:t xml:space="preserve">À savoir</w:t>
             </w:r>
             <w:r>
               <w:t xml:space="preserve"> : </w:t>
             </w:r>
             <w:r>
-              <w:t xml:space="preserve">depuis la version 2.5, les lecteurs signalent une coquille directement dans le chapitre. Les signalements arrivent dans l'espace équipe, menu </w:t>
-            </w:r>
-            <w:r>
-              <w:rPr>
-                <w:b/>
-                <w:bCs/>
-              </w:rPr>
-              <w:t xml:space="preserve">Catalogue</w:t>
-            </w:r>
-            <w:r>
-              <w:t xml:space="preserve">, puis </w:t>
-            </w:r>
-            <w:r>
-              <w:rPr>
-                <w:b/>
-                <w:bCs/>
-              </w:rPr>
-              <w:t xml:space="preserve">Corrections</w:t>
-            </w:r>
-            <w:r>
-              <w:t xml:space="preserve">.</w:t>
+              <w:t xml:space="preserve">en Automne, aucun arbre ne s'affiche tant que son image n'a pas été livrée avec une mise à jour du site.</w:t>
             </w:r>
           </w:p>
         </w:tc>
@@ -29225,20 +29348,171 @@
     </w:tbl>
     <w:p>
       <w:pPr>
+        <w:spacing w:after="60" w:before="0"/>
+      </w:pPr>
+    </w:p>
+    <w:tbl>
+      <w:tblPr>
+        <w:tblW w:type="dxa" w:w="9026"/>
+        <w:tblBorders>
+          <w:top w:val="single" w:color="auto" w:sz="4"/>
+          <w:left w:val="single" w:color="auto" w:sz="4"/>
+          <w:bottom w:val="single" w:color="auto" w:sz="4"/>
+          <w:right w:val="single" w:color="auto" w:sz="4"/>
+          <w:insideH w:val="single" w:color="auto" w:sz="4"/>
+          <w:insideV w:val="single" w:color="auto" w:sz="4"/>
+        </w:tblBorders>
+      </w:tblPr>
+      <w:tblGrid>
+        <w:gridCol w:w="9026"/>
+      </w:tblGrid>
+      <w:tr>
+        <w:trPr>
+          <w:cantSplit/>
+        </w:trPr>
+        <w:tc>
+          <w:tcPr>
+            <w:tcW w:type="dxa" w:w="9026"/>
+            <w:tcBorders>
+              <w:top w:val="none" w:color="FFFFFF" w:sz="0"/>
+              <w:left w:val="single" w:color="7A4FB0" w:sz="24"/>
+              <w:bottom w:val="none" w:color="FFFFFF" w:sz="0"/>
+              <w:right w:val="none" w:color="FFFFFF" w:sz="0"/>
+            </w:tcBorders>
+            <w:shd w:fill="F1ECFA" w:color="auto" w:val="clear"/>
+            <w:tcMar>
+              <w:top w:type="dxa" w:w="120"/>
+              <w:left w:type="dxa" w:w="200"/>
+              <w:bottom w:type="dxa" w:w="120"/>
+              <w:right w:type="dxa" w:w="160"/>
+            </w:tcMar>
+          </w:tcPr>
+          <w:p>
+            <w:pPr>
+              <w:spacing w:after="0" w:before="0"/>
+            </w:pPr>
+            <w:r>
+              <w:rPr>
+                <w:b/>
+                <w:bCs/>
+                <w:color w:val="4B2A7B"/>
+              </w:rPr>
+              <w:t xml:space="preserve">À savoir</w:t>
+            </w:r>
+            <w:r>
+              <w:t xml:space="preserve"> : </w:t>
+            </w:r>
+            <w:r>
+              <w:t xml:space="preserve">les logos des saisons sont des fichiers du site, pas des images de la médiathèque. Pour en changer, envoyez le nouveau visuel à l'équipe technique : il arrive avec une mise à jour du site.</w:t>
+            </w:r>
+          </w:p>
+        </w:tc>
+      </w:tr>
+    </w:tbl>
+    <w:p>
+      <w:pPr>
+        <w:pStyle w:val="Heading1"/>
+      </w:pPr>
+      <w:bookmarkStart w:name="titre-90" w:id="191"/>
+      <w:r>
+        <w:t xml:space="preserve">16 Les coquilles signalées par les lecteurs</w:t>
+      </w:r>
+      <w:bookmarkEnd w:id="191"/>
+    </w:p>
+    <w:tbl>
+      <w:tblPr>
+        <w:tblW w:type="dxa" w:w="9026"/>
+        <w:tblBorders>
+          <w:top w:val="single" w:color="auto" w:sz="4"/>
+          <w:left w:val="single" w:color="auto" w:sz="4"/>
+          <w:bottom w:val="single" w:color="auto" w:sz="4"/>
+          <w:right w:val="single" w:color="auto" w:sz="4"/>
+          <w:insideH w:val="single" w:color="auto" w:sz="4"/>
+          <w:insideV w:val="single" w:color="auto" w:sz="4"/>
+        </w:tblBorders>
+      </w:tblPr>
+      <w:tblGrid>
+        <w:gridCol w:w="9026"/>
+      </w:tblGrid>
+      <w:tr>
+        <w:trPr>
+          <w:cantSplit/>
+        </w:trPr>
+        <w:tc>
+          <w:tcPr>
+            <w:tcW w:type="dxa" w:w="9026"/>
+            <w:tcBorders>
+              <w:top w:val="none" w:color="FFFFFF" w:sz="0"/>
+              <w:left w:val="single" w:color="D6457F" w:sz="24"/>
+              <w:bottom w:val="none" w:color="FFFFFF" w:sz="0"/>
+              <w:right w:val="none" w:color="FFFFFF" w:sz="0"/>
+            </w:tcBorders>
+            <w:shd w:fill="FCE8F1" w:color="auto" w:val="clear"/>
+            <w:tcMar>
+              <w:top w:type="dxa" w:w="120"/>
+              <w:left w:type="dxa" w:w="200"/>
+              <w:bottom w:type="dxa" w:w="120"/>
+              <w:right w:type="dxa" w:w="160"/>
+            </w:tcMar>
+          </w:tcPr>
+          <w:p>
+            <w:pPr>
+              <w:spacing w:after="0" w:before="0"/>
+            </w:pPr>
+            <w:r>
+              <w:rPr>
+                <w:b/>
+                <w:bCs/>
+                <w:color w:val="9C1F52"/>
+              </w:rPr>
+              <w:t xml:space="preserve">Nouveau</w:t>
+            </w:r>
+            <w:r>
+              <w:t xml:space="preserve"> : </w:t>
+            </w:r>
+            <w:r>
+              <w:t xml:space="preserve">depuis la version 2.5, les lecteurs signalent une coquille directement dans le chapitre. Les signalements arrivent dans l'espace équipe, menu </w:t>
+            </w:r>
+            <w:r>
+              <w:rPr>
+                <w:b/>
+                <w:bCs/>
+              </w:rPr>
+              <w:t xml:space="preserve">Catalogue</w:t>
+            </w:r>
+            <w:r>
+              <w:t xml:space="preserve">, puis </w:t>
+            </w:r>
+            <w:r>
+              <w:rPr>
+                <w:b/>
+                <w:bCs/>
+              </w:rPr>
+              <w:t xml:space="preserve">Corrections</w:t>
+            </w:r>
+            <w:r>
+              <w:t xml:space="preserve">.</w:t>
+            </w:r>
+          </w:p>
+        </w:tc>
+      </w:tr>
+    </w:tbl>
+    <w:p>
+      <w:pPr>
         <w:pStyle w:val="Heading2"/>
       </w:pPr>
-      <w:bookmarkStart w:name="titre-90" w:id="190"/>
+      <w:bookmarkStart w:name="titre-91" w:id="192"/>
       <w:r>
         <w:t xml:space="preserve">16.1 Comprendre ce que fait le lecteur</w:t>
       </w:r>
-      <w:bookmarkEnd w:id="190"/>
+      <w:bookmarkEnd w:id="192"/>
     </w:p>
     <w:p>
       <w:pPr>
         <w:pStyle w:val="ListParagraph"/>
         <w:numPr>
           <w:ilvl w:val="0"/>
-          <w:numId w:val="48"/>
+          <w:numId w:val="49"/>
         </w:numPr>
         <w:spacing w:after="60" w:before="40"/>
       </w:pPr>
@@ -29251,7 +29525,7 @@
         <w:pStyle w:val="ListParagraph"/>
         <w:numPr>
           <w:ilvl w:val="0"/>
-          <w:numId w:val="48"/>
+          <w:numId w:val="49"/>
         </w:numPr>
         <w:spacing w:after="60" w:before="40"/>
       </w:pPr>
@@ -29294,7 +29568,7 @@
         <w:pStyle w:val="ListParagraph"/>
         <w:numPr>
           <w:ilvl w:val="0"/>
-          <w:numId w:val="48"/>
+          <w:numId w:val="49"/>
         </w:numPr>
         <w:spacing w:after="60" w:before="40"/>
       </w:pPr>
@@ -29441,11 +29715,11 @@
       <w:pPr>
         <w:pStyle w:val="Heading2"/>
       </w:pPr>
-      <w:bookmarkStart w:name="titre-91" w:id="191"/>
+      <w:bookmarkStart w:name="titre-92" w:id="193"/>
       <w:r>
         <w:t xml:space="preserve">16.2 Traiter une coquille</w:t>
       </w:r>
-      <w:bookmarkEnd w:id="191"/>
+      <w:bookmarkEnd w:id="193"/>
     </w:p>
     <w:p>
       <w:r>
@@ -29457,7 +29731,7 @@
         <w:pStyle w:val="ListParagraph"/>
         <w:numPr>
           <w:ilvl w:val="0"/>
-          <w:numId w:val="49"/>
+          <w:numId w:val="50"/>
         </w:numPr>
         <w:spacing w:after="60" w:before="40"/>
       </w:pPr>
@@ -29490,7 +29764,7 @@
         <w:pStyle w:val="ListParagraph"/>
         <w:numPr>
           <w:ilvl w:val="0"/>
-          <w:numId w:val="49"/>
+          <w:numId w:val="50"/>
         </w:numPr>
         <w:spacing w:after="60" w:before="40"/>
       </w:pPr>
@@ -29513,7 +29787,7 @@
         <w:pStyle w:val="ListParagraph"/>
         <w:numPr>
           <w:ilvl w:val="0"/>
-          <w:numId w:val="49"/>
+          <w:numId w:val="50"/>
         </w:numPr>
         <w:spacing w:after="60" w:before="40"/>
       </w:pPr>
@@ -29536,7 +29810,7 @@
         <w:pStyle w:val="ListParagraph"/>
         <w:numPr>
           <w:ilvl w:val="0"/>
-          <w:numId w:val="49"/>
+          <w:numId w:val="50"/>
         </w:numPr>
         <w:spacing w:after="60" w:before="40"/>
       </w:pPr>
@@ -29569,7 +29843,7 @@
         <w:pStyle w:val="ListParagraph"/>
         <w:numPr>
           <w:ilvl w:val="0"/>
-          <w:numId w:val="49"/>
+          <w:numId w:val="50"/>
         </w:numPr>
         <w:spacing w:after="60" w:before="40"/>
       </w:pPr>
@@ -29839,18 +30113,18 @@
       <w:pPr>
         <w:pStyle w:val="Heading2"/>
       </w:pPr>
-      <w:bookmarkStart w:name="titre-92" w:id="192"/>
+      <w:bookmarkStart w:name="titre-93" w:id="194"/>
       <w:r>
         <w:t xml:space="preserve">16.3 Retrouver les signalements traités</w:t>
       </w:r>
-      <w:bookmarkEnd w:id="192"/>
+      <w:bookmarkEnd w:id="194"/>
     </w:p>
     <w:p>
       <w:pPr>
         <w:pStyle w:val="ListParagraph"/>
         <w:numPr>
           <w:ilvl w:val="0"/>
-          <w:numId w:val="50"/>
+          <w:numId w:val="51"/>
         </w:numPr>
         <w:spacing w:after="60" w:before="40"/>
       </w:pPr>
@@ -29923,7 +30197,7 @@
         <w:pStyle w:val="ListParagraph"/>
         <w:numPr>
           <w:ilvl w:val="0"/>
-          <w:numId w:val="50"/>
+          <w:numId w:val="51"/>
         </w:numPr>
         <w:spacing w:after="60" w:before="40"/>
       </w:pPr>
@@ -30013,21 +30287,21 @@
       <w:pPr>
         <w:pStyle w:val="Heading1"/>
       </w:pPr>
-      <w:bookmarkStart w:name="titre-93" w:id="193"/>
+      <w:bookmarkStart w:name="titre-94" w:id="195"/>
       <w:r>
         <w:t xml:space="preserve">17 Glossaires, actualités et commentaires</w:t>
       </w:r>
-      <w:bookmarkEnd w:id="193"/>
+      <w:bookmarkEnd w:id="195"/>
     </w:p>
     <w:p>
       <w:pPr>
         <w:pStyle w:val="Heading2"/>
       </w:pPr>
-      <w:bookmarkStart w:name="titre-94" w:id="194"/>
+      <w:bookmarkStart w:name="titre-95" w:id="196"/>
       <w:r>
         <w:t xml:space="preserve">17.1 Publier le glossaire d'une œuvre</w:t>
       </w:r>
-      <w:bookmarkEnd w:id="194"/>
+      <w:bookmarkEnd w:id="196"/>
     </w:p>
     <w:p>
       <w:r>
@@ -30051,7 +30325,7 @@
         <w:pStyle w:val="ListParagraph"/>
         <w:numPr>
           <w:ilvl w:val="0"/>
-          <w:numId w:val="51"/>
+          <w:numId w:val="52"/>
         </w:numPr>
         <w:spacing w:after="60" w:before="40"/>
       </w:pPr>
@@ -30084,7 +30358,7 @@
         <w:pStyle w:val="ListParagraph"/>
         <w:numPr>
           <w:ilvl w:val="0"/>
-          <w:numId w:val="51"/>
+          <w:numId w:val="52"/>
         </w:numPr>
         <w:spacing w:after="60" w:before="40"/>
       </w:pPr>
@@ -30127,7 +30401,7 @@
         <w:pStyle w:val="ListParagraph"/>
         <w:numPr>
           <w:ilvl w:val="0"/>
-          <w:numId w:val="51"/>
+          <w:numId w:val="52"/>
         </w:numPr>
         <w:spacing w:after="60" w:before="40"/>
       </w:pPr>
@@ -30150,7 +30424,7 @@
         <w:pStyle w:val="ListParagraph"/>
         <w:numPr>
           <w:ilvl w:val="0"/>
-          <w:numId w:val="51"/>
+          <w:numId w:val="52"/>
         </w:numPr>
         <w:spacing w:after="60" w:before="40"/>
       </w:pPr>
@@ -30197,11 +30471,11 @@
       <w:pPr>
         <w:pStyle w:val="Heading2"/>
       </w:pPr>
-      <w:bookmarkStart w:name="titre-95" w:id="195"/>
+      <w:bookmarkStart w:name="titre-96" w:id="197"/>
       <w:r>
         <w:t xml:space="preserve">17.2 Lier une actualité à une œuvre</w:t>
       </w:r>
-      <w:bookmarkEnd w:id="195"/>
+      <w:bookmarkEnd w:id="197"/>
     </w:p>
     <w:p>
       <w:r>
@@ -30232,11 +30506,11 @@
       <w:pPr>
         <w:pStyle w:val="Heading2"/>
       </w:pPr>
-      <w:bookmarkStart w:name="titre-96" w:id="196"/>
+      <w:bookmarkStart w:name="titre-97" w:id="198"/>
       <w:r>
         <w:t xml:space="preserve">17.3 Modérer les commentaires</w:t>
       </w:r>
-      <w:bookmarkEnd w:id="196"/>
+      <w:bookmarkEnd w:id="198"/>
     </w:p>
     <w:p>
       <w:r>
@@ -30493,11 +30767,11 @@
       <w:pPr>
         <w:pStyle w:val="Heading1"/>
       </w:pPr>
-      <w:bookmarkStart w:name="titre-97" w:id="197"/>
+      <w:bookmarkStart w:name="titre-98" w:id="199"/>
       <w:r>
         <w:t xml:space="preserve">18 Questions fréquentes</w:t>
       </w:r>
-      <w:bookmarkEnd w:id="197"/>
+      <w:bookmarkEnd w:id="199"/>
     </w:p>
     <w:tbl>
       <w:tblPr>
@@ -32599,21 +32873,21 @@
       <w:pPr>
         <w:pStyle w:val="Heading1"/>
       </w:pPr>
-      <w:bookmarkStart w:name="titre-98" w:id="198"/>
+      <w:bookmarkStart w:name="titre-99" w:id="200"/>
       <w:r>
         <w:t xml:space="preserve">19 En cas de problème</w:t>
       </w:r>
-      <w:bookmarkEnd w:id="198"/>
+      <w:bookmarkEnd w:id="200"/>
     </w:p>
     <w:p>
       <w:pPr>
         <w:pStyle w:val="Heading2"/>
       </w:pPr>
-      <w:bookmarkStart w:name="titre-99" w:id="199"/>
+      <w:bookmarkStart w:name="titre-100" w:id="201"/>
       <w:r>
         <w:t xml:space="preserve">19.1 Qui contacter</w:t>
       </w:r>
-      <w:bookmarkEnd w:id="199"/>
+      <w:bookmarkEnd w:id="201"/>
     </w:p>
     <w:tbl>
       <w:tblPr>
@@ -33110,11 +33384,11 @@
       <w:pPr>
         <w:pStyle w:val="Heading2"/>
       </w:pPr>
-      <w:bookmarkStart w:name="titre-100" w:id="200"/>
+      <w:bookmarkStart w:name="titre-101" w:id="202"/>
       <w:r>
         <w:t xml:space="preserve">19.2 Signaler un problème</w:t>
       </w:r>
-      <w:bookmarkEnd w:id="200"/>
+      <w:bookmarkEnd w:id="202"/>
     </w:p>
     <w:p>
       <w:r>
@@ -33126,7 +33400,7 @@
         <w:pStyle w:val="ListParagraph"/>
         <w:numPr>
           <w:ilvl w:val="0"/>
-          <w:numId w:val="52"/>
+          <w:numId w:val="53"/>
         </w:numPr>
         <w:spacing w:after="60" w:before="40"/>
       </w:pPr>
@@ -33139,7 +33413,7 @@
         <w:pStyle w:val="ListParagraph"/>
         <w:numPr>
           <w:ilvl w:val="0"/>
-          <w:numId w:val="52"/>
+          <w:numId w:val="53"/>
         </w:numPr>
         <w:spacing w:after="60" w:before="40"/>
       </w:pPr>
@@ -33152,7 +33426,7 @@
         <w:pStyle w:val="ListParagraph"/>
         <w:numPr>
           <w:ilvl w:val="0"/>
-          <w:numId w:val="52"/>
+          <w:numId w:val="53"/>
         </w:numPr>
         <w:spacing w:after="60" w:before="40"/>
       </w:pPr>
@@ -33165,7 +33439,7 @@
         <w:pStyle w:val="ListParagraph"/>
         <w:numPr>
           <w:ilvl w:val="0"/>
-          <w:numId w:val="52"/>
+          <w:numId w:val="53"/>
         </w:numPr>
         <w:spacing w:after="60" w:before="40"/>
       </w:pPr>
@@ -33374,7 +33648,7 @@
         <w:sz w:val="17"/>
         <w:szCs w:val="17"/>
       </w:rPr>
-      <w:t xml:space="preserve">Version 2.6.0 du 30 octobre 2026</w:t>
+      <w:t xml:space="preserve">Version 2.7.0-dev.3 du 30 octobre 2026</w:t>
     </w:r>
     <w:r>
       <w:rPr>
@@ -33902,6 +34176,12 @@
     </w:lvlOverride>
   </w:num>
   <w:num w:numId="52">
+    <w:abstractNumId w:val="2"/>
+    <w:lvlOverride w:ilvl="0">
+      <w:startOverride w:val="1"/>
+    </w:lvlOverride>
+  </w:num>
+  <w:num w:numId="53">
     <w:abstractNumId w:val="2"/>
     <w:lvlOverride w:ilvl="0">
       <w:startOverride w:val="1"/>

</xml_diff>

<commit_message>
Yume Novel 2.7.0 : thèmes saisonniers
Version de release (pas de tag : il attend le Go de l'équipe). Guide Word reconstruit en 2.7.0.

Co-Authored-By: Claude Fable 5.1 <noreply@anthropic.com>
Claude-Session: https://claude.ai/code/session_015YMDuD9pvskBfZXb8f4YCu
</commit_message>
<xml_diff>
--- a/docs/guide-equipe/Guide-equipe-Yume-Novel.docx
+++ b/docs/guide-equipe/Guide-equipe-Yume-Novel.docx
@@ -61,7 +61,7 @@
           <w:sz w:val="22"/>
           <w:szCs w:val="22"/>
         </w:rPr>
-        <w:t xml:space="preserve">Version 2.7.0-dev.3 du 30 octobre 2026</w:t>
+        <w:t xml:space="preserve">Version 2.7.0 du 30 octobre 2026</w:t>
       </w:r>
     </w:p>
     <w:p>
@@ -33648,7 +33648,7 @@
         <w:sz w:val="17"/>
         <w:szCs w:val="17"/>
       </w:rPr>
-      <w:t xml:space="preserve">Version 2.7.0-dev.3 du 30 octobre 2026</w:t>
+      <w:t xml:space="preserve">Version 2.7.0 du 30 octobre 2026</w:t>
     </w:r>
     <w:r>
       <w:rPr>

</xml_diff>

<commit_message>
Arbre décoratif sur les chapitres, dans la marge libre de la colonne de lecture (2.7.2-dev.1)
Après essai en lecture, l'arbre n'est plus exclu des chapitres : la classe yn-sprite--lecture le
cantonne à la marge libre à droite de .yn-reader (largeur réelle mesurée par yume.js et transmise
en variable CSS, recalculée au redimensionnement et quand le panneau de lecture change la colonne ;
760 px supposés sans JavaScript), à pleine opacité, jamais sous le texte, masqué sous 160 px de marge.
Illustrations d'un tome, espace équipe, Sépia, contraste renforcé et moins de 1 024 px : inchangés.
Test, contrat §6 et §15, guide de l'équipe (Markdown et DOCX), design et docs/08 mis à jour.

Co-Authored-By: Claude Fable 5.1 <noreply@anthropic.com>
Claude-Session: https://claude.ai/code/session_015YMDuD9pvskBfZXb8f4YCu
</commit_message>
<xml_diff>
--- a/docs/guide-equipe/Guide-equipe-Yume-Novel.docx
+++ b/docs/guide-equipe/Guide-equipe-Yume-Novel.docx
@@ -61,7 +61,7 @@
           <w:sz w:val="22"/>
           <w:szCs w:val="22"/>
         </w:rPr>
-        <w:t xml:space="preserve">Version 2.7.0 du 30 octobre 2026</w:t>
+        <w:t xml:space="preserve">Version 2.7.1 du 30 octobre 2026</w:t>
       </w:r>
     </w:p>
     <w:p>
@@ -29257,7 +29257,7 @@
               <w:t xml:space="preserve"> : </w:t>
             </w:r>
             <w:r>
-              <w:t xml:space="preserve">l'arbre n'apparaît jamais sur un écran de moins de 1 024 pixels de large (téléphone, tablette en portrait), dans un chapitre, sur la page des illustrations d'un tome, dans l'espace équipe, dans le formulaire de publication ni dans l'administration. Il disparaît aussi pour un lecteur qui a demandé plus de contraste (réglage de l'appareil, ou </w:t>
+              <w:t xml:space="preserve">l'arbre n'apparaît jamais sur un écran de moins de 1 024 pixels de large (téléphone, tablette en portrait), sur la page des illustrations d'un tome, dans l'espace équipe, dans le formulaire de publication ni dans l'administration. Il disparaît aussi pour un lecteur qui a demandé plus de contraste (réglage de l'appareil, ou </w:t>
             </w:r>
             <w:r>
               <w:rPr>
@@ -29277,7 +29277,7 @@
               <w:t xml:space="preserve">Sépia</w:t>
             </w:r>
             <w:r>
-              <w:t xml:space="preserve"> et à l'impression.</w:t>
+              <w:t xml:space="preserve"> et à l'impression. Dans un chapitre, il reste dans la marge à droite du texte, sans jamais passer dessous.</w:t>
             </w:r>
           </w:p>
         </w:tc>
@@ -33648,7 +33648,7 @@
         <w:sz w:val="17"/>
         <w:szCs w:val="17"/>
       </w:rPr>
-      <w:t xml:space="preserve">Version 2.7.0 du 30 octobre 2026</w:t>
+      <w:t xml:space="preserve">Version 2.7.1 du 30 octobre 2026</w:t>
     </w:r>
     <w:r>
       <w:rPr>

</xml_diff>